<commit_message>
Contratto per xFIR e registri RENTRI: conservazione 3 anni, listino a spazio
Co-Authored-By: Claude Opus 5.5 <noreply@anthropic.com>
Claude-Session: https://claude.ai/code/session_01WDncHtSFTdQuV5JxtunJCC
</commit_message>
<xml_diff>
--- a/Contratto_Conservazione_WsTech.docx
+++ b/Contratto_Conservazione_WsTech.docx
@@ -15,7 +15,7 @@
           <w:sz w:val="30"/>
           <w:szCs w:val="30"/>
         </w:rPr>
-        <w:t xml:space="preserve">CONTRATTO PER IL SERVIZIO DI CONSERVAZIONE DIGITALE A NORMA</w:t>
+        <w:t xml:space="preserve">CONTRATTO PER IL SERVIZIO DI CONSERVAZIONE DIGITALE A NORMA DI XFIR E REGISTRI RENTRI</w:t>
       </w:r>
     </w:p>
     <w:p>
@@ -137,10 +137,10 @@
           <w:b/>
           <w:bCs/>
         </w:rPr>
-        <w:t xml:space="preserve">[● Ragione sociale]</w:t>
-      </w:r>
-      <w:r>
-        <w:t xml:space="preserve">, con sede legale in [●], P.IVA [●], C.F. [●], PEC [●], in persona del legale rappresentante pro tempore [●] (di seguito il "</w:t>
+        <w:t xml:space="preserve">____________________</w:t>
+      </w:r>
+      <w:r>
+        <w:t xml:space="preserve"> (ragione sociale), con sede legale in ____________________, P.IVA ____________________, C.F. ____________________, PEC ____________________, in persona del legale rappresentante pro tempore ____________________ (di seguito il "</w:t>
       </w:r>
       <w:r>
         <w:rPr>
@@ -262,7 +262,21 @@
         <w:jc w:val="both"/>
       </w:pPr>
       <w:r>
-        <w:t xml:space="preserve">il Cliente intende affidare a WST la gestione del versamento dei propri documenti nel sistema di conservazione di Intesi Group, alle condizioni che seguono.</w:t>
+        <w:t xml:space="preserve">il Cliente, in quanto soggetto agli obblighi di tracciabilità dei rifiuti di cui agli artt. 188-bis, 190 e 193 del D.Lgs. 152/2006 e al D.M. 4 aprile 2023 n. 59 (RENTRI), deve conservare i formulari di identificazione dei rifiuti in formato digitale (xFIR) e i registri cronologici di carico e scarico;</w:t>
+      </w:r>
+    </w:p>
+    <w:p>
+      <w:pPr>
+        <w:pStyle w:val="ListParagraph"/>
+        <w:numPr>
+          <w:ilvl w:val="0"/>
+          <w:numId w:val="2"/>
+        </w:numPr>
+        <w:spacing w:after="80" w:line="276"/>
+        <w:jc w:val="both"/>
+      </w:pPr>
+      <w:r>
+        <w:t xml:space="preserve">il Cliente intende affidare a WST la gestione del versamento di tali documenti nel sistema di conservazione di Intesi Group, alle condizioni che seguono.</w:t>
       </w:r>
     </w:p>
     <w:p>
@@ -844,7 +858,7 @@
                 <w:sz w:val="19"/>
                 <w:szCs w:val="19"/>
               </w:rPr>
-              <w:t xml:space="preserve">Anagrafica</w:t>
+              <w:t xml:space="preserve">RENTRI</w:t>
             </w:r>
           </w:p>
         </w:tc>
@@ -869,7 +883,7 @@
                 <w:sz w:val="19"/>
                 <w:szCs w:val="19"/>
               </w:rPr>
-              <w:t xml:space="preserve">Ogni soggetto Titolare dei documenti (ragione sociale o partita IVA) censito nel Sistema di Conservazione.</w:t>
+              <w:t xml:space="preserve">Registro Elettronico Nazionale per la Tracciabilità dei Rifiuti, di cui all'art. 188-bis del D.Lgs. 152/2006 e al D.M. 59/2023.</w:t>
             </w:r>
           </w:p>
         </w:tc>
@@ -899,7 +913,7 @@
                 <w:sz w:val="19"/>
                 <w:szCs w:val="19"/>
               </w:rPr>
-              <w:t xml:space="preserve">Periodo di versamento</w:t>
+              <w:t xml:space="preserve">xFIR</w:t>
             </w:r>
           </w:p>
         </w:tc>
@@ -923,7 +937,7 @@
                 <w:sz w:val="19"/>
                 <w:szCs w:val="19"/>
               </w:rPr>
-              <w:t xml:space="preserve">Il periodo in cui il Cliente può versare nuovi documenti. Coincide con la durata del Contratto.</w:t>
+              <w:t xml:space="preserve">Formulario di identificazione dei rifiuti in formato digitale, secondo i modelli e le specifiche RENTRI.</w:t>
             </w:r>
           </w:p>
         </w:tc>
@@ -954,7 +968,7 @@
                 <w:sz w:val="19"/>
                 <w:szCs w:val="19"/>
               </w:rPr>
-              <w:t xml:space="preserve">Periodo di conservazione</w:t>
+              <w:t xml:space="preserve">Registro di carico e scarico</w:t>
             </w:r>
           </w:p>
         </w:tc>
@@ -979,7 +993,7 @@
                 <w:sz w:val="19"/>
                 <w:szCs w:val="19"/>
               </w:rPr>
-              <w:t xml:space="preserve">Il periodo, indicato nell'Allegato A per ogni tipologia documentale, in cui i documenti restano conservati. Può durare oltre il Contratto.</w:t>
+              <w:t xml:space="preserve">Registro cronologico di carico e scarico dei rifiuti di cui all'art. 190 del D.Lgs. 152/2006, tenuto in formato digitale secondo le specifiche RENTRI.</w:t>
             </w:r>
           </w:p>
         </w:tc>
@@ -1009,7 +1023,7 @@
                 <w:sz w:val="19"/>
                 <w:szCs w:val="19"/>
               </w:rPr>
-              <w:t xml:space="preserve">Anno solare di versamento</w:t>
+              <w:t xml:space="preserve">GB</w:t>
             </w:r>
           </w:p>
         </w:tc>
@@ -1033,7 +1047,7 @@
                 <w:sz w:val="19"/>
                 <w:szCs w:val="19"/>
               </w:rPr>
-              <w:t xml:space="preserve">Il periodo dal 1° gennaio al 31 dicembre in cui un documento è versato. Il Periodo di conservazione si calcola a partire dal 31 dicembre di quell'anno.</w:t>
+              <w:t xml:space="preserve">Gigabyte (1.000.000.000 byte) di documenti e metadati versati, come rilevato dal Sistema di Conservazione.</w:t>
             </w:r>
           </w:p>
         </w:tc>
@@ -1064,6 +1078,226 @@
                 <w:sz w:val="19"/>
                 <w:szCs w:val="19"/>
               </w:rPr>
+              <w:t xml:space="preserve">Anagrafica</w:t>
+            </w:r>
+          </w:p>
+        </w:tc>
+        <w:tc>
+          <w:tcPr>
+            <w:tcW w:type="dxa" w:w="6361"/>
+            <w:shd w:fill="EAF1F9" w:color="auto" w:val="clear"/>
+            <w:tcMar>
+              <w:top w:type="dxa" w:w="35"/>
+              <w:left w:type="dxa" w:w="100"/>
+              <w:bottom w:type="dxa" w:w="35"/>
+              <w:right w:type="dxa" w:w="100"/>
+            </w:tcMar>
+            <w:vAlign w:val="center"/>
+          </w:tcPr>
+          <w:p>
+            <w:pPr>
+              <w:spacing w:after="0" w:before="0"/>
+            </w:pPr>
+            <w:r>
+              <w:rPr>
+                <w:sz w:val="19"/>
+                <w:szCs w:val="19"/>
+              </w:rPr>
+              <w:t xml:space="preserve">Ogni soggetto Titolare dei documenti (ragione sociale o partita IVA) censito nel Sistema di Conservazione.</w:t>
+            </w:r>
+          </w:p>
+        </w:tc>
+      </w:tr>
+      <w:tr>
+        <w:trPr>
+          <w:cantSplit/>
+          <w:tblHeader w:val="false"/>
+        </w:trPr>
+        <w:tc>
+          <w:tcPr>
+            <w:tcW w:type="dxa" w:w="3277"/>
+            <w:tcMar>
+              <w:top w:type="dxa" w:w="35"/>
+              <w:left w:type="dxa" w:w="100"/>
+              <w:bottom w:type="dxa" w:w="35"/>
+              <w:right w:type="dxa" w:w="100"/>
+            </w:tcMar>
+            <w:vAlign w:val="center"/>
+          </w:tcPr>
+          <w:p>
+            <w:pPr>
+              <w:spacing w:after="0" w:before="0"/>
+            </w:pPr>
+            <w:r>
+              <w:rPr>
+                <w:sz w:val="19"/>
+                <w:szCs w:val="19"/>
+              </w:rPr>
+              <w:t xml:space="preserve">Periodo di versamento</w:t>
+            </w:r>
+          </w:p>
+        </w:tc>
+        <w:tc>
+          <w:tcPr>
+            <w:tcW w:type="dxa" w:w="6361"/>
+            <w:tcMar>
+              <w:top w:type="dxa" w:w="35"/>
+              <w:left w:type="dxa" w:w="100"/>
+              <w:bottom w:type="dxa" w:w="35"/>
+              <w:right w:type="dxa" w:w="100"/>
+            </w:tcMar>
+            <w:vAlign w:val="center"/>
+          </w:tcPr>
+          <w:p>
+            <w:pPr>
+              <w:spacing w:after="0" w:before="0"/>
+            </w:pPr>
+            <w:r>
+              <w:rPr>
+                <w:sz w:val="19"/>
+                <w:szCs w:val="19"/>
+              </w:rPr>
+              <w:t xml:space="preserve">Il periodo in cui il Cliente può versare nuovi documenti. Coincide con la durata del Contratto.</w:t>
+            </w:r>
+          </w:p>
+        </w:tc>
+      </w:tr>
+      <w:tr>
+        <w:trPr>
+          <w:cantSplit/>
+          <w:tblHeader w:val="false"/>
+        </w:trPr>
+        <w:tc>
+          <w:tcPr>
+            <w:tcW w:type="dxa" w:w="3277"/>
+            <w:shd w:fill="EAF1F9" w:color="auto" w:val="clear"/>
+            <w:tcMar>
+              <w:top w:type="dxa" w:w="35"/>
+              <w:left w:type="dxa" w:w="100"/>
+              <w:bottom w:type="dxa" w:w="35"/>
+              <w:right w:type="dxa" w:w="100"/>
+            </w:tcMar>
+            <w:vAlign w:val="center"/>
+          </w:tcPr>
+          <w:p>
+            <w:pPr>
+              <w:spacing w:after="0" w:before="0"/>
+            </w:pPr>
+            <w:r>
+              <w:rPr>
+                <w:sz w:val="19"/>
+                <w:szCs w:val="19"/>
+              </w:rPr>
+              <w:t xml:space="preserve">Periodo di conservazione</w:t>
+            </w:r>
+          </w:p>
+        </w:tc>
+        <w:tc>
+          <w:tcPr>
+            <w:tcW w:type="dxa" w:w="6361"/>
+            <w:shd w:fill="EAF1F9" w:color="auto" w:val="clear"/>
+            <w:tcMar>
+              <w:top w:type="dxa" w:w="35"/>
+              <w:left w:type="dxa" w:w="100"/>
+              <w:bottom w:type="dxa" w:w="35"/>
+              <w:right w:type="dxa" w:w="100"/>
+            </w:tcMar>
+            <w:vAlign w:val="center"/>
+          </w:tcPr>
+          <w:p>
+            <w:pPr>
+              <w:spacing w:after="0" w:before="0"/>
+            </w:pPr>
+            <w:r>
+              <w:rPr>
+                <w:sz w:val="19"/>
+                <w:szCs w:val="19"/>
+              </w:rPr>
+              <w:t xml:space="preserve">Il periodo in cui i documenti restano conservati: 3 anni, salvo diversa indicazione nell'Allegato A. Può durare oltre il Contratto.</w:t>
+            </w:r>
+          </w:p>
+        </w:tc>
+      </w:tr>
+      <w:tr>
+        <w:trPr>
+          <w:cantSplit/>
+          <w:tblHeader w:val="false"/>
+        </w:trPr>
+        <w:tc>
+          <w:tcPr>
+            <w:tcW w:type="dxa" w:w="3277"/>
+            <w:tcMar>
+              <w:top w:type="dxa" w:w="35"/>
+              <w:left w:type="dxa" w:w="100"/>
+              <w:bottom w:type="dxa" w:w="35"/>
+              <w:right w:type="dxa" w:w="100"/>
+            </w:tcMar>
+            <w:vAlign w:val="center"/>
+          </w:tcPr>
+          <w:p>
+            <w:pPr>
+              <w:spacing w:after="0" w:before="0"/>
+            </w:pPr>
+            <w:r>
+              <w:rPr>
+                <w:sz w:val="19"/>
+                <w:szCs w:val="19"/>
+              </w:rPr>
+              <w:t xml:space="preserve">Anno solare di versamento</w:t>
+            </w:r>
+          </w:p>
+        </w:tc>
+        <w:tc>
+          <w:tcPr>
+            <w:tcW w:type="dxa" w:w="6361"/>
+            <w:tcMar>
+              <w:top w:type="dxa" w:w="35"/>
+              <w:left w:type="dxa" w:w="100"/>
+              <w:bottom w:type="dxa" w:w="35"/>
+              <w:right w:type="dxa" w:w="100"/>
+            </w:tcMar>
+            <w:vAlign w:val="center"/>
+          </w:tcPr>
+          <w:p>
+            <w:pPr>
+              <w:spacing w:after="0" w:before="0"/>
+            </w:pPr>
+            <w:r>
+              <w:rPr>
+                <w:sz w:val="19"/>
+                <w:szCs w:val="19"/>
+              </w:rPr>
+              <w:t xml:space="preserve">Il periodo dal 1° gennaio al 31 dicembre in cui un documento è versato. Il Periodo di conservazione si calcola a partire dal 31 dicembre di quell'anno.</w:t>
+            </w:r>
+          </w:p>
+        </w:tc>
+      </w:tr>
+      <w:tr>
+        <w:trPr>
+          <w:cantSplit/>
+          <w:tblHeader w:val="false"/>
+        </w:trPr>
+        <w:tc>
+          <w:tcPr>
+            <w:tcW w:type="dxa" w:w="3277"/>
+            <w:shd w:fill="EAF1F9" w:color="auto" w:val="clear"/>
+            <w:tcMar>
+              <w:top w:type="dxa" w:w="35"/>
+              <w:left w:type="dxa" w:w="100"/>
+              <w:bottom w:type="dxa" w:w="35"/>
+              <w:right w:type="dxa" w:w="100"/>
+            </w:tcMar>
+            <w:vAlign w:val="center"/>
+          </w:tcPr>
+          <w:p>
+            <w:pPr>
+              <w:spacing w:after="0" w:before="0"/>
+            </w:pPr>
+            <w:r>
+              <w:rPr>
+                <w:sz w:val="19"/>
+                <w:szCs w:val="19"/>
+              </w:rPr>
               <w:t xml:space="preserve">Manuale</w:t>
             </w:r>
           </w:p>
@@ -1133,7 +1367,7 @@
         <w:t xml:space="preserve">2.1  </w:t>
       </w:r>
       <w:r>
-        <w:t xml:space="preserve">WST fornisce al Cliente il servizio di conservazione digitale a norma dei documenti informatici indicati nell'Allegato A (il "</w:t>
+        <w:t xml:space="preserve">WST fornisce al Cliente il servizio di conservazione digitale a norma dei formulari xFIR e dei registri cronologici di carico e scarico RENTRI del Cliente, come dettagliati nell'Allegato A (il "</w:t>
       </w:r>
       <w:r>
         <w:rPr>
@@ -1143,7 +1377,7 @@
         <w:t xml:space="preserve">Servizio</w:t>
       </w:r>
       <w:r>
-        <w:t xml:space="preserve">"). Il Servizio comprende:</w:t>
+        <w:t xml:space="preserve">"), per un Periodo di conservazione di 3 anni. Il Servizio comprende:</w:t>
       </w:r>
     </w:p>
     <w:p>
@@ -1378,7 +1612,7 @@
         <w:jc w:val="both"/>
       </w:pPr>
       <w:r>
-        <w:t xml:space="preserve">indicare per ogni tipologia documentale un Periodo di conservazione non inferiore a quello previsto dalla legge. La scelta del periodo resta di sua esclusiva responsabilità;</w:t>
+        <w:t xml:space="preserve">verificare che il Periodo di conservazione di 3 anni sia sufficiente per la propria attività e chiedere per iscritto un periodo più lungo quando la legge lo impone (ad esempio per gli impianti di discarica o in caso di contenzioso). La verifica resta di sua esclusiva responsabilità;</w:t>
       </w:r>
     </w:p>
     <w:p>
@@ -1545,7 +1779,7 @@
         <w:jc w:val="both"/>
       </w:pPr>
       <w:r>
-        <w:t xml:space="preserve">attivare il Servizio entro [●] giorni lavorativi dalla firma del Contratto e dalla consegna dell'Allegato A compilato;</w:t>
+        <w:t xml:space="preserve">attivare il Servizio entro 10 giorni lavorativi dalla firma del Contratto e dalla consegna dell'Allegato A compilato;</w:t>
       </w:r>
     </w:p>
     <w:p>
@@ -1559,7 +1793,7 @@
         <w:jc w:val="both"/>
       </w:pPr>
       <w:r>
-        <w:t xml:space="preserve">versare i documenti ricevuti dal Cliente entro [●] giorni lavorativi, con la periodicità indicata nell'Allegato A;</w:t>
+        <w:t xml:space="preserve">versare i documenti ricevuti dal Cliente entro 5 giorni lavorativi, con la periodicità indicata nell'Allegato A;</w:t>
       </w:r>
     </w:p>
     <w:p>
@@ -1665,7 +1899,7 @@
         <w:t xml:space="preserve">5.1  </w:t>
       </w:r>
       <w:r>
-        <w:t xml:space="preserve">Il Contratto decorre dalla data di firma e scade il 31 dicembre [● anno].</w:t>
+        <w:t xml:space="preserve">Il Contratto decorre dalla data di firma e scade il 31 dicembre 2027.</w:t>
       </w:r>
     </w:p>
     <w:p>
@@ -1848,7 +2082,7 @@
         <w:t xml:space="preserve">6.2  </w:t>
       </w:r>
       <w:r>
-        <w:t xml:space="preserve">Il canone di conservazione è calcolato sui GB versati in ciascun anno solare, arrotondati per eccesso al GB intero. Copre l'intero Periodo di conservazione dei documenti versati in quell'anno, anche dopo la cessazione del Contratto.</w:t>
+        <w:t xml:space="preserve">Tutti i corrispettivi variabili sono calcolati sullo spazio occupato e non sul numero di documenti. Il canone di conservazione si applica ai GB versati in ciascun anno solare, arrotondati per eccesso al GB intero, con un minimo fatturabile di 1 GB per anno. Il canone copre l'intero Periodo di conservazione di 3 anni dei documenti versati in quell'anno, anche dopo la cessazione del Contratto.</w:t>
       </w:r>
     </w:p>
     <w:p>
@@ -2026,7 +2260,7 @@
                 <w:sz w:val="19"/>
                 <w:szCs w:val="19"/>
               </w:rPr>
-              <w:t xml:space="preserve">Canone di conservazione</w:t>
+              <w:t xml:space="preserve">Canone annuo di servizio</w:t>
             </w:r>
           </w:p>
         </w:tc>
@@ -2051,7 +2285,7 @@
                 <w:sz w:val="19"/>
                 <w:szCs w:val="19"/>
               </w:rPr>
-              <w:t xml:space="preserve">Anticipato, sui GB stimati nell'Allegato A; conguaglio a fine anno sui GB effettivi</w:t>
+              <w:t xml:space="preserve">Anticipato, a inizio di ogni anno solare (primo anno: alla firma, per intero)</w:t>
             </w:r>
           </w:p>
         </w:tc>
@@ -2081,7 +2315,7 @@
                 <w:sz w:val="19"/>
                 <w:szCs w:val="19"/>
               </w:rPr>
-              <w:t xml:space="preserve">Canone anagrafica</w:t>
+              <w:t xml:space="preserve">Canone di conservazione</w:t>
             </w:r>
           </w:p>
         </w:tc>
@@ -2105,7 +2339,7 @@
                 <w:sz w:val="19"/>
                 <w:szCs w:val="19"/>
               </w:rPr>
-              <w:t xml:space="preserve">Anticipato, a inizio di ogni anno solare (primo anno: alla firma)</w:t>
+              <w:t xml:space="preserve">Anticipato, sui GB stimati nell'Allegato A (minimo 1 GB); eccedenze a fine mese</w:t>
             </w:r>
           </w:p>
         </w:tc>
@@ -2240,7 +2474,7 @@
         <w:t xml:space="preserve">6.4  </w:t>
       </w:r>
       <w:r>
-        <w:t xml:space="preserve">Il pagamento avviene tramite bonifico bancario entro [●] giorni dalla data della fattura. In caso di ritardo si applicano gli interessi di mora previsti dal D.Lgs. 231/2002. Dopo 15 giorni di ritardo, e previo sollecito via PEC, WST può sospendere i nuovi versamenti. La consultazione dei documenti già conservati non viene mai sospesa.</w:t>
+        <w:t xml:space="preserve">Il pagamento avviene tramite bonifico bancario entro 10 giorni dalla data della fattura. In caso di ritardo si applicano gli interessi di mora previsti dal D.Lgs. 231/2002. Dopo 15 giorni di ritardo, e previo sollecito via PEC, WST può sospendere i nuovi versamenti. La consultazione dei documenti già conservati non viene mai sospesa.</w:t>
       </w:r>
     </w:p>
     <w:p>
@@ -2257,7 +2491,7 @@
         <w:t xml:space="preserve">6.5  </w:t>
       </w:r>
       <w:r>
-        <w:t xml:space="preserve">I prezzi restano fissi fino al 31 dicembre [● anno]. In seguito WST può aggiornarli comunicandolo via PEC almeno 120 giorni prima della scadenza annuale. Il Cliente che non accetta può dare disdetta entro la scadenza, senza costi.</w:t>
+        <w:t xml:space="preserve">I prezzi restano fissi fino al 31 dicembre 2027. In seguito WST può aggiornarli comunicandolo via PEC almeno 120 giorni prima della scadenza annuale. Il Cliente che non accetta può dare disdetta entro la scadenza, senza costi.</w:t>
       </w:r>
     </w:p>
     <w:p>
@@ -2291,7 +2525,7 @@
         <w:t xml:space="preserve">6.7  </w:t>
       </w:r>
       <w:r>
-        <w:t xml:space="preserve">Il canone di conservazione e il canone anagrafica non sono rimborsabili, neppure in caso di cessazione anticipata del Contratto o di cancellazione anticipata dei documenti.</w:t>
+        <w:t xml:space="preserve">Il canone di conservazione, il canone annuo di servizio e l'attivazione non sono rimborsabili, neppure in caso di cessazione anticipata del Contratto o di cancellazione anticipata dei documenti.</w:t>
       </w:r>
     </w:p>
     <w:p>
@@ -2344,7 +2578,7 @@
         <w:t xml:space="preserve">7.1  </w:t>
       </w:r>
       <w:r>
-        <w:t xml:space="preserve">Ogni documento è conservato fino al 31 dicembre dell'ultimo anno del Periodo di conservazione, calcolato dall'anno solare di versamento. Esempio: un documento versato a marzo 2027 con periodo di 10 anni è conservato fino al 31 dicembre 2037.</w:t>
+        <w:t xml:space="preserve">Ogni documento è conservato fino al 31 dicembre dell'ultimo anno del Periodo di conservazione, calcolato dall'anno solare di versamento. Esempio: un xFIR versato a marzo 2027 è conservato fino al 31 dicembre 2030.</w:t>
       </w:r>
     </w:p>
     <w:p>
@@ -2368,7 +2602,7 @@
         <w:t xml:space="preserve">Scarto.</w:t>
       </w:r>
       <w:r>
-        <w:t xml:space="preserve"> Al termine del Periodo di conservazione il Conservatore elimina i relativi PdA, senza costi per il Cliente. Il Cliente può chiedere per iscritto, almeno 90 giorni prima, di prolungare la conservazione. Il prolungamento è fatturato al prezzo del canone in vigore.</w:t>
+        <w:t xml:space="preserve"> Al termine del Periodo di conservazione il Conservatore elimina i relativi PdA, senza costi per il Cliente. Il Cliente può chiedere per iscritto, almeno 90 giorni prima, di prolungare la conservazione. Il prolungamento è fatturato, per ogni ulteriore triennio, al canone di conservazione per GB in vigore.</w:t>
       </w:r>
     </w:p>
     <w:p>
@@ -2426,7 +2660,7 @@
         <w:t xml:space="preserve">7.5  </w:t>
       </w:r>
       <w:r>
-        <w:t xml:space="preserve">La cancellazione è irreversibile ed è fatturata per ogni richiesta, in base al numero di documenti, secondo l'Allegato B. Il canone di conservazione già pagato per i documenti cancellati non viene rimborsato.</w:t>
+        <w:t xml:space="preserve">La cancellazione è irreversibile ed è fatturata per ogni richiesta, in base ai GB da cancellare, secondo l'Allegato B. Il canone di conservazione già pagato per i documenti cancellati non viene rimborsato.</w:t>
       </w:r>
     </w:p>
     <w:p>
@@ -4242,13 +4476,9 @@
       </w:tr>
     </w:tbl>
     <w:p>
-      <w:r>
-        <w:br w:type="page"/>
-      </w:r>
-    </w:p>
-    <w:p>
       <w:pPr>
         <w:keepNext/>
+        <w:pageBreakBefore/>
         <w:pBdr>
           <w:bottom w:val="single" w:color="6599CD" w:sz="6" w:space="2"/>
         </w:pBdr>
@@ -4779,7 +5009,7 @@
         <w:jc w:val="both"/>
       </w:pPr>
       <w:r>
-        <w:t xml:space="preserve">Il Periodo di conservazione concordato non può essere inferiore a quello previsto dalla legge.</w:t>
+        <w:t xml:space="preserve">Il Periodo di conservazione è di 3 anni dall'anno solare di versamento. Un periodo più lungo va indicato qui e si paga secondo l'art. 7.2.</w:t>
       </w:r>
     </w:p>
     <w:tbl>
@@ -4943,7 +5173,7 @@
                 <w:sz w:val="19"/>
                 <w:szCs w:val="19"/>
               </w:rPr>
-              <w:t xml:space="preserve">Fatture elettroniche attive</w:t>
+              <w:t xml:space="preserve">xFIR – Formulari di identificazione dei rifiuti digitali</w:t>
             </w:r>
           </w:p>
         </w:tc>
@@ -4967,7 +5197,7 @@
                 <w:sz w:val="19"/>
                 <w:szCs w:val="19"/>
               </w:rPr>
-              <w:t xml:space="preserve">xml, p7m</w:t>
+              <w:t xml:space="preserve">xml, pdf, p7m</w:t>
             </w:r>
           </w:p>
         </w:tc>
@@ -4986,6 +5216,13 @@
             <w:pPr>
               <w:spacing w:after="0" w:before="0"/>
             </w:pPr>
+            <w:r>
+              <w:rPr>
+                <w:sz w:val="19"/>
+                <w:szCs w:val="19"/>
+              </w:rPr>
+              <w:t xml:space="preserve">3</w:t>
+            </w:r>
           </w:p>
         </w:tc>
         <w:tc>
@@ -5003,6 +5240,13 @@
             <w:pPr>
               <w:spacing w:after="0" w:before="0"/>
             </w:pPr>
+            <w:r>
+              <w:rPr>
+                <w:sz w:val="19"/>
+                <w:szCs w:val="19"/>
+              </w:rPr>
+              <w:t xml:space="preserve">3 (art. 193 D.Lgs. 152/2006)</w:t>
+            </w:r>
           </w:p>
         </w:tc>
       </w:tr>
@@ -5032,7 +5276,7 @@
                 <w:sz w:val="19"/>
                 <w:szCs w:val="19"/>
               </w:rPr>
-              <w:t xml:space="preserve">Fatture elettroniche passive</w:t>
+              <w:t xml:space="preserve">Registro cronologico di carico e scarico (RENTRI)</w:t>
             </w:r>
           </w:p>
         </w:tc>
@@ -5057,7 +5301,7 @@
                 <w:sz w:val="19"/>
                 <w:szCs w:val="19"/>
               </w:rPr>
-              <w:t xml:space="preserve">xml, p7m</w:t>
+              <w:t xml:space="preserve">xml, pdf, p7m</w:t>
             </w:r>
           </w:p>
         </w:tc>
@@ -5077,6 +5321,13 @@
             <w:pPr>
               <w:spacing w:after="0" w:before="0"/>
             </w:pPr>
+            <w:r>
+              <w:rPr>
+                <w:sz w:val="19"/>
+                <w:szCs w:val="19"/>
+              </w:rPr>
+              <w:t xml:space="preserve">3</w:t>
+            </w:r>
           </w:p>
         </w:tc>
         <w:tc>
@@ -5095,6 +5346,13 @@
             <w:pPr>
               <w:spacing w:after="0" w:before="0"/>
             </w:pPr>
+            <w:r>
+              <w:rPr>
+                <w:sz w:val="19"/>
+                <w:szCs w:val="19"/>
+              </w:rPr>
+              <w:t xml:space="preserve">3 dall'ultima registrazione (art. 190 D.Lgs. 152/2006)</w:t>
+            </w:r>
           </w:p>
         </w:tc>
       </w:tr>
@@ -5123,7 +5381,7 @@
                 <w:sz w:val="19"/>
                 <w:szCs w:val="19"/>
               </w:rPr>
-              <w:t xml:space="preserve">Libri e registri fiscali</w:t>
+              <w:t xml:space="preserve">Allegati a xFIR (documenti di trasporto, analisi, ricevute RENTRI)</w:t>
             </w:r>
           </w:p>
         </w:tc>
@@ -5147,7 +5405,7 @@
                 <w:sz w:val="19"/>
                 <w:szCs w:val="19"/>
               </w:rPr>
-              <w:t xml:space="preserve">pdf, p7m</w:t>
+              <w:t xml:space="preserve">pdf, xml, p7m</w:t>
             </w:r>
           </w:p>
         </w:tc>
@@ -5166,6 +5424,13 @@
             <w:pPr>
               <w:spacing w:after="0" w:before="0"/>
             </w:pPr>
+            <w:r>
+              <w:rPr>
+                <w:sz w:val="19"/>
+                <w:szCs w:val="19"/>
+              </w:rPr>
+              <w:t xml:space="preserve">3</w:t>
+            </w:r>
           </w:p>
         </w:tc>
         <w:tc>
@@ -5183,271 +5448,13 @@
             <w:pPr>
               <w:spacing w:after="0" w:before="0"/>
             </w:pPr>
-          </w:p>
-        </w:tc>
-      </w:tr>
-      <w:tr>
-        <w:trPr>
-          <w:cantSplit/>
-          <w:tblHeader w:val="false"/>
-        </w:trPr>
-        <w:tc>
-          <w:tcPr>
-            <w:tcW w:type="dxa" w:w="2400"/>
-            <w:shd w:fill="EAF1F9" w:color="auto" w:val="clear"/>
-            <w:tcMar>
-              <w:top w:type="dxa" w:w="35"/>
-              <w:left w:type="dxa" w:w="100"/>
-              <w:bottom w:type="dxa" w:w="35"/>
-              <w:right w:type="dxa" w:w="100"/>
-            </w:tcMar>
-            <w:vAlign w:val="center"/>
-          </w:tcPr>
-          <w:p>
-            <w:pPr>
-              <w:spacing w:after="0" w:before="0"/>
-            </w:pPr>
-            <w:r>
-              <w:rPr>
-                <w:sz w:val="19"/>
-                <w:szCs w:val="19"/>
-              </w:rPr>
-              <w:t xml:space="preserve">Contratti / Ordini</w:t>
-            </w:r>
-          </w:p>
-        </w:tc>
-        <w:tc>
-          <w:tcPr>
-            <w:tcW w:type="dxa" w:w="3638"/>
-            <w:shd w:fill="EAF1F9" w:color="auto" w:val="clear"/>
-            <w:tcMar>
-              <w:top w:type="dxa" w:w="35"/>
-              <w:left w:type="dxa" w:w="100"/>
-              <w:bottom w:type="dxa" w:w="35"/>
-              <w:right w:type="dxa" w:w="100"/>
-            </w:tcMar>
-            <w:vAlign w:val="center"/>
-          </w:tcPr>
-          <w:p>
-            <w:pPr>
-              <w:spacing w:after="0" w:before="0"/>
-            </w:pPr>
-            <w:r>
-              <w:rPr>
-                <w:sz w:val="19"/>
-                <w:szCs w:val="19"/>
-              </w:rPr>
-              <w:t xml:space="preserve">pdf, p7m</w:t>
-            </w:r>
-          </w:p>
-        </w:tc>
-        <w:tc>
-          <w:tcPr>
-            <w:tcW w:type="dxa" w:w="1800"/>
-            <w:shd w:fill="EAF1F9" w:color="auto" w:val="clear"/>
-            <w:tcMar>
-              <w:top w:type="dxa" w:w="35"/>
-              <w:left w:type="dxa" w:w="100"/>
-              <w:bottom w:type="dxa" w:w="35"/>
-              <w:right w:type="dxa" w:w="100"/>
-            </w:tcMar>
-            <w:vAlign w:val="center"/>
-          </w:tcPr>
-          <w:p>
-            <w:pPr>
-              <w:spacing w:after="0" w:before="0"/>
-            </w:pPr>
-          </w:p>
-        </w:tc>
-        <w:tc>
-          <w:tcPr>
-            <w:tcW w:type="dxa" w:w="1800"/>
-            <w:shd w:fill="EAF1F9" w:color="auto" w:val="clear"/>
-            <w:tcMar>
-              <w:top w:type="dxa" w:w="35"/>
-              <w:left w:type="dxa" w:w="100"/>
-              <w:bottom w:type="dxa" w:w="35"/>
-              <w:right w:type="dxa" w:w="100"/>
-            </w:tcMar>
-            <w:vAlign w:val="center"/>
-          </w:tcPr>
-          <w:p>
-            <w:pPr>
-              <w:spacing w:after="0" w:before="0"/>
-            </w:pPr>
-          </w:p>
-        </w:tc>
-      </w:tr>
-      <w:tr>
-        <w:trPr>
-          <w:cantSplit/>
-          <w:tblHeader w:val="false"/>
-        </w:trPr>
-        <w:tc>
-          <w:tcPr>
-            <w:tcW w:type="dxa" w:w="2400"/>
-            <w:tcMar>
-              <w:top w:type="dxa" w:w="35"/>
-              <w:left w:type="dxa" w:w="100"/>
-              <w:bottom w:type="dxa" w:w="35"/>
-              <w:right w:type="dxa" w:w="100"/>
-            </w:tcMar>
-            <w:vAlign w:val="center"/>
-          </w:tcPr>
-          <w:p>
-            <w:pPr>
-              <w:spacing w:after="0" w:before="0"/>
-            </w:pPr>
-            <w:r>
-              <w:rPr>
-                <w:sz w:val="19"/>
-                <w:szCs w:val="19"/>
-              </w:rPr>
-              <w:t xml:space="preserve">Libro Unico del Lavoro / Cedolini</w:t>
-            </w:r>
-          </w:p>
-        </w:tc>
-        <w:tc>
-          <w:tcPr>
-            <w:tcW w:type="dxa" w:w="3638"/>
-            <w:tcMar>
-              <w:top w:type="dxa" w:w="35"/>
-              <w:left w:type="dxa" w:w="100"/>
-              <w:bottom w:type="dxa" w:w="35"/>
-              <w:right w:type="dxa" w:w="100"/>
-            </w:tcMar>
-            <w:vAlign w:val="center"/>
-          </w:tcPr>
-          <w:p>
-            <w:pPr>
-              <w:spacing w:after="0" w:before="0"/>
-            </w:pPr>
-            <w:r>
-              <w:rPr>
-                <w:sz w:val="19"/>
-                <w:szCs w:val="19"/>
-              </w:rPr>
-              <w:t xml:space="preserve">pdf, p7m</w:t>
-            </w:r>
-          </w:p>
-        </w:tc>
-        <w:tc>
-          <w:tcPr>
-            <w:tcW w:type="dxa" w:w="1800"/>
-            <w:tcMar>
-              <w:top w:type="dxa" w:w="35"/>
-              <w:left w:type="dxa" w:w="100"/>
-              <w:bottom w:type="dxa" w:w="35"/>
-              <w:right w:type="dxa" w:w="100"/>
-            </w:tcMar>
-            <w:vAlign w:val="center"/>
-          </w:tcPr>
-          <w:p>
-            <w:pPr>
-              <w:spacing w:after="0" w:before="0"/>
-            </w:pPr>
-          </w:p>
-        </w:tc>
-        <w:tc>
-          <w:tcPr>
-            <w:tcW w:type="dxa" w:w="1800"/>
-            <w:tcMar>
-              <w:top w:type="dxa" w:w="35"/>
-              <w:left w:type="dxa" w:w="100"/>
-              <w:bottom w:type="dxa" w:w="35"/>
-              <w:right w:type="dxa" w:w="100"/>
-            </w:tcMar>
-            <w:vAlign w:val="center"/>
-          </w:tcPr>
-          <w:p>
-            <w:pPr>
-              <w:spacing w:after="0" w:before="0"/>
-            </w:pPr>
-          </w:p>
-        </w:tc>
-      </w:tr>
-      <w:tr>
-        <w:trPr>
-          <w:cantSplit/>
-          <w:tblHeader w:val="false"/>
-        </w:trPr>
-        <w:tc>
-          <w:tcPr>
-            <w:tcW w:type="dxa" w:w="2400"/>
-            <w:shd w:fill="EAF1F9" w:color="auto" w:val="clear"/>
-            <w:tcMar>
-              <w:top w:type="dxa" w:w="35"/>
-              <w:left w:type="dxa" w:w="100"/>
-              <w:bottom w:type="dxa" w:w="35"/>
-              <w:right w:type="dxa" w:w="100"/>
-            </w:tcMar>
-            <w:vAlign w:val="center"/>
-          </w:tcPr>
-          <w:p>
-            <w:pPr>
-              <w:spacing w:after="0" w:before="0"/>
-            </w:pPr>
-            <w:r>
-              <w:rPr>
-                <w:sz w:val="19"/>
-                <w:szCs w:val="19"/>
-              </w:rPr>
-              <w:t xml:space="preserve">[● altra tipologia]</w:t>
-            </w:r>
-          </w:p>
-        </w:tc>
-        <w:tc>
-          <w:tcPr>
-            <w:tcW w:type="dxa" w:w="3638"/>
-            <w:shd w:fill="EAF1F9" w:color="auto" w:val="clear"/>
-            <w:tcMar>
-              <w:top w:type="dxa" w:w="35"/>
-              <w:left w:type="dxa" w:w="100"/>
-              <w:bottom w:type="dxa" w:w="35"/>
-              <w:right w:type="dxa" w:w="100"/>
-            </w:tcMar>
-            <w:vAlign w:val="center"/>
-          </w:tcPr>
-          <w:p>
-            <w:pPr>
-              <w:spacing w:after="0" w:before="0"/>
-            </w:pPr>
-          </w:p>
-        </w:tc>
-        <w:tc>
-          <w:tcPr>
-            <w:tcW w:type="dxa" w:w="1800"/>
-            <w:shd w:fill="EAF1F9" w:color="auto" w:val="clear"/>
-            <w:tcMar>
-              <w:top w:type="dxa" w:w="35"/>
-              <w:left w:type="dxa" w:w="100"/>
-              <w:bottom w:type="dxa" w:w="35"/>
-              <w:right w:type="dxa" w:w="100"/>
-            </w:tcMar>
-            <w:vAlign w:val="center"/>
-          </w:tcPr>
-          <w:p>
-            <w:pPr>
-              <w:spacing w:after="0" w:before="0"/>
-            </w:pPr>
-          </w:p>
-        </w:tc>
-        <w:tc>
-          <w:tcPr>
-            <w:tcW w:type="dxa" w:w="1800"/>
-            <w:shd w:fill="EAF1F9" w:color="auto" w:val="clear"/>
-            <w:tcMar>
-              <w:top w:type="dxa" w:w="35"/>
-              <w:left w:type="dxa" w:w="100"/>
-              <w:bottom w:type="dxa" w:w="35"/>
-              <w:right w:type="dxa" w:w="100"/>
-            </w:tcMar>
-            <w:vAlign w:val="center"/>
-          </w:tcPr>
-          <w:p>
-            <w:pPr>
-              <w:spacing w:after="0" w:before="0"/>
-            </w:pPr>
+            <w:r>
+              <w:rPr>
+                <w:sz w:val="19"/>
+                <w:szCs w:val="19"/>
+              </w:rPr>
+              <w:t xml:space="preserve">3</w:t>
+            </w:r>
           </w:p>
         </w:tc>
       </w:tr>
@@ -5808,13 +5815,9 @@
       </w:tr>
     </w:tbl>
     <w:p>
-      <w:r>
-        <w:br w:type="page"/>
-      </w:r>
-    </w:p>
-    <w:p>
       <w:pPr>
         <w:keepNext/>
+        <w:pageBreakBefore/>
         <w:pBdr>
           <w:bottom w:val="single" w:color="6599CD" w:sz="6" w:space="2"/>
         </w:pBdr>
@@ -5839,7 +5842,7 @@
         <w:jc w:val="both"/>
       </w:pPr>
       <w:r>
-        <w:t xml:space="preserve">Prezzi IVA esclusa, validi fino al 31 dicembre [● anno].</w:t>
+        <w:t xml:space="preserve">Prezzi IVA esclusa, validi fino al 31 dicembre 2027. Tutti i corrispettivi variabili sono calcolati sullo spazio (GB), mai sul numero di documenti.</w:t>
       </w:r>
     </w:p>
     <w:tbl>
@@ -5974,7 +5977,7 @@
                 <w:sz w:val="19"/>
                 <w:szCs w:val="19"/>
               </w:rPr>
-              <w:t xml:space="preserve">Attivazione del Servizio (anagrafica, utenze, configurazione)</w:t>
+              <w:t xml:space="preserve">Attivazione del Servizio (anagrafica, configurazione, 2 utenze, 2 ore di supporto all'avvio)</w:t>
             </w:r>
           </w:p>
         </w:tc>
@@ -6022,7 +6025,7 @@
                 <w:sz w:val="19"/>
                 <w:szCs w:val="19"/>
               </w:rPr>
-              <w:t xml:space="preserve">[●]</w:t>
+              <w:t xml:space="preserve">390,00</w:t>
             </w:r>
           </w:p>
         </w:tc>
@@ -6053,7 +6056,7 @@
                 <w:sz w:val="19"/>
                 <w:szCs w:val="19"/>
               </w:rPr>
-              <w:t xml:space="preserve">Canone di conservazione fino a 10 GB</w:t>
+              <w:t xml:space="preserve">Canone annuo di servizio (anagrafica, portale di esibizione, assistenza, ricevute)</w:t>
             </w:r>
           </w:p>
         </w:tc>
@@ -6078,7 +6081,7 @@
                 <w:sz w:val="19"/>
                 <w:szCs w:val="19"/>
               </w:rPr>
-              <w:t xml:space="preserve">per GB versato, copre il Periodo di conservazione</w:t>
+              <w:t xml:space="preserve">per anno solare</w:t>
             </w:r>
           </w:p>
         </w:tc>
@@ -6103,7 +6106,7 @@
                 <w:sz w:val="19"/>
                 <w:szCs w:val="19"/>
               </w:rPr>
-              <w:t xml:space="preserve">[●]</w:t>
+              <w:t xml:space="preserve">180,00</w:t>
             </w:r>
           </w:p>
         </w:tc>
@@ -6133,7 +6136,7 @@
                 <w:sz w:val="19"/>
                 <w:szCs w:val="19"/>
               </w:rPr>
-              <w:t xml:space="preserve">Canone di conservazione da 11 a 100 GB</w:t>
+              <w:t xml:space="preserve">Canone di conservazione triennale – 1° GB (minimo fatturabile)</w:t>
             </w:r>
           </w:p>
         </w:tc>
@@ -6157,7 +6160,7 @@
                 <w:sz w:val="19"/>
                 <w:szCs w:val="19"/>
               </w:rPr>
-              <w:t xml:space="preserve">per GB versato</w:t>
+              <w:t xml:space="preserve">per anno solare</w:t>
             </w:r>
           </w:p>
         </w:tc>
@@ -6181,7 +6184,7 @@
                 <w:sz w:val="19"/>
                 <w:szCs w:val="19"/>
               </w:rPr>
-              <w:t xml:space="preserve">[●]</w:t>
+              <w:t xml:space="preserve">390,00</w:t>
             </w:r>
           </w:p>
         </w:tc>
@@ -6212,7 +6215,7 @@
                 <w:sz w:val="19"/>
                 <w:szCs w:val="19"/>
               </w:rPr>
-              <w:t xml:space="preserve">Canone di conservazione oltre 100 GB</w:t>
+              <w:t xml:space="preserve">Canone di conservazione triennale – dal 2° al 10° GB</w:t>
             </w:r>
           </w:p>
         </w:tc>
@@ -6262,7 +6265,7 @@
                 <w:sz w:val="19"/>
                 <w:szCs w:val="19"/>
               </w:rPr>
-              <w:t xml:space="preserve">[●]</w:t>
+              <w:t xml:space="preserve">290,00</w:t>
             </w:r>
           </w:p>
         </w:tc>
@@ -6292,7 +6295,7 @@
                 <w:sz w:val="19"/>
                 <w:szCs w:val="19"/>
               </w:rPr>
-              <w:t xml:space="preserve">Canone anagrafica</w:t>
+              <w:t xml:space="preserve">Canone di conservazione triennale – dall'11° al 100° GB</w:t>
             </w:r>
           </w:p>
         </w:tc>
@@ -6316,7 +6319,7 @@
                 <w:sz w:val="19"/>
                 <w:szCs w:val="19"/>
               </w:rPr>
-              <w:t xml:space="preserve">per anno solare</w:t>
+              <w:t xml:space="preserve">per GB versato</w:t>
             </w:r>
           </w:p>
         </w:tc>
@@ -6340,7 +6343,7 @@
                 <w:sz w:val="19"/>
                 <w:szCs w:val="19"/>
               </w:rPr>
-              <w:t xml:space="preserve">[●]</w:t>
+              <w:t xml:space="preserve">220,00</w:t>
             </w:r>
           </w:p>
         </w:tc>
@@ -6371,7 +6374,7 @@
                 <w:sz w:val="19"/>
                 <w:szCs w:val="19"/>
               </w:rPr>
-              <w:t xml:space="preserve">Cancellazione anticipata fino a 1.000 documenti</w:t>
+              <w:t xml:space="preserve">Canone di conservazione triennale – oltre 100 GB</w:t>
             </w:r>
           </w:p>
         </w:tc>
@@ -6396,7 +6399,7 @@
                 <w:sz w:val="19"/>
                 <w:szCs w:val="19"/>
               </w:rPr>
-              <w:t xml:space="preserve">per richiesta</w:t>
+              <w:t xml:space="preserve">per GB versato</w:t>
             </w:r>
           </w:p>
         </w:tc>
@@ -6421,7 +6424,7 @@
                 <w:sz w:val="19"/>
                 <w:szCs w:val="19"/>
               </w:rPr>
-              <w:t xml:space="preserve">[●]</w:t>
+              <w:t xml:space="preserve">160,00</w:t>
             </w:r>
           </w:p>
         </w:tc>
@@ -6451,7 +6454,7 @@
                 <w:sz w:val="19"/>
                 <w:szCs w:val="19"/>
               </w:rPr>
-              <w:t xml:space="preserve">Cancellazione anticipata fino a 10.000 documenti</w:t>
+              <w:t xml:space="preserve">Prolungamento della conservazione, per ogni ulteriore triennio</w:t>
             </w:r>
           </w:p>
         </w:tc>
@@ -6475,7 +6478,7 @@
                 <w:sz w:val="19"/>
                 <w:szCs w:val="19"/>
               </w:rPr>
-              <w:t xml:space="preserve">per richiesta</w:t>
+              <w:t xml:space="preserve">per GB conservato</w:t>
             </w:r>
           </w:p>
         </w:tc>
@@ -6499,7 +6502,7 @@
                 <w:sz w:val="19"/>
                 <w:szCs w:val="19"/>
               </w:rPr>
-              <w:t xml:space="preserve">[●]</w:t>
+              <w:t xml:space="preserve">come canone di conservazione</w:t>
             </w:r>
           </w:p>
         </w:tc>
@@ -6530,7 +6533,7 @@
                 <w:sz w:val="19"/>
                 <w:szCs w:val="19"/>
               </w:rPr>
-              <w:t xml:space="preserve">Cancellazione anticipata fino a 100.000 documenti</w:t>
+              <w:t xml:space="preserve">Cancellazione anticipata – fino a 1 GB</w:t>
             </w:r>
           </w:p>
         </w:tc>
@@ -6580,7 +6583,7 @@
                 <w:sz w:val="19"/>
                 <w:szCs w:val="19"/>
               </w:rPr>
-              <w:t xml:space="preserve">[●]</w:t>
+              <w:t xml:space="preserve">990,00</w:t>
             </w:r>
           </w:p>
         </w:tc>
@@ -6610,7 +6613,7 @@
                 <w:sz w:val="19"/>
                 <w:szCs w:val="19"/>
               </w:rPr>
-              <w:t xml:space="preserve">Modalità ridotta (solo consultazione)</w:t>
+              <w:t xml:space="preserve">Cancellazione anticipata – oltre 1 GB</w:t>
             </w:r>
           </w:p>
         </w:tc>
@@ -6634,7 +6637,7 @@
                 <w:sz w:val="19"/>
                 <w:szCs w:val="19"/>
               </w:rPr>
-              <w:t xml:space="preserve">per anno solare</w:t>
+              <w:t xml:space="preserve">per GB aggiuntivo</w:t>
             </w:r>
           </w:p>
         </w:tc>
@@ -6658,7 +6661,7 @@
                 <w:sz w:val="19"/>
                 <w:szCs w:val="19"/>
               </w:rPr>
-              <w:t xml:space="preserve">[●]</w:t>
+              <w:t xml:space="preserve">490,00</w:t>
             </w:r>
           </w:p>
         </w:tc>
@@ -6689,7 +6692,7 @@
                 <w:sz w:val="19"/>
                 <w:szCs w:val="19"/>
               </w:rPr>
-              <w:t xml:space="preserve">Esportazione in PdD</w:t>
+              <w:t xml:space="preserve">Modalità ridotta (solo consultazione, dopo la cessazione)</w:t>
             </w:r>
           </w:p>
         </w:tc>
@@ -6714,7 +6717,7 @@
                 <w:sz w:val="19"/>
                 <w:szCs w:val="19"/>
               </w:rPr>
-              <w:t xml:space="preserve">per richiesta</w:t>
+              <w:t xml:space="preserve">per anno solare</w:t>
             </w:r>
           </w:p>
         </w:tc>
@@ -6739,7 +6742,7 @@
                 <w:sz w:val="19"/>
                 <w:szCs w:val="19"/>
               </w:rPr>
-              <w:t xml:space="preserve">[●]</w:t>
+              <w:t xml:space="preserve">240,00</w:t>
             </w:r>
           </w:p>
         </w:tc>
@@ -6769,7 +6772,7 @@
                 <w:sz w:val="19"/>
                 <w:szCs w:val="19"/>
               </w:rPr>
-              <w:t xml:space="preserve">Attività extra (integrazione, formazione)</w:t>
+              <w:t xml:space="preserve">Esportazione in PdD per il trasferimento ad altro conservatore</w:t>
             </w:r>
           </w:p>
         </w:tc>
@@ -6793,6 +6796,245 @@
                 <w:sz w:val="19"/>
                 <w:szCs w:val="19"/>
               </w:rPr>
+              <w:t xml:space="preserve">per richiesta + per GB</w:t>
+            </w:r>
+          </w:p>
+        </w:tc>
+        <w:tc>
+          <w:tcPr>
+            <w:tcW w:type="dxa" w:w="1928"/>
+            <w:tcMar>
+              <w:top w:type="dxa" w:w="35"/>
+              <w:left w:type="dxa" w:w="100"/>
+              <w:bottom w:type="dxa" w:w="35"/>
+              <w:right w:type="dxa" w:w="100"/>
+            </w:tcMar>
+            <w:vAlign w:val="center"/>
+          </w:tcPr>
+          <w:p>
+            <w:pPr>
+              <w:spacing w:after="0" w:before="0"/>
+            </w:pPr>
+            <w:r>
+              <w:rPr>
+                <w:sz w:val="19"/>
+                <w:szCs w:val="19"/>
+              </w:rPr>
+              <w:t xml:space="preserve">290,00 + 90,00/GB</w:t>
+            </w:r>
+          </w:p>
+        </w:tc>
+      </w:tr>
+      <w:tr>
+        <w:trPr>
+          <w:cantSplit/>
+          <w:tblHeader w:val="false"/>
+        </w:trPr>
+        <w:tc>
+          <w:tcPr>
+            <w:tcW w:type="dxa" w:w="4819"/>
+            <w:shd w:fill="EAF1F9" w:color="auto" w:val="clear"/>
+            <w:tcMar>
+              <w:top w:type="dxa" w:w="35"/>
+              <w:left w:type="dxa" w:w="100"/>
+              <w:bottom w:type="dxa" w:w="35"/>
+              <w:right w:type="dxa" w:w="100"/>
+            </w:tcMar>
+            <w:vAlign w:val="center"/>
+          </w:tcPr>
+          <w:p>
+            <w:pPr>
+              <w:spacing w:after="0" w:before="0"/>
+            </w:pPr>
+            <w:r>
+              <w:rPr>
+                <w:sz w:val="19"/>
+                <w:szCs w:val="19"/>
+              </w:rPr>
+              <w:t xml:space="preserve">Utenza aggiuntiva del portale</w:t>
+            </w:r>
+          </w:p>
+        </w:tc>
+        <w:tc>
+          <w:tcPr>
+            <w:tcW w:type="dxa" w:w="2891"/>
+            <w:shd w:fill="EAF1F9" w:color="auto" w:val="clear"/>
+            <w:tcMar>
+              <w:top w:type="dxa" w:w="35"/>
+              <w:left w:type="dxa" w:w="100"/>
+              <w:bottom w:type="dxa" w:w="35"/>
+              <w:right w:type="dxa" w:w="100"/>
+            </w:tcMar>
+            <w:vAlign w:val="center"/>
+          </w:tcPr>
+          <w:p>
+            <w:pPr>
+              <w:spacing w:after="0" w:before="0"/>
+            </w:pPr>
+            <w:r>
+              <w:rPr>
+                <w:sz w:val="19"/>
+                <w:szCs w:val="19"/>
+              </w:rPr>
+              <w:t xml:space="preserve">per utente, per anno</w:t>
+            </w:r>
+          </w:p>
+        </w:tc>
+        <w:tc>
+          <w:tcPr>
+            <w:tcW w:type="dxa" w:w="1928"/>
+            <w:shd w:fill="EAF1F9" w:color="auto" w:val="clear"/>
+            <w:tcMar>
+              <w:top w:type="dxa" w:w="35"/>
+              <w:left w:type="dxa" w:w="100"/>
+              <w:bottom w:type="dxa" w:w="35"/>
+              <w:right w:type="dxa" w:w="100"/>
+            </w:tcMar>
+            <w:vAlign w:val="center"/>
+          </w:tcPr>
+          <w:p>
+            <w:pPr>
+              <w:spacing w:after="0" w:before="0"/>
+            </w:pPr>
+            <w:r>
+              <w:rPr>
+                <w:sz w:val="19"/>
+                <w:szCs w:val="19"/>
+              </w:rPr>
+              <w:t xml:space="preserve">40,00</w:t>
+            </w:r>
+          </w:p>
+        </w:tc>
+      </w:tr>
+      <w:tr>
+        <w:trPr>
+          <w:cantSplit/>
+          <w:tblHeader w:val="false"/>
+        </w:trPr>
+        <w:tc>
+          <w:tcPr>
+            <w:tcW w:type="dxa" w:w="4819"/>
+            <w:tcMar>
+              <w:top w:type="dxa" w:w="35"/>
+              <w:left w:type="dxa" w:w="100"/>
+              <w:bottom w:type="dxa" w:w="35"/>
+              <w:right w:type="dxa" w:w="100"/>
+            </w:tcMar>
+            <w:vAlign w:val="center"/>
+          </w:tcPr>
+          <w:p>
+            <w:pPr>
+              <w:spacing w:after="0" w:before="0"/>
+            </w:pPr>
+            <w:r>
+              <w:rPr>
+                <w:sz w:val="19"/>
+                <w:szCs w:val="19"/>
+              </w:rPr>
+              <w:t xml:space="preserve">Integrazione API REST con il gestionale rifiuti del Cliente</w:t>
+            </w:r>
+          </w:p>
+        </w:tc>
+        <w:tc>
+          <w:tcPr>
+            <w:tcW w:type="dxa" w:w="2891"/>
+            <w:tcMar>
+              <w:top w:type="dxa" w:w="35"/>
+              <w:left w:type="dxa" w:w="100"/>
+              <w:bottom w:type="dxa" w:w="35"/>
+              <w:right w:type="dxa" w:w="100"/>
+            </w:tcMar>
+            <w:vAlign w:val="center"/>
+          </w:tcPr>
+          <w:p>
+            <w:pPr>
+              <w:spacing w:after="0" w:before="0"/>
+            </w:pPr>
+            <w:r>
+              <w:rPr>
+                <w:sz w:val="19"/>
+                <w:szCs w:val="19"/>
+              </w:rPr>
+              <w:t xml:space="preserve">una tantum</w:t>
+            </w:r>
+          </w:p>
+        </w:tc>
+        <w:tc>
+          <w:tcPr>
+            <w:tcW w:type="dxa" w:w="1928"/>
+            <w:tcMar>
+              <w:top w:type="dxa" w:w="35"/>
+              <w:left w:type="dxa" w:w="100"/>
+              <w:bottom w:type="dxa" w:w="35"/>
+              <w:right w:type="dxa" w:w="100"/>
+            </w:tcMar>
+            <w:vAlign w:val="center"/>
+          </w:tcPr>
+          <w:p>
+            <w:pPr>
+              <w:spacing w:after="0" w:before="0"/>
+            </w:pPr>
+            <w:r>
+              <w:rPr>
+                <w:sz w:val="19"/>
+                <w:szCs w:val="19"/>
+              </w:rPr>
+              <w:t xml:space="preserve">da preventivare</w:t>
+            </w:r>
+          </w:p>
+        </w:tc>
+      </w:tr>
+      <w:tr>
+        <w:trPr>
+          <w:cantSplit/>
+          <w:tblHeader w:val="false"/>
+        </w:trPr>
+        <w:tc>
+          <w:tcPr>
+            <w:tcW w:type="dxa" w:w="4819"/>
+            <w:shd w:fill="EAF1F9" w:color="auto" w:val="clear"/>
+            <w:tcMar>
+              <w:top w:type="dxa" w:w="35"/>
+              <w:left w:type="dxa" w:w="100"/>
+              <w:bottom w:type="dxa" w:w="35"/>
+              <w:right w:type="dxa" w:w="100"/>
+            </w:tcMar>
+            <w:vAlign w:val="center"/>
+          </w:tcPr>
+          <w:p>
+            <w:pPr>
+              <w:spacing w:after="0" w:before="0"/>
+            </w:pPr>
+            <w:r>
+              <w:rPr>
+                <w:sz w:val="19"/>
+                <w:szCs w:val="19"/>
+              </w:rPr>
+              <w:t xml:space="preserve">Attività extra (integrazione, formazione, supporto oltre il primo livello)</w:t>
+            </w:r>
+          </w:p>
+        </w:tc>
+        <w:tc>
+          <w:tcPr>
+            <w:tcW w:type="dxa" w:w="2891"/>
+            <w:shd w:fill="EAF1F9" w:color="auto" w:val="clear"/>
+            <w:tcMar>
+              <w:top w:type="dxa" w:w="35"/>
+              <w:left w:type="dxa" w:w="100"/>
+              <w:bottom w:type="dxa" w:w="35"/>
+              <w:right w:type="dxa" w:w="100"/>
+            </w:tcMar>
+            <w:vAlign w:val="center"/>
+          </w:tcPr>
+          <w:p>
+            <w:pPr>
+              <w:spacing w:after="0" w:before="0"/>
+            </w:pPr>
+            <w:r>
+              <w:rPr>
+                <w:sz w:val="19"/>
+                <w:szCs w:val="19"/>
+              </w:rPr>
               <w:t xml:space="preserve">per ora</w:t>
             </w:r>
           </w:p>
@@ -6800,24 +7042,25 @@
         <w:tc>
           <w:tcPr>
             <w:tcW w:type="dxa" w:w="1928"/>
-            <w:tcMar>
-              <w:top w:type="dxa" w:w="35"/>
-              <w:left w:type="dxa" w:w="100"/>
-              <w:bottom w:type="dxa" w:w="35"/>
-              <w:right w:type="dxa" w:w="100"/>
-            </w:tcMar>
-            <w:vAlign w:val="center"/>
-          </w:tcPr>
-          <w:p>
-            <w:pPr>
-              <w:spacing w:after="0" w:before="0"/>
-            </w:pPr>
-            <w:r>
-              <w:rPr>
-                <w:sz w:val="19"/>
-                <w:szCs w:val="19"/>
-              </w:rPr>
-              <w:t xml:space="preserve">[●]</w:t>
+            <w:shd w:fill="EAF1F9" w:color="auto" w:val="clear"/>
+            <w:tcMar>
+              <w:top w:type="dxa" w:w="35"/>
+              <w:left w:type="dxa" w:w="100"/>
+              <w:bottom w:type="dxa" w:w="35"/>
+              <w:right w:type="dxa" w:w="100"/>
+            </w:tcMar>
+            <w:vAlign w:val="center"/>
+          </w:tcPr>
+          <w:p>
+            <w:pPr>
+              <w:spacing w:after="0" w:before="0"/>
+            </w:pPr>
+            <w:r>
+              <w:rPr>
+                <w:sz w:val="19"/>
+                <w:szCs w:val="19"/>
+              </w:rPr>
+              <w:t xml:space="preserve">85,00</w:t>
             </w:r>
           </w:p>
         </w:tc>
@@ -6836,7 +7079,7 @@
         <w:jc w:val="both"/>
       </w:pPr>
       <w:r>
-        <w:t xml:space="preserve">Le fasce del canone di conservazione si applicano al volume complessivo versato nell'anno solare.</w:t>
+        <w:t xml:space="preserve">Le fasce del canone di conservazione si applicano ai GB versati dal Cliente nello stesso anno solare e sono progressive: ogni fascia si applica solo ai GB che vi rientrano. Esempio: 12 GB versati nell'anno = 390 + 9 × 290 + 2 × 220 = 3.440 € per il triennio di conservazione.</w:t>
       </w:r>
     </w:p>
     <w:tbl>
@@ -6943,13 +7186,9 @@
       </w:tr>
     </w:tbl>
     <w:p>
-      <w:r>
-        <w:br w:type="page"/>
-      </w:r>
-    </w:p>
-    <w:p>
       <w:pPr>
         <w:keepNext/>
+        <w:pageBreakBefore/>
         <w:pBdr>
           <w:bottom w:val="single" w:color="6599CD" w:sz="6" w:space="2"/>
         </w:pBdr>
@@ -7037,7 +7276,7 @@
         <w:t xml:space="preserve">Tipi di dati:</w:t>
       </w:r>
       <w:r>
-        <w:t xml:space="preserve"> ☐ anagrafici e identificativi ☐ di contatto ☐ finanziari e fiscali ☐ relativi al rapporto di lavoro ☐ relativi alla salute ☐ altro: [●]</w:t>
+        <w:t xml:space="preserve"> ☒ anagrafici e identificativi (nomi di produttori, trasportatori, destinatari e autisti) ☒ di contatto ☒ targhe dei mezzi e dati di trasporto ☐ relativi alla salute ☐ altro: ____________</w:t>
       </w:r>
     </w:p>
     <w:p>
@@ -7058,7 +7297,7 @@
         <w:t xml:space="preserve">Categorie di interessati:</w:t>
       </w:r>
       <w:r>
-        <w:t xml:space="preserve"> ☐ clienti ☐ fornitori ☐ dipendenti e collaboratori ☐ altro: [●]</w:t>
+        <w:t xml:space="preserve"> ☒ clienti ☒ fornitori e trasportatori ☒ dipendenti e collaboratori (autisti, firmatari) ☐ altro: ____________</w:t>
       </w:r>
     </w:p>
     <w:p>
@@ -7435,13 +7674,9 @@
       </w:tr>
     </w:tbl>
     <w:p>
-      <w:r>
-        <w:br w:type="page"/>
-      </w:r>
-    </w:p>
-    <w:p>
       <w:pPr>
         <w:keepNext/>
+        <w:pageBreakBefore/>
         <w:pBdr>
           <w:bottom w:val="single" w:color="6599CD" w:sz="6" w:space="2"/>
         </w:pBdr>
@@ -7466,7 +7701,7 @@
         <w:jc w:val="both"/>
       </w:pPr>
       <w:r>
-        <w:t xml:space="preserve">Il/La sottoscritto/a [● nome e cognome], nato/a a [●] il [●], C.F. [●], in qualità di Responsabile della conservazione di [● ragione sociale] (il "Titolare dei documenti"), P.IVA [●],</w:t>
+        <w:t xml:space="preserve">Il/La sottoscritto/a ____________________, nato/a a ____________________ il ____/____/________, C.F. ____________________, in qualità di Responsabile della conservazione di ____________________ (il "Titolare dei documenti"), P.IVA ____________________,</w:t>
       </w:r>
     </w:p>
     <w:p>
@@ -7495,7 +7730,7 @@
         <w:jc w:val="both"/>
       </w:pPr>
       <w:r>
-        <w:t xml:space="preserve">di essere stato/a nominato/a Responsabile della conservazione dal Titolare dei documenti, con atto del [● data];</w:t>
+        <w:t xml:space="preserve">di essere stato/a nominato/a Responsabile della conservazione dal Titolare dei documenti, con atto del ____/____/________;</w:t>
       </w:r>
     </w:p>
     <w:p>

</xml_diff>

<commit_message>
Contratto: nessuna utenza per i clienti, esibizione su richiesta tramite WST
Co-Authored-By: Claude Opus 5.5 <noreply@anthropic.com>
Claude-Session: https://claude.ai/code/session_01WDncHtSFTdQuV5JxtunJCC
</commit_message>
<xml_diff>
--- a/Contratto_Conservazione_WsTech.docx
+++ b/Contratto_Conservazione_WsTech.docx
@@ -1405,7 +1405,7 @@
         <w:jc w:val="both"/>
       </w:pPr>
       <w:r>
-        <w:t xml:space="preserve">la preparazione e il versamento dei PdV, manualmente tramite portale o in automatico tramite API;</w:t>
+        <w:t xml:space="preserve">la ricezione dei documenti dal Cliente, la preparazione e il versamento dei PdV a cura esclusiva di WST;</w:t>
       </w:r>
     </w:p>
     <w:p>
@@ -1419,7 +1419,7 @@
         <w:jc w:val="both"/>
       </w:pPr>
       <w:r>
-        <w:t xml:space="preserve">l'accesso del Cliente al portale di esibizione per consultare e scaricare i documenti conservati;</w:t>
+        <w:t xml:space="preserve">l'esibizione dei documenti conservati: su richiesta del Cliente, WST estrae dal Sistema di Conservazione e consegna i documenti richiesti, con le relative ricevute, secondo l'art. 8.6;</w:t>
       </w:r>
     </w:p>
     <w:p>
@@ -1450,7 +1450,7 @@
         <w:t xml:space="preserve">2.2  </w:t>
       </w:r>
       <w:r>
-        <w:t xml:space="preserve">Il processo di conservazione è eseguito da Intesi Group, secondo il Manuale. WST non gestisce il Sistema di Conservazione e non conserva copie dei documenti oltre quanto necessario al versamento.</w:t>
+        <w:t xml:space="preserve">Il Cliente non dispone di utenze né di accesso diretto al Sistema di Conservazione: tutte le operazioni sono svolte da WST. Il processo di conservazione è eseguito da Intesi Group, secondo il Manuale. WST non gestisce il Sistema di Conservazione e non conserva copie dei documenti oltre quanto necessario al versamento.</w:t>
       </w:r>
     </w:p>
     <w:p>
@@ -1654,7 +1654,7 @@
         <w:jc w:val="both"/>
       </w:pPr>
       <w:r>
-        <w:t xml:space="preserve">custodire le credenziali di accesso al portale e rispondere del loro uso;</w:t>
+        <w:t xml:space="preserve">consegnare i documenti a WST solo tramite i canali concordati nell'Allegato A e non modificarli dopo la consegna;</w:t>
       </w:r>
     </w:p>
     <w:p>
@@ -1735,7 +1735,7 @@
         <w:jc w:val="both"/>
       </w:pPr>
       <w:r>
-        <w:t xml:space="preserve">non eseguire accessi non autorizzati, test di sicurezza o carichi anomali sul portale o sul Sistema di Conservazione.</w:t>
+        <w:t xml:space="preserve">non tentare in alcun modo di accedere al Sistema di Conservazione o ai sistemi di WST.</w:t>
       </w:r>
     </w:p>
     <w:p>
@@ -1978,7 +1978,7 @@
         <w:jc w:val="both"/>
       </w:pPr>
       <w:r>
-        <w:t xml:space="preserve">viola gli obblighi di cui all'art. 3, punti 6 e 7.</w:t>
+        <w:t xml:space="preserve">viola gli obblighi di cui all'art. 3, punto 7.</w:t>
       </w:r>
     </w:p>
     <w:p>
@@ -2474,7 +2474,7 @@
         <w:t xml:space="preserve">6.4  </w:t>
       </w:r>
       <w:r>
-        <w:t xml:space="preserve">Il pagamento avviene tramite bonifico bancario entro 10 giorni dalla data della fattura. In caso di ritardo si applicano gli interessi di mora previsti dal D.Lgs. 231/2002. Dopo 15 giorni di ritardo, e previo sollecito via PEC, WST può sospendere i nuovi versamenti. La consultazione dei documenti già conservati non viene mai sospesa.</w:t>
+        <w:t xml:space="preserve">Il pagamento avviene tramite bonifico bancario entro 10 giorni dalla data della fattura. In caso di ritardo si applicano gli interessi di mora previsti dal D.Lgs. 231/2002. Dopo 15 giorni di ritardo, e previo sollecito via PEC, WST può sospendere i nuovi versamenti. L'esibizione dei documenti già conservati richiesta per controlli delle autorità non viene mai sospesa.</w:t>
       </w:r>
     </w:p>
     <w:p>
@@ -2918,7 +2918,7 @@
                 <w:sz w:val="19"/>
                 <w:szCs w:val="19"/>
               </w:rPr>
-              <w:t xml:space="preserve">Versamento o consultazione impossibili</w:t>
+              <w:t xml:space="preserve">Versamento impossibile o esibizione richiesta da un'autorità</w:t>
             </w:r>
           </w:p>
         </w:tc>
@@ -3344,6 +3344,30 @@
     </w:p>
     <w:p>
       <w:pPr>
+        <w:spacing w:after="120" w:line="276"/>
+        <w:jc w:val="both"/>
+      </w:pPr>
+      <w:r>
+        <w:rPr>
+          <w:b/>
+          <w:bCs/>
+          <w:color w:val="1F3A5F"/>
+        </w:rPr>
+        <w:t xml:space="preserve">8.6  </w:t>
+      </w:r>
+      <w:r>
+        <w:rPr>
+          <w:b/>
+          <w:bCs/>
+        </w:rPr>
+        <w:t xml:space="preserve">Esibizione.</w:t>
+      </w:r>
+      <w:r>
+        <w:t xml:space="preserve"> Il Cliente chiede l'esibizione via PEC o e-mail, indicando i documenti (numero xFIR, periodo del registro, produttore o destinatario). WST consegna i documenti, in formato elettronico e con le relative ricevute di conservazione, entro 3 giorni lavorativi. Per richieste delle autorità di controllo il termine è di 1 giorno lavorativo, se la richiesta lo segnala. Sono incluse nel canone annuo fino a 6 richieste di esibizione per anno; le ulteriori e quelle urgenti sono fatturate secondo l'Allegato B.</w:t>
+      </w:r>
+    </w:p>
+    <w:p>
+      <w:pPr>
         <w:keepNext/>
         <w:pBdr>
           <w:bottom w:val="single" w:color="6599CD" w:sz="6" w:space="2"/>
@@ -3434,7 +3458,7 @@
         <w:jc w:val="both"/>
       </w:pPr>
       <w:r>
-        <w:t xml:space="preserve">uso improprio delle credenziali o del portale;</w:t>
+        <w:t xml:space="preserve">ritardo del Cliente nel consegnare i documenti a WST;</w:t>
       </w:r>
     </w:p>
     <w:p>
@@ -3711,10 +3735,10 @@
           <w:b/>
           <w:bCs/>
         </w:rPr>
-        <w:t xml:space="preserve">Modalità ridotta.</w:t>
-      </w:r>
-      <w:r>
-        <w:t xml:space="preserve"> Il Cliente può chiedere via PEC, almeno 60 giorni prima della cessazione, di continuare a consultare i documenti tramite il portale. La modalità ridotta consente solo la consultazione ed è fatturata secondo l'Allegato B. Senza richiesta, l'accesso al portale cessa con il Contratto.</w:t>
+        <w:t xml:space="preserve">Esibizione dopo la cessazione.</w:t>
+      </w:r>
+      <w:r>
+        <w:t xml:space="preserve"> Dopo la cessazione i documenti restano conservati e il Cliente può chiederne l'esibizione a WST per tutto il Periodo di conservazione. Ogni richiesta è fatturata secondo l'Allegato B.</w:t>
       </w:r>
     </w:p>
     <w:p>
@@ -4144,7 +4168,7 @@
         <w:t xml:space="preserve">14.4  </w:t>
       </w:r>
       <w:r>
-        <w:t xml:space="preserve">Le modifiche agli Allegati A e B e le comunicazioni operative possono essere accettate anche con conferma via PEC o tramite il portale di WST, purché non riguardino le clausole elencate nella sezione Firme.</w:t>
+        <w:t xml:space="preserve">Le modifiche agli Allegati A e B e le comunicazioni operative possono essere accettate anche con conferma via PEC o per e-mail all'indirizzo indicato da WST, purché non riguardino le clausole elencate nella sezione Firme.</w:t>
       </w:r>
     </w:p>
     <w:p>
@@ -4957,7 +4981,105 @@
                 <w:sz w:val="19"/>
                 <w:szCs w:val="19"/>
               </w:rPr>
-              <w:t xml:space="preserve">Modalità di versamento (portale / API REST)</w:t>
+              <w:t xml:space="preserve">Modalità di consegna dei documenti a WST (integrazione con il gestionale rifiuti / invio file)</w:t>
+            </w:r>
+          </w:p>
+        </w:tc>
+        <w:tc>
+          <w:tcPr>
+            <w:tcW w:type="dxa" w:w="6361"/>
+            <w:shd w:fill="EAF1F9" w:color="auto" w:val="clear"/>
+            <w:tcMar>
+              <w:top w:type="dxa" w:w="35"/>
+              <w:left w:type="dxa" w:w="100"/>
+              <w:bottom w:type="dxa" w:w="35"/>
+              <w:right w:type="dxa" w:w="100"/>
+            </w:tcMar>
+            <w:vAlign w:val="center"/>
+          </w:tcPr>
+          <w:p>
+            <w:pPr>
+              <w:spacing w:after="0" w:before="0"/>
+            </w:pPr>
+          </w:p>
+        </w:tc>
+      </w:tr>
+      <w:tr>
+        <w:trPr>
+          <w:cantSplit/>
+          <w:tblHeader w:val="false"/>
+          <w:trHeight w:val="330" w:hRule="atLeast"/>
+        </w:trPr>
+        <w:tc>
+          <w:tcPr>
+            <w:tcW w:type="dxa" w:w="3277"/>
+            <w:tcMar>
+              <w:top w:type="dxa" w:w="35"/>
+              <w:left w:type="dxa" w:w="100"/>
+              <w:bottom w:type="dxa" w:w="35"/>
+              <w:right w:type="dxa" w:w="100"/>
+            </w:tcMar>
+            <w:vAlign w:val="center"/>
+          </w:tcPr>
+          <w:p>
+            <w:pPr>
+              <w:spacing w:after="0" w:before="0"/>
+            </w:pPr>
+            <w:r>
+              <w:rPr>
+                <w:sz w:val="19"/>
+                <w:szCs w:val="19"/>
+              </w:rPr>
+              <w:t xml:space="preserve">Software gestionale rifiuti utilizzato</w:t>
+            </w:r>
+          </w:p>
+        </w:tc>
+        <w:tc>
+          <w:tcPr>
+            <w:tcW w:type="dxa" w:w="6361"/>
+            <w:tcMar>
+              <w:top w:type="dxa" w:w="35"/>
+              <w:left w:type="dxa" w:w="100"/>
+              <w:bottom w:type="dxa" w:w="35"/>
+              <w:right w:type="dxa" w:w="100"/>
+            </w:tcMar>
+            <w:vAlign w:val="center"/>
+          </w:tcPr>
+          <w:p>
+            <w:pPr>
+              <w:spacing w:after="0" w:before="0"/>
+            </w:pPr>
+          </w:p>
+        </w:tc>
+      </w:tr>
+      <w:tr>
+        <w:trPr>
+          <w:cantSplit/>
+          <w:tblHeader w:val="false"/>
+          <w:trHeight w:val="330" w:hRule="atLeast"/>
+        </w:trPr>
+        <w:tc>
+          <w:tcPr>
+            <w:tcW w:type="dxa" w:w="3277"/>
+            <w:shd w:fill="EAF1F9" w:color="auto" w:val="clear"/>
+            <w:tcMar>
+              <w:top w:type="dxa" w:w="35"/>
+              <w:left w:type="dxa" w:w="100"/>
+              <w:bottom w:type="dxa" w:w="35"/>
+              <w:right w:type="dxa" w:w="100"/>
+            </w:tcMar>
+            <w:vAlign w:val="center"/>
+          </w:tcPr>
+          <w:p>
+            <w:pPr>
+              <w:spacing w:after="0" w:before="0"/>
+            </w:pPr>
+            <w:r>
+              <w:rPr>
+                <w:sz w:val="19"/>
+                <w:szCs w:val="19"/>
+              </w:rPr>
+              <w:t xml:space="preserve">Indirizzo PEC o e-mail per le richieste di esibizione</w:t>
             </w:r>
           </w:p>
         </w:tc>
@@ -5464,19 +5586,138 @@
         <w:spacing w:after="120"/>
       </w:pPr>
     </w:p>
+    <w:tbl>
+      <w:tblPr>
+        <w:tblW w:type="dxa" w:w="9638"/>
+        <w:tblBorders>
+          <w:top w:val="none" w:color="FFFFFF" w:sz="0"/>
+          <w:left w:val="none" w:color="FFFFFF" w:sz="0"/>
+          <w:bottom w:val="none" w:color="FFFFFF" w:sz="0"/>
+          <w:right w:val="none" w:color="FFFFFF" w:sz="0"/>
+          <w:insideH w:val="none" w:color="FFFFFF" w:sz="0"/>
+          <w:insideV w:val="none" w:color="FFFFFF" w:sz="0"/>
+        </w:tblBorders>
+      </w:tblPr>
+      <w:tblGrid>
+        <w:gridCol w:w="4819"/>
+        <w:gridCol w:w="4819"/>
+      </w:tblGrid>
+      <w:tr>
+        <w:trPr>
+          <w:cantSplit/>
+        </w:trPr>
+        <w:tc>
+          <w:tcPr>
+            <w:tcW w:type="dxa" w:w="4819"/>
+            <w:tcBorders>
+              <w:top w:val="none" w:color="FFFFFF" w:sz="0"/>
+              <w:left w:val="none" w:color="FFFFFF" w:sz="0"/>
+              <w:bottom w:val="none" w:color="FFFFFF" w:sz="0"/>
+              <w:right w:val="none" w:color="FFFFFF" w:sz="0"/>
+            </w:tcBorders>
+            <w:tcMar>
+              <w:left w:type="dxa" w:w="0"/>
+              <w:right w:type="dxa" w:w="200"/>
+            </w:tcMar>
+          </w:tcPr>
+          <w:p>
+            <w:pPr>
+              <w:spacing w:after="0" w:before="120"/>
+            </w:pPr>
+            <w:r>
+              <w:rPr>
+                <w:b/>
+                <w:bCs/>
+                <w:sz w:val="20"/>
+                <w:szCs w:val="20"/>
+              </w:rPr>
+              <w:t xml:space="preserve">Per accettazione – Il Cliente</w:t>
+            </w:r>
+          </w:p>
+          <w:p>
+            <w:pPr>
+              <w:spacing w:after="420"/>
+            </w:pPr>
+            <w:r>
+              <w:rPr>
+                <w:color w:val="7F7F7F"/>
+                <w:sz w:val="18"/>
+                <w:szCs w:val="18"/>
+              </w:rPr>
+              <w:t xml:space="preserve"> </w:t>
+            </w:r>
+          </w:p>
+          <w:p>
+            <w:pPr>
+              <w:pBdr>
+                <w:bottom w:val="single" w:color="404040" w:sz="6" w:space="1"/>
+              </w:pBdr>
+            </w:pPr>
+            <w:r>
+              <w:t xml:space="preserve"> </w:t>
+            </w:r>
+          </w:p>
+          <w:p>
+            <w:pPr>
+              <w:spacing w:after="120"/>
+            </w:pPr>
+            <w:r>
+              <w:rPr>
+                <w:color w:val="7F7F7F"/>
+                <w:sz w:val="16"/>
+                <w:szCs w:val="16"/>
+              </w:rPr>
+              <w:t xml:space="preserve">Firma</w:t>
+            </w:r>
+          </w:p>
+        </w:tc>
+        <w:tc>
+          <w:tcPr>
+            <w:tcW w:type="dxa" w:w="4819"/>
+            <w:tcBorders>
+              <w:top w:val="none" w:color="FFFFFF" w:sz="0"/>
+              <w:left w:val="none" w:color="FFFFFF" w:sz="0"/>
+              <w:bottom w:val="none" w:color="FFFFFF" w:sz="0"/>
+              <w:right w:val="none" w:color="FFFFFF" w:sz="0"/>
+            </w:tcBorders>
+          </w:tcPr>
+          <w:p>
+            <w:r>
+              <w:t xml:space="preserve"/>
+            </w:r>
+          </w:p>
+        </w:tc>
+      </w:tr>
+    </w:tbl>
     <w:p>
       <w:pPr>
         <w:keepNext/>
-        <w:keepLines/>
-        <w:spacing w:after="120" w:line="276"/>
-        <w:jc w:val="both"/>
-      </w:pPr>
-      <w:r>
-        <w:rPr>
-          <w:b/>
-          <w:bCs/>
-        </w:rPr>
-        <w:t xml:space="preserve">Utenti del portale</w:t>
+        <w:pageBreakBefore/>
+        <w:pBdr>
+          <w:bottom w:val="single" w:color="6599CD" w:sz="6" w:space="2"/>
+        </w:pBdr>
+        <w:spacing w:after="120" w:before="0"/>
+      </w:pPr>
+      <w:r>
+        <w:rPr>
+          <w:b/>
+          <w:bCs/>
+          <w:color w:val="1F3A5F"/>
+          <w:sz w:val="26"/>
+          <w:szCs w:val="26"/>
+        </w:rPr>
+        <w:t xml:space="preserve">Allegato B – Corrispettivi</w:t>
+      </w:r>
+    </w:p>
+    <w:p>
+      <w:pPr>
+        <w:keepNext w:val="false"/>
+        <w:keepLines w:val="false"/>
+        <w:spacing w:after="120" w:line="276"/>
+        <w:jc w:val="both"/>
+      </w:pPr>
+      <w:r>
+        <w:t xml:space="preserve">Prezzi IVA esclusa, validi fino al 31 dicembre 2027. Tutti i corrispettivi variabili sono calcolati sullo spazio (GB), mai sul numero di documenti.</w:t>
       </w:r>
     </w:p>
     <w:tbl>
@@ -5525,372 +5766,6 @@
                 <w:sz w:val="19"/>
                 <w:szCs w:val="19"/>
               </w:rPr>
-              <w:t xml:space="preserve">Nome e cognome</w:t>
-            </w:r>
-          </w:p>
-        </w:tc>
-        <w:tc>
-          <w:tcPr>
-            <w:tcW w:type="dxa" w:w="2891"/>
-            <w:shd w:fill="6599CD" w:color="auto" w:val="clear"/>
-            <w:tcMar>
-              <w:top w:type="dxa" w:w="35"/>
-              <w:left w:type="dxa" w:w="100"/>
-              <w:bottom w:type="dxa" w:w="35"/>
-              <w:right w:type="dxa" w:w="100"/>
-            </w:tcMar>
-            <w:vAlign w:val="center"/>
-          </w:tcPr>
-          <w:p>
-            <w:pPr>
-              <w:spacing w:after="0" w:before="0"/>
-            </w:pPr>
-            <w:r>
-              <w:rPr>
-                <w:b/>
-                <w:bCs/>
-                <w:color w:val="FFFFFF"/>
-                <w:sz w:val="19"/>
-                <w:szCs w:val="19"/>
-              </w:rPr>
-              <w:t xml:space="preserve">E-mail</w:t>
-            </w:r>
-          </w:p>
-        </w:tc>
-        <w:tc>
-          <w:tcPr>
-            <w:tcW w:type="dxa" w:w="1928"/>
-            <w:shd w:fill="6599CD" w:color="auto" w:val="clear"/>
-            <w:tcMar>
-              <w:top w:type="dxa" w:w="35"/>
-              <w:left w:type="dxa" w:w="100"/>
-              <w:bottom w:type="dxa" w:w="35"/>
-              <w:right w:type="dxa" w:w="100"/>
-            </w:tcMar>
-            <w:vAlign w:val="center"/>
-          </w:tcPr>
-          <w:p>
-            <w:pPr>
-              <w:spacing w:after="0" w:before="0"/>
-            </w:pPr>
-            <w:r>
-              <w:rPr>
-                <w:b/>
-                <w:bCs/>
-                <w:color w:val="FFFFFF"/>
-                <w:sz w:val="19"/>
-                <w:szCs w:val="19"/>
-              </w:rPr>
-              <w:t xml:space="preserve">Ruolo (versatore e consultazione / solo consultazione)</w:t>
-            </w:r>
-          </w:p>
-        </w:tc>
-      </w:tr>
-      <w:tr>
-        <w:trPr>
-          <w:cantSplit/>
-          <w:tblHeader w:val="false"/>
-          <w:trHeight w:val="330" w:hRule="atLeast"/>
-        </w:trPr>
-        <w:tc>
-          <w:tcPr>
-            <w:tcW w:type="dxa" w:w="4819"/>
-            <w:tcMar>
-              <w:top w:type="dxa" w:w="35"/>
-              <w:left w:type="dxa" w:w="100"/>
-              <w:bottom w:type="dxa" w:w="35"/>
-              <w:right w:type="dxa" w:w="100"/>
-            </w:tcMar>
-            <w:vAlign w:val="center"/>
-          </w:tcPr>
-          <w:p>
-            <w:pPr>
-              <w:spacing w:after="0" w:before="0"/>
-            </w:pPr>
-          </w:p>
-        </w:tc>
-        <w:tc>
-          <w:tcPr>
-            <w:tcW w:type="dxa" w:w="2891"/>
-            <w:tcMar>
-              <w:top w:type="dxa" w:w="35"/>
-              <w:left w:type="dxa" w:w="100"/>
-              <w:bottom w:type="dxa" w:w="35"/>
-              <w:right w:type="dxa" w:w="100"/>
-            </w:tcMar>
-            <w:vAlign w:val="center"/>
-          </w:tcPr>
-          <w:p>
-            <w:pPr>
-              <w:spacing w:after="0" w:before="0"/>
-            </w:pPr>
-          </w:p>
-        </w:tc>
-        <w:tc>
-          <w:tcPr>
-            <w:tcW w:type="dxa" w:w="1928"/>
-            <w:tcMar>
-              <w:top w:type="dxa" w:w="35"/>
-              <w:left w:type="dxa" w:w="100"/>
-              <w:bottom w:type="dxa" w:w="35"/>
-              <w:right w:type="dxa" w:w="100"/>
-            </w:tcMar>
-            <w:vAlign w:val="center"/>
-          </w:tcPr>
-          <w:p>
-            <w:pPr>
-              <w:spacing w:after="0" w:before="0"/>
-            </w:pPr>
-          </w:p>
-        </w:tc>
-      </w:tr>
-      <w:tr>
-        <w:trPr>
-          <w:cantSplit/>
-          <w:tblHeader w:val="false"/>
-          <w:trHeight w:val="330" w:hRule="atLeast"/>
-        </w:trPr>
-        <w:tc>
-          <w:tcPr>
-            <w:tcW w:type="dxa" w:w="4819"/>
-            <w:shd w:fill="EAF1F9" w:color="auto" w:val="clear"/>
-            <w:tcMar>
-              <w:top w:type="dxa" w:w="35"/>
-              <w:left w:type="dxa" w:w="100"/>
-              <w:bottom w:type="dxa" w:w="35"/>
-              <w:right w:type="dxa" w:w="100"/>
-            </w:tcMar>
-            <w:vAlign w:val="center"/>
-          </w:tcPr>
-          <w:p>
-            <w:pPr>
-              <w:spacing w:after="0" w:before="0"/>
-            </w:pPr>
-          </w:p>
-        </w:tc>
-        <w:tc>
-          <w:tcPr>
-            <w:tcW w:type="dxa" w:w="2891"/>
-            <w:shd w:fill="EAF1F9" w:color="auto" w:val="clear"/>
-            <w:tcMar>
-              <w:top w:type="dxa" w:w="35"/>
-              <w:left w:type="dxa" w:w="100"/>
-              <w:bottom w:type="dxa" w:w="35"/>
-              <w:right w:type="dxa" w:w="100"/>
-            </w:tcMar>
-            <w:vAlign w:val="center"/>
-          </w:tcPr>
-          <w:p>
-            <w:pPr>
-              <w:spacing w:after="0" w:before="0"/>
-            </w:pPr>
-          </w:p>
-        </w:tc>
-        <w:tc>
-          <w:tcPr>
-            <w:tcW w:type="dxa" w:w="1928"/>
-            <w:shd w:fill="EAF1F9" w:color="auto" w:val="clear"/>
-            <w:tcMar>
-              <w:top w:type="dxa" w:w="35"/>
-              <w:left w:type="dxa" w:w="100"/>
-              <w:bottom w:type="dxa" w:w="35"/>
-              <w:right w:type="dxa" w:w="100"/>
-            </w:tcMar>
-            <w:vAlign w:val="center"/>
-          </w:tcPr>
-          <w:p>
-            <w:pPr>
-              <w:spacing w:after="0" w:before="0"/>
-            </w:pPr>
-          </w:p>
-        </w:tc>
-      </w:tr>
-    </w:tbl>
-    <w:p>
-      <w:pPr>
-        <w:spacing w:after="120"/>
-      </w:pPr>
-    </w:p>
-    <w:tbl>
-      <w:tblPr>
-        <w:tblW w:type="dxa" w:w="9638"/>
-        <w:tblBorders>
-          <w:top w:val="none" w:color="FFFFFF" w:sz="0"/>
-          <w:left w:val="none" w:color="FFFFFF" w:sz="0"/>
-          <w:bottom w:val="none" w:color="FFFFFF" w:sz="0"/>
-          <w:right w:val="none" w:color="FFFFFF" w:sz="0"/>
-          <w:insideH w:val="none" w:color="FFFFFF" w:sz="0"/>
-          <w:insideV w:val="none" w:color="FFFFFF" w:sz="0"/>
-        </w:tblBorders>
-      </w:tblPr>
-      <w:tblGrid>
-        <w:gridCol w:w="4819"/>
-        <w:gridCol w:w="4819"/>
-      </w:tblGrid>
-      <w:tr>
-        <w:trPr>
-          <w:cantSplit/>
-        </w:trPr>
-        <w:tc>
-          <w:tcPr>
-            <w:tcW w:type="dxa" w:w="4819"/>
-            <w:tcBorders>
-              <w:top w:val="none" w:color="FFFFFF" w:sz="0"/>
-              <w:left w:val="none" w:color="FFFFFF" w:sz="0"/>
-              <w:bottom w:val="none" w:color="FFFFFF" w:sz="0"/>
-              <w:right w:val="none" w:color="FFFFFF" w:sz="0"/>
-            </w:tcBorders>
-            <w:tcMar>
-              <w:left w:type="dxa" w:w="0"/>
-              <w:right w:type="dxa" w:w="200"/>
-            </w:tcMar>
-          </w:tcPr>
-          <w:p>
-            <w:pPr>
-              <w:spacing w:after="0" w:before="120"/>
-            </w:pPr>
-            <w:r>
-              <w:rPr>
-                <w:b/>
-                <w:bCs/>
-                <w:sz w:val="20"/>
-                <w:szCs w:val="20"/>
-              </w:rPr>
-              <w:t xml:space="preserve">Per accettazione – Il Cliente</w:t>
-            </w:r>
-          </w:p>
-          <w:p>
-            <w:pPr>
-              <w:spacing w:after="420"/>
-            </w:pPr>
-            <w:r>
-              <w:rPr>
-                <w:color w:val="7F7F7F"/>
-                <w:sz w:val="18"/>
-                <w:szCs w:val="18"/>
-              </w:rPr>
-              <w:t xml:space="preserve"> </w:t>
-            </w:r>
-          </w:p>
-          <w:p>
-            <w:pPr>
-              <w:pBdr>
-                <w:bottom w:val="single" w:color="404040" w:sz="6" w:space="1"/>
-              </w:pBdr>
-            </w:pPr>
-            <w:r>
-              <w:t xml:space="preserve"> </w:t>
-            </w:r>
-          </w:p>
-          <w:p>
-            <w:pPr>
-              <w:spacing w:after="120"/>
-            </w:pPr>
-            <w:r>
-              <w:rPr>
-                <w:color w:val="7F7F7F"/>
-                <w:sz w:val="16"/>
-                <w:szCs w:val="16"/>
-              </w:rPr>
-              <w:t xml:space="preserve">Firma</w:t>
-            </w:r>
-          </w:p>
-        </w:tc>
-        <w:tc>
-          <w:tcPr>
-            <w:tcW w:type="dxa" w:w="4819"/>
-            <w:tcBorders>
-              <w:top w:val="none" w:color="FFFFFF" w:sz="0"/>
-              <w:left w:val="none" w:color="FFFFFF" w:sz="0"/>
-              <w:bottom w:val="none" w:color="FFFFFF" w:sz="0"/>
-              <w:right w:val="none" w:color="FFFFFF" w:sz="0"/>
-            </w:tcBorders>
-          </w:tcPr>
-          <w:p>
-            <w:r>
-              <w:t xml:space="preserve"/>
-            </w:r>
-          </w:p>
-        </w:tc>
-      </w:tr>
-    </w:tbl>
-    <w:p>
-      <w:pPr>
-        <w:keepNext/>
-        <w:pageBreakBefore/>
-        <w:pBdr>
-          <w:bottom w:val="single" w:color="6599CD" w:sz="6" w:space="2"/>
-        </w:pBdr>
-        <w:spacing w:after="120" w:before="0"/>
-      </w:pPr>
-      <w:r>
-        <w:rPr>
-          <w:b/>
-          <w:bCs/>
-          <w:color w:val="1F3A5F"/>
-          <w:sz w:val="26"/>
-          <w:szCs w:val="26"/>
-        </w:rPr>
-        <w:t xml:space="preserve">Allegato B – Corrispettivi</w:t>
-      </w:r>
-    </w:p>
-    <w:p>
-      <w:pPr>
-        <w:keepNext w:val="false"/>
-        <w:keepLines w:val="false"/>
-        <w:spacing w:after="120" w:line="276"/>
-        <w:jc w:val="both"/>
-      </w:pPr>
-      <w:r>
-        <w:t xml:space="preserve">Prezzi IVA esclusa, validi fino al 31 dicembre 2027. Tutti i corrispettivi variabili sono calcolati sullo spazio (GB), mai sul numero di documenti.</w:t>
-      </w:r>
-    </w:p>
-    <w:tbl>
-      <w:tblPr>
-        <w:tblW w:type="dxa" w:w="9638"/>
-        <w:tblBorders>
-          <w:top w:val="single" w:color="BFBFBF" w:sz="4"/>
-          <w:left w:val="single" w:color="BFBFBF" w:sz="4"/>
-          <w:bottom w:val="single" w:color="BFBFBF" w:sz="4"/>
-          <w:right w:val="single" w:color="BFBFBF" w:sz="4"/>
-          <w:insideH w:val="single" w:color="BFBFBF" w:sz="4"/>
-          <w:insideV w:val="single" w:color="BFBFBF" w:sz="4"/>
-        </w:tblBorders>
-      </w:tblPr>
-      <w:tblGrid>
-        <w:gridCol w:w="4819"/>
-        <w:gridCol w:w="2891"/>
-        <w:gridCol w:w="1928"/>
-      </w:tblGrid>
-      <w:tr>
-        <w:trPr>
-          <w:cantSplit/>
-          <w:tblHeader/>
-        </w:trPr>
-        <w:tc>
-          <w:tcPr>
-            <w:tcW w:type="dxa" w:w="4819"/>
-            <w:shd w:fill="6599CD" w:color="auto" w:val="clear"/>
-            <w:tcMar>
-              <w:top w:type="dxa" w:w="35"/>
-              <w:left w:type="dxa" w:w="100"/>
-              <w:bottom w:type="dxa" w:w="35"/>
-              <w:right w:type="dxa" w:w="100"/>
-            </w:tcMar>
-            <w:vAlign w:val="center"/>
-          </w:tcPr>
-          <w:p>
-            <w:pPr>
-              <w:spacing w:after="0" w:before="0"/>
-            </w:pPr>
-            <w:r>
-              <w:rPr>
-                <w:b/>
-                <w:bCs/>
-                <w:color w:val="FFFFFF"/>
-                <w:sz w:val="19"/>
-                <w:szCs w:val="19"/>
-              </w:rPr>
               <w:t xml:space="preserve">Voce</w:t>
             </w:r>
           </w:p>
@@ -5977,7 +5852,7 @@
                 <w:sz w:val="19"/>
                 <w:szCs w:val="19"/>
               </w:rPr>
-              <w:t xml:space="preserve">Attivazione del Servizio (anagrafica, configurazione, 2 utenze, 2 ore di supporto all'avvio)</w:t>
+              <w:t xml:space="preserve">Attivazione del Servizio (anagrafica, configurazione dei flussi di consegna, 2 ore di supporto all'avvio)</w:t>
             </w:r>
           </w:p>
         </w:tc>
@@ -6056,7 +5931,7 @@
                 <w:sz w:val="19"/>
                 <w:szCs w:val="19"/>
               </w:rPr>
-              <w:t xml:space="preserve">Canone annuo di servizio (anagrafica, portale di esibizione, assistenza, ricevute)</w:t>
+              <w:t xml:space="preserve">Canone annuo di servizio (anagrafica, versamento a cura di WST, ricevute, assistenza, fino a 6 esibizioni)</w:t>
             </w:r>
           </w:p>
         </w:tc>
@@ -6692,7 +6567,7 @@
                 <w:sz w:val="19"/>
                 <w:szCs w:val="19"/>
               </w:rPr>
-              <w:t xml:space="preserve">Modalità ridotta (solo consultazione, dopo la cessazione)</w:t>
+              <w:t xml:space="preserve">Esibizione oltre le 6 incluse, o dopo la cessazione</w:t>
             </w:r>
           </w:p>
         </w:tc>
@@ -6717,7 +6592,7 @@
                 <w:sz w:val="19"/>
                 <w:szCs w:val="19"/>
               </w:rPr>
-              <w:t xml:space="preserve">per anno solare</w:t>
+              <w:t xml:space="preserve">per richiesta</w:t>
             </w:r>
           </w:p>
         </w:tc>
@@ -6742,7 +6617,7 @@
                 <w:sz w:val="19"/>
                 <w:szCs w:val="19"/>
               </w:rPr>
-              <w:t xml:space="preserve">240,00</w:t>
+              <w:t xml:space="preserve">60,00</w:t>
             </w:r>
           </w:p>
         </w:tc>
@@ -6772,7 +6647,7 @@
                 <w:sz w:val="19"/>
                 <w:szCs w:val="19"/>
               </w:rPr>
-              <w:t xml:space="preserve">Esportazione in PdD per il trasferimento ad altro conservatore</w:t>
+              <w:t xml:space="preserve">Esibizione urgente (entro 1 giorno lavorativo)</w:t>
             </w:r>
           </w:p>
         </w:tc>
@@ -6796,7 +6671,7 @@
                 <w:sz w:val="19"/>
                 <w:szCs w:val="19"/>
               </w:rPr>
-              <w:t xml:space="preserve">per richiesta + per GB</w:t>
+              <w:t xml:space="preserve">per richiesta</w:t>
             </w:r>
           </w:p>
         </w:tc>
@@ -6820,7 +6695,7 @@
                 <w:sz w:val="19"/>
                 <w:szCs w:val="19"/>
               </w:rPr>
-              <w:t xml:space="preserve">290,00 + 90,00/GB</w:t>
+              <w:t xml:space="preserve">120,00</w:t>
             </w:r>
           </w:p>
         </w:tc>
@@ -6851,7 +6726,7 @@
                 <w:sz w:val="19"/>
                 <w:szCs w:val="19"/>
               </w:rPr>
-              <w:t xml:space="preserve">Utenza aggiuntiva del portale</w:t>
+              <w:t xml:space="preserve">Esportazione in PdD per il trasferimento ad altro conservatore</w:t>
             </w:r>
           </w:p>
         </w:tc>
@@ -6876,7 +6751,7 @@
                 <w:sz w:val="19"/>
                 <w:szCs w:val="19"/>
               </w:rPr>
-              <w:t xml:space="preserve">per utente, per anno</w:t>
+              <w:t xml:space="preserve">per richiesta + per GB</w:t>
             </w:r>
           </w:p>
         </w:tc>
@@ -6901,7 +6776,7 @@
                 <w:sz w:val="19"/>
                 <w:szCs w:val="19"/>
               </w:rPr>
-              <w:t xml:space="preserve">40,00</w:t>
+              <w:t xml:space="preserve">290,00 + 90,00/GB</w:t>
             </w:r>
           </w:p>
         </w:tc>

</xml_diff>

<commit_message>
Contratto: attivazione 100 € trasportatori, canone software 150 €/anno produttori
Co-Authored-By: Claude Opus 5.5 <noreply@anthropic.com>
Claude-Session: https://claude.ai/code/session_01WDncHtSFTdQuV5JxtunJCC
</commit_message>
<xml_diff>
--- a/Contratto_Conservazione_WsTech.docx
+++ b/Contratto_Conservazione_WsTech.docx
@@ -1023,7 +1023,7 @@
                 <w:sz w:val="19"/>
                 <w:szCs w:val="19"/>
               </w:rPr>
-              <w:t xml:space="preserve">GB</w:t>
+              <w:t xml:space="preserve">Software</w:t>
             </w:r>
           </w:p>
         </w:tc>
@@ -1047,7 +1047,7 @@
                 <w:sz w:val="19"/>
                 <w:szCs w:val="19"/>
               </w:rPr>
-              <w:t xml:space="preserve">Gigabyte (1.000.000.000 byte) di documenti e metadati versati, come rilevato dal Sistema di Conservazione.</w:t>
+              <w:t xml:space="preserve">Il software gestionale rifiuti di WST, per la compilazione e la gestione di xFIR e registri.</w:t>
             </w:r>
           </w:p>
         </w:tc>
@@ -1078,7 +1078,7 @@
                 <w:sz w:val="19"/>
                 <w:szCs w:val="19"/>
               </w:rPr>
-              <w:t xml:space="preserve">Anagrafica</w:t>
+              <w:t xml:space="preserve">Trasportatore</w:t>
             </w:r>
           </w:p>
         </w:tc>
@@ -1103,7 +1103,7 @@
                 <w:sz w:val="19"/>
                 <w:szCs w:val="19"/>
               </w:rPr>
-              <w:t xml:space="preserve">Ogni soggetto Titolare dei documenti (ragione sociale o partita IVA) censito nel Sistema di Conservazione.</w:t>
+              <w:t xml:space="preserve">Cliente che svolge attività di trasporto rifiuti ed è già licenziatario del Software in forza di un separato contratto con WST.</w:t>
             </w:r>
           </w:p>
         </w:tc>
@@ -1133,7 +1133,7 @@
                 <w:sz w:val="19"/>
                 <w:szCs w:val="19"/>
               </w:rPr>
-              <w:t xml:space="preserve">Periodo di versamento</w:t>
+              <w:t xml:space="preserve">Produttore</w:t>
             </w:r>
           </w:p>
         </w:tc>
@@ -1157,7 +1157,7 @@
                 <w:sz w:val="19"/>
                 <w:szCs w:val="19"/>
               </w:rPr>
-              <w:t xml:space="preserve">Il periodo in cui il Cliente può versare nuovi documenti. Coincide con la durata del Contratto.</w:t>
+              <w:t xml:space="preserve">Cliente produttore di rifiuti che riceve il Software in licenza d'uso con il presente Contratto.</w:t>
             </w:r>
           </w:p>
         </w:tc>
@@ -1188,7 +1188,7 @@
                 <w:sz w:val="19"/>
                 <w:szCs w:val="19"/>
               </w:rPr>
-              <w:t xml:space="preserve">Periodo di conservazione</w:t>
+              <w:t xml:space="preserve">GB</w:t>
             </w:r>
           </w:p>
         </w:tc>
@@ -1213,7 +1213,7 @@
                 <w:sz w:val="19"/>
                 <w:szCs w:val="19"/>
               </w:rPr>
-              <w:t xml:space="preserve">Il periodo in cui i documenti restano conservati: 3 anni, salvo diversa indicazione nell'Allegato A. Può durare oltre il Contratto.</w:t>
+              <w:t xml:space="preserve">Gigabyte (1.000.000.000 byte) di documenti e metadati versati, come rilevato dal Sistema di Conservazione.</w:t>
             </w:r>
           </w:p>
         </w:tc>
@@ -1243,7 +1243,7 @@
                 <w:sz w:val="19"/>
                 <w:szCs w:val="19"/>
               </w:rPr>
-              <w:t xml:space="preserve">Anno solare di versamento</w:t>
+              <w:t xml:space="preserve">Anagrafica</w:t>
             </w:r>
           </w:p>
         </w:tc>
@@ -1267,7 +1267,7 @@
                 <w:sz w:val="19"/>
                 <w:szCs w:val="19"/>
               </w:rPr>
-              <w:t xml:space="preserve">Il periodo dal 1° gennaio al 31 dicembre in cui un documento è versato. Il Periodo di conservazione si calcola a partire dal 31 dicembre di quell'anno.</w:t>
+              <w:t xml:space="preserve">Ogni soggetto Titolare dei documenti (ragione sociale o partita IVA) censito nel Sistema di Conservazione.</w:t>
             </w:r>
           </w:p>
         </w:tc>
@@ -1298,7 +1298,7 @@
                 <w:sz w:val="19"/>
                 <w:szCs w:val="19"/>
               </w:rPr>
-              <w:t xml:space="preserve">Manuale</w:t>
+              <w:t xml:space="preserve">Periodo di versamento</w:t>
             </w:r>
           </w:p>
         </w:tc>
@@ -1306,6 +1306,170 @@
           <w:tcPr>
             <w:tcW w:type="dxa" w:w="6361"/>
             <w:shd w:fill="EAF1F9" w:color="auto" w:val="clear"/>
+            <w:tcMar>
+              <w:top w:type="dxa" w:w="35"/>
+              <w:left w:type="dxa" w:w="100"/>
+              <w:bottom w:type="dxa" w:w="35"/>
+              <w:right w:type="dxa" w:w="100"/>
+            </w:tcMar>
+            <w:vAlign w:val="center"/>
+          </w:tcPr>
+          <w:p>
+            <w:pPr>
+              <w:spacing w:after="0" w:before="0"/>
+            </w:pPr>
+            <w:r>
+              <w:rPr>
+                <w:sz w:val="19"/>
+                <w:szCs w:val="19"/>
+              </w:rPr>
+              <w:t xml:space="preserve">Il periodo in cui il Cliente può versare nuovi documenti. Coincide con la durata del Contratto.</w:t>
+            </w:r>
+          </w:p>
+        </w:tc>
+      </w:tr>
+      <w:tr>
+        <w:trPr>
+          <w:cantSplit/>
+          <w:tblHeader w:val="false"/>
+        </w:trPr>
+        <w:tc>
+          <w:tcPr>
+            <w:tcW w:type="dxa" w:w="3277"/>
+            <w:tcMar>
+              <w:top w:type="dxa" w:w="35"/>
+              <w:left w:type="dxa" w:w="100"/>
+              <w:bottom w:type="dxa" w:w="35"/>
+              <w:right w:type="dxa" w:w="100"/>
+            </w:tcMar>
+            <w:vAlign w:val="center"/>
+          </w:tcPr>
+          <w:p>
+            <w:pPr>
+              <w:spacing w:after="0" w:before="0"/>
+            </w:pPr>
+            <w:r>
+              <w:rPr>
+                <w:sz w:val="19"/>
+                <w:szCs w:val="19"/>
+              </w:rPr>
+              <w:t xml:space="preserve">Periodo di conservazione</w:t>
+            </w:r>
+          </w:p>
+        </w:tc>
+        <w:tc>
+          <w:tcPr>
+            <w:tcW w:type="dxa" w:w="6361"/>
+            <w:tcMar>
+              <w:top w:type="dxa" w:w="35"/>
+              <w:left w:type="dxa" w:w="100"/>
+              <w:bottom w:type="dxa" w:w="35"/>
+              <w:right w:type="dxa" w:w="100"/>
+            </w:tcMar>
+            <w:vAlign w:val="center"/>
+          </w:tcPr>
+          <w:p>
+            <w:pPr>
+              <w:spacing w:after="0" w:before="0"/>
+            </w:pPr>
+            <w:r>
+              <w:rPr>
+                <w:sz w:val="19"/>
+                <w:szCs w:val="19"/>
+              </w:rPr>
+              <w:t xml:space="preserve">Il periodo in cui i documenti restano conservati: 3 anni, salvo diversa indicazione nell'Allegato A. Può durare oltre il Contratto.</w:t>
+            </w:r>
+          </w:p>
+        </w:tc>
+      </w:tr>
+      <w:tr>
+        <w:trPr>
+          <w:cantSplit/>
+          <w:tblHeader w:val="false"/>
+        </w:trPr>
+        <w:tc>
+          <w:tcPr>
+            <w:tcW w:type="dxa" w:w="3277"/>
+            <w:shd w:fill="EAF1F9" w:color="auto" w:val="clear"/>
+            <w:tcMar>
+              <w:top w:type="dxa" w:w="35"/>
+              <w:left w:type="dxa" w:w="100"/>
+              <w:bottom w:type="dxa" w:w="35"/>
+              <w:right w:type="dxa" w:w="100"/>
+            </w:tcMar>
+            <w:vAlign w:val="center"/>
+          </w:tcPr>
+          <w:p>
+            <w:pPr>
+              <w:spacing w:after="0" w:before="0"/>
+            </w:pPr>
+            <w:r>
+              <w:rPr>
+                <w:sz w:val="19"/>
+                <w:szCs w:val="19"/>
+              </w:rPr>
+              <w:t xml:space="preserve">Anno solare di versamento</w:t>
+            </w:r>
+          </w:p>
+        </w:tc>
+        <w:tc>
+          <w:tcPr>
+            <w:tcW w:type="dxa" w:w="6361"/>
+            <w:shd w:fill="EAF1F9" w:color="auto" w:val="clear"/>
+            <w:tcMar>
+              <w:top w:type="dxa" w:w="35"/>
+              <w:left w:type="dxa" w:w="100"/>
+              <w:bottom w:type="dxa" w:w="35"/>
+              <w:right w:type="dxa" w:w="100"/>
+            </w:tcMar>
+            <w:vAlign w:val="center"/>
+          </w:tcPr>
+          <w:p>
+            <w:pPr>
+              <w:spacing w:after="0" w:before="0"/>
+            </w:pPr>
+            <w:r>
+              <w:rPr>
+                <w:sz w:val="19"/>
+                <w:szCs w:val="19"/>
+              </w:rPr>
+              <w:t xml:space="preserve">Il periodo dal 1° gennaio al 31 dicembre in cui un documento è versato. Il Periodo di conservazione si calcola a partire dal 31 dicembre di quell'anno.</w:t>
+            </w:r>
+          </w:p>
+        </w:tc>
+      </w:tr>
+      <w:tr>
+        <w:trPr>
+          <w:cantSplit/>
+          <w:tblHeader w:val="false"/>
+        </w:trPr>
+        <w:tc>
+          <w:tcPr>
+            <w:tcW w:type="dxa" w:w="3277"/>
+            <w:tcMar>
+              <w:top w:type="dxa" w:w="35"/>
+              <w:left w:type="dxa" w:w="100"/>
+              <w:bottom w:type="dxa" w:w="35"/>
+              <w:right w:type="dxa" w:w="100"/>
+            </w:tcMar>
+            <w:vAlign w:val="center"/>
+          </w:tcPr>
+          <w:p>
+            <w:pPr>
+              <w:spacing w:after="0" w:before="0"/>
+            </w:pPr>
+            <w:r>
+              <w:rPr>
+                <w:sz w:val="19"/>
+                <w:szCs w:val="19"/>
+              </w:rPr>
+              <w:t xml:space="preserve">Manuale</w:t>
+            </w:r>
+          </w:p>
+        </w:tc>
+        <w:tc>
+          <w:tcPr>
+            <w:tcW w:type="dxa" w:w="6361"/>
             <w:tcMar>
               <w:top w:type="dxa" w:w="35"/>
               <w:left w:type="dxa" w:w="100"/>
@@ -1433,7 +1597,21 @@
         <w:jc w:val="both"/>
       </w:pPr>
       <w:r>
-        <w:t xml:space="preserve">l'assistenza di primo livello descritta all'art. 8.</w:t>
+        <w:t xml:space="preserve">l'assistenza di primo livello descritta all'art. 8;</w:t>
+      </w:r>
+    </w:p>
+    <w:p>
+      <w:pPr>
+        <w:pStyle w:val="ListParagraph"/>
+        <w:numPr>
+          <w:ilvl w:val="0"/>
+          <w:numId w:val="3"/>
+        </w:numPr>
+        <w:spacing w:after="80" w:line="276"/>
+        <w:jc w:val="both"/>
+      </w:pPr>
+      <w:r>
+        <w:t xml:space="preserve">solo per i Produttori, la licenza d'uso del Software secondo l'art. 15.</w:t>
       </w:r>
     </w:p>
     <w:p>
@@ -2205,7 +2383,7 @@
                 <w:sz w:val="19"/>
                 <w:szCs w:val="19"/>
               </w:rPr>
-              <w:t xml:space="preserve">Attivazione</w:t>
+              <w:t xml:space="preserve">Attivazione (Trasportatori)</w:t>
             </w:r>
           </w:p>
         </w:tc>
@@ -2260,7 +2438,7 @@
                 <w:sz w:val="19"/>
                 <w:szCs w:val="19"/>
               </w:rPr>
-              <w:t xml:space="preserve">Canone annuo di servizio</w:t>
+              <w:t xml:space="preserve">Canone annuo Software (Produttori)</w:t>
             </w:r>
           </w:p>
         </w:tc>
@@ -2315,7 +2493,7 @@
                 <w:sz w:val="19"/>
                 <w:szCs w:val="19"/>
               </w:rPr>
-              <w:t xml:space="preserve">Canone di conservazione</w:t>
+              <w:t xml:space="preserve">Canone annuo di servizio</w:t>
             </w:r>
           </w:p>
         </w:tc>
@@ -2339,7 +2517,7 @@
                 <w:sz w:val="19"/>
                 <w:szCs w:val="19"/>
               </w:rPr>
-              <w:t xml:space="preserve">Anticipato, sui GB stimati nell'Allegato A (minimo 1 GB); eccedenze a fine mese</w:t>
+              <w:t xml:space="preserve">Anticipato, a inizio di ogni anno solare (primo anno: alla firma, per intero)</w:t>
             </w:r>
           </w:p>
         </w:tc>
@@ -2370,7 +2548,7 @@
                 <w:sz w:val="19"/>
                 <w:szCs w:val="19"/>
               </w:rPr>
-              <w:t xml:space="preserve">Cancellazione anticipata</w:t>
+              <w:t xml:space="preserve">Canone di conservazione</w:t>
             </w:r>
           </w:p>
         </w:tc>
@@ -2395,7 +2573,7 @@
                 <w:sz w:val="19"/>
                 <w:szCs w:val="19"/>
               </w:rPr>
-              <w:t xml:space="preserve">All'esecuzione di ogni richiesta</w:t>
+              <w:t xml:space="preserve">Anticipato, sui GB stimati nell'Allegato A (minimo 1 GB); eccedenze a fine mese</w:t>
             </w:r>
           </w:p>
         </w:tc>
@@ -2425,6 +2603,61 @@
                 <w:sz w:val="19"/>
                 <w:szCs w:val="19"/>
               </w:rPr>
+              <w:t xml:space="preserve">Cancellazione anticipata</w:t>
+            </w:r>
+          </w:p>
+        </w:tc>
+        <w:tc>
+          <w:tcPr>
+            <w:tcW w:type="dxa" w:w="6361"/>
+            <w:tcMar>
+              <w:top w:type="dxa" w:w="35"/>
+              <w:left w:type="dxa" w:w="100"/>
+              <w:bottom w:type="dxa" w:w="35"/>
+              <w:right w:type="dxa" w:w="100"/>
+            </w:tcMar>
+            <w:vAlign w:val="center"/>
+          </w:tcPr>
+          <w:p>
+            <w:pPr>
+              <w:spacing w:after="0" w:before="0"/>
+            </w:pPr>
+            <w:r>
+              <w:rPr>
+                <w:sz w:val="19"/>
+                <w:szCs w:val="19"/>
+              </w:rPr>
+              <w:t xml:space="preserve">All'esecuzione di ogni richiesta</w:t>
+            </w:r>
+          </w:p>
+        </w:tc>
+      </w:tr>
+      <w:tr>
+        <w:trPr>
+          <w:cantSplit/>
+          <w:tblHeader w:val="false"/>
+        </w:trPr>
+        <w:tc>
+          <w:tcPr>
+            <w:tcW w:type="dxa" w:w="3277"/>
+            <w:shd w:fill="EAF1F9" w:color="auto" w:val="clear"/>
+            <w:tcMar>
+              <w:top w:type="dxa" w:w="35"/>
+              <w:left w:type="dxa" w:w="100"/>
+              <w:bottom w:type="dxa" w:w="35"/>
+              <w:right w:type="dxa" w:w="100"/>
+            </w:tcMar>
+            <w:vAlign w:val="center"/>
+          </w:tcPr>
+          <w:p>
+            <w:pPr>
+              <w:spacing w:after="0" w:before="0"/>
+            </w:pPr>
+            <w:r>
+              <w:rPr>
+                <w:sz w:val="19"/>
+                <w:szCs w:val="19"/>
+              </w:rPr>
               <w:t xml:space="preserve">Attività extra</w:t>
             </w:r>
           </w:p>
@@ -2432,6 +2665,7 @@
         <w:tc>
           <w:tcPr>
             <w:tcW w:type="dxa" w:w="6361"/>
+            <w:shd w:fill="EAF1F9" w:color="auto" w:val="clear"/>
             <w:tcMar>
               <w:top w:type="dxa" w:w="35"/>
               <w:left w:type="dxa" w:w="100"/>
@@ -2525,7 +2759,7 @@
         <w:t xml:space="preserve">6.7  </w:t>
       </w:r>
       <w:r>
-        <w:t xml:space="preserve">Il canone di conservazione, il canone annuo di servizio e l'attivazione non sono rimborsabili, neppure in caso di cessazione anticipata del Contratto o di cancellazione anticipata dei documenti.</w:t>
+        <w:t xml:space="preserve">Il canone di conservazione, il canone annuo di servizio, il canone annuo Software e l'attivazione non sono rimborsabili, neppure in caso di cessazione anticipata del Contratto o di cancellazione anticipata dei documenti.</w:t>
       </w:r>
     </w:p>
     <w:p>
@@ -4204,6 +4438,127 @@
           <w:sz w:val="22"/>
           <w:szCs w:val="22"/>
         </w:rPr>
+        <w:t xml:space="preserve">Art. 15 – Licenza d'uso del Software (solo Produttori)</w:t>
+      </w:r>
+    </w:p>
+    <w:p>
+      <w:pPr>
+        <w:spacing w:after="120" w:line="276"/>
+        <w:jc w:val="both"/>
+      </w:pPr>
+      <w:r>
+        <w:rPr>
+          <w:b/>
+          <w:bCs/>
+          <w:color w:val="1F3A5F"/>
+        </w:rPr>
+        <w:t xml:space="preserve">15.1  </w:t>
+      </w:r>
+      <w:r>
+        <w:t xml:space="preserve">Se il Cliente è un Produttore, WST gli concede per la durata del Contratto una licenza d'uso non esclusiva e non trasferibile del Software, per la sola gestione dei propri xFIR e registri.</w:t>
+      </w:r>
+    </w:p>
+    <w:p>
+      <w:pPr>
+        <w:spacing w:after="120" w:line="276"/>
+        <w:jc w:val="both"/>
+      </w:pPr>
+      <w:r>
+        <w:rPr>
+          <w:b/>
+          <w:bCs/>
+          <w:color w:val="1F3A5F"/>
+        </w:rPr>
+        <w:t xml:space="preserve">15.2  </w:t>
+      </w:r>
+      <w:r>
+        <w:t xml:space="preserve">La licenza è compresa nel canone annuo Software indicato nell'Allegato B. Cessa automaticamente con la cessazione del Contratto, salvo il diritto del Cliente di ottenere l'esibizione dei documenti già conservati secondo l'art. 11.</w:t>
+      </w:r>
+    </w:p>
+    <w:p>
+      <w:pPr>
+        <w:spacing w:after="120" w:line="276"/>
+        <w:jc w:val="both"/>
+      </w:pPr>
+      <w:r>
+        <w:rPr>
+          <w:b/>
+          <w:bCs/>
+          <w:color w:val="1F3A5F"/>
+        </w:rPr>
+        <w:t xml:space="preserve">15.3  </w:t>
+      </w:r>
+      <w:r>
+        <w:t xml:space="preserve">Il Software resta di proprietà esclusiva di WST. Il Cliente non può copiarlo, modificarlo, decompilarlo, cederlo, concederlo in sublicenza o metterlo a disposizione di terzi.</w:t>
+      </w:r>
+    </w:p>
+    <w:p>
+      <w:pPr>
+        <w:spacing w:after="120" w:line="276"/>
+        <w:jc w:val="both"/>
+      </w:pPr>
+      <w:r>
+        <w:rPr>
+          <w:b/>
+          <w:bCs/>
+          <w:color w:val="1F3A5F"/>
+        </w:rPr>
+        <w:t xml:space="preserve">15.4  </w:t>
+      </w:r>
+      <w:r>
+        <w:t xml:space="preserve">WST può aggiornare il Software, anche modificandone le funzioni, per adeguarlo alle specifiche RENTRI o per migliorarlo. Il Cliente è tenuto a usare la versione aggiornata.</w:t>
+      </w:r>
+    </w:p>
+    <w:p>
+      <w:pPr>
+        <w:spacing w:after="120" w:line="276"/>
+        <w:jc w:val="both"/>
+      </w:pPr>
+      <w:r>
+        <w:rPr>
+          <w:b/>
+          <w:bCs/>
+          <w:color w:val="1F3A5F"/>
+        </w:rPr>
+        <w:t xml:space="preserve">15.5  </w:t>
+      </w:r>
+      <w:r>
+        <w:t xml:space="preserve">Il Cliente resta responsabile della correttezza dei dati inseriti nel Software e degli adempimenti verso il RENTRI. Al Software si applicano le limitazioni di responsabilità dell'art. 9.</w:t>
+      </w:r>
+    </w:p>
+    <w:p>
+      <w:pPr>
+        <w:spacing w:after="120" w:line="276"/>
+        <w:jc w:val="both"/>
+      </w:pPr>
+      <w:r>
+        <w:rPr>
+          <w:b/>
+          <w:bCs/>
+          <w:color w:val="1F3A5F"/>
+        </w:rPr>
+        <w:t xml:space="preserve">15.6  </w:t>
+      </w:r>
+      <w:r>
+        <w:t xml:space="preserve">Per i Trasportatori la licenza del Software resta regolata dal relativo contratto separato, che il presente Contratto non modifica.</w:t>
+      </w:r>
+    </w:p>
+    <w:p>
+      <w:pPr>
+        <w:keepNext/>
+        <w:pBdr>
+          <w:bottom w:val="single" w:color="6599CD" w:sz="6" w:space="2"/>
+        </w:pBdr>
+        <w:spacing w:after="120" w:before="280"/>
+      </w:pPr>
+      <w:r>
+        <w:rPr>
+          <w:b/>
+          <w:bCs/>
+          <w:color w:val="1F3A5F"/>
+          <w:sz w:val="22"/>
+          <w:szCs w:val="22"/>
+        </w:rPr>
         <w:t xml:space="preserve">Firme</w:t>
       </w:r>
     </w:p>
@@ -4393,7 +4748,7 @@
         <w:jc w:val="both"/>
       </w:pPr>
       <w:r>
-        <w:t xml:space="preserve">Il Cliente dichiara di aver letto il Contratto e gli Allegati e di approvare espressamente, con questa seconda firma separata, le seguenti clausole: art. 2.4 (esclusione di verifiche sul contenuto); art. 3, punti 3 e 7 (responsabilità sul periodo di conservazione e manleva); art. 5.2 (rinnovo automatico); art. 5.4 (clausola risolutiva espressa); art. 5.5 (recesso di WST); art. 5.7 (corrispettivi dovuti in caso di risoluzione); art. 6.4 (sospensione dei versamenti); art. 6.5 (aggiornamento dei prezzi); art. 6.7 (non rimborsabilità dei canoni); art. 6.8 (termine per contestare le fatture); art. 7.4 e 7.5 (cancellazione anticipata: responsabilità e irreversibilità); art. 9.2 e 9.3 (esclusione e limitazione di responsabilità); art. 9.5 (manleva); art. 9.6 (decadenza dai reclami); art. 12.2 (divieto di cessione); art. 12.6 (foro esclusivo); art. 13.3 e 13.4 (modifiche e sostituzione del Conservatore); art. 14.2 (validità della firma elettronica).</w:t>
+        <w:t xml:space="preserve">Il Cliente dichiara di aver letto il Contratto e gli Allegati e di approvare espressamente, con questa seconda firma separata, le seguenti clausole: art. 2.4 (esclusione di verifiche sul contenuto); art. 3, punti 3 e 7 (responsabilità sul periodo di conservazione e manleva); art. 5.2 (rinnovo automatico); art. 5.4 (clausola risolutiva espressa); art. 5.5 (recesso di WST); art. 5.7 (corrispettivi dovuti in caso di risoluzione); art. 6.4 (sospensione dei versamenti); art. 6.5 (aggiornamento dei prezzi); art. 6.7 (non rimborsabilità dei canoni); art. 6.8 (termine per contestare le fatture); art. 7.4 e 7.5 (cancellazione anticipata: responsabilità e irreversibilità); art. 9.2 e 9.3 (esclusione e limitazione di responsabilità); art. 9.5 (manleva); art. 9.6 (decadenza dai reclami); art. 12.2 (divieto di cessione); art. 12.6 (foro esclusivo); art. 13.3 e 13.4 (modifiche e sostituzione del Conservatore); art. 14.2 (validità della firma elettronica); art. 15.2, 15.3 e 15.5 (cessazione della licenza, divieti d'uso del Software e responsabilità sui dati).</w:t>
       </w:r>
     </w:p>
     <w:tbl>
@@ -4616,7 +4971,6 @@
         <w:trPr>
           <w:cantSplit/>
           <w:tblHeader w:val="false"/>
-          <w:trHeight w:val="330" w:hRule="atLeast"/>
         </w:trPr>
         <w:tc>
           <w:tcPr>
@@ -4638,7 +4992,7 @@
                 <w:sz w:val="19"/>
                 <w:szCs w:val="19"/>
               </w:rPr>
-              <w:t xml:space="preserve">Ragione sociale / P.IVA / C.F.</w:t>
+              <w:t xml:space="preserve">Tipologia di Cliente</w:t>
             </w:r>
           </w:p>
         </w:tc>
@@ -4657,6 +5011,13 @@
             <w:pPr>
               <w:spacing w:after="0" w:before="0"/>
             </w:pPr>
+            <w:r>
+              <w:rPr>
+                <w:sz w:val="19"/>
+                <w:szCs w:val="19"/>
+              </w:rPr>
+              <w:t xml:space="preserve">☐ Trasportatore (già licenziatario del Software)   ☐ Produttore (Software incluso)</w:t>
+            </w:r>
           </w:p>
         </w:tc>
       </w:tr>
@@ -4664,7 +5025,6 @@
         <w:trPr>
           <w:cantSplit/>
           <w:tblHeader w:val="false"/>
-          <w:trHeight w:val="330" w:hRule="atLeast"/>
         </w:trPr>
         <w:tc>
           <w:tcPr>
@@ -4687,7 +5047,7 @@
                 <w:sz w:val="19"/>
                 <w:szCs w:val="19"/>
               </w:rPr>
-              <w:t xml:space="preserve">Sede (indirizzo, CAP, città, provincia, Stato)</w:t>
+              <w:t xml:space="preserve">Ragione sociale / P.IVA / C.F.</w:t>
             </w:r>
           </w:p>
         </w:tc>
@@ -4714,7 +5074,6 @@
         <w:trPr>
           <w:cantSplit/>
           <w:tblHeader w:val="false"/>
-          <w:trHeight w:val="330" w:hRule="atLeast"/>
         </w:trPr>
         <w:tc>
           <w:tcPr>
@@ -4736,7 +5095,7 @@
                 <w:sz w:val="19"/>
                 <w:szCs w:val="19"/>
               </w:rPr>
-              <w:t xml:space="preserve">PEC</w:t>
+              <w:t xml:space="preserve">Sede (indirizzo, CAP, città, provincia, Stato)</w:t>
             </w:r>
           </w:p>
         </w:tc>
@@ -4762,7 +5121,6 @@
         <w:trPr>
           <w:cantSplit/>
           <w:tblHeader w:val="false"/>
-          <w:trHeight w:val="330" w:hRule="atLeast"/>
         </w:trPr>
         <w:tc>
           <w:tcPr>
@@ -4785,7 +5143,7 @@
                 <w:sz w:val="19"/>
                 <w:szCs w:val="19"/>
               </w:rPr>
-              <w:t xml:space="preserve">Responsabile della conservazione (nome, e-mail, cellulare)</w:t>
+              <w:t xml:space="preserve">PEC</w:t>
             </w:r>
           </w:p>
         </w:tc>
@@ -4812,7 +5170,6 @@
         <w:trPr>
           <w:cantSplit/>
           <w:tblHeader w:val="false"/>
-          <w:trHeight w:val="330" w:hRule="atLeast"/>
         </w:trPr>
         <w:tc>
           <w:tcPr>
@@ -4834,7 +5191,7 @@
                 <w:sz w:val="19"/>
                 <w:szCs w:val="19"/>
               </w:rPr>
-              <w:t xml:space="preserve">Referente tecnico (nome, e-mail, cellulare)</w:t>
+              <w:t xml:space="preserve">Responsabile della conservazione (nome, e-mail, cellulare)</w:t>
             </w:r>
           </w:p>
         </w:tc>
@@ -4860,7 +5217,6 @@
         <w:trPr>
           <w:cantSplit/>
           <w:tblHeader w:val="false"/>
-          <w:trHeight w:val="330" w:hRule="atLeast"/>
         </w:trPr>
         <w:tc>
           <w:tcPr>
@@ -4883,7 +5239,7 @@
                 <w:sz w:val="19"/>
                 <w:szCs w:val="19"/>
               </w:rPr>
-              <w:t xml:space="preserve">Volume stimato (GB/anno)</w:t>
+              <w:t xml:space="preserve">Referente tecnico (nome, e-mail, cellulare)</w:t>
             </w:r>
           </w:p>
         </w:tc>
@@ -4910,7 +5266,6 @@
         <w:trPr>
           <w:cantSplit/>
           <w:tblHeader w:val="false"/>
-          <w:trHeight w:val="330" w:hRule="atLeast"/>
         </w:trPr>
         <w:tc>
           <w:tcPr>
@@ -4932,7 +5287,7 @@
                 <w:sz w:val="19"/>
                 <w:szCs w:val="19"/>
               </w:rPr>
-              <w:t xml:space="preserve">Periodicità di versamento (giornaliera, mensile, …)</w:t>
+              <w:t xml:space="preserve">Volume stimato (GB/anno)</w:t>
             </w:r>
           </w:p>
         </w:tc>
@@ -4958,7 +5313,6 @@
         <w:trPr>
           <w:cantSplit/>
           <w:tblHeader w:val="false"/>
-          <w:trHeight w:val="330" w:hRule="atLeast"/>
         </w:trPr>
         <w:tc>
           <w:tcPr>
@@ -4981,7 +5335,7 @@
                 <w:sz w:val="19"/>
                 <w:szCs w:val="19"/>
               </w:rPr>
-              <w:t xml:space="preserve">Modalità di consegna dei documenti a WST (integrazione con il gestionale rifiuti / invio file)</w:t>
+              <w:t xml:space="preserve">Periodicità di versamento (giornaliera, mensile, …)</w:t>
             </w:r>
           </w:p>
         </w:tc>
@@ -5008,7 +5362,6 @@
         <w:trPr>
           <w:cantSplit/>
           <w:tblHeader w:val="false"/>
-          <w:trHeight w:val="330" w:hRule="atLeast"/>
         </w:trPr>
         <w:tc>
           <w:tcPr>
@@ -5030,7 +5383,7 @@
                 <w:sz w:val="19"/>
                 <w:szCs w:val="19"/>
               </w:rPr>
-              <w:t xml:space="preserve">Software gestionale rifiuti utilizzato</w:t>
+              <w:t xml:space="preserve">Modalità di consegna dei documenti a WST (integrazione con il gestionale rifiuti / invio file)</w:t>
             </w:r>
           </w:p>
         </w:tc>
@@ -5056,7 +5409,6 @@
         <w:trPr>
           <w:cantSplit/>
           <w:tblHeader w:val="false"/>
-          <w:trHeight w:val="330" w:hRule="atLeast"/>
         </w:trPr>
         <w:tc>
           <w:tcPr>
@@ -5079,7 +5431,7 @@
                 <w:sz w:val="19"/>
                 <w:szCs w:val="19"/>
               </w:rPr>
-              <w:t xml:space="preserve">Indirizzo PEC o e-mail per le richieste di esibizione</w:t>
+              <w:t xml:space="preserve">Software gestionale rifiuti utilizzato</w:t>
             </w:r>
           </w:p>
         </w:tc>
@@ -5087,6 +5439,53 @@
           <w:tcPr>
             <w:tcW w:type="dxa" w:w="6361"/>
             <w:shd w:fill="EAF1F9" w:color="auto" w:val="clear"/>
+            <w:tcMar>
+              <w:top w:type="dxa" w:w="35"/>
+              <w:left w:type="dxa" w:w="100"/>
+              <w:bottom w:type="dxa" w:w="35"/>
+              <w:right w:type="dxa" w:w="100"/>
+            </w:tcMar>
+            <w:vAlign w:val="center"/>
+          </w:tcPr>
+          <w:p>
+            <w:pPr>
+              <w:spacing w:after="0" w:before="0"/>
+            </w:pPr>
+          </w:p>
+        </w:tc>
+      </w:tr>
+      <w:tr>
+        <w:trPr>
+          <w:cantSplit/>
+          <w:tblHeader w:val="false"/>
+        </w:trPr>
+        <w:tc>
+          <w:tcPr>
+            <w:tcW w:type="dxa" w:w="3277"/>
+            <w:tcMar>
+              <w:top w:type="dxa" w:w="35"/>
+              <w:left w:type="dxa" w:w="100"/>
+              <w:bottom w:type="dxa" w:w="35"/>
+              <w:right w:type="dxa" w:w="100"/>
+            </w:tcMar>
+            <w:vAlign w:val="center"/>
+          </w:tcPr>
+          <w:p>
+            <w:pPr>
+              <w:spacing w:after="0" w:before="0"/>
+            </w:pPr>
+            <w:r>
+              <w:rPr>
+                <w:sz w:val="19"/>
+                <w:szCs w:val="19"/>
+              </w:rPr>
+              <w:t xml:space="preserve">Indirizzo PEC o e-mail per le richieste di esibizione</w:t>
+            </w:r>
+          </w:p>
+        </w:tc>
+        <w:tc>
+          <w:tcPr>
+            <w:tcW w:type="dxa" w:w="6361"/>
             <w:tcMar>
               <w:top w:type="dxa" w:w="35"/>
               <w:left w:type="dxa" w:w="100"/>
@@ -5852,7 +6251,7 @@
                 <w:sz w:val="19"/>
                 <w:szCs w:val="19"/>
               </w:rPr>
-              <w:t xml:space="preserve">Attivazione del Servizio (anagrafica, configurazione dei flussi di consegna, 2 ore di supporto all'avvio)</w:t>
+              <w:t xml:space="preserve">Attivazione del Servizio – solo Trasportatori già licenziatari del Software</w:t>
             </w:r>
           </w:p>
         </w:tc>
@@ -5900,7 +6299,7 @@
                 <w:sz w:val="19"/>
                 <w:szCs w:val="19"/>
               </w:rPr>
-              <w:t xml:space="preserve">390,00</w:t>
+              <w:t xml:space="preserve">100,00</w:t>
             </w:r>
           </w:p>
         </w:tc>
@@ -5931,7 +6330,7 @@
                 <w:sz w:val="19"/>
                 <w:szCs w:val="19"/>
               </w:rPr>
-              <w:t xml:space="preserve">Canone annuo di servizio (anagrafica, versamento a cura di WST, ricevute, assistenza, fino a 6 esibizioni)</w:t>
+              <w:t xml:space="preserve">Canone annuo Software con attivazione inclusa – solo Produttori</w:t>
             </w:r>
           </w:p>
         </w:tc>
@@ -5981,7 +6380,7 @@
                 <w:sz w:val="19"/>
                 <w:szCs w:val="19"/>
               </w:rPr>
-              <w:t xml:space="preserve">180,00</w:t>
+              <w:t xml:space="preserve">150,00</w:t>
             </w:r>
           </w:p>
         </w:tc>
@@ -6011,7 +6410,7 @@
                 <w:sz w:val="19"/>
                 <w:szCs w:val="19"/>
               </w:rPr>
-              <w:t xml:space="preserve">Canone di conservazione triennale – 1° GB (minimo fatturabile)</w:t>
+              <w:t xml:space="preserve">Canone annuo di servizio (anagrafica, versamento a cura di WST, ricevute, assistenza, fino a 6 esibizioni)</w:t>
             </w:r>
           </w:p>
         </w:tc>
@@ -6059,7 +6458,7 @@
                 <w:sz w:val="19"/>
                 <w:szCs w:val="19"/>
               </w:rPr>
-              <w:t xml:space="preserve">390,00</w:t>
+              <w:t xml:space="preserve">180,00</w:t>
             </w:r>
           </w:p>
         </w:tc>
@@ -6090,7 +6489,7 @@
                 <w:sz w:val="19"/>
                 <w:szCs w:val="19"/>
               </w:rPr>
-              <w:t xml:space="preserve">Canone di conservazione triennale – dal 2° al 10° GB</w:t>
+              <w:t xml:space="preserve">Canone di conservazione triennale – 1° GB (minimo fatturabile)</w:t>
             </w:r>
           </w:p>
         </w:tc>
@@ -6115,7 +6514,7 @@
                 <w:sz w:val="19"/>
                 <w:szCs w:val="19"/>
               </w:rPr>
-              <w:t xml:space="preserve">per GB versato</w:t>
+              <w:t xml:space="preserve">per anno solare</w:t>
             </w:r>
           </w:p>
         </w:tc>
@@ -6140,7 +6539,7 @@
                 <w:sz w:val="19"/>
                 <w:szCs w:val="19"/>
               </w:rPr>
-              <w:t xml:space="preserve">290,00</w:t>
+              <w:t xml:space="preserve">390,00</w:t>
             </w:r>
           </w:p>
         </w:tc>
@@ -6170,7 +6569,7 @@
                 <w:sz w:val="19"/>
                 <w:szCs w:val="19"/>
               </w:rPr>
-              <w:t xml:space="preserve">Canone di conservazione triennale – dall'11° al 100° GB</w:t>
+              <w:t xml:space="preserve">Canone di conservazione triennale – dal 2° al 10° GB</w:t>
             </w:r>
           </w:p>
         </w:tc>
@@ -6218,7 +6617,7 @@
                 <w:sz w:val="19"/>
                 <w:szCs w:val="19"/>
               </w:rPr>
-              <w:t xml:space="preserve">220,00</w:t>
+              <w:t xml:space="preserve">290,00</w:t>
             </w:r>
           </w:p>
         </w:tc>
@@ -6249,7 +6648,7 @@
                 <w:sz w:val="19"/>
                 <w:szCs w:val="19"/>
               </w:rPr>
-              <w:t xml:space="preserve">Canone di conservazione triennale – oltre 100 GB</w:t>
+              <w:t xml:space="preserve">Canone di conservazione triennale – dall'11° al 100° GB</w:t>
             </w:r>
           </w:p>
         </w:tc>
@@ -6299,7 +6698,7 @@
                 <w:sz w:val="19"/>
                 <w:szCs w:val="19"/>
               </w:rPr>
-              <w:t xml:space="preserve">160,00</w:t>
+              <w:t xml:space="preserve">220,00</w:t>
             </w:r>
           </w:p>
         </w:tc>
@@ -6329,7 +6728,7 @@
                 <w:sz w:val="19"/>
                 <w:szCs w:val="19"/>
               </w:rPr>
-              <w:t xml:space="preserve">Prolungamento della conservazione, per ogni ulteriore triennio</w:t>
+              <w:t xml:space="preserve">Canone di conservazione triennale – oltre 100 GB</w:t>
             </w:r>
           </w:p>
         </w:tc>
@@ -6353,7 +6752,7 @@
                 <w:sz w:val="19"/>
                 <w:szCs w:val="19"/>
               </w:rPr>
-              <w:t xml:space="preserve">per GB conservato</w:t>
+              <w:t xml:space="preserve">per GB versato</w:t>
             </w:r>
           </w:p>
         </w:tc>
@@ -6377,7 +6776,7 @@
                 <w:sz w:val="19"/>
                 <w:szCs w:val="19"/>
               </w:rPr>
-              <w:t xml:space="preserve">come canone di conservazione</w:t>
+              <w:t xml:space="preserve">160,00</w:t>
             </w:r>
           </w:p>
         </w:tc>
@@ -6408,7 +6807,7 @@
                 <w:sz w:val="19"/>
                 <w:szCs w:val="19"/>
               </w:rPr>
-              <w:t xml:space="preserve">Cancellazione anticipata – fino a 1 GB</w:t>
+              <w:t xml:space="preserve">Prolungamento della conservazione, per ogni ulteriore triennio</w:t>
             </w:r>
           </w:p>
         </w:tc>
@@ -6433,7 +6832,7 @@
                 <w:sz w:val="19"/>
                 <w:szCs w:val="19"/>
               </w:rPr>
-              <w:t xml:space="preserve">per richiesta</w:t>
+              <w:t xml:space="preserve">per GB conservato</w:t>
             </w:r>
           </w:p>
         </w:tc>
@@ -6458,7 +6857,7 @@
                 <w:sz w:val="19"/>
                 <w:szCs w:val="19"/>
               </w:rPr>
-              <w:t xml:space="preserve">990,00</w:t>
+              <w:t xml:space="preserve">come canone di conservazione</w:t>
             </w:r>
           </w:p>
         </w:tc>
@@ -6488,7 +6887,7 @@
                 <w:sz w:val="19"/>
                 <w:szCs w:val="19"/>
               </w:rPr>
-              <w:t xml:space="preserve">Cancellazione anticipata – oltre 1 GB</w:t>
+              <w:t xml:space="preserve">Cancellazione anticipata – fino a 1 GB</w:t>
             </w:r>
           </w:p>
         </w:tc>
@@ -6512,7 +6911,7 @@
                 <w:sz w:val="19"/>
                 <w:szCs w:val="19"/>
               </w:rPr>
-              <w:t xml:space="preserve">per GB aggiuntivo</w:t>
+              <w:t xml:space="preserve">per richiesta</w:t>
             </w:r>
           </w:p>
         </w:tc>
@@ -6536,7 +6935,7 @@
                 <w:sz w:val="19"/>
                 <w:szCs w:val="19"/>
               </w:rPr>
-              <w:t xml:space="preserve">490,00</w:t>
+              <w:t xml:space="preserve">990,00</w:t>
             </w:r>
           </w:p>
         </w:tc>
@@ -6567,7 +6966,7 @@
                 <w:sz w:val="19"/>
                 <w:szCs w:val="19"/>
               </w:rPr>
-              <w:t xml:space="preserve">Esibizione oltre le 6 incluse, o dopo la cessazione</w:t>
+              <w:t xml:space="preserve">Cancellazione anticipata – oltre 1 GB</w:t>
             </w:r>
           </w:p>
         </w:tc>
@@ -6592,7 +6991,7 @@
                 <w:sz w:val="19"/>
                 <w:szCs w:val="19"/>
               </w:rPr>
-              <w:t xml:space="preserve">per richiesta</w:t>
+              <w:t xml:space="preserve">per GB aggiuntivo</w:t>
             </w:r>
           </w:p>
         </w:tc>
@@ -6617,7 +7016,7 @@
                 <w:sz w:val="19"/>
                 <w:szCs w:val="19"/>
               </w:rPr>
-              <w:t xml:space="preserve">60,00</w:t>
+              <w:t xml:space="preserve">490,00</w:t>
             </w:r>
           </w:p>
         </w:tc>
@@ -6647,7 +7046,7 @@
                 <w:sz w:val="19"/>
                 <w:szCs w:val="19"/>
               </w:rPr>
-              <w:t xml:space="preserve">Esibizione urgente (entro 1 giorno lavorativo)</w:t>
+              <w:t xml:space="preserve">Esibizione oltre le 6 incluse, o dopo la cessazione</w:t>
             </w:r>
           </w:p>
         </w:tc>
@@ -6695,7 +7094,7 @@
                 <w:sz w:val="19"/>
                 <w:szCs w:val="19"/>
               </w:rPr>
-              <w:t xml:space="preserve">120,00</w:t>
+              <w:t xml:space="preserve">60,00</w:t>
             </w:r>
           </w:p>
         </w:tc>
@@ -6726,7 +7125,7 @@
                 <w:sz w:val="19"/>
                 <w:szCs w:val="19"/>
               </w:rPr>
-              <w:t xml:space="preserve">Esportazione in PdD per il trasferimento ad altro conservatore</w:t>
+              <w:t xml:space="preserve">Esibizione urgente (entro 1 giorno lavorativo)</w:t>
             </w:r>
           </w:p>
         </w:tc>
@@ -6751,7 +7150,7 @@
                 <w:sz w:val="19"/>
                 <w:szCs w:val="19"/>
               </w:rPr>
-              <w:t xml:space="preserve">per richiesta + per GB</w:t>
+              <w:t xml:space="preserve">per richiesta</w:t>
             </w:r>
           </w:p>
         </w:tc>
@@ -6776,7 +7175,7 @@
                 <w:sz w:val="19"/>
                 <w:szCs w:val="19"/>
               </w:rPr>
-              <w:t xml:space="preserve">290,00 + 90,00/GB</w:t>
+              <w:t xml:space="preserve">120,00</w:t>
             </w:r>
           </w:p>
         </w:tc>
@@ -6806,7 +7205,7 @@
                 <w:sz w:val="19"/>
                 <w:szCs w:val="19"/>
               </w:rPr>
-              <w:t xml:space="preserve">Integrazione API REST con il gestionale rifiuti del Cliente</w:t>
+              <w:t xml:space="preserve">Esportazione in PdD per il trasferimento ad altro conservatore</w:t>
             </w:r>
           </w:p>
         </w:tc>
@@ -6830,7 +7229,7 @@
                 <w:sz w:val="19"/>
                 <w:szCs w:val="19"/>
               </w:rPr>
-              <w:t xml:space="preserve">una tantum</w:t>
+              <w:t xml:space="preserve">per richiesta + per GB</w:t>
             </w:r>
           </w:p>
         </w:tc>
@@ -6854,7 +7253,7 @@
                 <w:sz w:val="19"/>
                 <w:szCs w:val="19"/>
               </w:rPr>
-              <w:t xml:space="preserve">da preventivare</w:t>
+              <w:t xml:space="preserve">290,00 + 90,00/GB</w:t>
             </w:r>
           </w:p>
         </w:tc>
@@ -6885,7 +7284,7 @@
                 <w:sz w:val="19"/>
                 <w:szCs w:val="19"/>
               </w:rPr>
-              <w:t xml:space="preserve">Attività extra (integrazione, formazione, supporto oltre il primo livello)</w:t>
+              <w:t xml:space="preserve">Integrazione API REST con il gestionale rifiuti del Cliente</w:t>
             </w:r>
           </w:p>
         </w:tc>
@@ -6910,7 +7309,7 @@
                 <w:sz w:val="19"/>
                 <w:szCs w:val="19"/>
               </w:rPr>
-              <w:t xml:space="preserve">per ora</w:t>
+              <w:t xml:space="preserve">una tantum</w:t>
             </w:r>
           </w:p>
         </w:tc>
@@ -6918,6 +7317,84 @@
           <w:tcPr>
             <w:tcW w:type="dxa" w:w="1928"/>
             <w:shd w:fill="EAF1F9" w:color="auto" w:val="clear"/>
+            <w:tcMar>
+              <w:top w:type="dxa" w:w="35"/>
+              <w:left w:type="dxa" w:w="100"/>
+              <w:bottom w:type="dxa" w:w="35"/>
+              <w:right w:type="dxa" w:w="100"/>
+            </w:tcMar>
+            <w:vAlign w:val="center"/>
+          </w:tcPr>
+          <w:p>
+            <w:pPr>
+              <w:spacing w:after="0" w:before="0"/>
+            </w:pPr>
+            <w:r>
+              <w:rPr>
+                <w:sz w:val="19"/>
+                <w:szCs w:val="19"/>
+              </w:rPr>
+              <w:t xml:space="preserve">da preventivare</w:t>
+            </w:r>
+          </w:p>
+        </w:tc>
+      </w:tr>
+      <w:tr>
+        <w:trPr>
+          <w:cantSplit/>
+          <w:tblHeader w:val="false"/>
+        </w:trPr>
+        <w:tc>
+          <w:tcPr>
+            <w:tcW w:type="dxa" w:w="4819"/>
+            <w:tcMar>
+              <w:top w:type="dxa" w:w="35"/>
+              <w:left w:type="dxa" w:w="100"/>
+              <w:bottom w:type="dxa" w:w="35"/>
+              <w:right w:type="dxa" w:w="100"/>
+            </w:tcMar>
+            <w:vAlign w:val="center"/>
+          </w:tcPr>
+          <w:p>
+            <w:pPr>
+              <w:spacing w:after="0" w:before="0"/>
+            </w:pPr>
+            <w:r>
+              <w:rPr>
+                <w:sz w:val="19"/>
+                <w:szCs w:val="19"/>
+              </w:rPr>
+              <w:t xml:space="preserve">Attività extra (integrazione, formazione, supporto oltre il primo livello)</w:t>
+            </w:r>
+          </w:p>
+        </w:tc>
+        <w:tc>
+          <w:tcPr>
+            <w:tcW w:type="dxa" w:w="2891"/>
+            <w:tcMar>
+              <w:top w:type="dxa" w:w="35"/>
+              <w:left w:type="dxa" w:w="100"/>
+              <w:bottom w:type="dxa" w:w="35"/>
+              <w:right w:type="dxa" w:w="100"/>
+            </w:tcMar>
+            <w:vAlign w:val="center"/>
+          </w:tcPr>
+          <w:p>
+            <w:pPr>
+              <w:spacing w:after="0" w:before="0"/>
+            </w:pPr>
+            <w:r>
+              <w:rPr>
+                <w:sz w:val="19"/>
+                <w:szCs w:val="19"/>
+              </w:rPr>
+              <w:t xml:space="preserve">per ora</w:t>
+            </w:r>
+          </w:p>
+        </w:tc>
+        <w:tc>
+          <w:tcPr>
+            <w:tcW w:type="dxa" w:w="1928"/>
             <w:tcMar>
               <w:top w:type="dxa" w:w="35"/>
               <w:left w:type="dxa" w:w="100"/>

</xml_diff>

<commit_message>
Listino: pacchetto con 100 MB, spazio a canone annuale, servizi rari separati
Co-Authored-By: Claude Opus 5.5 <noreply@anthropic.com>
Claude-Session: https://claude.ai/code/session_01WDncHtSFTdQuV5JxtunJCC
</commit_message>
<xml_diff>
--- a/Contratto_Conservazione_WsTech.docx
+++ b/Contratto_Conservazione_WsTech.docx
@@ -1188,7 +1188,7 @@
                 <w:sz w:val="19"/>
                 <w:szCs w:val="19"/>
               </w:rPr>
-              <w:t xml:space="preserve">GB</w:t>
+              <w:t xml:space="preserve">MB / GB</w:t>
             </w:r>
           </w:p>
         </w:tc>
@@ -1213,7 +1213,7 @@
                 <w:sz w:val="19"/>
                 <w:szCs w:val="19"/>
               </w:rPr>
-              <w:t xml:space="preserve">Gigabyte (1.000.000.000 byte) di documenti e metadati versati, come rilevato dal Sistema di Conservazione.</w:t>
+              <w:t xml:space="preserve">Megabyte (1.000.000 byte) e Gigabyte (1.000 MB) di documenti e metadati conservati, come rilevati dal Sistema di Conservazione.</w:t>
             </w:r>
           </w:p>
         </w:tc>
@@ -1243,7 +1243,7 @@
                 <w:sz w:val="19"/>
                 <w:szCs w:val="19"/>
               </w:rPr>
-              <w:t xml:space="preserve">Anagrafica</w:t>
+              <w:t xml:space="preserve">Pacchetto</w:t>
             </w:r>
           </w:p>
         </w:tc>
@@ -1267,7 +1267,7 @@
                 <w:sz w:val="19"/>
                 <w:szCs w:val="19"/>
               </w:rPr>
-              <w:t xml:space="preserve">Ogni soggetto Titolare dei documenti (ragione sociale o partita IVA) censito nel Sistema di Conservazione.</w:t>
+              <w:t xml:space="preserve">L'attivazione (Trasportatori) o il canone annuo Software (Produttori), che comprendono 100 MB di spazio di conservazione, il versamento a cura di WST, le ricevute, l'assistenza e fino a 6 esibizioni per anno.</w:t>
             </w:r>
           </w:p>
         </w:tc>
@@ -1298,7 +1298,7 @@
                 <w:sz w:val="19"/>
                 <w:szCs w:val="19"/>
               </w:rPr>
-              <w:t xml:space="preserve">Periodo di versamento</w:t>
+              <w:t xml:space="preserve">Esibizione</w:t>
             </w:r>
           </w:p>
         </w:tc>
@@ -1323,7 +1323,7 @@
                 <w:sz w:val="19"/>
                 <w:szCs w:val="19"/>
               </w:rPr>
-              <w:t xml:space="preserve">Il periodo in cui il Cliente può versare nuovi documenti. Coincide con la durata del Contratto.</w:t>
+              <w:t xml:space="preserve">L'invio al Cliente, su sua richiesta, di copia dei documenti conservati con le relative ricevute, ad esempio per un controllo degli enti competenti o per una verifica interna.</w:t>
             </w:r>
           </w:p>
         </w:tc>
@@ -1353,7 +1353,7 @@
                 <w:sz w:val="19"/>
                 <w:szCs w:val="19"/>
               </w:rPr>
-              <w:t xml:space="preserve">Periodo di conservazione</w:t>
+              <w:t xml:space="preserve">Anagrafica</w:t>
             </w:r>
           </w:p>
         </w:tc>
@@ -1377,7 +1377,7 @@
                 <w:sz w:val="19"/>
                 <w:szCs w:val="19"/>
               </w:rPr>
-              <w:t xml:space="preserve">Il periodo in cui i documenti restano conservati: 3 anni, salvo diversa indicazione nell'Allegato A. Può durare oltre il Contratto.</w:t>
+              <w:t xml:space="preserve">Ogni soggetto Titolare dei documenti (ragione sociale o partita IVA) censito nel Sistema di Conservazione.</w:t>
             </w:r>
           </w:p>
         </w:tc>
@@ -1408,7 +1408,7 @@
                 <w:sz w:val="19"/>
                 <w:szCs w:val="19"/>
               </w:rPr>
-              <w:t xml:space="preserve">Anno solare di versamento</w:t>
+              <w:t xml:space="preserve">Periodo di versamento</w:t>
             </w:r>
           </w:p>
         </w:tc>
@@ -1433,7 +1433,7 @@
                 <w:sz w:val="19"/>
                 <w:szCs w:val="19"/>
               </w:rPr>
-              <w:t xml:space="preserve">Il periodo dal 1° gennaio al 31 dicembre in cui un documento è versato. Il Periodo di conservazione si calcola a partire dal 31 dicembre di quell'anno.</w:t>
+              <w:t xml:space="preserve">Il periodo in cui il Cliente può versare nuovi documenti. Coincide con la durata del Contratto.</w:t>
             </w:r>
           </w:p>
         </w:tc>
@@ -1463,6 +1463,116 @@
                 <w:sz w:val="19"/>
                 <w:szCs w:val="19"/>
               </w:rPr>
+              <w:t xml:space="preserve">Periodo di conservazione</w:t>
+            </w:r>
+          </w:p>
+        </w:tc>
+        <w:tc>
+          <w:tcPr>
+            <w:tcW w:type="dxa" w:w="6361"/>
+            <w:tcMar>
+              <w:top w:type="dxa" w:w="35"/>
+              <w:left w:type="dxa" w:w="100"/>
+              <w:bottom w:type="dxa" w:w="35"/>
+              <w:right w:type="dxa" w:w="100"/>
+            </w:tcMar>
+            <w:vAlign w:val="center"/>
+          </w:tcPr>
+          <w:p>
+            <w:pPr>
+              <w:spacing w:after="0" w:before="0"/>
+            </w:pPr>
+            <w:r>
+              <w:rPr>
+                <w:sz w:val="19"/>
+                <w:szCs w:val="19"/>
+              </w:rPr>
+              <w:t xml:space="preserve">Il periodo in cui i documenti restano conservati: 3 anni, salvo diversa indicazione nell'Allegato A. Può durare oltre il Contratto.</w:t>
+            </w:r>
+          </w:p>
+        </w:tc>
+      </w:tr>
+      <w:tr>
+        <w:trPr>
+          <w:cantSplit/>
+          <w:tblHeader w:val="false"/>
+        </w:trPr>
+        <w:tc>
+          <w:tcPr>
+            <w:tcW w:type="dxa" w:w="3277"/>
+            <w:shd w:fill="EAF1F9" w:color="auto" w:val="clear"/>
+            <w:tcMar>
+              <w:top w:type="dxa" w:w="35"/>
+              <w:left w:type="dxa" w:w="100"/>
+              <w:bottom w:type="dxa" w:w="35"/>
+              <w:right w:type="dxa" w:w="100"/>
+            </w:tcMar>
+            <w:vAlign w:val="center"/>
+          </w:tcPr>
+          <w:p>
+            <w:pPr>
+              <w:spacing w:after="0" w:before="0"/>
+            </w:pPr>
+            <w:r>
+              <w:rPr>
+                <w:sz w:val="19"/>
+                <w:szCs w:val="19"/>
+              </w:rPr>
+              <w:t xml:space="preserve">Anno solare di versamento</w:t>
+            </w:r>
+          </w:p>
+        </w:tc>
+        <w:tc>
+          <w:tcPr>
+            <w:tcW w:type="dxa" w:w="6361"/>
+            <w:shd w:fill="EAF1F9" w:color="auto" w:val="clear"/>
+            <w:tcMar>
+              <w:top w:type="dxa" w:w="35"/>
+              <w:left w:type="dxa" w:w="100"/>
+              <w:bottom w:type="dxa" w:w="35"/>
+              <w:right w:type="dxa" w:w="100"/>
+            </w:tcMar>
+            <w:vAlign w:val="center"/>
+          </w:tcPr>
+          <w:p>
+            <w:pPr>
+              <w:spacing w:after="0" w:before="0"/>
+            </w:pPr>
+            <w:r>
+              <w:rPr>
+                <w:sz w:val="19"/>
+                <w:szCs w:val="19"/>
+              </w:rPr>
+              <w:t xml:space="preserve">Il periodo dal 1° gennaio al 31 dicembre in cui un documento è versato. Il Periodo di conservazione si calcola a partire dal 31 dicembre di quell'anno.</w:t>
+            </w:r>
+          </w:p>
+        </w:tc>
+      </w:tr>
+      <w:tr>
+        <w:trPr>
+          <w:cantSplit/>
+          <w:tblHeader w:val="false"/>
+        </w:trPr>
+        <w:tc>
+          <w:tcPr>
+            <w:tcW w:type="dxa" w:w="3277"/>
+            <w:tcMar>
+              <w:top w:type="dxa" w:w="35"/>
+              <w:left w:type="dxa" w:w="100"/>
+              <w:bottom w:type="dxa" w:w="35"/>
+              <w:right w:type="dxa" w:w="100"/>
+            </w:tcMar>
+            <w:vAlign w:val="center"/>
+          </w:tcPr>
+          <w:p>
+            <w:pPr>
+              <w:spacing w:after="0" w:before="0"/>
+            </w:pPr>
+            <w:r>
+              <w:rPr>
+                <w:sz w:val="19"/>
+                <w:szCs w:val="19"/>
+              </w:rPr>
               <w:t xml:space="preserve">Manuale</w:t>
             </w:r>
           </w:p>
@@ -2260,7 +2370,7 @@
         <w:t xml:space="preserve">6.2  </w:t>
       </w:r>
       <w:r>
-        <w:t xml:space="preserve">Tutti i corrispettivi variabili sono calcolati sullo spazio occupato e non sul numero di documenti. Il canone di conservazione si applica ai GB versati in ciascun anno solare, arrotondati per eccesso al GB intero, con un minimo fatturabile di 1 GB per anno. Il canone copre l'intero Periodo di conservazione di 3 anni dei documenti versati in quell'anno, anche dopo la cessazione del Contratto.</w:t>
+        <w:t xml:space="preserve">Tutti i corrispettivi variabili sono calcolati sullo spazio occupato e non sul numero di documenti. Il Pacchetto comprende 100 MB di spazio. Oltre i 100 MB si applica il canone annuale di conservazione dell'Allegato B, calcolato sullo spazio complessivamente occupato dai documenti del Cliente nel Sistema di Conservazione, arrotondato per eccesso al GB intero. Ogni documento occupa spazio, e quindi genera canone, per tutti i 3 anni del Periodo di conservazione.</w:t>
       </w:r>
     </w:p>
     <w:p>
@@ -2493,7 +2603,7 @@
                 <w:sz w:val="19"/>
                 <w:szCs w:val="19"/>
               </w:rPr>
-              <w:t xml:space="preserve">Canone annuo di servizio</w:t>
+              <w:t xml:space="preserve">Canone annuale di conservazione (oltre 100 MB)</w:t>
             </w:r>
           </w:p>
         </w:tc>
@@ -2517,7 +2627,7 @@
                 <w:sz w:val="19"/>
                 <w:szCs w:val="19"/>
               </w:rPr>
-              <w:t xml:space="preserve">Anticipato, a inizio di ogni anno solare (primo anno: alla firma, per intero)</w:t>
+              <w:t xml:space="preserve">Anticipato, a inizio anno, sullo spazio occupato al 1° gennaio; il passaggio a una fascia superiore in corso d'anno è fatturato nel mese in cui avviene</w:t>
             </w:r>
           </w:p>
         </w:tc>
@@ -2548,7 +2658,7 @@
                 <w:sz w:val="19"/>
                 <w:szCs w:val="19"/>
               </w:rPr>
-              <w:t xml:space="preserve">Canone di conservazione</w:t>
+              <w:t xml:space="preserve">Cancellazione anticipata</w:t>
             </w:r>
           </w:p>
         </w:tc>
@@ -2573,7 +2683,7 @@
                 <w:sz w:val="19"/>
                 <w:szCs w:val="19"/>
               </w:rPr>
-              <w:t xml:space="preserve">Anticipato, sui GB stimati nell'Allegato A (minimo 1 GB); eccedenze a fine mese</w:t>
+              <w:t xml:space="preserve">All'esecuzione di ogni richiesta</w:t>
             </w:r>
           </w:p>
         </w:tc>
@@ -2603,69 +2713,13 @@
                 <w:sz w:val="19"/>
                 <w:szCs w:val="19"/>
               </w:rPr>
-              <w:t xml:space="preserve">Cancellazione anticipata</w:t>
+              <w:t xml:space="preserve">Attività extra</w:t>
             </w:r>
           </w:p>
         </w:tc>
         <w:tc>
           <w:tcPr>
             <w:tcW w:type="dxa" w:w="6361"/>
-            <w:tcMar>
-              <w:top w:type="dxa" w:w="35"/>
-              <w:left w:type="dxa" w:w="100"/>
-              <w:bottom w:type="dxa" w:w="35"/>
-              <w:right w:type="dxa" w:w="100"/>
-            </w:tcMar>
-            <w:vAlign w:val="center"/>
-          </w:tcPr>
-          <w:p>
-            <w:pPr>
-              <w:spacing w:after="0" w:before="0"/>
-            </w:pPr>
-            <w:r>
-              <w:rPr>
-                <w:sz w:val="19"/>
-                <w:szCs w:val="19"/>
-              </w:rPr>
-              <w:t xml:space="preserve">All'esecuzione di ogni richiesta</w:t>
-            </w:r>
-          </w:p>
-        </w:tc>
-      </w:tr>
-      <w:tr>
-        <w:trPr>
-          <w:cantSplit/>
-          <w:tblHeader w:val="false"/>
-        </w:trPr>
-        <w:tc>
-          <w:tcPr>
-            <w:tcW w:type="dxa" w:w="3277"/>
-            <w:shd w:fill="EAF1F9" w:color="auto" w:val="clear"/>
-            <w:tcMar>
-              <w:top w:type="dxa" w:w="35"/>
-              <w:left w:type="dxa" w:w="100"/>
-              <w:bottom w:type="dxa" w:w="35"/>
-              <w:right w:type="dxa" w:w="100"/>
-            </w:tcMar>
-            <w:vAlign w:val="center"/>
-          </w:tcPr>
-          <w:p>
-            <w:pPr>
-              <w:spacing w:after="0" w:before="0"/>
-            </w:pPr>
-            <w:r>
-              <w:rPr>
-                <w:sz w:val="19"/>
-                <w:szCs w:val="19"/>
-              </w:rPr>
-              <w:t xml:space="preserve">Attività extra</w:t>
-            </w:r>
-          </w:p>
-        </w:tc>
-        <w:tc>
-          <w:tcPr>
-            <w:tcW w:type="dxa" w:w="6361"/>
-            <w:shd w:fill="EAF1F9" w:color="auto" w:val="clear"/>
             <w:tcMar>
               <w:top w:type="dxa" w:w="35"/>
               <w:left w:type="dxa" w:w="100"/>
@@ -2742,7 +2796,7 @@
         <w:t xml:space="preserve">6.6  </w:t>
       </w:r>
       <w:r>
-        <w:t xml:space="preserve">Se i GB versati superano quelli fatturati in anticipo, WST fattura l'eccedenza alla fine di ogni mese.</w:t>
+        <w:t xml:space="preserve">WST comunica al Cliente quando lo spazio occupato supera i 100 MB compresi nel Pacchetto o passa a una fascia superiore.</w:t>
       </w:r>
     </w:p>
     <w:p>
@@ -2759,7 +2813,7 @@
         <w:t xml:space="preserve">6.7  </w:t>
       </w:r>
       <w:r>
-        <w:t xml:space="preserve">Il canone di conservazione, il canone annuo di servizio, il canone annuo Software e l'attivazione non sono rimborsabili, neppure in caso di cessazione anticipata del Contratto o di cancellazione anticipata dei documenti.</w:t>
+        <w:t xml:space="preserve">Il canone di conservazione, il canone annuo Software e l'attivazione non sono rimborsabili, neppure in caso di cessazione anticipata del Contratto o di cancellazione anticipata dei documenti.</w:t>
       </w:r>
     </w:p>
     <w:p>
@@ -2836,7 +2890,7 @@
         <w:t xml:space="preserve">Scarto.</w:t>
       </w:r>
       <w:r>
-        <w:t xml:space="preserve"> Al termine del Periodo di conservazione il Conservatore elimina i relativi PdA, senza costi per il Cliente. Il Cliente può chiedere per iscritto, almeno 90 giorni prima, di prolungare la conservazione. Il prolungamento è fatturato, per ogni ulteriore triennio, al canone di conservazione per GB in vigore.</w:t>
+        <w:t xml:space="preserve"> Al termine del Periodo di conservazione il Conservatore elimina i relativi PdA, senza costi per il Cliente. Il Cliente può chiedere per iscritto, almeno 90 giorni prima, di prolungare la conservazione. Il prolungamento è fatturato, per ogni ulteriore anno, al canone annuale di conservazione in vigore.</w:t>
       </w:r>
     </w:p>
     <w:p>
@@ -3597,7 +3651,7 @@
         <w:t xml:space="preserve">Esibizione.</w:t>
       </w:r>
       <w:r>
-        <w:t xml:space="preserve"> Il Cliente chiede l'esibizione via PEC o e-mail, indicando i documenti (numero xFIR, periodo del registro, produttore o destinatario). WST consegna i documenti, in formato elettronico e con le relative ricevute di conservazione, entro 3 giorni lavorativi. Per richieste delle autorità di controllo il termine è di 1 giorno lavorativo, se la richiesta lo segnala. Sono incluse nel canone annuo fino a 6 richieste di esibizione per anno; le ulteriori e quelle urgenti sono fatturate secondo l'Allegato B.</w:t>
+        <w:t xml:space="preserve"> Il Cliente chiede l'esibizione via PEC o e-mail, indicando i documenti (numero xFIR, periodo del registro, produttore o destinatario). WST consegna i documenti, in formato elettronico e con le relative ricevute di conservazione, entro 3 giorni lavorativi. Per richieste delle autorità di controllo il termine è di 1 giorno lavorativo, se la richiesta lo segnala. Sono comprese nel Pacchetto fino a 6 richieste di esibizione per anno; le ulteriori e quelle urgenti sono fatturate secondo l'Allegato B.</w:t>
       </w:r>
     </w:p>
     <w:p>
@@ -3948,7 +4002,7 @@
         <w:t xml:space="preserve">11.2  </w:t>
       </w:r>
       <w:r>
-        <w:t xml:space="preserve">I documenti già versati restano conservati fino alla fine del proprio Periodo di conservazione, senza ulteriori costi di canone.</w:t>
+        <w:t xml:space="preserve">I documenti già versati restano conservati fino alla fine del proprio Periodo di conservazione. Alla cessazione WST fattura in un'unica soluzione i canoni annuali di conservazione residui fino allo scarto, calcolati sullo spazio occupato a quella data; resta escluso lo spazio entro i 100 MB.</w:t>
       </w:r>
     </w:p>
     <w:p>
@@ -5287,7 +5341,7 @@
                 <w:sz w:val="19"/>
                 <w:szCs w:val="19"/>
               </w:rPr>
-              <w:t xml:space="preserve">Volume stimato (GB/anno)</w:t>
+              <w:t xml:space="preserve">Volume stimato di documenti per anno (MB)</w:t>
             </w:r>
           </w:p>
         </w:tc>
@@ -6116,7 +6170,22 @@
         <w:jc w:val="both"/>
       </w:pPr>
       <w:r>
-        <w:t xml:space="preserve">Prezzi IVA esclusa, validi fino al 31 dicembre 2027. Tutti i corrispettivi variabili sono calcolati sullo spazio (GB), mai sul numero di documenti.</w:t>
+        <w:t xml:space="preserve">Prezzi IVA esclusa, validi fino al 31 dicembre 2027. Tutti i corrispettivi sono calcolati sullo spazio, mai sul numero di documenti.</w:t>
+      </w:r>
+    </w:p>
+    <w:p>
+      <w:pPr>
+        <w:keepNext/>
+        <w:keepLines/>
+        <w:spacing w:after="120" w:line="276"/>
+        <w:jc w:val="both"/>
+      </w:pPr>
+      <w:r>
+        <w:rPr>
+          <w:b/>
+          <w:bCs/>
+        </w:rPr>
+        <w:t xml:space="preserve">Pacchetto</w:t>
       </w:r>
     </w:p>
     <w:tbl>
@@ -6132,9 +6201,9 @@
         </w:tblBorders>
       </w:tblPr>
       <w:tblGrid>
-        <w:gridCol w:w="4819"/>
-        <w:gridCol w:w="2891"/>
-        <w:gridCol w:w="1928"/>
+        <w:gridCol w:w="5976"/>
+        <w:gridCol w:w="2120"/>
+        <w:gridCol w:w="1542"/>
       </w:tblGrid>
       <w:tr>
         <w:trPr>
@@ -6143,7 +6212,7 @@
         </w:trPr>
         <w:tc>
           <w:tcPr>
-            <w:tcW w:type="dxa" w:w="4819"/>
+            <w:tcW w:type="dxa" w:w="5976"/>
             <w:shd w:fill="6599CD" w:color="auto" w:val="clear"/>
             <w:tcMar>
               <w:top w:type="dxa" w:w="35"/>
@@ -6171,7 +6240,7 @@
         </w:tc>
         <w:tc>
           <w:tcPr>
-            <w:tcW w:type="dxa" w:w="2891"/>
+            <w:tcW w:type="dxa" w:w="2120"/>
             <w:shd w:fill="6599CD" w:color="auto" w:val="clear"/>
             <w:tcMar>
               <w:top w:type="dxa" w:w="35"/>
@@ -6199,7 +6268,7 @@
         </w:tc>
         <w:tc>
           <w:tcPr>
-            <w:tcW w:type="dxa" w:w="1928"/>
+            <w:tcW w:type="dxa" w:w="1542"/>
             <w:shd w:fill="6599CD" w:color="auto" w:val="clear"/>
             <w:tcMar>
               <w:top w:type="dxa" w:w="35"/>
@@ -6233,31 +6302,31 @@
         </w:trPr>
         <w:tc>
           <w:tcPr>
-            <w:tcW w:type="dxa" w:w="4819"/>
-            <w:tcMar>
-              <w:top w:type="dxa" w:w="35"/>
-              <w:left w:type="dxa" w:w="100"/>
-              <w:bottom w:type="dxa" w:w="35"/>
-              <w:right w:type="dxa" w:w="100"/>
-            </w:tcMar>
-            <w:vAlign w:val="center"/>
-          </w:tcPr>
-          <w:p>
-            <w:pPr>
-              <w:spacing w:after="0" w:before="0"/>
-            </w:pPr>
-            <w:r>
-              <w:rPr>
-                <w:sz w:val="19"/>
-                <w:szCs w:val="19"/>
-              </w:rPr>
-              <w:t xml:space="preserve">Attivazione del Servizio – solo Trasportatori già licenziatari del Software</w:t>
-            </w:r>
-          </w:p>
-        </w:tc>
-        <w:tc>
-          <w:tcPr>
-            <w:tcW w:type="dxa" w:w="2891"/>
+            <w:tcW w:type="dxa" w:w="5976"/>
+            <w:tcMar>
+              <w:top w:type="dxa" w:w="35"/>
+              <w:left w:type="dxa" w:w="100"/>
+              <w:bottom w:type="dxa" w:w="35"/>
+              <w:right w:type="dxa" w:w="100"/>
+            </w:tcMar>
+            <w:vAlign w:val="center"/>
+          </w:tcPr>
+          <w:p>
+            <w:pPr>
+              <w:spacing w:after="0" w:before="0"/>
+            </w:pPr>
+            <w:r>
+              <w:rPr>
+                <w:sz w:val="19"/>
+                <w:szCs w:val="19"/>
+              </w:rPr>
+              <w:t xml:space="preserve">Pacchetto Trasportatori (già licenziatari del Software): attivazione, 100 MB di spazio, versamento a cura di WST, ricevute, assistenza, fino a 6 esibizioni per anno</w:t>
+            </w:r>
+          </w:p>
+        </w:tc>
+        <w:tc>
+          <w:tcPr>
+            <w:tcW w:type="dxa" w:w="2120"/>
             <w:tcMar>
               <w:top w:type="dxa" w:w="35"/>
               <w:left w:type="dxa" w:w="100"/>
@@ -6281,7 +6350,7 @@
         </w:tc>
         <w:tc>
           <w:tcPr>
-            <w:tcW w:type="dxa" w:w="1928"/>
+            <w:tcW w:type="dxa" w:w="1542"/>
             <w:tcMar>
               <w:top w:type="dxa" w:w="35"/>
               <w:left w:type="dxa" w:w="100"/>
@@ -6311,7 +6380,7 @@
         </w:trPr>
         <w:tc>
           <w:tcPr>
-            <w:tcW w:type="dxa" w:w="4819"/>
+            <w:tcW w:type="dxa" w:w="5976"/>
             <w:shd w:fill="EAF1F9" w:color="auto" w:val="clear"/>
             <w:tcMar>
               <w:top w:type="dxa" w:w="35"/>
@@ -6330,13 +6399,13 @@
                 <w:sz w:val="19"/>
                 <w:szCs w:val="19"/>
               </w:rPr>
-              <w:t xml:space="preserve">Canone annuo Software con attivazione inclusa – solo Produttori</w:t>
-            </w:r>
-          </w:p>
-        </w:tc>
-        <w:tc>
-          <w:tcPr>
-            <w:tcW w:type="dxa" w:w="2891"/>
+              <w:t xml:space="preserve">Pacchetto Produttori: licenza del Software, attivazione, 100 MB di spazio, versamento a cura di WST, ricevute, assistenza, fino a 6 esibizioni per anno</w:t>
+            </w:r>
+          </w:p>
+        </w:tc>
+        <w:tc>
+          <w:tcPr>
+            <w:tcW w:type="dxa" w:w="2120"/>
             <w:shd w:fill="EAF1F9" w:color="auto" w:val="clear"/>
             <w:tcMar>
               <w:top w:type="dxa" w:w="35"/>
@@ -6361,7 +6430,7 @@
         </w:tc>
         <w:tc>
           <w:tcPr>
-            <w:tcW w:type="dxa" w:w="1928"/>
+            <w:tcW w:type="dxa" w:w="1542"/>
             <w:shd w:fill="EAF1F9" w:color="auto" w:val="clear"/>
             <w:tcMar>
               <w:top w:type="dxa" w:w="35"/>
@@ -6381,6 +6450,134 @@
                 <w:szCs w:val="19"/>
               </w:rPr>
               <w:t xml:space="preserve">150,00</w:t>
+            </w:r>
+          </w:p>
+        </w:tc>
+      </w:tr>
+    </w:tbl>
+    <w:p>
+      <w:pPr>
+        <w:spacing w:after="120"/>
+      </w:pPr>
+    </w:p>
+    <w:p>
+      <w:pPr>
+        <w:keepNext/>
+        <w:keepLines/>
+        <w:spacing w:after="120" w:line="276"/>
+        <w:jc w:val="both"/>
+      </w:pPr>
+      <w:r>
+        <w:rPr>
+          <w:b/>
+          <w:bCs/>
+        </w:rPr>
+        <w:t xml:space="preserve">Spazio oltre i 100 MB compresi nel Pacchetto</w:t>
+      </w:r>
+    </w:p>
+    <w:tbl>
+      <w:tblPr>
+        <w:tblW w:type="dxa" w:w="9638"/>
+        <w:tblBorders>
+          <w:top w:val="single" w:color="BFBFBF" w:sz="4"/>
+          <w:left w:val="single" w:color="BFBFBF" w:sz="4"/>
+          <w:bottom w:val="single" w:color="BFBFBF" w:sz="4"/>
+          <w:right w:val="single" w:color="BFBFBF" w:sz="4"/>
+          <w:insideH w:val="single" w:color="BFBFBF" w:sz="4"/>
+          <w:insideV w:val="single" w:color="BFBFBF" w:sz="4"/>
+        </w:tblBorders>
+      </w:tblPr>
+      <w:tblGrid>
+        <w:gridCol w:w="5976"/>
+        <w:gridCol w:w="2120"/>
+        <w:gridCol w:w="1542"/>
+      </w:tblGrid>
+      <w:tr>
+        <w:trPr>
+          <w:cantSplit/>
+          <w:tblHeader/>
+        </w:trPr>
+        <w:tc>
+          <w:tcPr>
+            <w:tcW w:type="dxa" w:w="5976"/>
+            <w:shd w:fill="6599CD" w:color="auto" w:val="clear"/>
+            <w:tcMar>
+              <w:top w:type="dxa" w:w="35"/>
+              <w:left w:type="dxa" w:w="100"/>
+              <w:bottom w:type="dxa" w:w="35"/>
+              <w:right w:type="dxa" w:w="100"/>
+            </w:tcMar>
+            <w:vAlign w:val="center"/>
+          </w:tcPr>
+          <w:p>
+            <w:pPr>
+              <w:spacing w:after="0" w:before="0"/>
+            </w:pPr>
+            <w:r>
+              <w:rPr>
+                <w:b/>
+                <w:bCs/>
+                <w:color w:val="FFFFFF"/>
+                <w:sz w:val="19"/>
+                <w:szCs w:val="19"/>
+              </w:rPr>
+              <w:t xml:space="preserve">Spazio occupato</w:t>
+            </w:r>
+          </w:p>
+        </w:tc>
+        <w:tc>
+          <w:tcPr>
+            <w:tcW w:type="dxa" w:w="2120"/>
+            <w:shd w:fill="6599CD" w:color="auto" w:val="clear"/>
+            <w:tcMar>
+              <w:top w:type="dxa" w:w="35"/>
+              <w:left w:type="dxa" w:w="100"/>
+              <w:bottom w:type="dxa" w:w="35"/>
+              <w:right w:type="dxa" w:w="100"/>
+            </w:tcMar>
+            <w:vAlign w:val="center"/>
+          </w:tcPr>
+          <w:p>
+            <w:pPr>
+              <w:spacing w:after="0" w:before="0"/>
+            </w:pPr>
+            <w:r>
+              <w:rPr>
+                <w:b/>
+                <w:bCs/>
+                <w:color w:val="FFFFFF"/>
+                <w:sz w:val="19"/>
+                <w:szCs w:val="19"/>
+              </w:rPr>
+              <w:t xml:space="preserve">Unità</w:t>
+            </w:r>
+          </w:p>
+        </w:tc>
+        <w:tc>
+          <w:tcPr>
+            <w:tcW w:type="dxa" w:w="1542"/>
+            <w:shd w:fill="6599CD" w:color="auto" w:val="clear"/>
+            <w:tcMar>
+              <w:top w:type="dxa" w:w="35"/>
+              <w:left w:type="dxa" w:w="100"/>
+              <w:bottom w:type="dxa" w:w="35"/>
+              <w:right w:type="dxa" w:w="100"/>
+            </w:tcMar>
+            <w:vAlign w:val="center"/>
+          </w:tcPr>
+          <w:p>
+            <w:pPr>
+              <w:spacing w:after="0" w:before="0"/>
+            </w:pPr>
+            <w:r>
+              <w:rPr>
+                <w:b/>
+                <w:bCs/>
+                <w:color w:val="FFFFFF"/>
+                <w:sz w:val="19"/>
+                <w:szCs w:val="19"/>
+              </w:rPr>
+              <w:t xml:space="preserve">Prezzo (€)</w:t>
             </w:r>
           </w:p>
         </w:tc>
@@ -6392,31 +6589,31 @@
         </w:trPr>
         <w:tc>
           <w:tcPr>
-            <w:tcW w:type="dxa" w:w="4819"/>
-            <w:tcMar>
-              <w:top w:type="dxa" w:w="35"/>
-              <w:left w:type="dxa" w:w="100"/>
-              <w:bottom w:type="dxa" w:w="35"/>
-              <w:right w:type="dxa" w:w="100"/>
-            </w:tcMar>
-            <w:vAlign w:val="center"/>
-          </w:tcPr>
-          <w:p>
-            <w:pPr>
-              <w:spacing w:after="0" w:before="0"/>
-            </w:pPr>
-            <w:r>
-              <w:rPr>
-                <w:sz w:val="19"/>
-                <w:szCs w:val="19"/>
-              </w:rPr>
-              <w:t xml:space="preserve">Canone annuo di servizio (anagrafica, versamento a cura di WST, ricevute, assistenza, fino a 6 esibizioni)</w:t>
-            </w:r>
-          </w:p>
-        </w:tc>
-        <w:tc>
-          <w:tcPr>
-            <w:tcW w:type="dxa" w:w="2891"/>
+            <w:tcW w:type="dxa" w:w="5976"/>
+            <w:tcMar>
+              <w:top w:type="dxa" w:w="35"/>
+              <w:left w:type="dxa" w:w="100"/>
+              <w:bottom w:type="dxa" w:w="35"/>
+              <w:right w:type="dxa" w:w="100"/>
+            </w:tcMar>
+            <w:vAlign w:val="center"/>
+          </w:tcPr>
+          <w:p>
+            <w:pPr>
+              <w:spacing w:after="0" w:before="0"/>
+            </w:pPr>
+            <w:r>
+              <w:rPr>
+                <w:sz w:val="19"/>
+                <w:szCs w:val="19"/>
+              </w:rPr>
+              <w:t xml:space="preserve">Da 100 MB a 1 GB</w:t>
+            </w:r>
+          </w:p>
+        </w:tc>
+        <w:tc>
+          <w:tcPr>
+            <w:tcW w:type="dxa" w:w="2120"/>
             <w:tcMar>
               <w:top w:type="dxa" w:w="35"/>
               <w:left w:type="dxa" w:w="100"/>
@@ -6440,25 +6637,25 @@
         </w:tc>
         <w:tc>
           <w:tcPr>
-            <w:tcW w:type="dxa" w:w="1928"/>
-            <w:tcMar>
-              <w:top w:type="dxa" w:w="35"/>
-              <w:left w:type="dxa" w:w="100"/>
-              <w:bottom w:type="dxa" w:w="35"/>
-              <w:right w:type="dxa" w:w="100"/>
-            </w:tcMar>
-            <w:vAlign w:val="center"/>
-          </w:tcPr>
-          <w:p>
-            <w:pPr>
-              <w:spacing w:after="0" w:before="0"/>
-            </w:pPr>
-            <w:r>
-              <w:rPr>
-                <w:sz w:val="19"/>
-                <w:szCs w:val="19"/>
-              </w:rPr>
-              <w:t xml:space="preserve">180,00</w:t>
+            <w:tcW w:type="dxa" w:w="1542"/>
+            <w:tcMar>
+              <w:top w:type="dxa" w:w="35"/>
+              <w:left w:type="dxa" w:w="100"/>
+              <w:bottom w:type="dxa" w:w="35"/>
+              <w:right w:type="dxa" w:w="100"/>
+            </w:tcMar>
+            <w:vAlign w:val="center"/>
+          </w:tcPr>
+          <w:p>
+            <w:pPr>
+              <w:spacing w:after="0" w:before="0"/>
+            </w:pPr>
+            <w:r>
+              <w:rPr>
+                <w:sz w:val="19"/>
+                <w:szCs w:val="19"/>
+              </w:rPr>
+              <w:t xml:space="preserve">130,00</w:t>
             </w:r>
           </w:p>
         </w:tc>
@@ -6470,7 +6667,7 @@
         </w:trPr>
         <w:tc>
           <w:tcPr>
-            <w:tcW w:type="dxa" w:w="4819"/>
+            <w:tcW w:type="dxa" w:w="5976"/>
             <w:shd w:fill="EAF1F9" w:color="auto" w:val="clear"/>
             <w:tcMar>
               <w:top w:type="dxa" w:w="35"/>
@@ -6489,13 +6686,13 @@
                 <w:sz w:val="19"/>
                 <w:szCs w:val="19"/>
               </w:rPr>
-              <w:t xml:space="preserve">Canone di conservazione triennale – 1° GB (minimo fatturabile)</w:t>
-            </w:r>
-          </w:p>
-        </w:tc>
-        <w:tc>
-          <w:tcPr>
-            <w:tcW w:type="dxa" w:w="2891"/>
+              <w:t xml:space="preserve">Dal 2° al 10° GB</w:t>
+            </w:r>
+          </w:p>
+        </w:tc>
+        <w:tc>
+          <w:tcPr>
+            <w:tcW w:type="dxa" w:w="2120"/>
             <w:shd w:fill="EAF1F9" w:color="auto" w:val="clear"/>
             <w:tcMar>
               <w:top w:type="dxa" w:w="35"/>
@@ -6514,13 +6711,13 @@
                 <w:sz w:val="19"/>
                 <w:szCs w:val="19"/>
               </w:rPr>
-              <w:t xml:space="preserve">per anno solare</w:t>
-            </w:r>
-          </w:p>
-        </w:tc>
-        <w:tc>
-          <w:tcPr>
-            <w:tcW w:type="dxa" w:w="1928"/>
+              <w:t xml:space="preserve">per GB, per anno</w:t>
+            </w:r>
+          </w:p>
+        </w:tc>
+        <w:tc>
+          <w:tcPr>
+            <w:tcW w:type="dxa" w:w="1542"/>
             <w:shd w:fill="EAF1F9" w:color="auto" w:val="clear"/>
             <w:tcMar>
               <w:top w:type="dxa" w:w="35"/>
@@ -6539,7 +6736,7 @@
                 <w:sz w:val="19"/>
                 <w:szCs w:val="19"/>
               </w:rPr>
-              <w:t xml:space="preserve">390,00</w:t>
+              <w:t xml:space="preserve">97,00</w:t>
             </w:r>
           </w:p>
         </w:tc>
@@ -6551,73 +6748,73 @@
         </w:trPr>
         <w:tc>
           <w:tcPr>
-            <w:tcW w:type="dxa" w:w="4819"/>
-            <w:tcMar>
-              <w:top w:type="dxa" w:w="35"/>
-              <w:left w:type="dxa" w:w="100"/>
-              <w:bottom w:type="dxa" w:w="35"/>
-              <w:right w:type="dxa" w:w="100"/>
-            </w:tcMar>
-            <w:vAlign w:val="center"/>
-          </w:tcPr>
-          <w:p>
-            <w:pPr>
-              <w:spacing w:after="0" w:before="0"/>
-            </w:pPr>
-            <w:r>
-              <w:rPr>
-                <w:sz w:val="19"/>
-                <w:szCs w:val="19"/>
-              </w:rPr>
-              <w:t xml:space="preserve">Canone di conservazione triennale – dal 2° al 10° GB</w:t>
-            </w:r>
-          </w:p>
-        </w:tc>
-        <w:tc>
-          <w:tcPr>
-            <w:tcW w:type="dxa" w:w="2891"/>
-            <w:tcMar>
-              <w:top w:type="dxa" w:w="35"/>
-              <w:left w:type="dxa" w:w="100"/>
-              <w:bottom w:type="dxa" w:w="35"/>
-              <w:right w:type="dxa" w:w="100"/>
-            </w:tcMar>
-            <w:vAlign w:val="center"/>
-          </w:tcPr>
-          <w:p>
-            <w:pPr>
-              <w:spacing w:after="0" w:before="0"/>
-            </w:pPr>
-            <w:r>
-              <w:rPr>
-                <w:sz w:val="19"/>
-                <w:szCs w:val="19"/>
-              </w:rPr>
-              <w:t xml:space="preserve">per GB versato</w:t>
-            </w:r>
-          </w:p>
-        </w:tc>
-        <w:tc>
-          <w:tcPr>
-            <w:tcW w:type="dxa" w:w="1928"/>
-            <w:tcMar>
-              <w:top w:type="dxa" w:w="35"/>
-              <w:left w:type="dxa" w:w="100"/>
-              <w:bottom w:type="dxa" w:w="35"/>
-              <w:right w:type="dxa" w:w="100"/>
-            </w:tcMar>
-            <w:vAlign w:val="center"/>
-          </w:tcPr>
-          <w:p>
-            <w:pPr>
-              <w:spacing w:after="0" w:before="0"/>
-            </w:pPr>
-            <w:r>
-              <w:rPr>
-                <w:sz w:val="19"/>
-                <w:szCs w:val="19"/>
-              </w:rPr>
-              <w:t xml:space="preserve">290,00</w:t>
+            <w:tcW w:type="dxa" w:w="5976"/>
+            <w:tcMar>
+              <w:top w:type="dxa" w:w="35"/>
+              <w:left w:type="dxa" w:w="100"/>
+              <w:bottom w:type="dxa" w:w="35"/>
+              <w:right w:type="dxa" w:w="100"/>
+            </w:tcMar>
+            <w:vAlign w:val="center"/>
+          </w:tcPr>
+          <w:p>
+            <w:pPr>
+              <w:spacing w:after="0" w:before="0"/>
+            </w:pPr>
+            <w:r>
+              <w:rPr>
+                <w:sz w:val="19"/>
+                <w:szCs w:val="19"/>
+              </w:rPr>
+              <w:t xml:space="preserve">Dall'11° al 100° GB</w:t>
+            </w:r>
+          </w:p>
+        </w:tc>
+        <w:tc>
+          <w:tcPr>
+            <w:tcW w:type="dxa" w:w="2120"/>
+            <w:tcMar>
+              <w:top w:type="dxa" w:w="35"/>
+              <w:left w:type="dxa" w:w="100"/>
+              <w:bottom w:type="dxa" w:w="35"/>
+              <w:right w:type="dxa" w:w="100"/>
+            </w:tcMar>
+            <w:vAlign w:val="center"/>
+          </w:tcPr>
+          <w:p>
+            <w:pPr>
+              <w:spacing w:after="0" w:before="0"/>
+            </w:pPr>
+            <w:r>
+              <w:rPr>
+                <w:sz w:val="19"/>
+                <w:szCs w:val="19"/>
+              </w:rPr>
+              <w:t xml:space="preserve">per GB, per anno</w:t>
+            </w:r>
+          </w:p>
+        </w:tc>
+        <w:tc>
+          <w:tcPr>
+            <w:tcW w:type="dxa" w:w="1542"/>
+            <w:tcMar>
+              <w:top w:type="dxa" w:w="35"/>
+              <w:left w:type="dxa" w:w="100"/>
+              <w:bottom w:type="dxa" w:w="35"/>
+              <w:right w:type="dxa" w:w="100"/>
+            </w:tcMar>
+            <w:vAlign w:val="center"/>
+          </w:tcPr>
+          <w:p>
+            <w:pPr>
+              <w:spacing w:after="0" w:before="0"/>
+            </w:pPr>
+            <w:r>
+              <w:rPr>
+                <w:sz w:val="19"/>
+                <w:szCs w:val="19"/>
+              </w:rPr>
+              <w:t xml:space="preserve">73,00</w:t>
             </w:r>
           </w:p>
         </w:tc>
@@ -6629,7 +6826,7 @@
         </w:trPr>
         <w:tc>
           <w:tcPr>
-            <w:tcW w:type="dxa" w:w="4819"/>
+            <w:tcW w:type="dxa" w:w="5976"/>
             <w:shd w:fill="EAF1F9" w:color="auto" w:val="clear"/>
             <w:tcMar>
               <w:top w:type="dxa" w:w="35"/>
@@ -6648,13 +6845,13 @@
                 <w:sz w:val="19"/>
                 <w:szCs w:val="19"/>
               </w:rPr>
-              <w:t xml:space="preserve">Canone di conservazione triennale – dall'11° al 100° GB</w:t>
-            </w:r>
-          </w:p>
-        </w:tc>
-        <w:tc>
-          <w:tcPr>
-            <w:tcW w:type="dxa" w:w="2891"/>
+              <w:t xml:space="preserve">Oltre 100 GB</w:t>
+            </w:r>
+          </w:p>
+        </w:tc>
+        <w:tc>
+          <w:tcPr>
+            <w:tcW w:type="dxa" w:w="2120"/>
             <w:shd w:fill="EAF1F9" w:color="auto" w:val="clear"/>
             <w:tcMar>
               <w:top w:type="dxa" w:w="35"/>
@@ -6673,13 +6870,13 @@
                 <w:sz w:val="19"/>
                 <w:szCs w:val="19"/>
               </w:rPr>
-              <w:t xml:space="preserve">per GB versato</w:t>
-            </w:r>
-          </w:p>
-        </w:tc>
-        <w:tc>
-          <w:tcPr>
-            <w:tcW w:type="dxa" w:w="1928"/>
+              <w:t xml:space="preserve">per GB, per anno</w:t>
+            </w:r>
+          </w:p>
+        </w:tc>
+        <w:tc>
+          <w:tcPr>
+            <w:tcW w:type="dxa" w:w="1542"/>
             <w:shd w:fill="EAF1F9" w:color="auto" w:val="clear"/>
             <w:tcMar>
               <w:top w:type="dxa" w:w="35"/>
@@ -6698,7 +6895,7 @@
                 <w:sz w:val="19"/>
                 <w:szCs w:val="19"/>
               </w:rPr>
-              <w:t xml:space="preserve">220,00</w:t>
+              <w:t xml:space="preserve">53,00</w:t>
             </w:r>
           </w:p>
         </w:tc>
@@ -6710,73 +6907,212 @@
         </w:trPr>
         <w:tc>
           <w:tcPr>
-            <w:tcW w:type="dxa" w:w="4819"/>
-            <w:tcMar>
-              <w:top w:type="dxa" w:w="35"/>
-              <w:left w:type="dxa" w:w="100"/>
-              <w:bottom w:type="dxa" w:w="35"/>
-              <w:right w:type="dxa" w:w="100"/>
-            </w:tcMar>
-            <w:vAlign w:val="center"/>
-          </w:tcPr>
-          <w:p>
-            <w:pPr>
-              <w:spacing w:after="0" w:before="0"/>
-            </w:pPr>
-            <w:r>
-              <w:rPr>
-                <w:sz w:val="19"/>
-                <w:szCs w:val="19"/>
-              </w:rPr>
-              <w:t xml:space="preserve">Canone di conservazione triennale – oltre 100 GB</w:t>
-            </w:r>
-          </w:p>
-        </w:tc>
-        <w:tc>
-          <w:tcPr>
-            <w:tcW w:type="dxa" w:w="2891"/>
-            <w:tcMar>
-              <w:top w:type="dxa" w:w="35"/>
-              <w:left w:type="dxa" w:w="100"/>
-              <w:bottom w:type="dxa" w:w="35"/>
-              <w:right w:type="dxa" w:w="100"/>
-            </w:tcMar>
-            <w:vAlign w:val="center"/>
-          </w:tcPr>
-          <w:p>
-            <w:pPr>
-              <w:spacing w:after="0" w:before="0"/>
-            </w:pPr>
-            <w:r>
-              <w:rPr>
-                <w:sz w:val="19"/>
-                <w:szCs w:val="19"/>
-              </w:rPr>
-              <w:t xml:space="preserve">per GB versato</w:t>
-            </w:r>
-          </w:p>
-        </w:tc>
-        <w:tc>
-          <w:tcPr>
-            <w:tcW w:type="dxa" w:w="1928"/>
-            <w:tcMar>
-              <w:top w:type="dxa" w:w="35"/>
-              <w:left w:type="dxa" w:w="100"/>
-              <w:bottom w:type="dxa" w:w="35"/>
-              <w:right w:type="dxa" w:w="100"/>
-            </w:tcMar>
-            <w:vAlign w:val="center"/>
-          </w:tcPr>
-          <w:p>
-            <w:pPr>
-              <w:spacing w:after="0" w:before="0"/>
-            </w:pPr>
-            <w:r>
-              <w:rPr>
-                <w:sz w:val="19"/>
-                <w:szCs w:val="19"/>
-              </w:rPr>
-              <w:t xml:space="preserve">160,00</w:t>
+            <w:tcW w:type="dxa" w:w="5976"/>
+            <w:tcMar>
+              <w:top w:type="dxa" w:w="35"/>
+              <w:left w:type="dxa" w:w="100"/>
+              <w:bottom w:type="dxa" w:w="35"/>
+              <w:right w:type="dxa" w:w="100"/>
+            </w:tcMar>
+            <w:vAlign w:val="center"/>
+          </w:tcPr>
+          <w:p>
+            <w:pPr>
+              <w:spacing w:after="0" w:before="0"/>
+            </w:pPr>
+            <w:r>
+              <w:rPr>
+                <w:sz w:val="19"/>
+                <w:szCs w:val="19"/>
+              </w:rPr>
+              <w:t xml:space="preserve">Prolungamento oltre i 3 anni</w:t>
+            </w:r>
+          </w:p>
+        </w:tc>
+        <w:tc>
+          <w:tcPr>
+            <w:tcW w:type="dxa" w:w="2120"/>
+            <w:tcMar>
+              <w:top w:type="dxa" w:w="35"/>
+              <w:left w:type="dxa" w:w="100"/>
+              <w:bottom w:type="dxa" w:w="35"/>
+              <w:right w:type="dxa" w:w="100"/>
+            </w:tcMar>
+            <w:vAlign w:val="center"/>
+          </w:tcPr>
+          <w:p>
+            <w:pPr>
+              <w:spacing w:after="0" w:before="0"/>
+            </w:pPr>
+            <w:r>
+              <w:rPr>
+                <w:sz w:val="19"/>
+                <w:szCs w:val="19"/>
+              </w:rPr>
+              <w:t xml:space="preserve">per anno</w:t>
+            </w:r>
+          </w:p>
+        </w:tc>
+        <w:tc>
+          <w:tcPr>
+            <w:tcW w:type="dxa" w:w="1542"/>
+            <w:tcMar>
+              <w:top w:type="dxa" w:w="35"/>
+              <w:left w:type="dxa" w:w="100"/>
+              <w:bottom w:type="dxa" w:w="35"/>
+              <w:right w:type="dxa" w:w="100"/>
+            </w:tcMar>
+            <w:vAlign w:val="center"/>
+          </w:tcPr>
+          <w:p>
+            <w:pPr>
+              <w:spacing w:after="0" w:before="0"/>
+            </w:pPr>
+            <w:r>
+              <w:rPr>
+                <w:sz w:val="19"/>
+                <w:szCs w:val="19"/>
+              </w:rPr>
+              <w:t xml:space="preserve">stesso canone annuale</w:t>
+            </w:r>
+          </w:p>
+        </w:tc>
+      </w:tr>
+    </w:tbl>
+    <w:p>
+      <w:pPr>
+        <w:spacing w:after="120"/>
+      </w:pPr>
+    </w:p>
+    <w:p>
+      <w:pPr>
+        <w:keepNext w:val="false"/>
+        <w:keepLines w:val="false"/>
+        <w:spacing w:after="120" w:line="276"/>
+        <w:jc w:val="both"/>
+      </w:pPr>
+      <w:r>
+        <w:t xml:space="preserve">Le fasce sono progressive: ogni fascia si applica solo ai GB che vi rientrano. Esempio: spazio occupato 3,4 GB, arrotondato a 4 GB = 130 + 3 × 97 = 421 € per anno. Finché lo spazio resta entro 100 MB il Cliente paga solo il Pacchetto.</w:t>
+      </w:r>
+    </w:p>
+    <w:p>
+      <w:pPr>
+        <w:keepNext/>
+        <w:keepLines/>
+        <w:spacing w:after="120" w:line="276"/>
+        <w:jc w:val="both"/>
+      </w:pPr>
+      <w:r>
+        <w:rPr>
+          <w:b/>
+          <w:bCs/>
+        </w:rPr>
+        <w:t xml:space="preserve">Servizi su richiesta</w:t>
+      </w:r>
+    </w:p>
+    <w:tbl>
+      <w:tblPr>
+        <w:tblW w:type="dxa" w:w="9638"/>
+        <w:tblBorders>
+          <w:top w:val="single" w:color="BFBFBF" w:sz="4"/>
+          <w:left w:val="single" w:color="BFBFBF" w:sz="4"/>
+          <w:bottom w:val="single" w:color="BFBFBF" w:sz="4"/>
+          <w:right w:val="single" w:color="BFBFBF" w:sz="4"/>
+          <w:insideH w:val="single" w:color="BFBFBF" w:sz="4"/>
+          <w:insideV w:val="single" w:color="BFBFBF" w:sz="4"/>
+        </w:tblBorders>
+      </w:tblPr>
+      <w:tblGrid>
+        <w:gridCol w:w="5976"/>
+        <w:gridCol w:w="2120"/>
+        <w:gridCol w:w="1542"/>
+      </w:tblGrid>
+      <w:tr>
+        <w:trPr>
+          <w:cantSplit/>
+          <w:tblHeader/>
+        </w:trPr>
+        <w:tc>
+          <w:tcPr>
+            <w:tcW w:type="dxa" w:w="5976"/>
+            <w:shd w:fill="6599CD" w:color="auto" w:val="clear"/>
+            <w:tcMar>
+              <w:top w:type="dxa" w:w="35"/>
+              <w:left w:type="dxa" w:w="100"/>
+              <w:bottom w:type="dxa" w:w="35"/>
+              <w:right w:type="dxa" w:w="100"/>
+            </w:tcMar>
+            <w:vAlign w:val="center"/>
+          </w:tcPr>
+          <w:p>
+            <w:pPr>
+              <w:spacing w:after="0" w:before="0"/>
+            </w:pPr>
+            <w:r>
+              <w:rPr>
+                <w:b/>
+                <w:bCs/>
+                <w:color w:val="FFFFFF"/>
+                <w:sz w:val="19"/>
+                <w:szCs w:val="19"/>
+              </w:rPr>
+              <w:t xml:space="preserve">Servizio</w:t>
+            </w:r>
+          </w:p>
+        </w:tc>
+        <w:tc>
+          <w:tcPr>
+            <w:tcW w:type="dxa" w:w="2120"/>
+            <w:shd w:fill="6599CD" w:color="auto" w:val="clear"/>
+            <w:tcMar>
+              <w:top w:type="dxa" w:w="35"/>
+              <w:left w:type="dxa" w:w="100"/>
+              <w:bottom w:type="dxa" w:w="35"/>
+              <w:right w:type="dxa" w:w="100"/>
+            </w:tcMar>
+            <w:vAlign w:val="center"/>
+          </w:tcPr>
+          <w:p>
+            <w:pPr>
+              <w:spacing w:after="0" w:before="0"/>
+            </w:pPr>
+            <w:r>
+              <w:rPr>
+                <w:b/>
+                <w:bCs/>
+                <w:color w:val="FFFFFF"/>
+                <w:sz w:val="19"/>
+                <w:szCs w:val="19"/>
+              </w:rPr>
+              <w:t xml:space="preserve">Unità</w:t>
+            </w:r>
+          </w:p>
+        </w:tc>
+        <w:tc>
+          <w:tcPr>
+            <w:tcW w:type="dxa" w:w="1542"/>
+            <w:shd w:fill="6599CD" w:color="auto" w:val="clear"/>
+            <w:tcMar>
+              <w:top w:type="dxa" w:w="35"/>
+              <w:left w:type="dxa" w:w="100"/>
+              <w:bottom w:type="dxa" w:w="35"/>
+              <w:right w:type="dxa" w:w="100"/>
+            </w:tcMar>
+            <w:vAlign w:val="center"/>
+          </w:tcPr>
+          <w:p>
+            <w:pPr>
+              <w:spacing w:after="0" w:before="0"/>
+            </w:pPr>
+            <w:r>
+              <w:rPr>
+                <w:b/>
+                <w:bCs/>
+                <w:color w:val="FFFFFF"/>
+                <w:sz w:val="19"/>
+                <w:szCs w:val="19"/>
+              </w:rPr>
+              <w:t xml:space="preserve">Prezzo (€)</w:t>
             </w:r>
           </w:p>
         </w:tc>
@@ -6788,76 +7124,73 @@
         </w:trPr>
         <w:tc>
           <w:tcPr>
-            <w:tcW w:type="dxa" w:w="4819"/>
-            <w:shd w:fill="EAF1F9" w:color="auto" w:val="clear"/>
-            <w:tcMar>
-              <w:top w:type="dxa" w:w="35"/>
-              <w:left w:type="dxa" w:w="100"/>
-              <w:bottom w:type="dxa" w:w="35"/>
-              <w:right w:type="dxa" w:w="100"/>
-            </w:tcMar>
-            <w:vAlign w:val="center"/>
-          </w:tcPr>
-          <w:p>
-            <w:pPr>
-              <w:spacing w:after="0" w:before="0"/>
-            </w:pPr>
-            <w:r>
-              <w:rPr>
-                <w:sz w:val="19"/>
-                <w:szCs w:val="19"/>
-              </w:rPr>
-              <w:t xml:space="preserve">Prolungamento della conservazione, per ogni ulteriore triennio</w:t>
-            </w:r>
-          </w:p>
-        </w:tc>
-        <w:tc>
-          <w:tcPr>
-            <w:tcW w:type="dxa" w:w="2891"/>
-            <w:shd w:fill="EAF1F9" w:color="auto" w:val="clear"/>
-            <w:tcMar>
-              <w:top w:type="dxa" w:w="35"/>
-              <w:left w:type="dxa" w:w="100"/>
-              <w:bottom w:type="dxa" w:w="35"/>
-              <w:right w:type="dxa" w:w="100"/>
-            </w:tcMar>
-            <w:vAlign w:val="center"/>
-          </w:tcPr>
-          <w:p>
-            <w:pPr>
-              <w:spacing w:after="0" w:before="0"/>
-            </w:pPr>
-            <w:r>
-              <w:rPr>
-                <w:sz w:val="19"/>
-                <w:szCs w:val="19"/>
-              </w:rPr>
-              <w:t xml:space="preserve">per GB conservato</w:t>
-            </w:r>
-          </w:p>
-        </w:tc>
-        <w:tc>
-          <w:tcPr>
-            <w:tcW w:type="dxa" w:w="1928"/>
-            <w:shd w:fill="EAF1F9" w:color="auto" w:val="clear"/>
-            <w:tcMar>
-              <w:top w:type="dxa" w:w="35"/>
-              <w:left w:type="dxa" w:w="100"/>
-              <w:bottom w:type="dxa" w:w="35"/>
-              <w:right w:type="dxa" w:w="100"/>
-            </w:tcMar>
-            <w:vAlign w:val="center"/>
-          </w:tcPr>
-          <w:p>
-            <w:pPr>
-              <w:spacing w:after="0" w:before="0"/>
-            </w:pPr>
-            <w:r>
-              <w:rPr>
-                <w:sz w:val="19"/>
-                <w:szCs w:val="19"/>
-              </w:rPr>
-              <w:t xml:space="preserve">come canone di conservazione</w:t>
+            <w:tcW w:type="dxa" w:w="5976"/>
+            <w:tcMar>
+              <w:top w:type="dxa" w:w="35"/>
+              <w:left w:type="dxa" w:w="100"/>
+              <w:bottom w:type="dxa" w:w="35"/>
+              <w:right w:type="dxa" w:w="100"/>
+            </w:tcMar>
+            <w:vAlign w:val="center"/>
+          </w:tcPr>
+          <w:p>
+            <w:pPr>
+              <w:spacing w:after="0" w:before="0"/>
+            </w:pPr>
+            <w:r>
+              <w:rPr>
+                <w:sz w:val="19"/>
+                <w:szCs w:val="19"/>
+              </w:rPr>
+              <w:t xml:space="preserve">Esibizione oltre le 6 comprese, o dopo la fine del Contratto</w:t>
+            </w:r>
+          </w:p>
+        </w:tc>
+        <w:tc>
+          <w:tcPr>
+            <w:tcW w:type="dxa" w:w="2120"/>
+            <w:tcMar>
+              <w:top w:type="dxa" w:w="35"/>
+              <w:left w:type="dxa" w:w="100"/>
+              <w:bottom w:type="dxa" w:w="35"/>
+              <w:right w:type="dxa" w:w="100"/>
+            </w:tcMar>
+            <w:vAlign w:val="center"/>
+          </w:tcPr>
+          <w:p>
+            <w:pPr>
+              <w:spacing w:after="0" w:before="0"/>
+            </w:pPr>
+            <w:r>
+              <w:rPr>
+                <w:sz w:val="19"/>
+                <w:szCs w:val="19"/>
+              </w:rPr>
+              <w:t xml:space="preserve">per richiesta</w:t>
+            </w:r>
+          </w:p>
+        </w:tc>
+        <w:tc>
+          <w:tcPr>
+            <w:tcW w:type="dxa" w:w="1542"/>
+            <w:tcMar>
+              <w:top w:type="dxa" w:w="35"/>
+              <w:left w:type="dxa" w:w="100"/>
+              <w:bottom w:type="dxa" w:w="35"/>
+              <w:right w:type="dxa" w:w="100"/>
+            </w:tcMar>
+            <w:vAlign w:val="center"/>
+          </w:tcPr>
+          <w:p>
+            <w:pPr>
+              <w:spacing w:after="0" w:before="0"/>
+            </w:pPr>
+            <w:r>
+              <w:rPr>
+                <w:sz w:val="19"/>
+                <w:szCs w:val="19"/>
+              </w:rPr>
+              <w:t xml:space="preserve">60,00</w:t>
             </w:r>
           </w:p>
         </w:tc>
@@ -6869,31 +7202,33 @@
         </w:trPr>
         <w:tc>
           <w:tcPr>
-            <w:tcW w:type="dxa" w:w="4819"/>
-            <w:tcMar>
-              <w:top w:type="dxa" w:w="35"/>
-              <w:left w:type="dxa" w:w="100"/>
-              <w:bottom w:type="dxa" w:w="35"/>
-              <w:right w:type="dxa" w:w="100"/>
-            </w:tcMar>
-            <w:vAlign w:val="center"/>
-          </w:tcPr>
-          <w:p>
-            <w:pPr>
-              <w:spacing w:after="0" w:before="0"/>
-            </w:pPr>
-            <w:r>
-              <w:rPr>
-                <w:sz w:val="19"/>
-                <w:szCs w:val="19"/>
-              </w:rPr>
-              <w:t xml:space="preserve">Cancellazione anticipata – fino a 1 GB</w:t>
-            </w:r>
-          </w:p>
-        </w:tc>
-        <w:tc>
-          <w:tcPr>
-            <w:tcW w:type="dxa" w:w="2891"/>
+            <w:tcW w:type="dxa" w:w="5976"/>
+            <w:shd w:fill="EAF1F9" w:color="auto" w:val="clear"/>
+            <w:tcMar>
+              <w:top w:type="dxa" w:w="35"/>
+              <w:left w:type="dxa" w:w="100"/>
+              <w:bottom w:type="dxa" w:w="35"/>
+              <w:right w:type="dxa" w:w="100"/>
+            </w:tcMar>
+            <w:vAlign w:val="center"/>
+          </w:tcPr>
+          <w:p>
+            <w:pPr>
+              <w:spacing w:after="0" w:before="0"/>
+            </w:pPr>
+            <w:r>
+              <w:rPr>
+                <w:sz w:val="19"/>
+                <w:szCs w:val="19"/>
+              </w:rPr>
+              <w:t xml:space="preserve">Esibizione urgente (entro 1 giorno lavorativo)</w:t>
+            </w:r>
+          </w:p>
+        </w:tc>
+        <w:tc>
+          <w:tcPr>
+            <w:tcW w:type="dxa" w:w="2120"/>
+            <w:shd w:fill="EAF1F9" w:color="auto" w:val="clear"/>
             <w:tcMar>
               <w:top w:type="dxa" w:w="35"/>
               <w:left w:type="dxa" w:w="100"/>
@@ -6917,25 +7252,26 @@
         </w:tc>
         <w:tc>
           <w:tcPr>
-            <w:tcW w:type="dxa" w:w="1928"/>
-            <w:tcMar>
-              <w:top w:type="dxa" w:w="35"/>
-              <w:left w:type="dxa" w:w="100"/>
-              <w:bottom w:type="dxa" w:w="35"/>
-              <w:right w:type="dxa" w:w="100"/>
-            </w:tcMar>
-            <w:vAlign w:val="center"/>
-          </w:tcPr>
-          <w:p>
-            <w:pPr>
-              <w:spacing w:after="0" w:before="0"/>
-            </w:pPr>
-            <w:r>
-              <w:rPr>
-                <w:sz w:val="19"/>
-                <w:szCs w:val="19"/>
-              </w:rPr>
-              <w:t xml:space="preserve">990,00</w:t>
+            <w:tcW w:type="dxa" w:w="1542"/>
+            <w:shd w:fill="EAF1F9" w:color="auto" w:val="clear"/>
+            <w:tcMar>
+              <w:top w:type="dxa" w:w="35"/>
+              <w:left w:type="dxa" w:w="100"/>
+              <w:bottom w:type="dxa" w:w="35"/>
+              <w:right w:type="dxa" w:w="100"/>
+            </w:tcMar>
+            <w:vAlign w:val="center"/>
+          </w:tcPr>
+          <w:p>
+            <w:pPr>
+              <w:spacing w:after="0" w:before="0"/>
+            </w:pPr>
+            <w:r>
+              <w:rPr>
+                <w:sz w:val="19"/>
+                <w:szCs w:val="19"/>
+              </w:rPr>
+              <w:t xml:space="preserve">120,00</w:t>
             </w:r>
           </w:p>
         </w:tc>
@@ -6947,76 +7283,73 @@
         </w:trPr>
         <w:tc>
           <w:tcPr>
-            <w:tcW w:type="dxa" w:w="4819"/>
-            <w:shd w:fill="EAF1F9" w:color="auto" w:val="clear"/>
-            <w:tcMar>
-              <w:top w:type="dxa" w:w="35"/>
-              <w:left w:type="dxa" w:w="100"/>
-              <w:bottom w:type="dxa" w:w="35"/>
-              <w:right w:type="dxa" w:w="100"/>
-            </w:tcMar>
-            <w:vAlign w:val="center"/>
-          </w:tcPr>
-          <w:p>
-            <w:pPr>
-              <w:spacing w:after="0" w:before="0"/>
-            </w:pPr>
-            <w:r>
-              <w:rPr>
-                <w:sz w:val="19"/>
-                <w:szCs w:val="19"/>
-              </w:rPr>
-              <w:t xml:space="preserve">Cancellazione anticipata – oltre 1 GB</w:t>
-            </w:r>
-          </w:p>
-        </w:tc>
-        <w:tc>
-          <w:tcPr>
-            <w:tcW w:type="dxa" w:w="2891"/>
-            <w:shd w:fill="EAF1F9" w:color="auto" w:val="clear"/>
-            <w:tcMar>
-              <w:top w:type="dxa" w:w="35"/>
-              <w:left w:type="dxa" w:w="100"/>
-              <w:bottom w:type="dxa" w:w="35"/>
-              <w:right w:type="dxa" w:w="100"/>
-            </w:tcMar>
-            <w:vAlign w:val="center"/>
-          </w:tcPr>
-          <w:p>
-            <w:pPr>
-              <w:spacing w:after="0" w:before="0"/>
-            </w:pPr>
-            <w:r>
-              <w:rPr>
-                <w:sz w:val="19"/>
-                <w:szCs w:val="19"/>
-              </w:rPr>
-              <w:t xml:space="preserve">per GB aggiuntivo</w:t>
-            </w:r>
-          </w:p>
-        </w:tc>
-        <w:tc>
-          <w:tcPr>
-            <w:tcW w:type="dxa" w:w="1928"/>
-            <w:shd w:fill="EAF1F9" w:color="auto" w:val="clear"/>
-            <w:tcMar>
-              <w:top w:type="dxa" w:w="35"/>
-              <w:left w:type="dxa" w:w="100"/>
-              <w:bottom w:type="dxa" w:w="35"/>
-              <w:right w:type="dxa" w:w="100"/>
-            </w:tcMar>
-            <w:vAlign w:val="center"/>
-          </w:tcPr>
-          <w:p>
-            <w:pPr>
-              <w:spacing w:after="0" w:before="0"/>
-            </w:pPr>
-            <w:r>
-              <w:rPr>
-                <w:sz w:val="19"/>
-                <w:szCs w:val="19"/>
-              </w:rPr>
-              <w:t xml:space="preserve">490,00</w:t>
+            <w:tcW w:type="dxa" w:w="5976"/>
+            <w:tcMar>
+              <w:top w:type="dxa" w:w="35"/>
+              <w:left w:type="dxa" w:w="100"/>
+              <w:bottom w:type="dxa" w:w="35"/>
+              <w:right w:type="dxa" w:w="100"/>
+            </w:tcMar>
+            <w:vAlign w:val="center"/>
+          </w:tcPr>
+          <w:p>
+            <w:pPr>
+              <w:spacing w:after="0" w:before="0"/>
+            </w:pPr>
+            <w:r>
+              <w:rPr>
+                <w:sz w:val="19"/>
+                <w:szCs w:val="19"/>
+              </w:rPr>
+              <w:t xml:space="preserve">Attività extra (integrazione, formazione, supporto oltre il primo livello)</w:t>
+            </w:r>
+          </w:p>
+        </w:tc>
+        <w:tc>
+          <w:tcPr>
+            <w:tcW w:type="dxa" w:w="2120"/>
+            <w:tcMar>
+              <w:top w:type="dxa" w:w="35"/>
+              <w:left w:type="dxa" w:w="100"/>
+              <w:bottom w:type="dxa" w:w="35"/>
+              <w:right w:type="dxa" w:w="100"/>
+            </w:tcMar>
+            <w:vAlign w:val="center"/>
+          </w:tcPr>
+          <w:p>
+            <w:pPr>
+              <w:spacing w:after="0" w:before="0"/>
+            </w:pPr>
+            <w:r>
+              <w:rPr>
+                <w:sz w:val="19"/>
+                <w:szCs w:val="19"/>
+              </w:rPr>
+              <w:t xml:space="preserve">per ora</w:t>
+            </w:r>
+          </w:p>
+        </w:tc>
+        <w:tc>
+          <w:tcPr>
+            <w:tcW w:type="dxa" w:w="1542"/>
+            <w:tcMar>
+              <w:top w:type="dxa" w:w="35"/>
+              <w:left w:type="dxa" w:w="100"/>
+              <w:bottom w:type="dxa" w:w="35"/>
+              <w:right w:type="dxa" w:w="100"/>
+            </w:tcMar>
+            <w:vAlign w:val="center"/>
+          </w:tcPr>
+          <w:p>
+            <w:pPr>
+              <w:spacing w:after="0" w:before="0"/>
+            </w:pPr>
+            <w:r>
+              <w:rPr>
+                <w:sz w:val="19"/>
+                <w:szCs w:val="19"/>
+              </w:rPr>
+              <w:t xml:space="preserve">50,00</w:t>
             </w:r>
           </w:p>
         </w:tc>
@@ -7028,85 +7361,7 @@
         </w:trPr>
         <w:tc>
           <w:tcPr>
-            <w:tcW w:type="dxa" w:w="4819"/>
-            <w:tcMar>
-              <w:top w:type="dxa" w:w="35"/>
-              <w:left w:type="dxa" w:w="100"/>
-              <w:bottom w:type="dxa" w:w="35"/>
-              <w:right w:type="dxa" w:w="100"/>
-            </w:tcMar>
-            <w:vAlign w:val="center"/>
-          </w:tcPr>
-          <w:p>
-            <w:pPr>
-              <w:spacing w:after="0" w:before="0"/>
-            </w:pPr>
-            <w:r>
-              <w:rPr>
-                <w:sz w:val="19"/>
-                <w:szCs w:val="19"/>
-              </w:rPr>
-              <w:t xml:space="preserve">Esibizione oltre le 6 incluse, o dopo la cessazione</w:t>
-            </w:r>
-          </w:p>
-        </w:tc>
-        <w:tc>
-          <w:tcPr>
-            <w:tcW w:type="dxa" w:w="2891"/>
-            <w:tcMar>
-              <w:top w:type="dxa" w:w="35"/>
-              <w:left w:type="dxa" w:w="100"/>
-              <w:bottom w:type="dxa" w:w="35"/>
-              <w:right w:type="dxa" w:w="100"/>
-            </w:tcMar>
-            <w:vAlign w:val="center"/>
-          </w:tcPr>
-          <w:p>
-            <w:pPr>
-              <w:spacing w:after="0" w:before="0"/>
-            </w:pPr>
-            <w:r>
-              <w:rPr>
-                <w:sz w:val="19"/>
-                <w:szCs w:val="19"/>
-              </w:rPr>
-              <w:t xml:space="preserve">per richiesta</w:t>
-            </w:r>
-          </w:p>
-        </w:tc>
-        <w:tc>
-          <w:tcPr>
-            <w:tcW w:type="dxa" w:w="1928"/>
-            <w:tcMar>
-              <w:top w:type="dxa" w:w="35"/>
-              <w:left w:type="dxa" w:w="100"/>
-              <w:bottom w:type="dxa" w:w="35"/>
-              <w:right w:type="dxa" w:w="100"/>
-            </w:tcMar>
-            <w:vAlign w:val="center"/>
-          </w:tcPr>
-          <w:p>
-            <w:pPr>
-              <w:spacing w:after="0" w:before="0"/>
-            </w:pPr>
-            <w:r>
-              <w:rPr>
-                <w:sz w:val="19"/>
-                <w:szCs w:val="19"/>
-              </w:rPr>
-              <w:t xml:space="preserve">60,00</w:t>
-            </w:r>
-          </w:p>
-        </w:tc>
-      </w:tr>
-      <w:tr>
-        <w:trPr>
-          <w:cantSplit/>
-          <w:tblHeader w:val="false"/>
-        </w:trPr>
-        <w:tc>
-          <w:tcPr>
-            <w:tcW w:type="dxa" w:w="4819"/>
+            <w:tcW w:type="dxa" w:w="5976"/>
             <w:shd w:fill="EAF1F9" w:color="auto" w:val="clear"/>
             <w:tcMar>
               <w:top w:type="dxa" w:w="35"/>
@@ -7125,13 +7380,13 @@
                 <w:sz w:val="19"/>
                 <w:szCs w:val="19"/>
               </w:rPr>
-              <w:t xml:space="preserve">Esibizione urgente (entro 1 giorno lavorativo)</w:t>
-            </w:r>
-          </w:p>
-        </w:tc>
-        <w:tc>
-          <w:tcPr>
-            <w:tcW w:type="dxa" w:w="2891"/>
+              <w:t xml:space="preserve">Integrazione API REST con il gestionale rifiuti del Cliente</w:t>
+            </w:r>
+          </w:p>
+        </w:tc>
+        <w:tc>
+          <w:tcPr>
+            <w:tcW w:type="dxa" w:w="2120"/>
             <w:shd w:fill="EAF1F9" w:color="auto" w:val="clear"/>
             <w:tcMar>
               <w:top w:type="dxa" w:w="35"/>
@@ -7150,13 +7405,13 @@
                 <w:sz w:val="19"/>
                 <w:szCs w:val="19"/>
               </w:rPr>
-              <w:t xml:space="preserve">per richiesta</w:t>
-            </w:r>
-          </w:p>
-        </w:tc>
-        <w:tc>
-          <w:tcPr>
-            <w:tcW w:type="dxa" w:w="1928"/>
+              <w:t xml:space="preserve">una tantum</w:t>
+            </w:r>
+          </w:p>
+        </w:tc>
+        <w:tc>
+          <w:tcPr>
+            <w:tcW w:type="dxa" w:w="1542"/>
             <w:shd w:fill="EAF1F9" w:color="auto" w:val="clear"/>
             <w:tcMar>
               <w:top w:type="dxa" w:w="35"/>
@@ -7175,244 +7430,7 @@
                 <w:sz w:val="19"/>
                 <w:szCs w:val="19"/>
               </w:rPr>
-              <w:t xml:space="preserve">120,00</w:t>
-            </w:r>
-          </w:p>
-        </w:tc>
-      </w:tr>
-      <w:tr>
-        <w:trPr>
-          <w:cantSplit/>
-          <w:tblHeader w:val="false"/>
-        </w:trPr>
-        <w:tc>
-          <w:tcPr>
-            <w:tcW w:type="dxa" w:w="4819"/>
-            <w:tcMar>
-              <w:top w:type="dxa" w:w="35"/>
-              <w:left w:type="dxa" w:w="100"/>
-              <w:bottom w:type="dxa" w:w="35"/>
-              <w:right w:type="dxa" w:w="100"/>
-            </w:tcMar>
-            <w:vAlign w:val="center"/>
-          </w:tcPr>
-          <w:p>
-            <w:pPr>
-              <w:spacing w:after="0" w:before="0"/>
-            </w:pPr>
-            <w:r>
-              <w:rPr>
-                <w:sz w:val="19"/>
-                <w:szCs w:val="19"/>
-              </w:rPr>
-              <w:t xml:space="preserve">Esportazione in PdD per il trasferimento ad altro conservatore</w:t>
-            </w:r>
-          </w:p>
-        </w:tc>
-        <w:tc>
-          <w:tcPr>
-            <w:tcW w:type="dxa" w:w="2891"/>
-            <w:tcMar>
-              <w:top w:type="dxa" w:w="35"/>
-              <w:left w:type="dxa" w:w="100"/>
-              <w:bottom w:type="dxa" w:w="35"/>
-              <w:right w:type="dxa" w:w="100"/>
-            </w:tcMar>
-            <w:vAlign w:val="center"/>
-          </w:tcPr>
-          <w:p>
-            <w:pPr>
-              <w:spacing w:after="0" w:before="0"/>
-            </w:pPr>
-            <w:r>
-              <w:rPr>
-                <w:sz w:val="19"/>
-                <w:szCs w:val="19"/>
-              </w:rPr>
-              <w:t xml:space="preserve">per richiesta + per GB</w:t>
-            </w:r>
-          </w:p>
-        </w:tc>
-        <w:tc>
-          <w:tcPr>
-            <w:tcW w:type="dxa" w:w="1928"/>
-            <w:tcMar>
-              <w:top w:type="dxa" w:w="35"/>
-              <w:left w:type="dxa" w:w="100"/>
-              <w:bottom w:type="dxa" w:w="35"/>
-              <w:right w:type="dxa" w:w="100"/>
-            </w:tcMar>
-            <w:vAlign w:val="center"/>
-          </w:tcPr>
-          <w:p>
-            <w:pPr>
-              <w:spacing w:after="0" w:before="0"/>
-            </w:pPr>
-            <w:r>
-              <w:rPr>
-                <w:sz w:val="19"/>
-                <w:szCs w:val="19"/>
-              </w:rPr>
-              <w:t xml:space="preserve">290,00 + 90,00/GB</w:t>
-            </w:r>
-          </w:p>
-        </w:tc>
-      </w:tr>
-      <w:tr>
-        <w:trPr>
-          <w:cantSplit/>
-          <w:tblHeader w:val="false"/>
-        </w:trPr>
-        <w:tc>
-          <w:tcPr>
-            <w:tcW w:type="dxa" w:w="4819"/>
-            <w:shd w:fill="EAF1F9" w:color="auto" w:val="clear"/>
-            <w:tcMar>
-              <w:top w:type="dxa" w:w="35"/>
-              <w:left w:type="dxa" w:w="100"/>
-              <w:bottom w:type="dxa" w:w="35"/>
-              <w:right w:type="dxa" w:w="100"/>
-            </w:tcMar>
-            <w:vAlign w:val="center"/>
-          </w:tcPr>
-          <w:p>
-            <w:pPr>
-              <w:spacing w:after="0" w:before="0"/>
-            </w:pPr>
-            <w:r>
-              <w:rPr>
-                <w:sz w:val="19"/>
-                <w:szCs w:val="19"/>
-              </w:rPr>
-              <w:t xml:space="preserve">Integrazione API REST con il gestionale rifiuti del Cliente</w:t>
-            </w:r>
-          </w:p>
-        </w:tc>
-        <w:tc>
-          <w:tcPr>
-            <w:tcW w:type="dxa" w:w="2891"/>
-            <w:shd w:fill="EAF1F9" w:color="auto" w:val="clear"/>
-            <w:tcMar>
-              <w:top w:type="dxa" w:w="35"/>
-              <w:left w:type="dxa" w:w="100"/>
-              <w:bottom w:type="dxa" w:w="35"/>
-              <w:right w:type="dxa" w:w="100"/>
-            </w:tcMar>
-            <w:vAlign w:val="center"/>
-          </w:tcPr>
-          <w:p>
-            <w:pPr>
-              <w:spacing w:after="0" w:before="0"/>
-            </w:pPr>
-            <w:r>
-              <w:rPr>
-                <w:sz w:val="19"/>
-                <w:szCs w:val="19"/>
-              </w:rPr>
-              <w:t xml:space="preserve">una tantum</w:t>
-            </w:r>
-          </w:p>
-        </w:tc>
-        <w:tc>
-          <w:tcPr>
-            <w:tcW w:type="dxa" w:w="1928"/>
-            <w:shd w:fill="EAF1F9" w:color="auto" w:val="clear"/>
-            <w:tcMar>
-              <w:top w:type="dxa" w:w="35"/>
-              <w:left w:type="dxa" w:w="100"/>
-              <w:bottom w:type="dxa" w:w="35"/>
-              <w:right w:type="dxa" w:w="100"/>
-            </w:tcMar>
-            <w:vAlign w:val="center"/>
-          </w:tcPr>
-          <w:p>
-            <w:pPr>
-              <w:spacing w:after="0" w:before="0"/>
-            </w:pPr>
-            <w:r>
-              <w:rPr>
-                <w:sz w:val="19"/>
-                <w:szCs w:val="19"/>
-              </w:rPr>
               <w:t xml:space="preserve">da preventivare</w:t>
-            </w:r>
-          </w:p>
-        </w:tc>
-      </w:tr>
-      <w:tr>
-        <w:trPr>
-          <w:cantSplit/>
-          <w:tblHeader w:val="false"/>
-        </w:trPr>
-        <w:tc>
-          <w:tcPr>
-            <w:tcW w:type="dxa" w:w="4819"/>
-            <w:tcMar>
-              <w:top w:type="dxa" w:w="35"/>
-              <w:left w:type="dxa" w:w="100"/>
-              <w:bottom w:type="dxa" w:w="35"/>
-              <w:right w:type="dxa" w:w="100"/>
-            </w:tcMar>
-            <w:vAlign w:val="center"/>
-          </w:tcPr>
-          <w:p>
-            <w:pPr>
-              <w:spacing w:after="0" w:before="0"/>
-            </w:pPr>
-            <w:r>
-              <w:rPr>
-                <w:sz w:val="19"/>
-                <w:szCs w:val="19"/>
-              </w:rPr>
-              <w:t xml:space="preserve">Attività extra (integrazione, formazione, supporto oltre il primo livello)</w:t>
-            </w:r>
-          </w:p>
-        </w:tc>
-        <w:tc>
-          <w:tcPr>
-            <w:tcW w:type="dxa" w:w="2891"/>
-            <w:tcMar>
-              <w:top w:type="dxa" w:w="35"/>
-              <w:left w:type="dxa" w:w="100"/>
-              <w:bottom w:type="dxa" w:w="35"/>
-              <w:right w:type="dxa" w:w="100"/>
-            </w:tcMar>
-            <w:vAlign w:val="center"/>
-          </w:tcPr>
-          <w:p>
-            <w:pPr>
-              <w:spacing w:after="0" w:before="0"/>
-            </w:pPr>
-            <w:r>
-              <w:rPr>
-                <w:sz w:val="19"/>
-                <w:szCs w:val="19"/>
-              </w:rPr>
-              <w:t xml:space="preserve">per ora</w:t>
-            </w:r>
-          </w:p>
-        </w:tc>
-        <w:tc>
-          <w:tcPr>
-            <w:tcW w:type="dxa" w:w="1928"/>
-            <w:tcMar>
-              <w:top w:type="dxa" w:w="35"/>
-              <w:left w:type="dxa" w:w="100"/>
-              <w:bottom w:type="dxa" w:w="35"/>
-              <w:right w:type="dxa" w:w="100"/>
-            </w:tcMar>
-            <w:vAlign w:val="center"/>
-          </w:tcPr>
-          <w:p>
-            <w:pPr>
-              <w:spacing w:after="0" w:before="0"/>
-            </w:pPr>
-            <w:r>
-              <w:rPr>
-                <w:sz w:val="19"/>
-                <w:szCs w:val="19"/>
-              </w:rPr>
-              <w:t xml:space="preserve">85,00</w:t>
             </w:r>
           </w:p>
         </w:tc>
@@ -7431,7 +7449,64 @@
         <w:jc w:val="both"/>
       </w:pPr>
       <w:r>
-        <w:t xml:space="preserve">Le fasce del canone di conservazione si applicano ai GB versati dal Cliente nello stesso anno solare e sono progressive: ogni fascia si applica solo ai GB che vi rientrano. Esempio: 12 GB versati nell'anno = 390 + 9 × 290 + 2 × 220 = 3.440 € per il triennio di conservazione.</w:t>
+        <w:rPr>
+          <w:b/>
+          <w:bCs/>
+        </w:rPr>
+        <w:t xml:space="preserve">Altri servizi, solo in casi particolari</w:t>
+      </w:r>
+    </w:p>
+    <w:p>
+      <w:pPr>
+        <w:keepNext w:val="false"/>
+        <w:keepLines w:val="false"/>
+        <w:spacing w:after="120" w:line="276"/>
+        <w:jc w:val="both"/>
+      </w:pPr>
+      <w:r>
+        <w:t xml:space="preserve">Nell'uso normale non servono: alla fine dei 3 anni i documenti vengono eliminati in automatico e senza costi.</w:t>
+      </w:r>
+    </w:p>
+    <w:p>
+      <w:pPr>
+        <w:pStyle w:val="ListParagraph"/>
+        <w:numPr>
+          <w:ilvl w:val="0"/>
+          <w:numId w:val="3"/>
+        </w:numPr>
+        <w:spacing w:after="80" w:line="276"/>
+        <w:jc w:val="both"/>
+      </w:pPr>
+      <w:r>
+        <w:rPr>
+          <w:b/>
+          <w:bCs/>
+        </w:rPr>
+        <w:t xml:space="preserve">Trasferimento ad altro conservatore</w:t>
+      </w:r>
+      <w:r>
+        <w:t xml:space="preserve">, se il Cliente decide di spostare i propri documenti: 290 € a richiesta più 90 € per GB.</w:t>
+      </w:r>
+    </w:p>
+    <w:p>
+      <w:pPr>
+        <w:pStyle w:val="ListParagraph"/>
+        <w:numPr>
+          <w:ilvl w:val="0"/>
+          <w:numId w:val="3"/>
+        </w:numPr>
+        <w:spacing w:after="80" w:line="276"/>
+        <w:jc w:val="both"/>
+      </w:pPr>
+      <w:r>
+        <w:rPr>
+          <w:b/>
+          <w:bCs/>
+        </w:rPr>
+        <w:t xml:space="preserve">Cancellazione anticipata</w:t>
+      </w:r>
+      <w:r>
+        <w:t xml:space="preserve">, solo se il Cliente chiede per iscritto di eliminare definitivamente documenti prima dei 3 anni, ad esempio perché versati per errore: 990 € a richiesta fino a 1 GB, più 490 € per ogni GB in più. WST conferma per iscritto al Cliente l'avvenuta cancellazione.</w:t>
       </w:r>
     </w:p>
     <w:tbl>

</xml_diff>

<commit_message>
Contratto: 3 esibizioni incluse anche via Software/API, nuove fasce 50 MB e 1 GB
Co-Authored-By: Claude Opus 5.5 <noreply@anthropic.com>
Claude-Session: https://claude.ai/code/session_01WDncHtSFTdQuV5JxtunJCC
</commit_message>
<xml_diff>
--- a/Contratto_Conservazione_WsTech.docx
+++ b/Contratto_Conservazione_WsTech.docx
@@ -396,9 +396,9 @@
             <w:tcW w:type="dxa" w:w="3277"/>
             <w:shd w:fill="6599CD" w:color="auto" w:val="clear"/>
             <w:tcMar>
-              <w:top w:type="dxa" w:w="35"/>
-              <w:left w:type="dxa" w:w="100"/>
-              <w:bottom w:type="dxa" w:w="35"/>
+              <w:top w:type="dxa" w:w="20"/>
+              <w:left w:type="dxa" w:w="100"/>
+              <w:bottom w:type="dxa" w:w="20"/>
               <w:right w:type="dxa" w:w="100"/>
             </w:tcMar>
             <w:vAlign w:val="center"/>
@@ -424,9 +424,9 @@
             <w:tcW w:type="dxa" w:w="6361"/>
             <w:shd w:fill="6599CD" w:color="auto" w:val="clear"/>
             <w:tcMar>
-              <w:top w:type="dxa" w:w="35"/>
-              <w:left w:type="dxa" w:w="100"/>
-              <w:bottom w:type="dxa" w:w="35"/>
+              <w:top w:type="dxa" w:w="20"/>
+              <w:left w:type="dxa" w:w="100"/>
+              <w:bottom w:type="dxa" w:w="20"/>
               <w:right w:type="dxa" w:w="100"/>
             </w:tcMar>
             <w:vAlign w:val="center"/>
@@ -457,9 +457,9 @@
           <w:tcPr>
             <w:tcW w:type="dxa" w:w="3277"/>
             <w:tcMar>
-              <w:top w:type="dxa" w:w="35"/>
-              <w:left w:type="dxa" w:w="100"/>
-              <w:bottom w:type="dxa" w:w="35"/>
+              <w:top w:type="dxa" w:w="20"/>
+              <w:left w:type="dxa" w:w="100"/>
+              <w:bottom w:type="dxa" w:w="20"/>
               <w:right w:type="dxa" w:w="100"/>
             </w:tcMar>
             <w:vAlign w:val="center"/>
@@ -481,9 +481,9 @@
           <w:tcPr>
             <w:tcW w:type="dxa" w:w="6361"/>
             <w:tcMar>
-              <w:top w:type="dxa" w:w="35"/>
-              <w:left w:type="dxa" w:w="100"/>
-              <w:bottom w:type="dxa" w:w="35"/>
+              <w:top w:type="dxa" w:w="20"/>
+              <w:left w:type="dxa" w:w="100"/>
+              <w:bottom w:type="dxa" w:w="20"/>
               <w:right w:type="dxa" w:w="100"/>
             </w:tcMar>
             <w:vAlign w:val="center"/>
@@ -512,9 +512,9 @@
             <w:tcW w:type="dxa" w:w="3277"/>
             <w:shd w:fill="EAF1F9" w:color="auto" w:val="clear"/>
             <w:tcMar>
-              <w:top w:type="dxa" w:w="35"/>
-              <w:left w:type="dxa" w:w="100"/>
-              <w:bottom w:type="dxa" w:w="35"/>
+              <w:top w:type="dxa" w:w="20"/>
+              <w:left w:type="dxa" w:w="100"/>
+              <w:bottom w:type="dxa" w:w="20"/>
               <w:right w:type="dxa" w:w="100"/>
             </w:tcMar>
             <w:vAlign w:val="center"/>
@@ -537,9 +537,9 @@
             <w:tcW w:type="dxa" w:w="6361"/>
             <w:shd w:fill="EAF1F9" w:color="auto" w:val="clear"/>
             <w:tcMar>
-              <w:top w:type="dxa" w:w="35"/>
-              <w:left w:type="dxa" w:w="100"/>
-              <w:bottom w:type="dxa" w:w="35"/>
+              <w:top w:type="dxa" w:w="20"/>
+              <w:left w:type="dxa" w:w="100"/>
+              <w:bottom w:type="dxa" w:w="20"/>
               <w:right w:type="dxa" w:w="100"/>
             </w:tcMar>
             <w:vAlign w:val="center"/>
@@ -567,9 +567,9 @@
           <w:tcPr>
             <w:tcW w:type="dxa" w:w="3277"/>
             <w:tcMar>
-              <w:top w:type="dxa" w:w="35"/>
-              <w:left w:type="dxa" w:w="100"/>
-              <w:bottom w:type="dxa" w:w="35"/>
+              <w:top w:type="dxa" w:w="20"/>
+              <w:left w:type="dxa" w:w="100"/>
+              <w:bottom w:type="dxa" w:w="20"/>
               <w:right w:type="dxa" w:w="100"/>
             </w:tcMar>
             <w:vAlign w:val="center"/>
@@ -591,9 +591,9 @@
           <w:tcPr>
             <w:tcW w:type="dxa" w:w="6361"/>
             <w:tcMar>
-              <w:top w:type="dxa" w:w="35"/>
-              <w:left w:type="dxa" w:w="100"/>
-              <w:bottom w:type="dxa" w:w="35"/>
+              <w:top w:type="dxa" w:w="20"/>
+              <w:left w:type="dxa" w:w="100"/>
+              <w:bottom w:type="dxa" w:w="20"/>
               <w:right w:type="dxa" w:w="100"/>
             </w:tcMar>
             <w:vAlign w:val="center"/>
@@ -622,9 +622,9 @@
             <w:tcW w:type="dxa" w:w="3277"/>
             <w:shd w:fill="EAF1F9" w:color="auto" w:val="clear"/>
             <w:tcMar>
-              <w:top w:type="dxa" w:w="35"/>
-              <w:left w:type="dxa" w:w="100"/>
-              <w:bottom w:type="dxa" w:w="35"/>
+              <w:top w:type="dxa" w:w="20"/>
+              <w:left w:type="dxa" w:w="100"/>
+              <w:bottom w:type="dxa" w:w="20"/>
               <w:right w:type="dxa" w:w="100"/>
             </w:tcMar>
             <w:vAlign w:val="center"/>
@@ -647,9 +647,9 @@
             <w:tcW w:type="dxa" w:w="6361"/>
             <w:shd w:fill="EAF1F9" w:color="auto" w:val="clear"/>
             <w:tcMar>
-              <w:top w:type="dxa" w:w="35"/>
-              <w:left w:type="dxa" w:w="100"/>
-              <w:bottom w:type="dxa" w:w="35"/>
+              <w:top w:type="dxa" w:w="20"/>
+              <w:left w:type="dxa" w:w="100"/>
+              <w:bottom w:type="dxa" w:w="20"/>
               <w:right w:type="dxa" w:w="100"/>
             </w:tcMar>
             <w:vAlign w:val="center"/>
@@ -677,9 +677,9 @@
           <w:tcPr>
             <w:tcW w:type="dxa" w:w="3277"/>
             <w:tcMar>
-              <w:top w:type="dxa" w:w="35"/>
-              <w:left w:type="dxa" w:w="100"/>
-              <w:bottom w:type="dxa" w:w="35"/>
+              <w:top w:type="dxa" w:w="20"/>
+              <w:left w:type="dxa" w:w="100"/>
+              <w:bottom w:type="dxa" w:w="20"/>
               <w:right w:type="dxa" w:w="100"/>
             </w:tcMar>
             <w:vAlign w:val="center"/>
@@ -701,9 +701,9 @@
           <w:tcPr>
             <w:tcW w:type="dxa" w:w="6361"/>
             <w:tcMar>
-              <w:top w:type="dxa" w:w="35"/>
-              <w:left w:type="dxa" w:w="100"/>
-              <w:bottom w:type="dxa" w:w="35"/>
+              <w:top w:type="dxa" w:w="20"/>
+              <w:left w:type="dxa" w:w="100"/>
+              <w:bottom w:type="dxa" w:w="20"/>
               <w:right w:type="dxa" w:w="100"/>
             </w:tcMar>
             <w:vAlign w:val="center"/>
@@ -732,9 +732,9 @@
             <w:tcW w:type="dxa" w:w="3277"/>
             <w:shd w:fill="EAF1F9" w:color="auto" w:val="clear"/>
             <w:tcMar>
-              <w:top w:type="dxa" w:w="35"/>
-              <w:left w:type="dxa" w:w="100"/>
-              <w:bottom w:type="dxa" w:w="35"/>
+              <w:top w:type="dxa" w:w="20"/>
+              <w:left w:type="dxa" w:w="100"/>
+              <w:bottom w:type="dxa" w:w="20"/>
               <w:right w:type="dxa" w:w="100"/>
             </w:tcMar>
             <w:vAlign w:val="center"/>
@@ -757,9 +757,9 @@
             <w:tcW w:type="dxa" w:w="6361"/>
             <w:shd w:fill="EAF1F9" w:color="auto" w:val="clear"/>
             <w:tcMar>
-              <w:top w:type="dxa" w:w="35"/>
-              <w:left w:type="dxa" w:w="100"/>
-              <w:bottom w:type="dxa" w:w="35"/>
+              <w:top w:type="dxa" w:w="20"/>
+              <w:left w:type="dxa" w:w="100"/>
+              <w:bottom w:type="dxa" w:w="20"/>
               <w:right w:type="dxa" w:w="100"/>
             </w:tcMar>
             <w:vAlign w:val="center"/>
@@ -787,9 +787,9 @@
           <w:tcPr>
             <w:tcW w:type="dxa" w:w="3277"/>
             <w:tcMar>
-              <w:top w:type="dxa" w:w="35"/>
-              <w:left w:type="dxa" w:w="100"/>
-              <w:bottom w:type="dxa" w:w="35"/>
+              <w:top w:type="dxa" w:w="20"/>
+              <w:left w:type="dxa" w:w="100"/>
+              <w:bottom w:type="dxa" w:w="20"/>
               <w:right w:type="dxa" w:w="100"/>
             </w:tcMar>
             <w:vAlign w:val="center"/>
@@ -811,9 +811,9 @@
           <w:tcPr>
             <w:tcW w:type="dxa" w:w="6361"/>
             <w:tcMar>
-              <w:top w:type="dxa" w:w="35"/>
-              <w:left w:type="dxa" w:w="100"/>
-              <w:bottom w:type="dxa" w:w="35"/>
+              <w:top w:type="dxa" w:w="20"/>
+              <w:left w:type="dxa" w:w="100"/>
+              <w:bottom w:type="dxa" w:w="20"/>
               <w:right w:type="dxa" w:w="100"/>
             </w:tcMar>
             <w:vAlign w:val="center"/>
@@ -842,9 +842,9 @@
             <w:tcW w:type="dxa" w:w="3277"/>
             <w:shd w:fill="EAF1F9" w:color="auto" w:val="clear"/>
             <w:tcMar>
-              <w:top w:type="dxa" w:w="35"/>
-              <w:left w:type="dxa" w:w="100"/>
-              <w:bottom w:type="dxa" w:w="35"/>
+              <w:top w:type="dxa" w:w="20"/>
+              <w:left w:type="dxa" w:w="100"/>
+              <w:bottom w:type="dxa" w:w="20"/>
               <w:right w:type="dxa" w:w="100"/>
             </w:tcMar>
             <w:vAlign w:val="center"/>
@@ -867,9 +867,9 @@
             <w:tcW w:type="dxa" w:w="6361"/>
             <w:shd w:fill="EAF1F9" w:color="auto" w:val="clear"/>
             <w:tcMar>
-              <w:top w:type="dxa" w:w="35"/>
-              <w:left w:type="dxa" w:w="100"/>
-              <w:bottom w:type="dxa" w:w="35"/>
+              <w:top w:type="dxa" w:w="20"/>
+              <w:left w:type="dxa" w:w="100"/>
+              <w:bottom w:type="dxa" w:w="20"/>
               <w:right w:type="dxa" w:w="100"/>
             </w:tcMar>
             <w:vAlign w:val="center"/>
@@ -897,9 +897,9 @@
           <w:tcPr>
             <w:tcW w:type="dxa" w:w="3277"/>
             <w:tcMar>
-              <w:top w:type="dxa" w:w="35"/>
-              <w:left w:type="dxa" w:w="100"/>
-              <w:bottom w:type="dxa" w:w="35"/>
+              <w:top w:type="dxa" w:w="20"/>
+              <w:left w:type="dxa" w:w="100"/>
+              <w:bottom w:type="dxa" w:w="20"/>
               <w:right w:type="dxa" w:w="100"/>
             </w:tcMar>
             <w:vAlign w:val="center"/>
@@ -921,9 +921,9 @@
           <w:tcPr>
             <w:tcW w:type="dxa" w:w="6361"/>
             <w:tcMar>
-              <w:top w:type="dxa" w:w="35"/>
-              <w:left w:type="dxa" w:w="100"/>
-              <w:bottom w:type="dxa" w:w="35"/>
+              <w:top w:type="dxa" w:w="20"/>
+              <w:left w:type="dxa" w:w="100"/>
+              <w:bottom w:type="dxa" w:w="20"/>
               <w:right w:type="dxa" w:w="100"/>
             </w:tcMar>
             <w:vAlign w:val="center"/>
@@ -952,9 +952,9 @@
             <w:tcW w:type="dxa" w:w="3277"/>
             <w:shd w:fill="EAF1F9" w:color="auto" w:val="clear"/>
             <w:tcMar>
-              <w:top w:type="dxa" w:w="35"/>
-              <w:left w:type="dxa" w:w="100"/>
-              <w:bottom w:type="dxa" w:w="35"/>
+              <w:top w:type="dxa" w:w="20"/>
+              <w:left w:type="dxa" w:w="100"/>
+              <w:bottom w:type="dxa" w:w="20"/>
               <w:right w:type="dxa" w:w="100"/>
             </w:tcMar>
             <w:vAlign w:val="center"/>
@@ -977,9 +977,9 @@
             <w:tcW w:type="dxa" w:w="6361"/>
             <w:shd w:fill="EAF1F9" w:color="auto" w:val="clear"/>
             <w:tcMar>
-              <w:top w:type="dxa" w:w="35"/>
-              <w:left w:type="dxa" w:w="100"/>
-              <w:bottom w:type="dxa" w:w="35"/>
+              <w:top w:type="dxa" w:w="20"/>
+              <w:left w:type="dxa" w:w="100"/>
+              <w:bottom w:type="dxa" w:w="20"/>
               <w:right w:type="dxa" w:w="100"/>
             </w:tcMar>
             <w:vAlign w:val="center"/>
@@ -1007,9 +1007,9 @@
           <w:tcPr>
             <w:tcW w:type="dxa" w:w="3277"/>
             <w:tcMar>
-              <w:top w:type="dxa" w:w="35"/>
-              <w:left w:type="dxa" w:w="100"/>
-              <w:bottom w:type="dxa" w:w="35"/>
+              <w:top w:type="dxa" w:w="20"/>
+              <w:left w:type="dxa" w:w="100"/>
+              <w:bottom w:type="dxa" w:w="20"/>
               <w:right w:type="dxa" w:w="100"/>
             </w:tcMar>
             <w:vAlign w:val="center"/>
@@ -1031,9 +1031,9 @@
           <w:tcPr>
             <w:tcW w:type="dxa" w:w="6361"/>
             <w:tcMar>
-              <w:top w:type="dxa" w:w="35"/>
-              <w:left w:type="dxa" w:w="100"/>
-              <w:bottom w:type="dxa" w:w="35"/>
+              <w:top w:type="dxa" w:w="20"/>
+              <w:left w:type="dxa" w:w="100"/>
+              <w:bottom w:type="dxa" w:w="20"/>
               <w:right w:type="dxa" w:w="100"/>
             </w:tcMar>
             <w:vAlign w:val="center"/>
@@ -1062,9 +1062,9 @@
             <w:tcW w:type="dxa" w:w="3277"/>
             <w:shd w:fill="EAF1F9" w:color="auto" w:val="clear"/>
             <w:tcMar>
-              <w:top w:type="dxa" w:w="35"/>
-              <w:left w:type="dxa" w:w="100"/>
-              <w:bottom w:type="dxa" w:w="35"/>
+              <w:top w:type="dxa" w:w="20"/>
+              <w:left w:type="dxa" w:w="100"/>
+              <w:bottom w:type="dxa" w:w="20"/>
               <w:right w:type="dxa" w:w="100"/>
             </w:tcMar>
             <w:vAlign w:val="center"/>
@@ -1087,9 +1087,9 @@
             <w:tcW w:type="dxa" w:w="6361"/>
             <w:shd w:fill="EAF1F9" w:color="auto" w:val="clear"/>
             <w:tcMar>
-              <w:top w:type="dxa" w:w="35"/>
-              <w:left w:type="dxa" w:w="100"/>
-              <w:bottom w:type="dxa" w:w="35"/>
+              <w:top w:type="dxa" w:w="20"/>
+              <w:left w:type="dxa" w:w="100"/>
+              <w:bottom w:type="dxa" w:w="20"/>
               <w:right w:type="dxa" w:w="100"/>
             </w:tcMar>
             <w:vAlign w:val="center"/>
@@ -1117,9 +1117,9 @@
           <w:tcPr>
             <w:tcW w:type="dxa" w:w="3277"/>
             <w:tcMar>
-              <w:top w:type="dxa" w:w="35"/>
-              <w:left w:type="dxa" w:w="100"/>
-              <w:bottom w:type="dxa" w:w="35"/>
+              <w:top w:type="dxa" w:w="20"/>
+              <w:left w:type="dxa" w:w="100"/>
+              <w:bottom w:type="dxa" w:w="20"/>
               <w:right w:type="dxa" w:w="100"/>
             </w:tcMar>
             <w:vAlign w:val="center"/>
@@ -1141,9 +1141,9 @@
           <w:tcPr>
             <w:tcW w:type="dxa" w:w="6361"/>
             <w:tcMar>
-              <w:top w:type="dxa" w:w="35"/>
-              <w:left w:type="dxa" w:w="100"/>
-              <w:bottom w:type="dxa" w:w="35"/>
+              <w:top w:type="dxa" w:w="20"/>
+              <w:left w:type="dxa" w:w="100"/>
+              <w:bottom w:type="dxa" w:w="20"/>
               <w:right w:type="dxa" w:w="100"/>
             </w:tcMar>
             <w:vAlign w:val="center"/>
@@ -1172,9 +1172,9 @@
             <w:tcW w:type="dxa" w:w="3277"/>
             <w:shd w:fill="EAF1F9" w:color="auto" w:val="clear"/>
             <w:tcMar>
-              <w:top w:type="dxa" w:w="35"/>
-              <w:left w:type="dxa" w:w="100"/>
-              <w:bottom w:type="dxa" w:w="35"/>
+              <w:top w:type="dxa" w:w="20"/>
+              <w:left w:type="dxa" w:w="100"/>
+              <w:bottom w:type="dxa" w:w="20"/>
               <w:right w:type="dxa" w:w="100"/>
             </w:tcMar>
             <w:vAlign w:val="center"/>
@@ -1197,9 +1197,9 @@
             <w:tcW w:type="dxa" w:w="6361"/>
             <w:shd w:fill="EAF1F9" w:color="auto" w:val="clear"/>
             <w:tcMar>
-              <w:top w:type="dxa" w:w="35"/>
-              <w:left w:type="dxa" w:w="100"/>
-              <w:bottom w:type="dxa" w:w="35"/>
+              <w:top w:type="dxa" w:w="20"/>
+              <w:left w:type="dxa" w:w="100"/>
+              <w:bottom w:type="dxa" w:w="20"/>
               <w:right w:type="dxa" w:w="100"/>
             </w:tcMar>
             <w:vAlign w:val="center"/>
@@ -1227,9 +1227,9 @@
           <w:tcPr>
             <w:tcW w:type="dxa" w:w="3277"/>
             <w:tcMar>
-              <w:top w:type="dxa" w:w="35"/>
-              <w:left w:type="dxa" w:w="100"/>
-              <w:bottom w:type="dxa" w:w="35"/>
+              <w:top w:type="dxa" w:w="20"/>
+              <w:left w:type="dxa" w:w="100"/>
+              <w:bottom w:type="dxa" w:w="20"/>
               <w:right w:type="dxa" w:w="100"/>
             </w:tcMar>
             <w:vAlign w:val="center"/>
@@ -1251,23 +1251,23 @@
           <w:tcPr>
             <w:tcW w:type="dxa" w:w="6361"/>
             <w:tcMar>
-              <w:top w:type="dxa" w:w="35"/>
-              <w:left w:type="dxa" w:w="100"/>
-              <w:bottom w:type="dxa" w:w="35"/>
-              <w:right w:type="dxa" w:w="100"/>
-            </w:tcMar>
-            <w:vAlign w:val="center"/>
-          </w:tcPr>
-          <w:p>
-            <w:pPr>
-              <w:spacing w:after="0" w:before="0"/>
-            </w:pPr>
-            <w:r>
-              <w:rPr>
-                <w:sz w:val="19"/>
-                <w:szCs w:val="19"/>
-              </w:rPr>
-              <w:t xml:space="preserve">L'attivazione (Trasportatori) o il canone annuo Software (Produttori), che comprendono 100 MB di spazio di conservazione, il versamento a cura di WST, le ricevute, l'assistenza e fino a 6 esibizioni per anno.</w:t>
+              <w:top w:type="dxa" w:w="20"/>
+              <w:left w:type="dxa" w:w="100"/>
+              <w:bottom w:type="dxa" w:w="20"/>
+              <w:right w:type="dxa" w:w="100"/>
+            </w:tcMar>
+            <w:vAlign w:val="center"/>
+          </w:tcPr>
+          <w:p>
+            <w:pPr>
+              <w:spacing w:after="0" w:before="0"/>
+            </w:pPr>
+            <w:r>
+              <w:rPr>
+                <w:sz w:val="19"/>
+                <w:szCs w:val="19"/>
+              </w:rPr>
+              <w:t xml:space="preserve">L'attivazione (Trasportatori) o il canone annuo Software (Produttori), che comprendono 100 MB di spazio di conservazione, il versamento a cura di WST, le ricevute, l'assistenza e fino a 3 esibizioni per anno.</w:t>
             </w:r>
           </w:p>
         </w:tc>
@@ -1282,9 +1282,9 @@
             <w:tcW w:type="dxa" w:w="3277"/>
             <w:shd w:fill="EAF1F9" w:color="auto" w:val="clear"/>
             <w:tcMar>
-              <w:top w:type="dxa" w:w="35"/>
-              <w:left w:type="dxa" w:w="100"/>
-              <w:bottom w:type="dxa" w:w="35"/>
+              <w:top w:type="dxa" w:w="20"/>
+              <w:left w:type="dxa" w:w="100"/>
+              <w:bottom w:type="dxa" w:w="20"/>
               <w:right w:type="dxa" w:w="100"/>
             </w:tcMar>
             <w:vAlign w:val="center"/>
@@ -1307,9 +1307,9 @@
             <w:tcW w:type="dxa" w:w="6361"/>
             <w:shd w:fill="EAF1F9" w:color="auto" w:val="clear"/>
             <w:tcMar>
-              <w:top w:type="dxa" w:w="35"/>
-              <w:left w:type="dxa" w:w="100"/>
-              <w:bottom w:type="dxa" w:w="35"/>
+              <w:top w:type="dxa" w:w="20"/>
+              <w:left w:type="dxa" w:w="100"/>
+              <w:bottom w:type="dxa" w:w="20"/>
               <w:right w:type="dxa" w:w="100"/>
             </w:tcMar>
             <w:vAlign w:val="center"/>
@@ -1337,9 +1337,9 @@
           <w:tcPr>
             <w:tcW w:type="dxa" w:w="3277"/>
             <w:tcMar>
-              <w:top w:type="dxa" w:w="35"/>
-              <w:left w:type="dxa" w:w="100"/>
-              <w:bottom w:type="dxa" w:w="35"/>
+              <w:top w:type="dxa" w:w="20"/>
+              <w:left w:type="dxa" w:w="100"/>
+              <w:bottom w:type="dxa" w:w="20"/>
               <w:right w:type="dxa" w:w="100"/>
             </w:tcMar>
             <w:vAlign w:val="center"/>
@@ -1361,9 +1361,9 @@
           <w:tcPr>
             <w:tcW w:type="dxa" w:w="6361"/>
             <w:tcMar>
-              <w:top w:type="dxa" w:w="35"/>
-              <w:left w:type="dxa" w:w="100"/>
-              <w:bottom w:type="dxa" w:w="35"/>
+              <w:top w:type="dxa" w:w="20"/>
+              <w:left w:type="dxa" w:w="100"/>
+              <w:bottom w:type="dxa" w:w="20"/>
               <w:right w:type="dxa" w:w="100"/>
             </w:tcMar>
             <w:vAlign w:val="center"/>
@@ -1392,9 +1392,9 @@
             <w:tcW w:type="dxa" w:w="3277"/>
             <w:shd w:fill="EAF1F9" w:color="auto" w:val="clear"/>
             <w:tcMar>
-              <w:top w:type="dxa" w:w="35"/>
-              <w:left w:type="dxa" w:w="100"/>
-              <w:bottom w:type="dxa" w:w="35"/>
+              <w:top w:type="dxa" w:w="20"/>
+              <w:left w:type="dxa" w:w="100"/>
+              <w:bottom w:type="dxa" w:w="20"/>
               <w:right w:type="dxa" w:w="100"/>
             </w:tcMar>
             <w:vAlign w:val="center"/>
@@ -1417,9 +1417,9 @@
             <w:tcW w:type="dxa" w:w="6361"/>
             <w:shd w:fill="EAF1F9" w:color="auto" w:val="clear"/>
             <w:tcMar>
-              <w:top w:type="dxa" w:w="35"/>
-              <w:left w:type="dxa" w:w="100"/>
-              <w:bottom w:type="dxa" w:w="35"/>
+              <w:top w:type="dxa" w:w="20"/>
+              <w:left w:type="dxa" w:w="100"/>
+              <w:bottom w:type="dxa" w:w="20"/>
               <w:right w:type="dxa" w:w="100"/>
             </w:tcMar>
             <w:vAlign w:val="center"/>
@@ -1447,9 +1447,9 @@
           <w:tcPr>
             <w:tcW w:type="dxa" w:w="3277"/>
             <w:tcMar>
-              <w:top w:type="dxa" w:w="35"/>
-              <w:left w:type="dxa" w:w="100"/>
-              <w:bottom w:type="dxa" w:w="35"/>
+              <w:top w:type="dxa" w:w="20"/>
+              <w:left w:type="dxa" w:w="100"/>
+              <w:bottom w:type="dxa" w:w="20"/>
               <w:right w:type="dxa" w:w="100"/>
             </w:tcMar>
             <w:vAlign w:val="center"/>
@@ -1471,9 +1471,9 @@
           <w:tcPr>
             <w:tcW w:type="dxa" w:w="6361"/>
             <w:tcMar>
-              <w:top w:type="dxa" w:w="35"/>
-              <w:left w:type="dxa" w:w="100"/>
-              <w:bottom w:type="dxa" w:w="35"/>
+              <w:top w:type="dxa" w:w="20"/>
+              <w:left w:type="dxa" w:w="100"/>
+              <w:bottom w:type="dxa" w:w="20"/>
               <w:right w:type="dxa" w:w="100"/>
             </w:tcMar>
             <w:vAlign w:val="center"/>
@@ -1502,9 +1502,9 @@
             <w:tcW w:type="dxa" w:w="3277"/>
             <w:shd w:fill="EAF1F9" w:color="auto" w:val="clear"/>
             <w:tcMar>
-              <w:top w:type="dxa" w:w="35"/>
-              <w:left w:type="dxa" w:w="100"/>
-              <w:bottom w:type="dxa" w:w="35"/>
+              <w:top w:type="dxa" w:w="20"/>
+              <w:left w:type="dxa" w:w="100"/>
+              <w:bottom w:type="dxa" w:w="20"/>
               <w:right w:type="dxa" w:w="100"/>
             </w:tcMar>
             <w:vAlign w:val="center"/>
@@ -1527,9 +1527,9 @@
             <w:tcW w:type="dxa" w:w="6361"/>
             <w:shd w:fill="EAF1F9" w:color="auto" w:val="clear"/>
             <w:tcMar>
-              <w:top w:type="dxa" w:w="35"/>
-              <w:left w:type="dxa" w:w="100"/>
-              <w:bottom w:type="dxa" w:w="35"/>
+              <w:top w:type="dxa" w:w="20"/>
+              <w:left w:type="dxa" w:w="100"/>
+              <w:bottom w:type="dxa" w:w="20"/>
               <w:right w:type="dxa" w:w="100"/>
             </w:tcMar>
             <w:vAlign w:val="center"/>
@@ -1557,9 +1557,9 @@
           <w:tcPr>
             <w:tcW w:type="dxa" w:w="3277"/>
             <w:tcMar>
-              <w:top w:type="dxa" w:w="35"/>
-              <w:left w:type="dxa" w:w="100"/>
-              <w:bottom w:type="dxa" w:w="35"/>
+              <w:top w:type="dxa" w:w="20"/>
+              <w:left w:type="dxa" w:w="100"/>
+              <w:bottom w:type="dxa" w:w="20"/>
               <w:right w:type="dxa" w:w="100"/>
             </w:tcMar>
             <w:vAlign w:val="center"/>
@@ -1581,9 +1581,9 @@
           <w:tcPr>
             <w:tcW w:type="dxa" w:w="6361"/>
             <w:tcMar>
-              <w:top w:type="dxa" w:w="35"/>
-              <w:left w:type="dxa" w:w="100"/>
-              <w:bottom w:type="dxa" w:w="35"/>
+              <w:top w:type="dxa" w:w="20"/>
+              <w:left w:type="dxa" w:w="100"/>
+              <w:bottom w:type="dxa" w:w="20"/>
               <w:right w:type="dxa" w:w="100"/>
             </w:tcMar>
             <w:vAlign w:val="center"/>
@@ -1693,7 +1693,7 @@
         <w:jc w:val="both"/>
       </w:pPr>
       <w:r>
-        <w:t xml:space="preserve">l'esibizione dei documenti conservati: su richiesta del Cliente, WST estrae dal Sistema di Conservazione e consegna i documenti richiesti, con le relative ricevute, secondo l'art. 8.6;</w:t>
+        <w:t xml:space="preserve">l'esibizione dei documenti conservati, che il Cliente può ottenere in autonomia tramite il Software o chiedendola a WST, secondo l'art. 8.6;</w:t>
       </w:r>
     </w:p>
     <w:p>
@@ -2370,7 +2370,7 @@
         <w:t xml:space="preserve">6.2  </w:t>
       </w:r>
       <w:r>
-        <w:t xml:space="preserve">Tutti i corrispettivi variabili sono calcolati sullo spazio occupato e non sul numero di documenti. Il Pacchetto comprende 100 MB di spazio. Oltre i 100 MB si applica il canone annuale di conservazione dell'Allegato B, calcolato sullo spazio complessivamente occupato dai documenti del Cliente nel Sistema di Conservazione, arrotondato per eccesso al GB intero. Ogni documento occupa spazio, e quindi genera canone, per tutti i 3 anni del Periodo di conservazione.</w:t>
+        <w:t xml:space="preserve">Tutti i corrispettivi variabili sono calcolati sullo spazio occupato e non sul numero di documenti. Il Pacchetto comprende 100 MB di spazio. Oltre i 100 MB si applica il canone annuale di conservazione dell'Allegato B, calcolato sullo spazio complessivamente occupato dai documenti del Cliente nel Sistema di Conservazione: fino a 1 GB secondo le fasce in MB, oltre 1 GB arrotondato per eccesso al GB intero. Ogni documento occupa spazio, e quindi genera canone, per tutti i 3 anni del Periodo di conservazione.</w:t>
       </w:r>
     </w:p>
     <w:p>
@@ -2416,9 +2416,9 @@
             <w:tcW w:type="dxa" w:w="3277"/>
             <w:shd w:fill="6599CD" w:color="auto" w:val="clear"/>
             <w:tcMar>
-              <w:top w:type="dxa" w:w="35"/>
-              <w:left w:type="dxa" w:w="100"/>
-              <w:bottom w:type="dxa" w:w="35"/>
+              <w:top w:type="dxa" w:w="20"/>
+              <w:left w:type="dxa" w:w="100"/>
+              <w:bottom w:type="dxa" w:w="20"/>
               <w:right w:type="dxa" w:w="100"/>
             </w:tcMar>
             <w:vAlign w:val="center"/>
@@ -2444,9 +2444,9 @@
             <w:tcW w:type="dxa" w:w="6361"/>
             <w:shd w:fill="6599CD" w:color="auto" w:val="clear"/>
             <w:tcMar>
-              <w:top w:type="dxa" w:w="35"/>
-              <w:left w:type="dxa" w:w="100"/>
-              <w:bottom w:type="dxa" w:w="35"/>
+              <w:top w:type="dxa" w:w="20"/>
+              <w:left w:type="dxa" w:w="100"/>
+              <w:bottom w:type="dxa" w:w="20"/>
               <w:right w:type="dxa" w:w="100"/>
             </w:tcMar>
             <w:vAlign w:val="center"/>
@@ -2477,9 +2477,9 @@
           <w:tcPr>
             <w:tcW w:type="dxa" w:w="3277"/>
             <w:tcMar>
-              <w:top w:type="dxa" w:w="35"/>
-              <w:left w:type="dxa" w:w="100"/>
-              <w:bottom w:type="dxa" w:w="35"/>
+              <w:top w:type="dxa" w:w="20"/>
+              <w:left w:type="dxa" w:w="100"/>
+              <w:bottom w:type="dxa" w:w="20"/>
               <w:right w:type="dxa" w:w="100"/>
             </w:tcMar>
             <w:vAlign w:val="center"/>
@@ -2501,9 +2501,9 @@
           <w:tcPr>
             <w:tcW w:type="dxa" w:w="6361"/>
             <w:tcMar>
-              <w:top w:type="dxa" w:w="35"/>
-              <w:left w:type="dxa" w:w="100"/>
-              <w:bottom w:type="dxa" w:w="35"/>
+              <w:top w:type="dxa" w:w="20"/>
+              <w:left w:type="dxa" w:w="100"/>
+              <w:bottom w:type="dxa" w:w="20"/>
               <w:right w:type="dxa" w:w="100"/>
             </w:tcMar>
             <w:vAlign w:val="center"/>
@@ -2532,9 +2532,9 @@
             <w:tcW w:type="dxa" w:w="3277"/>
             <w:shd w:fill="EAF1F9" w:color="auto" w:val="clear"/>
             <w:tcMar>
-              <w:top w:type="dxa" w:w="35"/>
-              <w:left w:type="dxa" w:w="100"/>
-              <w:bottom w:type="dxa" w:w="35"/>
+              <w:top w:type="dxa" w:w="20"/>
+              <w:left w:type="dxa" w:w="100"/>
+              <w:bottom w:type="dxa" w:w="20"/>
               <w:right w:type="dxa" w:w="100"/>
             </w:tcMar>
             <w:vAlign w:val="center"/>
@@ -2557,9 +2557,9 @@
             <w:tcW w:type="dxa" w:w="6361"/>
             <w:shd w:fill="EAF1F9" w:color="auto" w:val="clear"/>
             <w:tcMar>
-              <w:top w:type="dxa" w:w="35"/>
-              <w:left w:type="dxa" w:w="100"/>
-              <w:bottom w:type="dxa" w:w="35"/>
+              <w:top w:type="dxa" w:w="20"/>
+              <w:left w:type="dxa" w:w="100"/>
+              <w:bottom w:type="dxa" w:w="20"/>
               <w:right w:type="dxa" w:w="100"/>
             </w:tcMar>
             <w:vAlign w:val="center"/>
@@ -2587,9 +2587,9 @@
           <w:tcPr>
             <w:tcW w:type="dxa" w:w="3277"/>
             <w:tcMar>
-              <w:top w:type="dxa" w:w="35"/>
-              <w:left w:type="dxa" w:w="100"/>
-              <w:bottom w:type="dxa" w:w="35"/>
+              <w:top w:type="dxa" w:w="20"/>
+              <w:left w:type="dxa" w:w="100"/>
+              <w:bottom w:type="dxa" w:w="20"/>
               <w:right w:type="dxa" w:w="100"/>
             </w:tcMar>
             <w:vAlign w:val="center"/>
@@ -2611,9 +2611,9 @@
           <w:tcPr>
             <w:tcW w:type="dxa" w:w="6361"/>
             <w:tcMar>
-              <w:top w:type="dxa" w:w="35"/>
-              <w:left w:type="dxa" w:w="100"/>
-              <w:bottom w:type="dxa" w:w="35"/>
+              <w:top w:type="dxa" w:w="20"/>
+              <w:left w:type="dxa" w:w="100"/>
+              <w:bottom w:type="dxa" w:w="20"/>
               <w:right w:type="dxa" w:w="100"/>
             </w:tcMar>
             <w:vAlign w:val="center"/>
@@ -2642,9 +2642,9 @@
             <w:tcW w:type="dxa" w:w="3277"/>
             <w:shd w:fill="EAF1F9" w:color="auto" w:val="clear"/>
             <w:tcMar>
-              <w:top w:type="dxa" w:w="35"/>
-              <w:left w:type="dxa" w:w="100"/>
-              <w:bottom w:type="dxa" w:w="35"/>
+              <w:top w:type="dxa" w:w="20"/>
+              <w:left w:type="dxa" w:w="100"/>
+              <w:bottom w:type="dxa" w:w="20"/>
               <w:right w:type="dxa" w:w="100"/>
             </w:tcMar>
             <w:vAlign w:val="center"/>
@@ -2667,9 +2667,9 @@
             <w:tcW w:type="dxa" w:w="6361"/>
             <w:shd w:fill="EAF1F9" w:color="auto" w:val="clear"/>
             <w:tcMar>
-              <w:top w:type="dxa" w:w="35"/>
-              <w:left w:type="dxa" w:w="100"/>
-              <w:bottom w:type="dxa" w:w="35"/>
+              <w:top w:type="dxa" w:w="20"/>
+              <w:left w:type="dxa" w:w="100"/>
+              <w:bottom w:type="dxa" w:w="20"/>
               <w:right w:type="dxa" w:w="100"/>
             </w:tcMar>
             <w:vAlign w:val="center"/>
@@ -2697,9 +2697,9 @@
           <w:tcPr>
             <w:tcW w:type="dxa" w:w="3277"/>
             <w:tcMar>
-              <w:top w:type="dxa" w:w="35"/>
-              <w:left w:type="dxa" w:w="100"/>
-              <w:bottom w:type="dxa" w:w="35"/>
+              <w:top w:type="dxa" w:w="20"/>
+              <w:left w:type="dxa" w:w="100"/>
+              <w:bottom w:type="dxa" w:w="20"/>
               <w:right w:type="dxa" w:w="100"/>
             </w:tcMar>
             <w:vAlign w:val="center"/>
@@ -2721,9 +2721,9 @@
           <w:tcPr>
             <w:tcW w:type="dxa" w:w="6361"/>
             <w:tcMar>
-              <w:top w:type="dxa" w:w="35"/>
-              <w:left w:type="dxa" w:w="100"/>
-              <w:bottom w:type="dxa" w:w="35"/>
+              <w:top w:type="dxa" w:w="20"/>
+              <w:left w:type="dxa" w:w="100"/>
+              <w:bottom w:type="dxa" w:w="20"/>
               <w:right w:type="dxa" w:w="100"/>
             </w:tcMar>
             <w:vAlign w:val="center"/>
@@ -3049,9 +3049,9 @@
             <w:tcW w:type="dxa" w:w="2400"/>
             <w:shd w:fill="6599CD" w:color="auto" w:val="clear"/>
             <w:tcMar>
-              <w:top w:type="dxa" w:w="35"/>
-              <w:left w:type="dxa" w:w="100"/>
-              <w:bottom w:type="dxa" w:w="35"/>
+              <w:top w:type="dxa" w:w="20"/>
+              <w:left w:type="dxa" w:w="100"/>
+              <w:bottom w:type="dxa" w:w="20"/>
               <w:right w:type="dxa" w:w="100"/>
             </w:tcMar>
             <w:vAlign w:val="center"/>
@@ -3077,9 +3077,9 @@
             <w:tcW w:type="dxa" w:w="3638"/>
             <w:shd w:fill="6599CD" w:color="auto" w:val="clear"/>
             <w:tcMar>
-              <w:top w:type="dxa" w:w="35"/>
-              <w:left w:type="dxa" w:w="100"/>
-              <w:bottom w:type="dxa" w:w="35"/>
+              <w:top w:type="dxa" w:w="20"/>
+              <w:left w:type="dxa" w:w="100"/>
+              <w:bottom w:type="dxa" w:w="20"/>
               <w:right w:type="dxa" w:w="100"/>
             </w:tcMar>
             <w:vAlign w:val="center"/>
@@ -3105,9 +3105,9 @@
             <w:tcW w:type="dxa" w:w="1800"/>
             <w:shd w:fill="6599CD" w:color="auto" w:val="clear"/>
             <w:tcMar>
-              <w:top w:type="dxa" w:w="35"/>
-              <w:left w:type="dxa" w:w="100"/>
-              <w:bottom w:type="dxa" w:w="35"/>
+              <w:top w:type="dxa" w:w="20"/>
+              <w:left w:type="dxa" w:w="100"/>
+              <w:bottom w:type="dxa" w:w="20"/>
               <w:right w:type="dxa" w:w="100"/>
             </w:tcMar>
             <w:vAlign w:val="center"/>
@@ -3133,9 +3133,9 @@
             <w:tcW w:type="dxa" w:w="1800"/>
             <w:shd w:fill="6599CD" w:color="auto" w:val="clear"/>
             <w:tcMar>
-              <w:top w:type="dxa" w:w="35"/>
-              <w:left w:type="dxa" w:w="100"/>
-              <w:bottom w:type="dxa" w:w="35"/>
+              <w:top w:type="dxa" w:w="20"/>
+              <w:left w:type="dxa" w:w="100"/>
+              <w:bottom w:type="dxa" w:w="20"/>
               <w:right w:type="dxa" w:w="100"/>
             </w:tcMar>
             <w:vAlign w:val="center"/>
@@ -3166,9 +3166,9 @@
           <w:tcPr>
             <w:tcW w:type="dxa" w:w="2400"/>
             <w:tcMar>
-              <w:top w:type="dxa" w:w="35"/>
-              <w:left w:type="dxa" w:w="100"/>
-              <w:bottom w:type="dxa" w:w="35"/>
+              <w:top w:type="dxa" w:w="20"/>
+              <w:left w:type="dxa" w:w="100"/>
+              <w:bottom w:type="dxa" w:w="20"/>
               <w:right w:type="dxa" w:w="100"/>
             </w:tcMar>
             <w:vAlign w:val="center"/>
@@ -3190,9 +3190,9 @@
           <w:tcPr>
             <w:tcW w:type="dxa" w:w="3638"/>
             <w:tcMar>
-              <w:top w:type="dxa" w:w="35"/>
-              <w:left w:type="dxa" w:w="100"/>
-              <w:bottom w:type="dxa" w:w="35"/>
+              <w:top w:type="dxa" w:w="20"/>
+              <w:left w:type="dxa" w:w="100"/>
+              <w:bottom w:type="dxa" w:w="20"/>
               <w:right w:type="dxa" w:w="100"/>
             </w:tcMar>
             <w:vAlign w:val="center"/>
@@ -3214,9 +3214,9 @@
           <w:tcPr>
             <w:tcW w:type="dxa" w:w="1800"/>
             <w:tcMar>
-              <w:top w:type="dxa" w:w="35"/>
-              <w:left w:type="dxa" w:w="100"/>
-              <w:bottom w:type="dxa" w:w="35"/>
+              <w:top w:type="dxa" w:w="20"/>
+              <w:left w:type="dxa" w:w="100"/>
+              <w:bottom w:type="dxa" w:w="20"/>
               <w:right w:type="dxa" w:w="100"/>
             </w:tcMar>
             <w:vAlign w:val="center"/>
@@ -3238,9 +3238,9 @@
           <w:tcPr>
             <w:tcW w:type="dxa" w:w="1800"/>
             <w:tcMar>
-              <w:top w:type="dxa" w:w="35"/>
-              <w:left w:type="dxa" w:w="100"/>
-              <w:bottom w:type="dxa" w:w="35"/>
+              <w:top w:type="dxa" w:w="20"/>
+              <w:left w:type="dxa" w:w="100"/>
+              <w:bottom w:type="dxa" w:w="20"/>
               <w:right w:type="dxa" w:w="100"/>
             </w:tcMar>
             <w:vAlign w:val="center"/>
@@ -3269,9 +3269,9 @@
             <w:tcW w:type="dxa" w:w="2400"/>
             <w:shd w:fill="EAF1F9" w:color="auto" w:val="clear"/>
             <w:tcMar>
-              <w:top w:type="dxa" w:w="35"/>
-              <w:left w:type="dxa" w:w="100"/>
-              <w:bottom w:type="dxa" w:w="35"/>
+              <w:top w:type="dxa" w:w="20"/>
+              <w:left w:type="dxa" w:w="100"/>
+              <w:bottom w:type="dxa" w:w="20"/>
               <w:right w:type="dxa" w:w="100"/>
             </w:tcMar>
             <w:vAlign w:val="center"/>
@@ -3294,9 +3294,9 @@
             <w:tcW w:type="dxa" w:w="3638"/>
             <w:shd w:fill="EAF1F9" w:color="auto" w:val="clear"/>
             <w:tcMar>
-              <w:top w:type="dxa" w:w="35"/>
-              <w:left w:type="dxa" w:w="100"/>
-              <w:bottom w:type="dxa" w:w="35"/>
+              <w:top w:type="dxa" w:w="20"/>
+              <w:left w:type="dxa" w:w="100"/>
+              <w:bottom w:type="dxa" w:w="20"/>
               <w:right w:type="dxa" w:w="100"/>
             </w:tcMar>
             <w:vAlign w:val="center"/>
@@ -3319,9 +3319,9 @@
             <w:tcW w:type="dxa" w:w="1800"/>
             <w:shd w:fill="EAF1F9" w:color="auto" w:val="clear"/>
             <w:tcMar>
-              <w:top w:type="dxa" w:w="35"/>
-              <w:left w:type="dxa" w:w="100"/>
-              <w:bottom w:type="dxa" w:w="35"/>
+              <w:top w:type="dxa" w:w="20"/>
+              <w:left w:type="dxa" w:w="100"/>
+              <w:bottom w:type="dxa" w:w="20"/>
               <w:right w:type="dxa" w:w="100"/>
             </w:tcMar>
             <w:vAlign w:val="center"/>
@@ -3344,9 +3344,9 @@
             <w:tcW w:type="dxa" w:w="1800"/>
             <w:shd w:fill="EAF1F9" w:color="auto" w:val="clear"/>
             <w:tcMar>
-              <w:top w:type="dxa" w:w="35"/>
-              <w:left w:type="dxa" w:w="100"/>
-              <w:bottom w:type="dxa" w:w="35"/>
+              <w:top w:type="dxa" w:w="20"/>
+              <w:left w:type="dxa" w:w="100"/>
+              <w:bottom w:type="dxa" w:w="20"/>
               <w:right w:type="dxa" w:w="100"/>
             </w:tcMar>
             <w:vAlign w:val="center"/>
@@ -3374,9 +3374,9 @@
           <w:tcPr>
             <w:tcW w:type="dxa" w:w="2400"/>
             <w:tcMar>
-              <w:top w:type="dxa" w:w="35"/>
-              <w:left w:type="dxa" w:w="100"/>
-              <w:bottom w:type="dxa" w:w="35"/>
+              <w:top w:type="dxa" w:w="20"/>
+              <w:left w:type="dxa" w:w="100"/>
+              <w:bottom w:type="dxa" w:w="20"/>
               <w:right w:type="dxa" w:w="100"/>
             </w:tcMar>
             <w:vAlign w:val="center"/>
@@ -3398,9 +3398,9 @@
           <w:tcPr>
             <w:tcW w:type="dxa" w:w="3638"/>
             <w:tcMar>
-              <w:top w:type="dxa" w:w="35"/>
-              <w:left w:type="dxa" w:w="100"/>
-              <w:bottom w:type="dxa" w:w="35"/>
+              <w:top w:type="dxa" w:w="20"/>
+              <w:left w:type="dxa" w:w="100"/>
+              <w:bottom w:type="dxa" w:w="20"/>
               <w:right w:type="dxa" w:w="100"/>
             </w:tcMar>
             <w:vAlign w:val="center"/>
@@ -3422,9 +3422,9 @@
           <w:tcPr>
             <w:tcW w:type="dxa" w:w="1800"/>
             <w:tcMar>
-              <w:top w:type="dxa" w:w="35"/>
-              <w:left w:type="dxa" w:w="100"/>
-              <w:bottom w:type="dxa" w:w="35"/>
+              <w:top w:type="dxa" w:w="20"/>
+              <w:left w:type="dxa" w:w="100"/>
+              <w:bottom w:type="dxa" w:w="20"/>
               <w:right w:type="dxa" w:w="100"/>
             </w:tcMar>
             <w:vAlign w:val="center"/>
@@ -3446,9 +3446,9 @@
           <w:tcPr>
             <w:tcW w:type="dxa" w:w="1800"/>
             <w:tcMar>
-              <w:top w:type="dxa" w:w="35"/>
-              <w:left w:type="dxa" w:w="100"/>
-              <w:bottom w:type="dxa" w:w="35"/>
+              <w:top w:type="dxa" w:w="20"/>
+              <w:left w:type="dxa" w:w="100"/>
+              <w:bottom w:type="dxa" w:w="20"/>
               <w:right w:type="dxa" w:w="100"/>
             </w:tcMar>
             <w:vAlign w:val="center"/>
@@ -3477,9 +3477,9 @@
             <w:tcW w:type="dxa" w:w="2400"/>
             <w:shd w:fill="EAF1F9" w:color="auto" w:val="clear"/>
             <w:tcMar>
-              <w:top w:type="dxa" w:w="35"/>
-              <w:left w:type="dxa" w:w="100"/>
-              <w:bottom w:type="dxa" w:w="35"/>
+              <w:top w:type="dxa" w:w="20"/>
+              <w:left w:type="dxa" w:w="100"/>
+              <w:bottom w:type="dxa" w:w="20"/>
               <w:right w:type="dxa" w:w="100"/>
             </w:tcMar>
             <w:vAlign w:val="center"/>
@@ -3502,9 +3502,9 @@
             <w:tcW w:type="dxa" w:w="3638"/>
             <w:shd w:fill="EAF1F9" w:color="auto" w:val="clear"/>
             <w:tcMar>
-              <w:top w:type="dxa" w:w="35"/>
-              <w:left w:type="dxa" w:w="100"/>
-              <w:bottom w:type="dxa" w:w="35"/>
+              <w:top w:type="dxa" w:w="20"/>
+              <w:left w:type="dxa" w:w="100"/>
+              <w:bottom w:type="dxa" w:w="20"/>
               <w:right w:type="dxa" w:w="100"/>
             </w:tcMar>
             <w:vAlign w:val="center"/>
@@ -3527,9 +3527,9 @@
             <w:tcW w:type="dxa" w:w="1800"/>
             <w:shd w:fill="EAF1F9" w:color="auto" w:val="clear"/>
             <w:tcMar>
-              <w:top w:type="dxa" w:w="35"/>
-              <w:left w:type="dxa" w:w="100"/>
-              <w:bottom w:type="dxa" w:w="35"/>
+              <w:top w:type="dxa" w:w="20"/>
+              <w:left w:type="dxa" w:w="100"/>
+              <w:bottom w:type="dxa" w:w="20"/>
               <w:right w:type="dxa" w:w="100"/>
             </w:tcMar>
             <w:vAlign w:val="center"/>
@@ -3552,9 +3552,9 @@
             <w:tcW w:type="dxa" w:w="1800"/>
             <w:shd w:fill="EAF1F9" w:color="auto" w:val="clear"/>
             <w:tcMar>
-              <w:top w:type="dxa" w:w="35"/>
-              <w:left w:type="dxa" w:w="100"/>
-              <w:bottom w:type="dxa" w:w="35"/>
+              <w:top w:type="dxa" w:w="20"/>
+              <w:left w:type="dxa" w:w="100"/>
+              <w:bottom w:type="dxa" w:w="20"/>
               <w:right w:type="dxa" w:w="100"/>
             </w:tcMar>
             <w:vAlign w:val="center"/>
@@ -3651,60 +3651,7 @@
         <w:t xml:space="preserve">Esibizione.</w:t>
       </w:r>
       <w:r>
-        <w:t xml:space="preserve"> Il Cliente chiede l'esibizione via PEC o e-mail, indicando i documenti (numero xFIR, periodo del registro, produttore o destinatario). WST consegna i documenti, in formato elettronico e con le relative ricevute di conservazione, entro 3 giorni lavorativi. Per richieste delle autorità di controllo il termine è di 1 giorno lavorativo, se la richiesta lo segnala. Sono comprese nel Pacchetto fino a 6 richieste di esibizione per anno; le ulteriori e quelle urgenti sono fatturate secondo l'Allegato B.</w:t>
-      </w:r>
-    </w:p>
-    <w:p>
-      <w:pPr>
-        <w:keepNext/>
-        <w:pBdr>
-          <w:bottom w:val="single" w:color="6599CD" w:sz="6" w:space="2"/>
-        </w:pBdr>
-        <w:spacing w:after="120" w:before="280"/>
-      </w:pPr>
-      <w:r>
-        <w:rPr>
-          <w:b/>
-          <w:bCs/>
-          <w:color w:val="1F3A5F"/>
-          <w:sz w:val="22"/>
-          <w:szCs w:val="22"/>
-        </w:rPr>
-        <w:t xml:space="preserve">Art. 9 – Responsabilità</w:t>
-      </w:r>
-    </w:p>
-    <w:p>
-      <w:pPr>
-        <w:spacing w:after="120" w:line="276"/>
-        <w:jc w:val="both"/>
-      </w:pPr>
-      <w:r>
-        <w:rPr>
-          <w:b/>
-          <w:bCs/>
-          <w:color w:val="1F3A5F"/>
-        </w:rPr>
-        <w:t xml:space="preserve">9.1  </w:t>
-      </w:r>
-      <w:r>
-        <w:t xml:space="preserve">WST risponde della corretta esecuzione delle attività di Produttore dei PdV. Il Conservatore risponde del processo di conservazione secondo il Manuale e la normativa applicabile.</w:t>
-      </w:r>
-    </w:p>
-    <w:p>
-      <w:pPr>
-        <w:spacing w:after="120" w:line="276"/>
-        <w:jc w:val="both"/>
-      </w:pPr>
-      <w:r>
-        <w:rPr>
-          <w:b/>
-          <w:bCs/>
-          <w:color w:val="1F3A5F"/>
-        </w:rPr>
-        <w:t xml:space="preserve">9.2  </w:t>
-      </w:r>
-      <w:r>
-        <w:t xml:space="preserve">WST non risponde di danni causati da:</w:t>
+        <w:t xml:space="preserve"> Il Cliente può ottenere l'esibizione dei propri documenti conservati in due modi:</w:t>
       </w:r>
     </w:p>
     <w:p>
@@ -3718,7 +3665,14 @@
         <w:jc w:val="both"/>
       </w:pPr>
       <w:r>
-        <w:t xml:space="preserve">documenti, metadati o dati non corretti forniti dal Cliente;</w:t>
+        <w:rPr>
+          <w:b/>
+          <w:bCs/>
+        </w:rPr>
+        <w:t xml:space="preserve">in autonomia, tramite il Software</w:t>
+      </w:r>
+      <w:r>
+        <w:t xml:space="preserve">: il Cliente cerca il documento (numero xFIR, periodo del registro, produttore o destinatario) e il Software lo recupera dal Sistema di Conservazione tramite le interfacce applicative (API) messe a disposizione dal Conservatore, insieme alla relativa ricevuta. Il Cliente non dispone di utenze sul Sistema di Conservazione e vede solo i propri documenti;</w:t>
       </w:r>
     </w:p>
     <w:p>
@@ -3732,7 +3686,78 @@
         <w:jc w:val="both"/>
       </w:pPr>
       <w:r>
-        <w:t xml:space="preserve">scelta di un Periodo di conservazione inadeguato;</w:t>
+        <w:rPr>
+          <w:b/>
+          <w:bCs/>
+        </w:rPr>
+        <w:t xml:space="preserve">su richiesta a WST</w:t>
+      </w:r>
+      <w:r>
+        <w:t xml:space="preserve">, via PEC o e-mail: WST consegna i documenti, in formato elettronico e con le relative ricevute, entro 3 giorni lavorativi, oppure entro 1 giorno lavorativo per le richieste urgenti o delle autorità di controllo.</w:t>
+      </w:r>
+    </w:p>
+    <w:p>
+      <w:pPr>
+        <w:keepNext w:val="false"/>
+        <w:keepLines w:val="false"/>
+        <w:spacing w:after="120" w:line="276"/>
+        <w:jc w:val="both"/>
+      </w:pPr>
+      <w:r>
+        <w:t xml:space="preserve">Sono comprese nel Pacchetto 3 esibizioni per anno solare, in qualunque modo richieste. Le esibizioni ulteriori sono fatturate secondo l'Allegato B. Ogni esibizione è registrata dal Software o da WST, e il registro fa fede ai fini del conteggio.</w:t>
+      </w:r>
+    </w:p>
+    <w:p>
+      <w:pPr>
+        <w:keepNext/>
+        <w:pBdr>
+          <w:bottom w:val="single" w:color="6599CD" w:sz="6" w:space="2"/>
+        </w:pBdr>
+        <w:spacing w:after="120" w:before="280"/>
+      </w:pPr>
+      <w:r>
+        <w:rPr>
+          <w:b/>
+          <w:bCs/>
+          <w:color w:val="1F3A5F"/>
+          <w:sz w:val="22"/>
+          <w:szCs w:val="22"/>
+        </w:rPr>
+        <w:t xml:space="preserve">Art. 9 – Responsabilità</w:t>
+      </w:r>
+    </w:p>
+    <w:p>
+      <w:pPr>
+        <w:spacing w:after="120" w:line="276"/>
+        <w:jc w:val="both"/>
+      </w:pPr>
+      <w:r>
+        <w:rPr>
+          <w:b/>
+          <w:bCs/>
+          <w:color w:val="1F3A5F"/>
+        </w:rPr>
+        <w:t xml:space="preserve">9.1  </w:t>
+      </w:r>
+      <w:r>
+        <w:t xml:space="preserve">WST risponde della corretta esecuzione delle attività di Produttore dei PdV. Il Conservatore risponde del processo di conservazione secondo il Manuale e la normativa applicabile.</w:t>
+      </w:r>
+    </w:p>
+    <w:p>
+      <w:pPr>
+        <w:spacing w:after="120" w:line="276"/>
+        <w:jc w:val="both"/>
+      </w:pPr>
+      <w:r>
+        <w:rPr>
+          <w:b/>
+          <w:bCs/>
+          <w:color w:val="1F3A5F"/>
+        </w:rPr>
+        <w:t xml:space="preserve">9.2  </w:t>
+      </w:r>
+      <w:r>
+        <w:t xml:space="preserve">WST non risponde di danni causati da:</w:t>
       </w:r>
     </w:p>
     <w:p>
@@ -3746,7 +3771,49 @@
         <w:jc w:val="both"/>
       </w:pPr>
       <w:r>
+        <w:t xml:space="preserve">documenti, metadati o dati non corretti forniti dal Cliente;</w:t>
+      </w:r>
+    </w:p>
+    <w:p>
+      <w:pPr>
+        <w:pStyle w:val="ListParagraph"/>
+        <w:numPr>
+          <w:ilvl w:val="0"/>
+          <w:numId w:val="3"/>
+        </w:numPr>
+        <w:spacing w:after="80" w:line="276"/>
+        <w:jc w:val="both"/>
+      </w:pPr>
+      <w:r>
+        <w:t xml:space="preserve">scelta di un Periodo di conservazione inadeguato;</w:t>
+      </w:r>
+    </w:p>
+    <w:p>
+      <w:pPr>
+        <w:pStyle w:val="ListParagraph"/>
+        <w:numPr>
+          <w:ilvl w:val="0"/>
+          <w:numId w:val="3"/>
+        </w:numPr>
+        <w:spacing w:after="80" w:line="276"/>
+        <w:jc w:val="both"/>
+      </w:pPr>
+      <w:r>
         <w:t xml:space="preserve">ritardo del Cliente nel consegnare i documenti a WST;</w:t>
+      </w:r>
+    </w:p>
+    <w:p>
+      <w:pPr>
+        <w:pStyle w:val="ListParagraph"/>
+        <w:numPr>
+          <w:ilvl w:val="0"/>
+          <w:numId w:val="3"/>
+        </w:numPr>
+        <w:spacing w:after="80" w:line="276"/>
+        <w:jc w:val="both"/>
+      </w:pPr>
+      <w:r>
+        <w:t xml:space="preserve">indisponibilità temporanea delle interfacce applicative (API) o del Sistema di Conservazione del Conservatore; in tal caso il Cliente può sempre chiedere l'esibizione a WST;</w:t>
       </w:r>
     </w:p>
     <w:p>
@@ -4677,7 +4744,7 @@
           </w:p>
           <w:p>
             <w:pPr>
-              <w:spacing w:after="420"/>
+              <w:spacing w:after="300"/>
             </w:pPr>
             <w:r>
               <w:rPr>
@@ -4742,7 +4809,7 @@
           </w:p>
           <w:p>
             <w:pPr>
-              <w:spacing w:after="420"/>
+              <w:spacing w:after="300"/>
             </w:pPr>
             <w:r>
               <w:rPr>
@@ -4855,7 +4922,7 @@
           </w:p>
           <w:p>
             <w:pPr>
-              <w:spacing w:after="420"/>
+              <w:spacing w:after="300"/>
             </w:pPr>
             <w:r>
               <w:rPr>
@@ -4969,9 +5036,9 @@
             <w:tcW w:type="dxa" w:w="3277"/>
             <w:shd w:fill="6599CD" w:color="auto" w:val="clear"/>
             <w:tcMar>
-              <w:top w:type="dxa" w:w="35"/>
-              <w:left w:type="dxa" w:w="100"/>
-              <w:bottom w:type="dxa" w:w="35"/>
+              <w:top w:type="dxa" w:w="20"/>
+              <w:left w:type="dxa" w:w="100"/>
+              <w:bottom w:type="dxa" w:w="20"/>
               <w:right w:type="dxa" w:w="100"/>
             </w:tcMar>
             <w:vAlign w:val="center"/>
@@ -4997,9 +5064,9 @@
             <w:tcW w:type="dxa" w:w="6361"/>
             <w:shd w:fill="6599CD" w:color="auto" w:val="clear"/>
             <w:tcMar>
-              <w:top w:type="dxa" w:w="35"/>
-              <w:left w:type="dxa" w:w="100"/>
-              <w:bottom w:type="dxa" w:w="35"/>
+              <w:top w:type="dxa" w:w="20"/>
+              <w:left w:type="dxa" w:w="100"/>
+              <w:bottom w:type="dxa" w:w="20"/>
               <w:right w:type="dxa" w:w="100"/>
             </w:tcMar>
             <w:vAlign w:val="center"/>
@@ -5030,9 +5097,9 @@
           <w:tcPr>
             <w:tcW w:type="dxa" w:w="3277"/>
             <w:tcMar>
-              <w:top w:type="dxa" w:w="35"/>
-              <w:left w:type="dxa" w:w="100"/>
-              <w:bottom w:type="dxa" w:w="35"/>
+              <w:top w:type="dxa" w:w="20"/>
+              <w:left w:type="dxa" w:w="100"/>
+              <w:bottom w:type="dxa" w:w="20"/>
               <w:right w:type="dxa" w:w="100"/>
             </w:tcMar>
             <w:vAlign w:val="center"/>
@@ -5054,9 +5121,9 @@
           <w:tcPr>
             <w:tcW w:type="dxa" w:w="6361"/>
             <w:tcMar>
-              <w:top w:type="dxa" w:w="35"/>
-              <w:left w:type="dxa" w:w="100"/>
-              <w:bottom w:type="dxa" w:w="35"/>
+              <w:top w:type="dxa" w:w="20"/>
+              <w:left w:type="dxa" w:w="100"/>
+              <w:bottom w:type="dxa" w:w="20"/>
               <w:right w:type="dxa" w:w="100"/>
             </w:tcMar>
             <w:vAlign w:val="center"/>
@@ -5085,9 +5152,9 @@
             <w:tcW w:type="dxa" w:w="3277"/>
             <w:shd w:fill="EAF1F9" w:color="auto" w:val="clear"/>
             <w:tcMar>
-              <w:top w:type="dxa" w:w="35"/>
-              <w:left w:type="dxa" w:w="100"/>
-              <w:bottom w:type="dxa" w:w="35"/>
+              <w:top w:type="dxa" w:w="20"/>
+              <w:left w:type="dxa" w:w="100"/>
+              <w:bottom w:type="dxa" w:w="20"/>
               <w:right w:type="dxa" w:w="100"/>
             </w:tcMar>
             <w:vAlign w:val="center"/>
@@ -5110,9 +5177,9 @@
             <w:tcW w:type="dxa" w:w="6361"/>
             <w:shd w:fill="EAF1F9" w:color="auto" w:val="clear"/>
             <w:tcMar>
-              <w:top w:type="dxa" w:w="35"/>
-              <w:left w:type="dxa" w:w="100"/>
-              <w:bottom w:type="dxa" w:w="35"/>
+              <w:top w:type="dxa" w:w="20"/>
+              <w:left w:type="dxa" w:w="100"/>
+              <w:bottom w:type="dxa" w:w="20"/>
               <w:right w:type="dxa" w:w="100"/>
             </w:tcMar>
             <w:vAlign w:val="center"/>
@@ -5133,9 +5200,9 @@
           <w:tcPr>
             <w:tcW w:type="dxa" w:w="3277"/>
             <w:tcMar>
-              <w:top w:type="dxa" w:w="35"/>
-              <w:left w:type="dxa" w:w="100"/>
-              <w:bottom w:type="dxa" w:w="35"/>
+              <w:top w:type="dxa" w:w="20"/>
+              <w:left w:type="dxa" w:w="100"/>
+              <w:bottom w:type="dxa" w:w="20"/>
               <w:right w:type="dxa" w:w="100"/>
             </w:tcMar>
             <w:vAlign w:val="center"/>
@@ -5157,9 +5224,9 @@
           <w:tcPr>
             <w:tcW w:type="dxa" w:w="6361"/>
             <w:tcMar>
-              <w:top w:type="dxa" w:w="35"/>
-              <w:left w:type="dxa" w:w="100"/>
-              <w:bottom w:type="dxa" w:w="35"/>
+              <w:top w:type="dxa" w:w="20"/>
+              <w:left w:type="dxa" w:w="100"/>
+              <w:bottom w:type="dxa" w:w="20"/>
               <w:right w:type="dxa" w:w="100"/>
             </w:tcMar>
             <w:vAlign w:val="center"/>
@@ -5181,9 +5248,9 @@
             <w:tcW w:type="dxa" w:w="3277"/>
             <w:shd w:fill="EAF1F9" w:color="auto" w:val="clear"/>
             <w:tcMar>
-              <w:top w:type="dxa" w:w="35"/>
-              <w:left w:type="dxa" w:w="100"/>
-              <w:bottom w:type="dxa" w:w="35"/>
+              <w:top w:type="dxa" w:w="20"/>
+              <w:left w:type="dxa" w:w="100"/>
+              <w:bottom w:type="dxa" w:w="20"/>
               <w:right w:type="dxa" w:w="100"/>
             </w:tcMar>
             <w:vAlign w:val="center"/>
@@ -5206,9 +5273,9 @@
             <w:tcW w:type="dxa" w:w="6361"/>
             <w:shd w:fill="EAF1F9" w:color="auto" w:val="clear"/>
             <w:tcMar>
-              <w:top w:type="dxa" w:w="35"/>
-              <w:left w:type="dxa" w:w="100"/>
-              <w:bottom w:type="dxa" w:w="35"/>
+              <w:top w:type="dxa" w:w="20"/>
+              <w:left w:type="dxa" w:w="100"/>
+              <w:bottom w:type="dxa" w:w="20"/>
               <w:right w:type="dxa" w:w="100"/>
             </w:tcMar>
             <w:vAlign w:val="center"/>
@@ -5229,9 +5296,9 @@
           <w:tcPr>
             <w:tcW w:type="dxa" w:w="3277"/>
             <w:tcMar>
-              <w:top w:type="dxa" w:w="35"/>
-              <w:left w:type="dxa" w:w="100"/>
-              <w:bottom w:type="dxa" w:w="35"/>
+              <w:top w:type="dxa" w:w="20"/>
+              <w:left w:type="dxa" w:w="100"/>
+              <w:bottom w:type="dxa" w:w="20"/>
               <w:right w:type="dxa" w:w="100"/>
             </w:tcMar>
             <w:vAlign w:val="center"/>
@@ -5253,9 +5320,9 @@
           <w:tcPr>
             <w:tcW w:type="dxa" w:w="6361"/>
             <w:tcMar>
-              <w:top w:type="dxa" w:w="35"/>
-              <w:left w:type="dxa" w:w="100"/>
-              <w:bottom w:type="dxa" w:w="35"/>
+              <w:top w:type="dxa" w:w="20"/>
+              <w:left w:type="dxa" w:w="100"/>
+              <w:bottom w:type="dxa" w:w="20"/>
               <w:right w:type="dxa" w:w="100"/>
             </w:tcMar>
             <w:vAlign w:val="center"/>
@@ -5277,9 +5344,9 @@
             <w:tcW w:type="dxa" w:w="3277"/>
             <w:shd w:fill="EAF1F9" w:color="auto" w:val="clear"/>
             <w:tcMar>
-              <w:top w:type="dxa" w:w="35"/>
-              <w:left w:type="dxa" w:w="100"/>
-              <w:bottom w:type="dxa" w:w="35"/>
+              <w:top w:type="dxa" w:w="20"/>
+              <w:left w:type="dxa" w:w="100"/>
+              <w:bottom w:type="dxa" w:w="20"/>
               <w:right w:type="dxa" w:w="100"/>
             </w:tcMar>
             <w:vAlign w:val="center"/>
@@ -5302,9 +5369,9 @@
             <w:tcW w:type="dxa" w:w="6361"/>
             <w:shd w:fill="EAF1F9" w:color="auto" w:val="clear"/>
             <w:tcMar>
-              <w:top w:type="dxa" w:w="35"/>
-              <w:left w:type="dxa" w:w="100"/>
-              <w:bottom w:type="dxa" w:w="35"/>
+              <w:top w:type="dxa" w:w="20"/>
+              <w:left w:type="dxa" w:w="100"/>
+              <w:bottom w:type="dxa" w:w="20"/>
               <w:right w:type="dxa" w:w="100"/>
             </w:tcMar>
             <w:vAlign w:val="center"/>
@@ -5325,9 +5392,9 @@
           <w:tcPr>
             <w:tcW w:type="dxa" w:w="3277"/>
             <w:tcMar>
-              <w:top w:type="dxa" w:w="35"/>
-              <w:left w:type="dxa" w:w="100"/>
-              <w:bottom w:type="dxa" w:w="35"/>
+              <w:top w:type="dxa" w:w="20"/>
+              <w:left w:type="dxa" w:w="100"/>
+              <w:bottom w:type="dxa" w:w="20"/>
               <w:right w:type="dxa" w:w="100"/>
             </w:tcMar>
             <w:vAlign w:val="center"/>
@@ -5349,9 +5416,9 @@
           <w:tcPr>
             <w:tcW w:type="dxa" w:w="6361"/>
             <w:tcMar>
-              <w:top w:type="dxa" w:w="35"/>
-              <w:left w:type="dxa" w:w="100"/>
-              <w:bottom w:type="dxa" w:w="35"/>
+              <w:top w:type="dxa" w:w="20"/>
+              <w:left w:type="dxa" w:w="100"/>
+              <w:bottom w:type="dxa" w:w="20"/>
               <w:right w:type="dxa" w:w="100"/>
             </w:tcMar>
             <w:vAlign w:val="center"/>
@@ -5373,9 +5440,9 @@
             <w:tcW w:type="dxa" w:w="3277"/>
             <w:shd w:fill="EAF1F9" w:color="auto" w:val="clear"/>
             <w:tcMar>
-              <w:top w:type="dxa" w:w="35"/>
-              <w:left w:type="dxa" w:w="100"/>
-              <w:bottom w:type="dxa" w:w="35"/>
+              <w:top w:type="dxa" w:w="20"/>
+              <w:left w:type="dxa" w:w="100"/>
+              <w:bottom w:type="dxa" w:w="20"/>
               <w:right w:type="dxa" w:w="100"/>
             </w:tcMar>
             <w:vAlign w:val="center"/>
@@ -5398,9 +5465,9 @@
             <w:tcW w:type="dxa" w:w="6361"/>
             <w:shd w:fill="EAF1F9" w:color="auto" w:val="clear"/>
             <w:tcMar>
-              <w:top w:type="dxa" w:w="35"/>
-              <w:left w:type="dxa" w:w="100"/>
-              <w:bottom w:type="dxa" w:w="35"/>
+              <w:top w:type="dxa" w:w="20"/>
+              <w:left w:type="dxa" w:w="100"/>
+              <w:bottom w:type="dxa" w:w="20"/>
               <w:right w:type="dxa" w:w="100"/>
             </w:tcMar>
             <w:vAlign w:val="center"/>
@@ -5421,9 +5488,9 @@
           <w:tcPr>
             <w:tcW w:type="dxa" w:w="3277"/>
             <w:tcMar>
-              <w:top w:type="dxa" w:w="35"/>
-              <w:left w:type="dxa" w:w="100"/>
-              <w:bottom w:type="dxa" w:w="35"/>
+              <w:top w:type="dxa" w:w="20"/>
+              <w:left w:type="dxa" w:w="100"/>
+              <w:bottom w:type="dxa" w:w="20"/>
               <w:right w:type="dxa" w:w="100"/>
             </w:tcMar>
             <w:vAlign w:val="center"/>
@@ -5445,9 +5512,9 @@
           <w:tcPr>
             <w:tcW w:type="dxa" w:w="6361"/>
             <w:tcMar>
-              <w:top w:type="dxa" w:w="35"/>
-              <w:left w:type="dxa" w:w="100"/>
-              <w:bottom w:type="dxa" w:w="35"/>
+              <w:top w:type="dxa" w:w="20"/>
+              <w:left w:type="dxa" w:w="100"/>
+              <w:bottom w:type="dxa" w:w="20"/>
               <w:right w:type="dxa" w:w="100"/>
             </w:tcMar>
             <w:vAlign w:val="center"/>
@@ -5469,9 +5536,9 @@
             <w:tcW w:type="dxa" w:w="3277"/>
             <w:shd w:fill="EAF1F9" w:color="auto" w:val="clear"/>
             <w:tcMar>
-              <w:top w:type="dxa" w:w="35"/>
-              <w:left w:type="dxa" w:w="100"/>
-              <w:bottom w:type="dxa" w:w="35"/>
+              <w:top w:type="dxa" w:w="20"/>
+              <w:left w:type="dxa" w:w="100"/>
+              <w:bottom w:type="dxa" w:w="20"/>
               <w:right w:type="dxa" w:w="100"/>
             </w:tcMar>
             <w:vAlign w:val="center"/>
@@ -5494,9 +5561,9 @@
             <w:tcW w:type="dxa" w:w="6361"/>
             <w:shd w:fill="EAF1F9" w:color="auto" w:val="clear"/>
             <w:tcMar>
-              <w:top w:type="dxa" w:w="35"/>
-              <w:left w:type="dxa" w:w="100"/>
-              <w:bottom w:type="dxa" w:w="35"/>
+              <w:top w:type="dxa" w:w="20"/>
+              <w:left w:type="dxa" w:w="100"/>
+              <w:bottom w:type="dxa" w:w="20"/>
               <w:right w:type="dxa" w:w="100"/>
             </w:tcMar>
             <w:vAlign w:val="center"/>
@@ -5517,9 +5584,9 @@
           <w:tcPr>
             <w:tcW w:type="dxa" w:w="3277"/>
             <w:tcMar>
-              <w:top w:type="dxa" w:w="35"/>
-              <w:left w:type="dxa" w:w="100"/>
-              <w:bottom w:type="dxa" w:w="35"/>
+              <w:top w:type="dxa" w:w="20"/>
+              <w:left w:type="dxa" w:w="100"/>
+              <w:bottom w:type="dxa" w:w="20"/>
               <w:right w:type="dxa" w:w="100"/>
             </w:tcMar>
             <w:vAlign w:val="center"/>
@@ -5541,9 +5608,9 @@
           <w:tcPr>
             <w:tcW w:type="dxa" w:w="6361"/>
             <w:tcMar>
-              <w:top w:type="dxa" w:w="35"/>
-              <w:left w:type="dxa" w:w="100"/>
-              <w:bottom w:type="dxa" w:w="35"/>
+              <w:top w:type="dxa" w:w="20"/>
+              <w:left w:type="dxa" w:w="100"/>
+              <w:bottom w:type="dxa" w:w="20"/>
               <w:right w:type="dxa" w:w="100"/>
             </w:tcMar>
             <w:vAlign w:val="center"/>
@@ -5615,9 +5682,9 @@
             <w:tcW w:type="dxa" w:w="2400"/>
             <w:shd w:fill="6599CD" w:color="auto" w:val="clear"/>
             <w:tcMar>
-              <w:top w:type="dxa" w:w="35"/>
-              <w:left w:type="dxa" w:w="100"/>
-              <w:bottom w:type="dxa" w:w="35"/>
+              <w:top w:type="dxa" w:w="20"/>
+              <w:left w:type="dxa" w:w="100"/>
+              <w:bottom w:type="dxa" w:w="20"/>
               <w:right w:type="dxa" w:w="100"/>
             </w:tcMar>
             <w:vAlign w:val="center"/>
@@ -5643,9 +5710,9 @@
             <w:tcW w:type="dxa" w:w="3638"/>
             <w:shd w:fill="6599CD" w:color="auto" w:val="clear"/>
             <w:tcMar>
-              <w:top w:type="dxa" w:w="35"/>
-              <w:left w:type="dxa" w:w="100"/>
-              <w:bottom w:type="dxa" w:w="35"/>
+              <w:top w:type="dxa" w:w="20"/>
+              <w:left w:type="dxa" w:w="100"/>
+              <w:bottom w:type="dxa" w:w="20"/>
               <w:right w:type="dxa" w:w="100"/>
             </w:tcMar>
             <w:vAlign w:val="center"/>
@@ -5671,9 +5738,9 @@
             <w:tcW w:type="dxa" w:w="1800"/>
             <w:shd w:fill="6599CD" w:color="auto" w:val="clear"/>
             <w:tcMar>
-              <w:top w:type="dxa" w:w="35"/>
-              <w:left w:type="dxa" w:w="100"/>
-              <w:bottom w:type="dxa" w:w="35"/>
+              <w:top w:type="dxa" w:w="20"/>
+              <w:left w:type="dxa" w:w="100"/>
+              <w:bottom w:type="dxa" w:w="20"/>
               <w:right w:type="dxa" w:w="100"/>
             </w:tcMar>
             <w:vAlign w:val="center"/>
@@ -5699,9 +5766,9 @@
             <w:tcW w:type="dxa" w:w="1800"/>
             <w:shd w:fill="6599CD" w:color="auto" w:val="clear"/>
             <w:tcMar>
-              <w:top w:type="dxa" w:w="35"/>
-              <w:left w:type="dxa" w:w="100"/>
-              <w:bottom w:type="dxa" w:w="35"/>
+              <w:top w:type="dxa" w:w="20"/>
+              <w:left w:type="dxa" w:w="100"/>
+              <w:bottom w:type="dxa" w:w="20"/>
               <w:right w:type="dxa" w:w="100"/>
             </w:tcMar>
             <w:vAlign w:val="center"/>
@@ -5732,9 +5799,9 @@
           <w:tcPr>
             <w:tcW w:type="dxa" w:w="2400"/>
             <w:tcMar>
-              <w:top w:type="dxa" w:w="35"/>
-              <w:left w:type="dxa" w:w="100"/>
-              <w:bottom w:type="dxa" w:w="35"/>
+              <w:top w:type="dxa" w:w="20"/>
+              <w:left w:type="dxa" w:w="100"/>
+              <w:bottom w:type="dxa" w:w="20"/>
               <w:right w:type="dxa" w:w="100"/>
             </w:tcMar>
             <w:vAlign w:val="center"/>
@@ -5756,9 +5823,9 @@
           <w:tcPr>
             <w:tcW w:type="dxa" w:w="3638"/>
             <w:tcMar>
-              <w:top w:type="dxa" w:w="35"/>
-              <w:left w:type="dxa" w:w="100"/>
-              <w:bottom w:type="dxa" w:w="35"/>
+              <w:top w:type="dxa" w:w="20"/>
+              <w:left w:type="dxa" w:w="100"/>
+              <w:bottom w:type="dxa" w:w="20"/>
               <w:right w:type="dxa" w:w="100"/>
             </w:tcMar>
             <w:vAlign w:val="center"/>
@@ -5780,9 +5847,9 @@
           <w:tcPr>
             <w:tcW w:type="dxa" w:w="1800"/>
             <w:tcMar>
-              <w:top w:type="dxa" w:w="35"/>
-              <w:left w:type="dxa" w:w="100"/>
-              <w:bottom w:type="dxa" w:w="35"/>
+              <w:top w:type="dxa" w:w="20"/>
+              <w:left w:type="dxa" w:w="100"/>
+              <w:bottom w:type="dxa" w:w="20"/>
               <w:right w:type="dxa" w:w="100"/>
             </w:tcMar>
             <w:vAlign w:val="center"/>
@@ -5804,9 +5871,9 @@
           <w:tcPr>
             <w:tcW w:type="dxa" w:w="1800"/>
             <w:tcMar>
-              <w:top w:type="dxa" w:w="35"/>
-              <w:left w:type="dxa" w:w="100"/>
-              <w:bottom w:type="dxa" w:w="35"/>
+              <w:top w:type="dxa" w:w="20"/>
+              <w:left w:type="dxa" w:w="100"/>
+              <w:bottom w:type="dxa" w:w="20"/>
               <w:right w:type="dxa" w:w="100"/>
             </w:tcMar>
             <w:vAlign w:val="center"/>
@@ -5835,9 +5902,9 @@
             <w:tcW w:type="dxa" w:w="2400"/>
             <w:shd w:fill="EAF1F9" w:color="auto" w:val="clear"/>
             <w:tcMar>
-              <w:top w:type="dxa" w:w="35"/>
-              <w:left w:type="dxa" w:w="100"/>
-              <w:bottom w:type="dxa" w:w="35"/>
+              <w:top w:type="dxa" w:w="20"/>
+              <w:left w:type="dxa" w:w="100"/>
+              <w:bottom w:type="dxa" w:w="20"/>
               <w:right w:type="dxa" w:w="100"/>
             </w:tcMar>
             <w:vAlign w:val="center"/>
@@ -5860,9 +5927,9 @@
             <w:tcW w:type="dxa" w:w="3638"/>
             <w:shd w:fill="EAF1F9" w:color="auto" w:val="clear"/>
             <w:tcMar>
-              <w:top w:type="dxa" w:w="35"/>
-              <w:left w:type="dxa" w:w="100"/>
-              <w:bottom w:type="dxa" w:w="35"/>
+              <w:top w:type="dxa" w:w="20"/>
+              <w:left w:type="dxa" w:w="100"/>
+              <w:bottom w:type="dxa" w:w="20"/>
               <w:right w:type="dxa" w:w="100"/>
             </w:tcMar>
             <w:vAlign w:val="center"/>
@@ -5885,9 +5952,9 @@
             <w:tcW w:type="dxa" w:w="1800"/>
             <w:shd w:fill="EAF1F9" w:color="auto" w:val="clear"/>
             <w:tcMar>
-              <w:top w:type="dxa" w:w="35"/>
-              <w:left w:type="dxa" w:w="100"/>
-              <w:bottom w:type="dxa" w:w="35"/>
+              <w:top w:type="dxa" w:w="20"/>
+              <w:left w:type="dxa" w:w="100"/>
+              <w:bottom w:type="dxa" w:w="20"/>
               <w:right w:type="dxa" w:w="100"/>
             </w:tcMar>
             <w:vAlign w:val="center"/>
@@ -5910,9 +5977,9 @@
             <w:tcW w:type="dxa" w:w="1800"/>
             <w:shd w:fill="EAF1F9" w:color="auto" w:val="clear"/>
             <w:tcMar>
-              <w:top w:type="dxa" w:w="35"/>
-              <w:left w:type="dxa" w:w="100"/>
-              <w:bottom w:type="dxa" w:w="35"/>
+              <w:top w:type="dxa" w:w="20"/>
+              <w:left w:type="dxa" w:w="100"/>
+              <w:bottom w:type="dxa" w:w="20"/>
               <w:right w:type="dxa" w:w="100"/>
             </w:tcMar>
             <w:vAlign w:val="center"/>
@@ -5940,9 +6007,9 @@
           <w:tcPr>
             <w:tcW w:type="dxa" w:w="2400"/>
             <w:tcMar>
-              <w:top w:type="dxa" w:w="35"/>
-              <w:left w:type="dxa" w:w="100"/>
-              <w:bottom w:type="dxa" w:w="35"/>
+              <w:top w:type="dxa" w:w="20"/>
+              <w:left w:type="dxa" w:w="100"/>
+              <w:bottom w:type="dxa" w:w="20"/>
               <w:right w:type="dxa" w:w="100"/>
             </w:tcMar>
             <w:vAlign w:val="center"/>
@@ -5964,9 +6031,9 @@
           <w:tcPr>
             <w:tcW w:type="dxa" w:w="3638"/>
             <w:tcMar>
-              <w:top w:type="dxa" w:w="35"/>
-              <w:left w:type="dxa" w:w="100"/>
-              <w:bottom w:type="dxa" w:w="35"/>
+              <w:top w:type="dxa" w:w="20"/>
+              <w:left w:type="dxa" w:w="100"/>
+              <w:bottom w:type="dxa" w:w="20"/>
               <w:right w:type="dxa" w:w="100"/>
             </w:tcMar>
             <w:vAlign w:val="center"/>
@@ -5988,9 +6055,9 @@
           <w:tcPr>
             <w:tcW w:type="dxa" w:w="1800"/>
             <w:tcMar>
-              <w:top w:type="dxa" w:w="35"/>
-              <w:left w:type="dxa" w:w="100"/>
-              <w:bottom w:type="dxa" w:w="35"/>
+              <w:top w:type="dxa" w:w="20"/>
+              <w:left w:type="dxa" w:w="100"/>
+              <w:bottom w:type="dxa" w:w="20"/>
               <w:right w:type="dxa" w:w="100"/>
             </w:tcMar>
             <w:vAlign w:val="center"/>
@@ -6012,9 +6079,9 @@
           <w:tcPr>
             <w:tcW w:type="dxa" w:w="1800"/>
             <w:tcMar>
-              <w:top w:type="dxa" w:w="35"/>
-              <w:left w:type="dxa" w:w="100"/>
-              <w:bottom w:type="dxa" w:w="35"/>
+              <w:top w:type="dxa" w:w="20"/>
+              <w:left w:type="dxa" w:w="100"/>
+              <w:bottom w:type="dxa" w:w="20"/>
               <w:right w:type="dxa" w:w="100"/>
             </w:tcMar>
             <w:vAlign w:val="center"/>
@@ -6089,7 +6156,7 @@
           </w:p>
           <w:p>
             <w:pPr>
-              <w:spacing w:after="420"/>
+              <w:spacing w:after="300"/>
             </w:pPr>
             <w:r>
               <w:rPr>
@@ -6215,9 +6282,9 @@
             <w:tcW w:type="dxa" w:w="5976"/>
             <w:shd w:fill="6599CD" w:color="auto" w:val="clear"/>
             <w:tcMar>
-              <w:top w:type="dxa" w:w="35"/>
-              <w:left w:type="dxa" w:w="100"/>
-              <w:bottom w:type="dxa" w:w="35"/>
+              <w:top w:type="dxa" w:w="20"/>
+              <w:left w:type="dxa" w:w="100"/>
+              <w:bottom w:type="dxa" w:w="20"/>
               <w:right w:type="dxa" w:w="100"/>
             </w:tcMar>
             <w:vAlign w:val="center"/>
@@ -6243,9 +6310,9 @@
             <w:tcW w:type="dxa" w:w="2120"/>
             <w:shd w:fill="6599CD" w:color="auto" w:val="clear"/>
             <w:tcMar>
-              <w:top w:type="dxa" w:w="35"/>
-              <w:left w:type="dxa" w:w="100"/>
-              <w:bottom w:type="dxa" w:w="35"/>
+              <w:top w:type="dxa" w:w="20"/>
+              <w:left w:type="dxa" w:w="100"/>
+              <w:bottom w:type="dxa" w:w="20"/>
               <w:right w:type="dxa" w:w="100"/>
             </w:tcMar>
             <w:vAlign w:val="center"/>
@@ -6271,9 +6338,9 @@
             <w:tcW w:type="dxa" w:w="1542"/>
             <w:shd w:fill="6599CD" w:color="auto" w:val="clear"/>
             <w:tcMar>
-              <w:top w:type="dxa" w:w="35"/>
-              <w:left w:type="dxa" w:w="100"/>
-              <w:bottom w:type="dxa" w:w="35"/>
+              <w:top w:type="dxa" w:w="20"/>
+              <w:left w:type="dxa" w:w="100"/>
+              <w:bottom w:type="dxa" w:w="20"/>
               <w:right w:type="dxa" w:w="100"/>
             </w:tcMar>
             <w:vAlign w:val="center"/>
@@ -6304,23 +6371,23 @@
           <w:tcPr>
             <w:tcW w:type="dxa" w:w="5976"/>
             <w:tcMar>
-              <w:top w:type="dxa" w:w="35"/>
-              <w:left w:type="dxa" w:w="100"/>
-              <w:bottom w:type="dxa" w:w="35"/>
-              <w:right w:type="dxa" w:w="100"/>
-            </w:tcMar>
-            <w:vAlign w:val="center"/>
-          </w:tcPr>
-          <w:p>
-            <w:pPr>
-              <w:spacing w:after="0" w:before="0"/>
-            </w:pPr>
-            <w:r>
-              <w:rPr>
-                <w:sz w:val="19"/>
-                <w:szCs w:val="19"/>
-              </w:rPr>
-              <w:t xml:space="preserve">Pacchetto Trasportatori (già licenziatari del Software): attivazione, 100 MB di spazio, versamento a cura di WST, ricevute, assistenza, fino a 6 esibizioni per anno</w:t>
+              <w:top w:type="dxa" w:w="20"/>
+              <w:left w:type="dxa" w:w="100"/>
+              <w:bottom w:type="dxa" w:w="20"/>
+              <w:right w:type="dxa" w:w="100"/>
+            </w:tcMar>
+            <w:vAlign w:val="center"/>
+          </w:tcPr>
+          <w:p>
+            <w:pPr>
+              <w:spacing w:after="0" w:before="0"/>
+            </w:pPr>
+            <w:r>
+              <w:rPr>
+                <w:sz w:val="19"/>
+                <w:szCs w:val="19"/>
+              </w:rPr>
+              <w:t xml:space="preserve">Pacchetto Trasportatori (già licenziatari del Software): attivazione, 100 MB di spazio, versamento a cura di WST, ricevute, assistenza, fino a 3 esibizioni per anno</w:t>
             </w:r>
           </w:p>
         </w:tc>
@@ -6328,9 +6395,9 @@
           <w:tcPr>
             <w:tcW w:type="dxa" w:w="2120"/>
             <w:tcMar>
-              <w:top w:type="dxa" w:w="35"/>
-              <w:left w:type="dxa" w:w="100"/>
-              <w:bottom w:type="dxa" w:w="35"/>
+              <w:top w:type="dxa" w:w="20"/>
+              <w:left w:type="dxa" w:w="100"/>
+              <w:bottom w:type="dxa" w:w="20"/>
               <w:right w:type="dxa" w:w="100"/>
             </w:tcMar>
             <w:vAlign w:val="center"/>
@@ -6352,9 +6419,9 @@
           <w:tcPr>
             <w:tcW w:type="dxa" w:w="1542"/>
             <w:tcMar>
-              <w:top w:type="dxa" w:w="35"/>
-              <w:left w:type="dxa" w:w="100"/>
-              <w:bottom w:type="dxa" w:w="35"/>
+              <w:top w:type="dxa" w:w="20"/>
+              <w:left w:type="dxa" w:w="100"/>
+              <w:bottom w:type="dxa" w:w="20"/>
               <w:right w:type="dxa" w:w="100"/>
             </w:tcMar>
             <w:vAlign w:val="center"/>
@@ -6383,23 +6450,23 @@
             <w:tcW w:type="dxa" w:w="5976"/>
             <w:shd w:fill="EAF1F9" w:color="auto" w:val="clear"/>
             <w:tcMar>
-              <w:top w:type="dxa" w:w="35"/>
-              <w:left w:type="dxa" w:w="100"/>
-              <w:bottom w:type="dxa" w:w="35"/>
-              <w:right w:type="dxa" w:w="100"/>
-            </w:tcMar>
-            <w:vAlign w:val="center"/>
-          </w:tcPr>
-          <w:p>
-            <w:pPr>
-              <w:spacing w:after="0" w:before="0"/>
-            </w:pPr>
-            <w:r>
-              <w:rPr>
-                <w:sz w:val="19"/>
-                <w:szCs w:val="19"/>
-              </w:rPr>
-              <w:t xml:space="preserve">Pacchetto Produttori: licenza del Software, attivazione, 100 MB di spazio, versamento a cura di WST, ricevute, assistenza, fino a 6 esibizioni per anno</w:t>
+              <w:top w:type="dxa" w:w="20"/>
+              <w:left w:type="dxa" w:w="100"/>
+              <w:bottom w:type="dxa" w:w="20"/>
+              <w:right w:type="dxa" w:w="100"/>
+            </w:tcMar>
+            <w:vAlign w:val="center"/>
+          </w:tcPr>
+          <w:p>
+            <w:pPr>
+              <w:spacing w:after="0" w:before="0"/>
+            </w:pPr>
+            <w:r>
+              <w:rPr>
+                <w:sz w:val="19"/>
+                <w:szCs w:val="19"/>
+              </w:rPr>
+              <w:t xml:space="preserve">Pacchetto Produttori: licenza del Software, attivazione, 100 MB di spazio, versamento a cura di WST, ricevute, assistenza, fino a 3 esibizioni per anno</w:t>
             </w:r>
           </w:p>
         </w:tc>
@@ -6408,9 +6475,9 @@
             <w:tcW w:type="dxa" w:w="2120"/>
             <w:shd w:fill="EAF1F9" w:color="auto" w:val="clear"/>
             <w:tcMar>
-              <w:top w:type="dxa" w:w="35"/>
-              <w:left w:type="dxa" w:w="100"/>
-              <w:bottom w:type="dxa" w:w="35"/>
+              <w:top w:type="dxa" w:w="20"/>
+              <w:left w:type="dxa" w:w="100"/>
+              <w:bottom w:type="dxa" w:w="20"/>
               <w:right w:type="dxa" w:w="100"/>
             </w:tcMar>
             <w:vAlign w:val="center"/>
@@ -6433,9 +6500,9 @@
             <w:tcW w:type="dxa" w:w="1542"/>
             <w:shd w:fill="EAF1F9" w:color="auto" w:val="clear"/>
             <w:tcMar>
-              <w:top w:type="dxa" w:w="35"/>
-              <w:left w:type="dxa" w:w="100"/>
-              <w:bottom w:type="dxa" w:w="35"/>
+              <w:top w:type="dxa" w:w="20"/>
+              <w:left w:type="dxa" w:w="100"/>
+              <w:bottom w:type="dxa" w:w="20"/>
               <w:right w:type="dxa" w:w="100"/>
             </w:tcMar>
             <w:vAlign w:val="center"/>
@@ -6502,9 +6569,9 @@
             <w:tcW w:type="dxa" w:w="5976"/>
             <w:shd w:fill="6599CD" w:color="auto" w:val="clear"/>
             <w:tcMar>
-              <w:top w:type="dxa" w:w="35"/>
-              <w:left w:type="dxa" w:w="100"/>
-              <w:bottom w:type="dxa" w:w="35"/>
+              <w:top w:type="dxa" w:w="20"/>
+              <w:left w:type="dxa" w:w="100"/>
+              <w:bottom w:type="dxa" w:w="20"/>
               <w:right w:type="dxa" w:w="100"/>
             </w:tcMar>
             <w:vAlign w:val="center"/>
@@ -6530,9 +6597,9 @@
             <w:tcW w:type="dxa" w:w="2120"/>
             <w:shd w:fill="6599CD" w:color="auto" w:val="clear"/>
             <w:tcMar>
-              <w:top w:type="dxa" w:w="35"/>
-              <w:left w:type="dxa" w:w="100"/>
-              <w:bottom w:type="dxa" w:w="35"/>
+              <w:top w:type="dxa" w:w="20"/>
+              <w:left w:type="dxa" w:w="100"/>
+              <w:bottom w:type="dxa" w:w="20"/>
               <w:right w:type="dxa" w:w="100"/>
             </w:tcMar>
             <w:vAlign w:val="center"/>
@@ -6558,9 +6625,9 @@
             <w:tcW w:type="dxa" w:w="1542"/>
             <w:shd w:fill="6599CD" w:color="auto" w:val="clear"/>
             <w:tcMar>
-              <w:top w:type="dxa" w:w="35"/>
-              <w:left w:type="dxa" w:w="100"/>
-              <w:bottom w:type="dxa" w:w="35"/>
+              <w:top w:type="dxa" w:w="20"/>
+              <w:left w:type="dxa" w:w="100"/>
+              <w:bottom w:type="dxa" w:w="20"/>
               <w:right w:type="dxa" w:w="100"/>
             </w:tcMar>
             <w:vAlign w:val="center"/>
@@ -6591,23 +6658,23 @@
           <w:tcPr>
             <w:tcW w:type="dxa" w:w="5976"/>
             <w:tcMar>
-              <w:top w:type="dxa" w:w="35"/>
-              <w:left w:type="dxa" w:w="100"/>
-              <w:bottom w:type="dxa" w:w="35"/>
-              <w:right w:type="dxa" w:w="100"/>
-            </w:tcMar>
-            <w:vAlign w:val="center"/>
-          </w:tcPr>
-          <w:p>
-            <w:pPr>
-              <w:spacing w:after="0" w:before="0"/>
-            </w:pPr>
-            <w:r>
-              <w:rPr>
-                <w:sz w:val="19"/>
-                <w:szCs w:val="19"/>
-              </w:rPr>
-              <w:t xml:space="preserve">Da 100 MB a 1 GB</w:t>
+              <w:top w:type="dxa" w:w="20"/>
+              <w:left w:type="dxa" w:w="100"/>
+              <w:bottom w:type="dxa" w:w="20"/>
+              <w:right w:type="dxa" w:w="100"/>
+            </w:tcMar>
+            <w:vAlign w:val="center"/>
+          </w:tcPr>
+          <w:p>
+            <w:pPr>
+              <w:spacing w:after="0" w:before="0"/>
+            </w:pPr>
+            <w:r>
+              <w:rPr>
+                <w:sz w:val="19"/>
+                <w:szCs w:val="19"/>
+              </w:rPr>
+              <w:t xml:space="preserve">Da 100 MB a 150 MB (50 MB aggiuntivi)</w:t>
             </w:r>
           </w:p>
         </w:tc>
@@ -6615,9 +6682,9 @@
           <w:tcPr>
             <w:tcW w:type="dxa" w:w="2120"/>
             <w:tcMar>
-              <w:top w:type="dxa" w:w="35"/>
-              <w:left w:type="dxa" w:w="100"/>
-              <w:bottom w:type="dxa" w:w="35"/>
+              <w:top w:type="dxa" w:w="20"/>
+              <w:left w:type="dxa" w:w="100"/>
+              <w:bottom w:type="dxa" w:w="20"/>
               <w:right w:type="dxa" w:w="100"/>
             </w:tcMar>
             <w:vAlign w:val="center"/>
@@ -6639,23 +6706,23 @@
           <w:tcPr>
             <w:tcW w:type="dxa" w:w="1542"/>
             <w:tcMar>
-              <w:top w:type="dxa" w:w="35"/>
-              <w:left w:type="dxa" w:w="100"/>
-              <w:bottom w:type="dxa" w:w="35"/>
-              <w:right w:type="dxa" w:w="100"/>
-            </w:tcMar>
-            <w:vAlign w:val="center"/>
-          </w:tcPr>
-          <w:p>
-            <w:pPr>
-              <w:spacing w:after="0" w:before="0"/>
-            </w:pPr>
-            <w:r>
-              <w:rPr>
-                <w:sz w:val="19"/>
-                <w:szCs w:val="19"/>
-              </w:rPr>
-              <w:t xml:space="preserve">130,00</w:t>
+              <w:top w:type="dxa" w:w="20"/>
+              <w:left w:type="dxa" w:w="100"/>
+              <w:bottom w:type="dxa" w:w="20"/>
+              <w:right w:type="dxa" w:w="100"/>
+            </w:tcMar>
+            <w:vAlign w:val="center"/>
+          </w:tcPr>
+          <w:p>
+            <w:pPr>
+              <w:spacing w:after="0" w:before="0"/>
+            </w:pPr>
+            <w:r>
+              <w:rPr>
+                <w:sz w:val="19"/>
+                <w:szCs w:val="19"/>
+              </w:rPr>
+              <w:t xml:space="preserve">95,00</w:t>
             </w:r>
           </w:p>
         </w:tc>
@@ -6670,23 +6737,23 @@
             <w:tcW w:type="dxa" w:w="5976"/>
             <w:shd w:fill="EAF1F9" w:color="auto" w:val="clear"/>
             <w:tcMar>
-              <w:top w:type="dxa" w:w="35"/>
-              <w:left w:type="dxa" w:w="100"/>
-              <w:bottom w:type="dxa" w:w="35"/>
-              <w:right w:type="dxa" w:w="100"/>
-            </w:tcMar>
-            <w:vAlign w:val="center"/>
-          </w:tcPr>
-          <w:p>
-            <w:pPr>
-              <w:spacing w:after="0" w:before="0"/>
-            </w:pPr>
-            <w:r>
-              <w:rPr>
-                <w:sz w:val="19"/>
-                <w:szCs w:val="19"/>
-              </w:rPr>
-              <w:t xml:space="preserve">Dal 2° al 10° GB</w:t>
+              <w:top w:type="dxa" w:w="20"/>
+              <w:left w:type="dxa" w:w="100"/>
+              <w:bottom w:type="dxa" w:w="20"/>
+              <w:right w:type="dxa" w:w="100"/>
+            </w:tcMar>
+            <w:vAlign w:val="center"/>
+          </w:tcPr>
+          <w:p>
+            <w:pPr>
+              <w:spacing w:after="0" w:before="0"/>
+            </w:pPr>
+            <w:r>
+              <w:rPr>
+                <w:sz w:val="19"/>
+                <w:szCs w:val="19"/>
+              </w:rPr>
+              <w:t xml:space="preserve">Da 150 MB a 1 GB</w:t>
             </w:r>
           </w:p>
         </w:tc>
@@ -6695,23 +6762,23 @@
             <w:tcW w:type="dxa" w:w="2120"/>
             <w:shd w:fill="EAF1F9" w:color="auto" w:val="clear"/>
             <w:tcMar>
-              <w:top w:type="dxa" w:w="35"/>
-              <w:left w:type="dxa" w:w="100"/>
-              <w:bottom w:type="dxa" w:w="35"/>
-              <w:right w:type="dxa" w:w="100"/>
-            </w:tcMar>
-            <w:vAlign w:val="center"/>
-          </w:tcPr>
-          <w:p>
-            <w:pPr>
-              <w:spacing w:after="0" w:before="0"/>
-            </w:pPr>
-            <w:r>
-              <w:rPr>
-                <w:sz w:val="19"/>
-                <w:szCs w:val="19"/>
-              </w:rPr>
-              <w:t xml:space="preserve">per GB, per anno</w:t>
+              <w:top w:type="dxa" w:w="20"/>
+              <w:left w:type="dxa" w:w="100"/>
+              <w:bottom w:type="dxa" w:w="20"/>
+              <w:right w:type="dxa" w:w="100"/>
+            </w:tcMar>
+            <w:vAlign w:val="center"/>
+          </w:tcPr>
+          <w:p>
+            <w:pPr>
+              <w:spacing w:after="0" w:before="0"/>
+            </w:pPr>
+            <w:r>
+              <w:rPr>
+                <w:sz w:val="19"/>
+                <w:szCs w:val="19"/>
+              </w:rPr>
+              <w:t xml:space="preserve">per anno solare</w:t>
             </w:r>
           </w:p>
         </w:tc>
@@ -6720,23 +6787,23 @@
             <w:tcW w:type="dxa" w:w="1542"/>
             <w:shd w:fill="EAF1F9" w:color="auto" w:val="clear"/>
             <w:tcMar>
-              <w:top w:type="dxa" w:w="35"/>
-              <w:left w:type="dxa" w:w="100"/>
-              <w:bottom w:type="dxa" w:w="35"/>
-              <w:right w:type="dxa" w:w="100"/>
-            </w:tcMar>
-            <w:vAlign w:val="center"/>
-          </w:tcPr>
-          <w:p>
-            <w:pPr>
-              <w:spacing w:after="0" w:before="0"/>
-            </w:pPr>
-            <w:r>
-              <w:rPr>
-                <w:sz w:val="19"/>
-                <w:szCs w:val="19"/>
-              </w:rPr>
-              <w:t xml:space="preserve">97,00</w:t>
+              <w:top w:type="dxa" w:w="20"/>
+              <w:left w:type="dxa" w:w="100"/>
+              <w:bottom w:type="dxa" w:w="20"/>
+              <w:right w:type="dxa" w:w="100"/>
+            </w:tcMar>
+            <w:vAlign w:val="center"/>
+          </w:tcPr>
+          <w:p>
+            <w:pPr>
+              <w:spacing w:after="0" w:before="0"/>
+            </w:pPr>
+            <w:r>
+              <w:rPr>
+                <w:sz w:val="19"/>
+                <w:szCs w:val="19"/>
+              </w:rPr>
+              <w:t xml:space="preserve">170,00</w:t>
             </w:r>
           </w:p>
         </w:tc>
@@ -6750,23 +6817,23 @@
           <w:tcPr>
             <w:tcW w:type="dxa" w:w="5976"/>
             <w:tcMar>
-              <w:top w:type="dxa" w:w="35"/>
-              <w:left w:type="dxa" w:w="100"/>
-              <w:bottom w:type="dxa" w:w="35"/>
-              <w:right w:type="dxa" w:w="100"/>
-            </w:tcMar>
-            <w:vAlign w:val="center"/>
-          </w:tcPr>
-          <w:p>
-            <w:pPr>
-              <w:spacing w:after="0" w:before="0"/>
-            </w:pPr>
-            <w:r>
-              <w:rPr>
-                <w:sz w:val="19"/>
-                <w:szCs w:val="19"/>
-              </w:rPr>
-              <w:t xml:space="preserve">Dall'11° al 100° GB</w:t>
+              <w:top w:type="dxa" w:w="20"/>
+              <w:left w:type="dxa" w:w="100"/>
+              <w:bottom w:type="dxa" w:w="20"/>
+              <w:right w:type="dxa" w:w="100"/>
+            </w:tcMar>
+            <w:vAlign w:val="center"/>
+          </w:tcPr>
+          <w:p>
+            <w:pPr>
+              <w:spacing w:after="0" w:before="0"/>
+            </w:pPr>
+            <w:r>
+              <w:rPr>
+                <w:sz w:val="19"/>
+                <w:szCs w:val="19"/>
+              </w:rPr>
+              <w:t xml:space="preserve">Dal 2° al 10° GB</w:t>
             </w:r>
           </w:p>
         </w:tc>
@@ -6774,9 +6841,9 @@
           <w:tcPr>
             <w:tcW w:type="dxa" w:w="2120"/>
             <w:tcMar>
-              <w:top w:type="dxa" w:w="35"/>
-              <w:left w:type="dxa" w:w="100"/>
-              <w:bottom w:type="dxa" w:w="35"/>
+              <w:top w:type="dxa" w:w="20"/>
+              <w:left w:type="dxa" w:w="100"/>
+              <w:bottom w:type="dxa" w:w="20"/>
               <w:right w:type="dxa" w:w="100"/>
             </w:tcMar>
             <w:vAlign w:val="center"/>
@@ -6798,23 +6865,23 @@
           <w:tcPr>
             <w:tcW w:type="dxa" w:w="1542"/>
             <w:tcMar>
-              <w:top w:type="dxa" w:w="35"/>
-              <w:left w:type="dxa" w:w="100"/>
-              <w:bottom w:type="dxa" w:w="35"/>
-              <w:right w:type="dxa" w:w="100"/>
-            </w:tcMar>
-            <w:vAlign w:val="center"/>
-          </w:tcPr>
-          <w:p>
-            <w:pPr>
-              <w:spacing w:after="0" w:before="0"/>
-            </w:pPr>
-            <w:r>
-              <w:rPr>
-                <w:sz w:val="19"/>
-                <w:szCs w:val="19"/>
-              </w:rPr>
-              <w:t xml:space="preserve">73,00</w:t>
+              <w:top w:type="dxa" w:w="20"/>
+              <w:left w:type="dxa" w:w="100"/>
+              <w:bottom w:type="dxa" w:w="20"/>
+              <w:right w:type="dxa" w:w="100"/>
+            </w:tcMar>
+            <w:vAlign w:val="center"/>
+          </w:tcPr>
+          <w:p>
+            <w:pPr>
+              <w:spacing w:after="0" w:before="0"/>
+            </w:pPr>
+            <w:r>
+              <w:rPr>
+                <w:sz w:val="19"/>
+                <w:szCs w:val="19"/>
+              </w:rPr>
+              <w:t xml:space="preserve">97,00</w:t>
             </w:r>
           </w:p>
         </w:tc>
@@ -6829,23 +6896,23 @@
             <w:tcW w:type="dxa" w:w="5976"/>
             <w:shd w:fill="EAF1F9" w:color="auto" w:val="clear"/>
             <w:tcMar>
-              <w:top w:type="dxa" w:w="35"/>
-              <w:left w:type="dxa" w:w="100"/>
-              <w:bottom w:type="dxa" w:w="35"/>
-              <w:right w:type="dxa" w:w="100"/>
-            </w:tcMar>
-            <w:vAlign w:val="center"/>
-          </w:tcPr>
-          <w:p>
-            <w:pPr>
-              <w:spacing w:after="0" w:before="0"/>
-            </w:pPr>
-            <w:r>
-              <w:rPr>
-                <w:sz w:val="19"/>
-                <w:szCs w:val="19"/>
-              </w:rPr>
-              <w:t xml:space="preserve">Oltre 100 GB</w:t>
+              <w:top w:type="dxa" w:w="20"/>
+              <w:left w:type="dxa" w:w="100"/>
+              <w:bottom w:type="dxa" w:w="20"/>
+              <w:right w:type="dxa" w:w="100"/>
+            </w:tcMar>
+            <w:vAlign w:val="center"/>
+          </w:tcPr>
+          <w:p>
+            <w:pPr>
+              <w:spacing w:after="0" w:before="0"/>
+            </w:pPr>
+            <w:r>
+              <w:rPr>
+                <w:sz w:val="19"/>
+                <w:szCs w:val="19"/>
+              </w:rPr>
+              <w:t xml:space="preserve">Dall'11° al 100° GB</w:t>
             </w:r>
           </w:p>
         </w:tc>
@@ -6854,9 +6921,9 @@
             <w:tcW w:type="dxa" w:w="2120"/>
             <w:shd w:fill="EAF1F9" w:color="auto" w:val="clear"/>
             <w:tcMar>
-              <w:top w:type="dxa" w:w="35"/>
-              <w:left w:type="dxa" w:w="100"/>
-              <w:bottom w:type="dxa" w:w="35"/>
+              <w:top w:type="dxa" w:w="20"/>
+              <w:left w:type="dxa" w:w="100"/>
+              <w:bottom w:type="dxa" w:w="20"/>
               <w:right w:type="dxa" w:w="100"/>
             </w:tcMar>
             <w:vAlign w:val="center"/>
@@ -6879,23 +6946,23 @@
             <w:tcW w:type="dxa" w:w="1542"/>
             <w:shd w:fill="EAF1F9" w:color="auto" w:val="clear"/>
             <w:tcMar>
-              <w:top w:type="dxa" w:w="35"/>
-              <w:left w:type="dxa" w:w="100"/>
-              <w:bottom w:type="dxa" w:w="35"/>
-              <w:right w:type="dxa" w:w="100"/>
-            </w:tcMar>
-            <w:vAlign w:val="center"/>
-          </w:tcPr>
-          <w:p>
-            <w:pPr>
-              <w:spacing w:after="0" w:before="0"/>
-            </w:pPr>
-            <w:r>
-              <w:rPr>
-                <w:sz w:val="19"/>
-                <w:szCs w:val="19"/>
-              </w:rPr>
-              <w:t xml:space="preserve">53,00</w:t>
+              <w:top w:type="dxa" w:w="20"/>
+              <w:left w:type="dxa" w:w="100"/>
+              <w:bottom w:type="dxa" w:w="20"/>
+              <w:right w:type="dxa" w:w="100"/>
+            </w:tcMar>
+            <w:vAlign w:val="center"/>
+          </w:tcPr>
+          <w:p>
+            <w:pPr>
+              <w:spacing w:after="0" w:before="0"/>
+            </w:pPr>
+            <w:r>
+              <w:rPr>
+                <w:sz w:val="19"/>
+                <w:szCs w:val="19"/>
+              </w:rPr>
+              <w:t xml:space="preserve">73,00</w:t>
             </w:r>
           </w:p>
         </w:tc>
@@ -6909,9 +6976,88 @@
           <w:tcPr>
             <w:tcW w:type="dxa" w:w="5976"/>
             <w:tcMar>
-              <w:top w:type="dxa" w:w="35"/>
-              <w:left w:type="dxa" w:w="100"/>
-              <w:bottom w:type="dxa" w:w="35"/>
+              <w:top w:type="dxa" w:w="20"/>
+              <w:left w:type="dxa" w:w="100"/>
+              <w:bottom w:type="dxa" w:w="20"/>
+              <w:right w:type="dxa" w:w="100"/>
+            </w:tcMar>
+            <w:vAlign w:val="center"/>
+          </w:tcPr>
+          <w:p>
+            <w:pPr>
+              <w:spacing w:after="0" w:before="0"/>
+            </w:pPr>
+            <w:r>
+              <w:rPr>
+                <w:sz w:val="19"/>
+                <w:szCs w:val="19"/>
+              </w:rPr>
+              <w:t xml:space="preserve">Oltre 100 GB</w:t>
+            </w:r>
+          </w:p>
+        </w:tc>
+        <w:tc>
+          <w:tcPr>
+            <w:tcW w:type="dxa" w:w="2120"/>
+            <w:tcMar>
+              <w:top w:type="dxa" w:w="20"/>
+              <w:left w:type="dxa" w:w="100"/>
+              <w:bottom w:type="dxa" w:w="20"/>
+              <w:right w:type="dxa" w:w="100"/>
+            </w:tcMar>
+            <w:vAlign w:val="center"/>
+          </w:tcPr>
+          <w:p>
+            <w:pPr>
+              <w:spacing w:after="0" w:before="0"/>
+            </w:pPr>
+            <w:r>
+              <w:rPr>
+                <w:sz w:val="19"/>
+                <w:szCs w:val="19"/>
+              </w:rPr>
+              <w:t xml:space="preserve">per GB, per anno</w:t>
+            </w:r>
+          </w:p>
+        </w:tc>
+        <w:tc>
+          <w:tcPr>
+            <w:tcW w:type="dxa" w:w="1542"/>
+            <w:tcMar>
+              <w:top w:type="dxa" w:w="20"/>
+              <w:left w:type="dxa" w:w="100"/>
+              <w:bottom w:type="dxa" w:w="20"/>
+              <w:right w:type="dxa" w:w="100"/>
+            </w:tcMar>
+            <w:vAlign w:val="center"/>
+          </w:tcPr>
+          <w:p>
+            <w:pPr>
+              <w:spacing w:after="0" w:before="0"/>
+            </w:pPr>
+            <w:r>
+              <w:rPr>
+                <w:sz w:val="19"/>
+                <w:szCs w:val="19"/>
+              </w:rPr>
+              <w:t xml:space="preserve">53,00</w:t>
+            </w:r>
+          </w:p>
+        </w:tc>
+      </w:tr>
+      <w:tr>
+        <w:trPr>
+          <w:cantSplit/>
+          <w:tblHeader w:val="false"/>
+        </w:trPr>
+        <w:tc>
+          <w:tcPr>
+            <w:tcW w:type="dxa" w:w="5976"/>
+            <w:shd w:fill="EAF1F9" w:color="auto" w:val="clear"/>
+            <w:tcMar>
+              <w:top w:type="dxa" w:w="20"/>
+              <w:left w:type="dxa" w:w="100"/>
+              <w:bottom w:type="dxa" w:w="20"/>
               <w:right w:type="dxa" w:w="100"/>
             </w:tcMar>
             <w:vAlign w:val="center"/>
@@ -6932,10 +7078,11 @@
         <w:tc>
           <w:tcPr>
             <w:tcW w:type="dxa" w:w="2120"/>
-            <w:tcMar>
-              <w:top w:type="dxa" w:w="35"/>
-              <w:left w:type="dxa" w:w="100"/>
-              <w:bottom w:type="dxa" w:w="35"/>
+            <w:shd w:fill="EAF1F9" w:color="auto" w:val="clear"/>
+            <w:tcMar>
+              <w:top w:type="dxa" w:w="20"/>
+              <w:left w:type="dxa" w:w="100"/>
+              <w:bottom w:type="dxa" w:w="20"/>
               <w:right w:type="dxa" w:w="100"/>
             </w:tcMar>
             <w:vAlign w:val="center"/>
@@ -6956,10 +7103,11 @@
         <w:tc>
           <w:tcPr>
             <w:tcW w:type="dxa" w:w="1542"/>
-            <w:tcMar>
-              <w:top w:type="dxa" w:w="35"/>
-              <w:left w:type="dxa" w:w="100"/>
-              <w:bottom w:type="dxa" w:w="35"/>
+            <w:shd w:fill="EAF1F9" w:color="auto" w:val="clear"/>
+            <w:tcMar>
+              <w:top w:type="dxa" w:w="20"/>
+              <w:left w:type="dxa" w:w="100"/>
+              <w:bottom w:type="dxa" w:w="20"/>
               <w:right w:type="dxa" w:w="100"/>
             </w:tcMar>
             <w:vAlign w:val="center"/>
@@ -6992,7 +7140,7 @@
         <w:jc w:val="both"/>
       </w:pPr>
       <w:r>
-        <w:t xml:space="preserve">Le fasce sono progressive: ogni fascia si applica solo ai GB che vi rientrano. Esempio: spazio occupato 3,4 GB, arrotondato a 4 GB = 130 + 3 × 97 = 421 € per anno. Finché lo spazio resta entro 100 MB il Cliente paga solo il Pacchetto.</w:t>
+        <w:t xml:space="preserve">Fino a 1 GB si paga la sola fascia raggiunta. Oltre 1 GB le fasce sono progressive: ogni fascia si applica solo ai GB che vi rientrano. Esempi: spazio occupato 130 MB = 95 € per anno; 600 MB = 170 € per anno; 3,4 GB, arrotondato a 4 GB = 170 + 3 × 97 = 461 € per anno. Finché lo spazio resta entro 100 MB il Cliente paga solo il Pacchetto.</w:t>
       </w:r>
     </w:p>
     <w:p>
@@ -7037,9 +7185,9 @@
             <w:tcW w:type="dxa" w:w="5976"/>
             <w:shd w:fill="6599CD" w:color="auto" w:val="clear"/>
             <w:tcMar>
-              <w:top w:type="dxa" w:w="35"/>
-              <w:left w:type="dxa" w:w="100"/>
-              <w:bottom w:type="dxa" w:w="35"/>
+              <w:top w:type="dxa" w:w="20"/>
+              <w:left w:type="dxa" w:w="100"/>
+              <w:bottom w:type="dxa" w:w="20"/>
               <w:right w:type="dxa" w:w="100"/>
             </w:tcMar>
             <w:vAlign w:val="center"/>
@@ -7065,9 +7213,9 @@
             <w:tcW w:type="dxa" w:w="2120"/>
             <w:shd w:fill="6599CD" w:color="auto" w:val="clear"/>
             <w:tcMar>
-              <w:top w:type="dxa" w:w="35"/>
-              <w:left w:type="dxa" w:w="100"/>
-              <w:bottom w:type="dxa" w:w="35"/>
+              <w:top w:type="dxa" w:w="20"/>
+              <w:left w:type="dxa" w:w="100"/>
+              <w:bottom w:type="dxa" w:w="20"/>
               <w:right w:type="dxa" w:w="100"/>
             </w:tcMar>
             <w:vAlign w:val="center"/>
@@ -7093,9 +7241,9 @@
             <w:tcW w:type="dxa" w:w="1542"/>
             <w:shd w:fill="6599CD" w:color="auto" w:val="clear"/>
             <w:tcMar>
-              <w:top w:type="dxa" w:w="35"/>
-              <w:left w:type="dxa" w:w="100"/>
-              <w:bottom w:type="dxa" w:w="35"/>
+              <w:top w:type="dxa" w:w="20"/>
+              <w:left w:type="dxa" w:w="100"/>
+              <w:bottom w:type="dxa" w:w="20"/>
               <w:right w:type="dxa" w:w="100"/>
             </w:tcMar>
             <w:vAlign w:val="center"/>
@@ -7126,23 +7274,23 @@
           <w:tcPr>
             <w:tcW w:type="dxa" w:w="5976"/>
             <w:tcMar>
-              <w:top w:type="dxa" w:w="35"/>
-              <w:left w:type="dxa" w:w="100"/>
-              <w:bottom w:type="dxa" w:w="35"/>
-              <w:right w:type="dxa" w:w="100"/>
-            </w:tcMar>
-            <w:vAlign w:val="center"/>
-          </w:tcPr>
-          <w:p>
-            <w:pPr>
-              <w:spacing w:after="0" w:before="0"/>
-            </w:pPr>
-            <w:r>
-              <w:rPr>
-                <w:sz w:val="19"/>
-                <w:szCs w:val="19"/>
-              </w:rPr>
-              <w:t xml:space="preserve">Esibizione oltre le 6 comprese, o dopo la fine del Contratto</w:t>
+              <w:top w:type="dxa" w:w="20"/>
+              <w:left w:type="dxa" w:w="100"/>
+              <w:bottom w:type="dxa" w:w="20"/>
+              <w:right w:type="dxa" w:w="100"/>
+            </w:tcMar>
+            <w:vAlign w:val="center"/>
+          </w:tcPr>
+          <w:p>
+            <w:pPr>
+              <w:spacing w:after="0" w:before="0"/>
+            </w:pPr>
+            <w:r>
+              <w:rPr>
+                <w:sz w:val="19"/>
+                <w:szCs w:val="19"/>
+              </w:rPr>
+              <w:t xml:space="preserve">Esibizione oltre le 3 comprese per anno (tramite Software o richiesta a WST), o dopo la fine del Contratto</w:t>
             </w:r>
           </w:p>
         </w:tc>
@@ -7150,23 +7298,23 @@
           <w:tcPr>
             <w:tcW w:type="dxa" w:w="2120"/>
             <w:tcMar>
-              <w:top w:type="dxa" w:w="35"/>
-              <w:left w:type="dxa" w:w="100"/>
-              <w:bottom w:type="dxa" w:w="35"/>
-              <w:right w:type="dxa" w:w="100"/>
-            </w:tcMar>
-            <w:vAlign w:val="center"/>
-          </w:tcPr>
-          <w:p>
-            <w:pPr>
-              <w:spacing w:after="0" w:before="0"/>
-            </w:pPr>
-            <w:r>
-              <w:rPr>
-                <w:sz w:val="19"/>
-                <w:szCs w:val="19"/>
-              </w:rPr>
-              <w:t xml:space="preserve">per richiesta</w:t>
+              <w:top w:type="dxa" w:w="20"/>
+              <w:left w:type="dxa" w:w="100"/>
+              <w:bottom w:type="dxa" w:w="20"/>
+              <w:right w:type="dxa" w:w="100"/>
+            </w:tcMar>
+            <w:vAlign w:val="center"/>
+          </w:tcPr>
+          <w:p>
+            <w:pPr>
+              <w:spacing w:after="0" w:before="0"/>
+            </w:pPr>
+            <w:r>
+              <w:rPr>
+                <w:sz w:val="19"/>
+                <w:szCs w:val="19"/>
+              </w:rPr>
+              <w:t xml:space="preserve">per esibizione</w:t>
             </w:r>
           </w:p>
         </w:tc>
@@ -7174,9 +7322,9 @@
           <w:tcPr>
             <w:tcW w:type="dxa" w:w="1542"/>
             <w:tcMar>
-              <w:top w:type="dxa" w:w="35"/>
-              <w:left w:type="dxa" w:w="100"/>
-              <w:bottom w:type="dxa" w:w="35"/>
+              <w:top w:type="dxa" w:w="20"/>
+              <w:left w:type="dxa" w:w="100"/>
+              <w:bottom w:type="dxa" w:w="20"/>
               <w:right w:type="dxa" w:w="100"/>
             </w:tcMar>
             <w:vAlign w:val="center"/>
@@ -7205,9 +7353,9 @@
             <w:tcW w:type="dxa" w:w="5976"/>
             <w:shd w:fill="EAF1F9" w:color="auto" w:val="clear"/>
             <w:tcMar>
-              <w:top w:type="dxa" w:w="35"/>
-              <w:left w:type="dxa" w:w="100"/>
-              <w:bottom w:type="dxa" w:w="35"/>
+              <w:top w:type="dxa" w:w="20"/>
+              <w:left w:type="dxa" w:w="100"/>
+              <w:bottom w:type="dxa" w:w="20"/>
               <w:right w:type="dxa" w:w="100"/>
             </w:tcMar>
             <w:vAlign w:val="center"/>
@@ -7230,9 +7378,9 @@
             <w:tcW w:type="dxa" w:w="2120"/>
             <w:shd w:fill="EAF1F9" w:color="auto" w:val="clear"/>
             <w:tcMar>
-              <w:top w:type="dxa" w:w="35"/>
-              <w:left w:type="dxa" w:w="100"/>
-              <w:bottom w:type="dxa" w:w="35"/>
+              <w:top w:type="dxa" w:w="20"/>
+              <w:left w:type="dxa" w:w="100"/>
+              <w:bottom w:type="dxa" w:w="20"/>
               <w:right w:type="dxa" w:w="100"/>
             </w:tcMar>
             <w:vAlign w:val="center"/>
@@ -7255,9 +7403,9 @@
             <w:tcW w:type="dxa" w:w="1542"/>
             <w:shd w:fill="EAF1F9" w:color="auto" w:val="clear"/>
             <w:tcMar>
-              <w:top w:type="dxa" w:w="35"/>
-              <w:left w:type="dxa" w:w="100"/>
-              <w:bottom w:type="dxa" w:w="35"/>
+              <w:top w:type="dxa" w:w="20"/>
+              <w:left w:type="dxa" w:w="100"/>
+              <w:bottom w:type="dxa" w:w="20"/>
               <w:right w:type="dxa" w:w="100"/>
             </w:tcMar>
             <w:vAlign w:val="center"/>
@@ -7285,9 +7433,9 @@
           <w:tcPr>
             <w:tcW w:type="dxa" w:w="5976"/>
             <w:tcMar>
-              <w:top w:type="dxa" w:w="35"/>
-              <w:left w:type="dxa" w:w="100"/>
-              <w:bottom w:type="dxa" w:w="35"/>
+              <w:top w:type="dxa" w:w="20"/>
+              <w:left w:type="dxa" w:w="100"/>
+              <w:bottom w:type="dxa" w:w="20"/>
               <w:right w:type="dxa" w:w="100"/>
             </w:tcMar>
             <w:vAlign w:val="center"/>
@@ -7309,9 +7457,9 @@
           <w:tcPr>
             <w:tcW w:type="dxa" w:w="2120"/>
             <w:tcMar>
-              <w:top w:type="dxa" w:w="35"/>
-              <w:left w:type="dxa" w:w="100"/>
-              <w:bottom w:type="dxa" w:w="35"/>
+              <w:top w:type="dxa" w:w="20"/>
+              <w:left w:type="dxa" w:w="100"/>
+              <w:bottom w:type="dxa" w:w="20"/>
               <w:right w:type="dxa" w:w="100"/>
             </w:tcMar>
             <w:vAlign w:val="center"/>
@@ -7333,9 +7481,9 @@
           <w:tcPr>
             <w:tcW w:type="dxa" w:w="1542"/>
             <w:tcMar>
-              <w:top w:type="dxa" w:w="35"/>
-              <w:left w:type="dxa" w:w="100"/>
-              <w:bottom w:type="dxa" w:w="35"/>
+              <w:top w:type="dxa" w:w="20"/>
+              <w:left w:type="dxa" w:w="100"/>
+              <w:bottom w:type="dxa" w:w="20"/>
               <w:right w:type="dxa" w:w="100"/>
             </w:tcMar>
             <w:vAlign w:val="center"/>
@@ -7364,9 +7512,9 @@
             <w:tcW w:type="dxa" w:w="5976"/>
             <w:shd w:fill="EAF1F9" w:color="auto" w:val="clear"/>
             <w:tcMar>
-              <w:top w:type="dxa" w:w="35"/>
-              <w:left w:type="dxa" w:w="100"/>
-              <w:bottom w:type="dxa" w:w="35"/>
+              <w:top w:type="dxa" w:w="20"/>
+              <w:left w:type="dxa" w:w="100"/>
+              <w:bottom w:type="dxa" w:w="20"/>
               <w:right w:type="dxa" w:w="100"/>
             </w:tcMar>
             <w:vAlign w:val="center"/>
@@ -7389,9 +7537,9 @@
             <w:tcW w:type="dxa" w:w="2120"/>
             <w:shd w:fill="EAF1F9" w:color="auto" w:val="clear"/>
             <w:tcMar>
-              <w:top w:type="dxa" w:w="35"/>
-              <w:left w:type="dxa" w:w="100"/>
-              <w:bottom w:type="dxa" w:w="35"/>
+              <w:top w:type="dxa" w:w="20"/>
+              <w:left w:type="dxa" w:w="100"/>
+              <w:bottom w:type="dxa" w:w="20"/>
               <w:right w:type="dxa" w:w="100"/>
             </w:tcMar>
             <w:vAlign w:val="center"/>
@@ -7414,9 +7562,9 @@
             <w:tcW w:type="dxa" w:w="1542"/>
             <w:shd w:fill="EAF1F9" w:color="auto" w:val="clear"/>
             <w:tcMar>
-              <w:top w:type="dxa" w:w="35"/>
-              <w:left w:type="dxa" w:w="100"/>
-              <w:bottom w:type="dxa" w:w="35"/>
+              <w:top w:type="dxa" w:w="20"/>
+              <w:left w:type="dxa" w:w="100"/>
+              <w:bottom w:type="dxa" w:w="20"/>
               <w:right w:type="dxa" w:w="100"/>
             </w:tcMar>
             <w:vAlign w:val="center"/>
@@ -7559,7 +7707,7 @@
           </w:p>
           <w:p>
             <w:pPr>
-              <w:spacing w:after="420"/>
+              <w:spacing w:after="300"/>
             </w:pPr>
             <w:r>
               <w:rPr>
@@ -7998,7 +8146,7 @@
           </w:p>
           <w:p>
             <w:pPr>
-              <w:spacing w:after="420"/>
+              <w:spacing w:after="300"/>
             </w:pPr>
             <w:r>
               <w:rPr>
@@ -8063,7 +8211,7 @@
           </w:p>
           <w:p>
             <w:pPr>
-              <w:spacing w:after="420"/>
+              <w:spacing w:after="300"/>
             </w:pPr>
             <w:r>
               <w:rPr>
@@ -8320,7 +8468,7 @@
           </w:p>
           <w:p>
             <w:pPr>
-              <w:spacing w:after="420"/>
+              <w:spacing w:after="300"/>
             </w:pPr>
             <w:r>
               <w:rPr>
@@ -8385,7 +8533,7 @@
           </w:p>
           <w:p>
             <w:pPr>
-              <w:spacing w:after="420"/>
+              <w:spacing w:after="300"/>
             </w:pPr>
             <w:r>
               <w:rPr>

</xml_diff>

<commit_message>
Contratto: dati societari WST, esibizione solo su richiesta (3 incluse)
Co-Authored-By: Claude Opus 5.5 <noreply@anthropic.com>
Claude-Session: https://claude.ai/code/session_01WDncHtSFTdQuV5JxtunJCC
</commit_message>
<xml_diff>
--- a/Contratto_Conservazione_WsTech.docx
+++ b/Contratto_Conservazione_WsTech.docx
@@ -97,7 +97,7 @@
         <w:t xml:space="preserve">Web System Technology S.r.l.</w:t>
       </w:r>
       <w:r>
-        <w:t xml:space="preserve">, con sede legale in Via Cesare Terranova 20, 03100 Frosinone (FR), P.IVA [●], PEC [●], in persona del legale rappresentante pro tempore [●] (di seguito "</w:t>
+        <w:t xml:space="preserve">, con sede legale in Via Cesare Terranova 74, 03100 Frosinone (FR), P.IVA e C.F. 02664400609, partita IVA comunitaria IT02664400609, PEC [●], in persona del legale rappresentante pro tempore [●] (di seguito "</w:t>
       </w:r>
       <w:r>
         <w:rPr>
@@ -1693,7 +1693,7 @@
         <w:jc w:val="both"/>
       </w:pPr>
       <w:r>
-        <w:t xml:space="preserve">l'esibizione dei documenti conservati, che il Cliente può ottenere in autonomia tramite il Software o chiedendola a WST, secondo l'art. 8.6;</w:t>
+        <w:t xml:space="preserve">l'esibizione dei documenti conservati su richiesta del Cliente, secondo l'art. 8.6;</w:t>
       </w:r>
     </w:p>
     <w:p>
@@ -3651,7 +3651,60 @@
         <w:t xml:space="preserve">Esibizione.</w:t>
       </w:r>
       <w:r>
-        <w:t xml:space="preserve"> Il Cliente può ottenere l'esibizione dei propri documenti conservati in due modi:</w:t>
+        <w:t xml:space="preserve"> Il Cliente chiede l'esibizione a WST via PEC o e-mail, indicando i documenti (numero xFIR, periodo del registro, produttore o destinatario). WST consegna i documenti, in formato elettronico e con le relative ricevute di conservazione, entro 3 giorni lavorativi, oppure entro 1 giorno lavorativo per le richieste urgenti o delle autorità di controllo. Sono comprese nel Pacchetto 3 esibizioni per anno solare; le ulteriori sono fatturate secondo l'Allegato B. WST registra ogni esibizione e il registro fa fede ai fini del conteggio.</w:t>
+      </w:r>
+    </w:p>
+    <w:p>
+      <w:pPr>
+        <w:keepNext/>
+        <w:pBdr>
+          <w:bottom w:val="single" w:color="6599CD" w:sz="6" w:space="2"/>
+        </w:pBdr>
+        <w:spacing w:after="120" w:before="280"/>
+      </w:pPr>
+      <w:r>
+        <w:rPr>
+          <w:b/>
+          <w:bCs/>
+          <w:color w:val="1F3A5F"/>
+          <w:sz w:val="22"/>
+          <w:szCs w:val="22"/>
+        </w:rPr>
+        <w:t xml:space="preserve">Art. 9 – Responsabilità</w:t>
+      </w:r>
+    </w:p>
+    <w:p>
+      <w:pPr>
+        <w:spacing w:after="120" w:line="276"/>
+        <w:jc w:val="both"/>
+      </w:pPr>
+      <w:r>
+        <w:rPr>
+          <w:b/>
+          <w:bCs/>
+          <w:color w:val="1F3A5F"/>
+        </w:rPr>
+        <w:t xml:space="preserve">9.1  </w:t>
+      </w:r>
+      <w:r>
+        <w:t xml:space="preserve">WST risponde della corretta esecuzione delle attività di Produttore dei PdV. Il Conservatore risponde del processo di conservazione secondo il Manuale e la normativa applicabile.</w:t>
+      </w:r>
+    </w:p>
+    <w:p>
+      <w:pPr>
+        <w:spacing w:after="120" w:line="276"/>
+        <w:jc w:val="both"/>
+      </w:pPr>
+      <w:r>
+        <w:rPr>
+          <w:b/>
+          <w:bCs/>
+          <w:color w:val="1F3A5F"/>
+        </w:rPr>
+        <w:t xml:space="preserve">9.2  </w:t>
+      </w:r>
+      <w:r>
+        <w:t xml:space="preserve">WST non risponde di danni causati da:</w:t>
       </w:r>
     </w:p>
     <w:p>
@@ -3665,14 +3718,7 @@
         <w:jc w:val="both"/>
       </w:pPr>
       <w:r>
-        <w:rPr>
-          <w:b/>
-          <w:bCs/>
-        </w:rPr>
-        <w:t xml:space="preserve">in autonomia, tramite il Software</w:t>
-      </w:r>
-      <w:r>
-        <w:t xml:space="preserve">: il Cliente cerca il documento (numero xFIR, periodo del registro, produttore o destinatario) e il Software lo recupera dal Sistema di Conservazione tramite le interfacce applicative (API) messe a disposizione dal Conservatore, insieme alla relativa ricevuta. Il Cliente non dispone di utenze sul Sistema di Conservazione e vede solo i propri documenti;</w:t>
+        <w:t xml:space="preserve">documenti, metadati o dati non corretti forniti dal Cliente;</w:t>
       </w:r>
     </w:p>
     <w:p>
@@ -3686,78 +3732,7 @@
         <w:jc w:val="both"/>
       </w:pPr>
       <w:r>
-        <w:rPr>
-          <w:b/>
-          <w:bCs/>
-        </w:rPr>
-        <w:t xml:space="preserve">su richiesta a WST</w:t>
-      </w:r>
-      <w:r>
-        <w:t xml:space="preserve">, via PEC o e-mail: WST consegna i documenti, in formato elettronico e con le relative ricevute, entro 3 giorni lavorativi, oppure entro 1 giorno lavorativo per le richieste urgenti o delle autorità di controllo.</w:t>
-      </w:r>
-    </w:p>
-    <w:p>
-      <w:pPr>
-        <w:keepNext w:val="false"/>
-        <w:keepLines w:val="false"/>
-        <w:spacing w:after="120" w:line="276"/>
-        <w:jc w:val="both"/>
-      </w:pPr>
-      <w:r>
-        <w:t xml:space="preserve">Sono comprese nel Pacchetto 3 esibizioni per anno solare, in qualunque modo richieste. Le esibizioni ulteriori sono fatturate secondo l'Allegato B. Ogni esibizione è registrata dal Software o da WST, e il registro fa fede ai fini del conteggio.</w:t>
-      </w:r>
-    </w:p>
-    <w:p>
-      <w:pPr>
-        <w:keepNext/>
-        <w:pBdr>
-          <w:bottom w:val="single" w:color="6599CD" w:sz="6" w:space="2"/>
-        </w:pBdr>
-        <w:spacing w:after="120" w:before="280"/>
-      </w:pPr>
-      <w:r>
-        <w:rPr>
-          <w:b/>
-          <w:bCs/>
-          <w:color w:val="1F3A5F"/>
-          <w:sz w:val="22"/>
-          <w:szCs w:val="22"/>
-        </w:rPr>
-        <w:t xml:space="preserve">Art. 9 – Responsabilità</w:t>
-      </w:r>
-    </w:p>
-    <w:p>
-      <w:pPr>
-        <w:spacing w:after="120" w:line="276"/>
-        <w:jc w:val="both"/>
-      </w:pPr>
-      <w:r>
-        <w:rPr>
-          <w:b/>
-          <w:bCs/>
-          <w:color w:val="1F3A5F"/>
-        </w:rPr>
-        <w:t xml:space="preserve">9.1  </w:t>
-      </w:r>
-      <w:r>
-        <w:t xml:space="preserve">WST risponde della corretta esecuzione delle attività di Produttore dei PdV. Il Conservatore risponde del processo di conservazione secondo il Manuale e la normativa applicabile.</w:t>
-      </w:r>
-    </w:p>
-    <w:p>
-      <w:pPr>
-        <w:spacing w:after="120" w:line="276"/>
-        <w:jc w:val="both"/>
-      </w:pPr>
-      <w:r>
-        <w:rPr>
-          <w:b/>
-          <w:bCs/>
-          <w:color w:val="1F3A5F"/>
-        </w:rPr>
-        <w:t xml:space="preserve">9.2  </w:t>
-      </w:r>
-      <w:r>
-        <w:t xml:space="preserve">WST non risponde di danni causati da:</w:t>
+        <w:t xml:space="preserve">scelta di un Periodo di conservazione inadeguato;</w:t>
       </w:r>
     </w:p>
     <w:p>
@@ -3771,7 +3746,7 @@
         <w:jc w:val="both"/>
       </w:pPr>
       <w:r>
-        <w:t xml:space="preserve">documenti, metadati o dati non corretti forniti dal Cliente;</w:t>
+        <w:t xml:space="preserve">ritardo del Cliente nel consegnare i documenti a WST;</w:t>
       </w:r>
     </w:p>
     <w:p>
@@ -3785,35 +3760,7 @@
         <w:jc w:val="both"/>
       </w:pPr>
       <w:r>
-        <w:t xml:space="preserve">scelta di un Periodo di conservazione inadeguato;</w:t>
-      </w:r>
-    </w:p>
-    <w:p>
-      <w:pPr>
-        <w:pStyle w:val="ListParagraph"/>
-        <w:numPr>
-          <w:ilvl w:val="0"/>
-          <w:numId w:val="3"/>
-        </w:numPr>
-        <w:spacing w:after="80" w:line="276"/>
-        <w:jc w:val="both"/>
-      </w:pPr>
-      <w:r>
-        <w:t xml:space="preserve">ritardo del Cliente nel consegnare i documenti a WST;</w:t>
-      </w:r>
-    </w:p>
-    <w:p>
-      <w:pPr>
-        <w:pStyle w:val="ListParagraph"/>
-        <w:numPr>
-          <w:ilvl w:val="0"/>
-          <w:numId w:val="3"/>
-        </w:numPr>
-        <w:spacing w:after="80" w:line="276"/>
-        <w:jc w:val="both"/>
-      </w:pPr>
-      <w:r>
-        <w:t xml:space="preserve">indisponibilità temporanea delle interfacce applicative (API) o del Sistema di Conservazione del Conservatore; in tal caso il Cliente può sempre chiedere l'esibizione a WST;</w:t>
+        <w:t xml:space="preserve">indisponibilità temporanea del Sistema di Conservazione del Conservatore;</w:t>
       </w:r>
     </w:p>
     <w:p>
@@ -7290,7 +7237,7 @@
                 <w:sz w:val="19"/>
                 <w:szCs w:val="19"/>
               </w:rPr>
-              <w:t xml:space="preserve">Esibizione oltre le 3 comprese per anno (tramite Software o richiesta a WST), o dopo la fine del Contratto</w:t>
+              <w:t xml:space="preserve">Esibizione oltre le 3 comprese per anno, o dopo la fine del Contratto</w:t>
             </w:r>
           </w:p>
         </w:tc>
@@ -7314,7 +7261,7 @@
                 <w:sz w:val="19"/>
                 <w:szCs w:val="19"/>
               </w:rPr>
-              <w:t xml:space="preserve">per esibizione</w:t>
+              <w:t xml:space="preserve">per richiesta</w:t>
             </w:r>
           </w:p>
         </w:tc>
@@ -8824,7 +8771,7 @@
               <w:sz w:val="16"/>
               <w:szCs w:val="16"/>
             </w:rPr>
-            <w:t xml:space="preserve">Via Cesare Terranova, 20 – 03100 Frosinone (FR)</w:t>
+            <w:t xml:space="preserve">Via Cesare Terranova, 74 – 03100 Frosinone (FR)</w:t>
           </w:r>
         </w:p>
         <w:p>
@@ -8838,7 +8785,7 @@
               <w:sz w:val="16"/>
               <w:szCs w:val="16"/>
             </w:rPr>
-            <w:t xml:space="preserve">P.IVA [●]  ·  PEC [●]  ·  www.[●].it</w:t>
+            <w:t xml:space="preserve">P.IVA e C.F. 02664400609  ·  VAT IT02664400609</w:t>
           </w:r>
         </w:p>
       </w:tc>

</xml_diff>

<commit_message>
Contratto: Conservatore anonimo nel testo, patto di non aggiramento, pacchetto annuale e nuove fasce; bozza mail a Intesi
Co-Authored-By: Claude Opus 5.5 <noreply@anthropic.com>
Claude-Session: https://claude.ai/code/session_01WDncHtSFTdQuV5JxtunJCC
</commit_message>
<xml_diff>
--- a/Contratto_Conservazione_WsTech.docx
+++ b/Contratto_Conservazione_WsTech.docx
@@ -214,17 +214,7 @@
         <w:jc w:val="both"/>
       </w:pPr>
       <w:r>
-        <w:t xml:space="preserve">Intesi Group S.p.A., con sede in Milano, Via Torino 48, P.IVA 02780480964 (di seguito "</w:t>
-      </w:r>
-      <w:r>
-        <w:rPr>
-          <w:b/>
-          <w:bCs/>
-        </w:rPr>
-        <w:t xml:space="preserve">Intesi Group</w:t>
-      </w:r>
-      <w:r>
-        <w:t xml:space="preserve">" o il "</w:t>
+        <w:t xml:space="preserve">WST ha stipulato con un conservatore qualificato, iscritto nell'elenco dei prestatori di servizi fiduciari qualificati (di seguito il "</w:t>
       </w:r>
       <w:r>
         <w:rPr>
@@ -234,7 +224,7 @@
         <w:t xml:space="preserve">Conservatore</w:t>
       </w:r>
       <w:r>
-        <w:t xml:space="preserve">"), è un prestatore di servizi fiduciari qualificati che eroga il servizio di conservazione digitale a norma descritto nel proprio Manuale del Sistema di Conservazione;</w:t>
+        <w:t xml:space="preserve">"), un contratto che le consente di versare nel sistema di conservazione del Conservatore i documenti dei propri clienti, operando come Produttore dei Pacchetti di Versamento. Il Conservatore è indicato nell'Allegato D;</w:t>
       </w:r>
     </w:p>
     <w:p>
@@ -248,7 +238,7 @@
         <w:jc w:val="both"/>
       </w:pPr>
       <w:r>
-        <w:t xml:space="preserve">WST ha stipulato con Intesi Group un contratto (rif. WST2601) che le consente di versare nel sistema di conservazione di Intesi Group i documenti dei propri clienti, operando come Produttore dei Pacchetti di Versamento;</w:t>
+        <w:t xml:space="preserve">il Cliente, in quanto soggetto agli obblighi di tracciabilità dei rifiuti di cui agli artt. 188-bis, 190 e 193 del D.Lgs. 152/2006 e al D.M. 4 aprile 2023 n. 59 (RENTRI), deve conservare i formulari di identificazione dei rifiuti in formato digitale (xFIR) e i registri cronologici di carico e scarico;</w:t>
       </w:r>
     </w:p>
     <w:p>
@@ -262,21 +252,7 @@
         <w:jc w:val="both"/>
       </w:pPr>
       <w:r>
-        <w:t xml:space="preserve">il Cliente, in quanto soggetto agli obblighi di tracciabilità dei rifiuti di cui agli artt. 188-bis, 190 e 193 del D.Lgs. 152/2006 e al D.M. 4 aprile 2023 n. 59 (RENTRI), deve conservare i formulari di identificazione dei rifiuti in formato digitale (xFIR) e i registri cronologici di carico e scarico;</w:t>
-      </w:r>
-    </w:p>
-    <w:p>
-      <w:pPr>
-        <w:pStyle w:val="ListParagraph"/>
-        <w:numPr>
-          <w:ilvl w:val="0"/>
-          <w:numId w:val="2"/>
-        </w:numPr>
-        <w:spacing w:after="80" w:line="276"/>
-        <w:jc w:val="both"/>
-      </w:pPr>
-      <w:r>
-        <w:t xml:space="preserve">il Cliente intende affidare a WST la gestione del versamento di tali documenti nel sistema di conservazione di Intesi Group, alle condizioni che seguono.</w:t>
+        <w:t xml:space="preserve">il Cliente intende affidare a WST la gestione del versamento di tali documenti nel sistema di conservazione del Conservatore, alle condizioni che seguono.</w:t>
       </w:r>
     </w:p>
     <w:p>
@@ -663,7 +639,7 @@
                 <w:sz w:val="19"/>
                 <w:szCs w:val="19"/>
               </w:rPr>
-              <w:t xml:space="preserve">Intesi Group, che gestisce il Sistema di Conservazione.</w:t>
+              <w:t xml:space="preserve">Il conservatore qualificato indicato nell'Allegato D, che gestisce il Sistema di Conservazione.</w:t>
             </w:r>
           </w:p>
         </w:tc>
@@ -1267,7 +1243,7 @@
                 <w:sz w:val="19"/>
                 <w:szCs w:val="19"/>
               </w:rPr>
-              <w:t xml:space="preserve">L'attivazione (Trasportatori) o il canone annuo Software (Produttori), che comprendono 100 MB di spazio di conservazione, il versamento a cura di WST, le ricevute, l'assistenza e fino a 3 esibizioni per anno.</w:t>
+              <w:t xml:space="preserve">Il canone annuale del Pacchetto Trasportatori o del Pacchetto Produttori (quest'ultimo comprensivo della licenza del Software), che comprende 100 MB di spazio di conservazione, il versamento a cura di WST, le ricevute, l'assistenza e fino a 3 esibizioni per anno.</w:t>
             </w:r>
           </w:p>
         </w:tc>
@@ -1597,7 +1573,7 @@
                 <w:sz w:val="19"/>
                 <w:szCs w:val="19"/>
               </w:rPr>
-              <w:t xml:space="preserve">Il Manuale del Sistema di Conservazione di Intesi Group, pubblicato su https://www.intesigroup.com/it/qtsp/documenti/</w:t>
+              <w:t xml:space="preserve">Il Manuale del Sistema di Conservazione del Conservatore, pubblicato sul sito del Conservatore e disponibile su richiesta presso WST.</w:t>
             </w:r>
           </w:p>
         </w:tc>
@@ -1738,7 +1714,7 @@
         <w:t xml:space="preserve">2.2  </w:t>
       </w:r>
       <w:r>
-        <w:t xml:space="preserve">Il Cliente non dispone di utenze né di accesso diretto al Sistema di Conservazione: tutte le operazioni sono svolte da WST. Il processo di conservazione è eseguito da Intesi Group, secondo il Manuale. WST non gestisce il Sistema di Conservazione e non conserva copie dei documenti oltre quanto necessario al versamento.</w:t>
+        <w:t xml:space="preserve">Il Cliente non dispone di utenze né di accesso diretto al Sistema di Conservazione: tutte le operazioni sono svolte da WST. Il processo di conservazione è eseguito dal Conservatore, secondo il Manuale. WST non gestisce il Sistema di Conservazione e non conserva copie dei documenti oltre quanto necessario al versamento.</w:t>
       </w:r>
     </w:p>
     <w:p>
@@ -1794,10 +1770,10 @@
           <w:b/>
           <w:bCs/>
         </w:rPr>
-        <w:t xml:space="preserve">autorizza WST a conferire a Intesi Group</w:t>
-      </w:r>
-      <w:r>
-        <w:t xml:space="preserve">, e per essa al Responsabile del servizio di conservazione pro tempore, l'incarico di svolgere il processo di conservazione come descritto nel Manuale;</w:t>
+        <w:t xml:space="preserve">autorizza WST a conferire al Conservatore</w:t>
+      </w:r>
+      <w:r>
+        <w:t xml:space="preserve">, e per esso al Responsabile del servizio di conservazione pro tempore, l'incarico di svolgere il processo di conservazione come descritto nel Manuale;</w:t>
       </w:r>
     </w:p>
     <w:p>
@@ -2283,7 +2259,7 @@
         <w:t xml:space="preserve">5.5  </w:t>
       </w:r>
       <w:r>
-        <w:t xml:space="preserve">Se cessa per qualsiasi motivo il contratto tra WST e Intesi Group, WST può recedere con comunicazione via PEC e preavviso di almeno 60 giorni, salvo tempi più brevi imposti dal Conservatore. In tal caso WST propone al Cliente un conservatore alternativo o il subentro diretto del Cliente nei rapporti con Intesi Group.</w:t>
+        <w:t xml:space="preserve">Se cessa per qualsiasi motivo il contratto tra WST e il Conservatore, WST può trasferire il Servizio a un altro conservatore qualificato secondo l'art. 13.4, oppure recedere con comunicazione via PEC e preavviso di almeno 60 giorni, salvo tempi più brevi imposti dal Conservatore.</w:t>
       </w:r>
     </w:p>
     <w:p>
@@ -2493,7 +2469,7 @@
                 <w:sz w:val="19"/>
                 <w:szCs w:val="19"/>
               </w:rPr>
-              <w:t xml:space="preserve">Attivazione (Trasportatori)</w:t>
+              <w:t xml:space="preserve">Canone annuale del Pacchetto (Trasportatori e Produttori)</w:t>
             </w:r>
           </w:p>
         </w:tc>
@@ -2517,7 +2493,7 @@
                 <w:sz w:val="19"/>
                 <w:szCs w:val="19"/>
               </w:rPr>
-              <w:t xml:space="preserve">Alla firma del Contratto</w:t>
+              <w:t xml:space="preserve">Anticipato, a inizio di ogni anno solare (primo anno: alla firma, per intero)</w:t>
             </w:r>
           </w:p>
         </w:tc>
@@ -2548,7 +2524,7 @@
                 <w:sz w:val="19"/>
                 <w:szCs w:val="19"/>
               </w:rPr>
-              <w:t xml:space="preserve">Canone annuo Software (Produttori)</w:t>
+              <w:t xml:space="preserve">Canone annuale di conservazione (oltre 100 MB)</w:t>
             </w:r>
           </w:p>
         </w:tc>
@@ -2573,7 +2549,7 @@
                 <w:sz w:val="19"/>
                 <w:szCs w:val="19"/>
               </w:rPr>
-              <w:t xml:space="preserve">Anticipato, a inizio di ogni anno solare (primo anno: alla firma, per intero)</w:t>
+              <w:t xml:space="preserve">Anticipato, a inizio anno, sullo spazio occupato al 1° gennaio; il passaggio a una fascia superiore in corso d'anno è fatturato nel mese in cui avviene</w:t>
             </w:r>
           </w:p>
         </w:tc>
@@ -2603,7 +2579,7 @@
                 <w:sz w:val="19"/>
                 <w:szCs w:val="19"/>
               </w:rPr>
-              <w:t xml:space="preserve">Canone annuale di conservazione (oltre 100 MB)</w:t>
+              <w:t xml:space="preserve">Cancellazione anticipata</w:t>
             </w:r>
           </w:p>
         </w:tc>
@@ -2627,7 +2603,7 @@
                 <w:sz w:val="19"/>
                 <w:szCs w:val="19"/>
               </w:rPr>
-              <w:t xml:space="preserve">Anticipato, a inizio anno, sullo spazio occupato al 1° gennaio; il passaggio a una fascia superiore in corso d'anno è fatturato nel mese in cui avviene</w:t>
+              <w:t xml:space="preserve">All'esecuzione di ogni richiesta</w:t>
             </w:r>
           </w:p>
         </w:tc>
@@ -2658,7 +2634,7 @@
                 <w:sz w:val="19"/>
                 <w:szCs w:val="19"/>
               </w:rPr>
-              <w:t xml:space="preserve">Cancellazione anticipata</w:t>
+              <w:t xml:space="preserve">Attività extra</w:t>
             </w:r>
           </w:p>
         </w:tc>
@@ -2683,60 +2659,6 @@
                 <w:sz w:val="19"/>
                 <w:szCs w:val="19"/>
               </w:rPr>
-              <w:t xml:space="preserve">All'esecuzione di ogni richiesta</w:t>
-            </w:r>
-          </w:p>
-        </w:tc>
-      </w:tr>
-      <w:tr>
-        <w:trPr>
-          <w:cantSplit/>
-          <w:tblHeader w:val="false"/>
-        </w:trPr>
-        <w:tc>
-          <w:tcPr>
-            <w:tcW w:type="dxa" w:w="3277"/>
-            <w:tcMar>
-              <w:top w:type="dxa" w:w="20"/>
-              <w:left w:type="dxa" w:w="100"/>
-              <w:bottom w:type="dxa" w:w="20"/>
-              <w:right w:type="dxa" w:w="100"/>
-            </w:tcMar>
-            <w:vAlign w:val="center"/>
-          </w:tcPr>
-          <w:p>
-            <w:pPr>
-              <w:spacing w:after="0" w:before="0"/>
-            </w:pPr>
-            <w:r>
-              <w:rPr>
-                <w:sz w:val="19"/>
-                <w:szCs w:val="19"/>
-              </w:rPr>
-              <w:t xml:space="preserve">Attività extra</w:t>
-            </w:r>
-          </w:p>
-        </w:tc>
-        <w:tc>
-          <w:tcPr>
-            <w:tcW w:type="dxa" w:w="6361"/>
-            <w:tcMar>
-              <w:top w:type="dxa" w:w="20"/>
-              <w:left w:type="dxa" w:w="100"/>
-              <w:bottom w:type="dxa" w:w="20"/>
-              <w:right w:type="dxa" w:w="100"/>
-            </w:tcMar>
-            <w:vAlign w:val="center"/>
-          </w:tcPr>
-          <w:p>
-            <w:pPr>
-              <w:spacing w:after="0" w:before="0"/>
-            </w:pPr>
-            <w:r>
-              <w:rPr>
-                <w:sz w:val="19"/>
-                <w:szCs w:val="19"/>
-              </w:rPr>
               <w:t xml:space="preserve">A consuntivo, mensilmente</w:t>
             </w:r>
           </w:p>
@@ -2813,7 +2735,7 @@
         <w:t xml:space="preserve">6.7  </w:t>
       </w:r>
       <w:r>
-        <w:t xml:space="preserve">Il canone di conservazione, il canone annuo Software e l'attivazione non sono rimborsabili, neppure in caso di cessazione anticipata del Contratto o di cancellazione anticipata dei documenti.</w:t>
+        <w:t xml:space="preserve">Il canone del Pacchetto e il canone di conservazione non sono rimborsabili, neppure in caso di cessazione anticipata del Contratto o di cancellazione anticipata dei documenti.</w:t>
       </w:r>
     </w:p>
     <w:p>
@@ -3929,7 +3851,7 @@
         <w:t xml:space="preserve">10.2  </w:t>
       </w:r>
       <w:r>
-        <w:t xml:space="preserve">Il Cliente autorizza WST ad avvalersi di Intesi Group come sub-responsabile del trattamento, e dei sub-responsabili di Intesi Group pubblicati su https://www.intesigroup.com/it/dpa/. WST impone a Intesi Group obblighi di protezione dei dati non inferiori a quelli dell'Allegato C.</w:t>
+        <w:t xml:space="preserve">Il Cliente autorizza WST ad avvalersi del Conservatore come sub-responsabile del trattamento, e dei sub-responsabili del Conservatore, indicati nell'Allegato C. WST impone al Conservatore obblighi di protezione dei dati non inferiori a quelli dell'Allegato C.</w:t>
       </w:r>
     </w:p>
     <w:p>
@@ -4304,7 +4226,7 @@
         <w:t xml:space="preserve">13.1  </w:t>
       </w:r>
       <w:r>
-        <w:t xml:space="preserve">Il Cliente prende atto che il Servizio dipende dal Sistema di Conservazione di Intesi Group, che può modificare le proprie condizioni, il Manuale e le funzionalità del Sistema.</w:t>
+        <w:t xml:space="preserve">Il Cliente prende atto che il Servizio dipende dal Sistema di Conservazione del Conservatore, che può modificare le proprie condizioni, il Manuale e le funzionalità del Sistema.</w:t>
       </w:r>
     </w:p>
     <w:p>
@@ -4540,7 +4462,7 @@
         <w:t xml:space="preserve">15.2  </w:t>
       </w:r>
       <w:r>
-        <w:t xml:space="preserve">La licenza è compresa nel canone annuo Software indicato nell'Allegato B. Cessa automaticamente con la cessazione del Contratto, salvo il diritto del Cliente di ottenere l'esibizione dei documenti già conservati secondo l'art. 11.</w:t>
+        <w:t xml:space="preserve">La licenza è compresa nel canone annuale del Pacchetto Produttori indicato nell'Allegato B. Cessa automaticamente con la cessazione del Contratto, salvo il diritto del Cliente di ottenere l'esibizione dei documenti già conservati secondo l'art. 11.</w:t>
       </w:r>
     </w:p>
     <w:p>
@@ -4609,6 +4531,93 @@
       </w:r>
       <w:r>
         <w:t xml:space="preserve">Per i Trasportatori la licenza del Software resta regolata dal relativo contratto separato, che il presente Contratto non modifica.</w:t>
+      </w:r>
+    </w:p>
+    <w:p>
+      <w:pPr>
+        <w:keepNext/>
+        <w:pBdr>
+          <w:bottom w:val="single" w:color="6599CD" w:sz="6" w:space="2"/>
+        </w:pBdr>
+        <w:spacing w:after="120" w:before="280"/>
+      </w:pPr>
+      <w:r>
+        <w:rPr>
+          <w:b/>
+          <w:bCs/>
+          <w:color w:val="1F3A5F"/>
+          <w:sz w:val="22"/>
+          <w:szCs w:val="22"/>
+        </w:rPr>
+        <w:t xml:space="preserve">Art. 16 – Non aggiramento</w:t>
+      </w:r>
+    </w:p>
+    <w:p>
+      <w:pPr>
+        <w:spacing w:after="120" w:line="276"/>
+        <w:jc w:val="both"/>
+      </w:pPr>
+      <w:r>
+        <w:rPr>
+          <w:b/>
+          <w:bCs/>
+          <w:color w:val="1F3A5F"/>
+        </w:rPr>
+        <w:t xml:space="preserve">16.1  </w:t>
+      </w:r>
+      <w:r>
+        <w:t xml:space="preserve">Il Cliente riconosce che il rapporto con il Conservatore e con gli altri fornitori del Servizio è frutto dell'organizzazione commerciale di WST.</w:t>
+      </w:r>
+    </w:p>
+    <w:p>
+      <w:pPr>
+        <w:spacing w:after="120" w:line="276"/>
+        <w:jc w:val="both"/>
+      </w:pPr>
+      <w:r>
+        <w:rPr>
+          <w:b/>
+          <w:bCs/>
+          <w:color w:val="1F3A5F"/>
+        </w:rPr>
+        <w:t xml:space="preserve">16.2  </w:t>
+      </w:r>
+      <w:r>
+        <w:t xml:space="preserve">Per tutta la durata del Contratto e per i 24 mesi successivi alla sua cessazione, il Cliente si impegna a non affidare, direttamente o tramite terzi, al Conservatore o ad altri fornitori conosciuti tramite WST servizi di conservazione o di gestione di xFIR e registri uguali o simili a quelli del Contratto, e a non sollecitarne le offerte.</w:t>
+      </w:r>
+    </w:p>
+    <w:p>
+      <w:pPr>
+        <w:spacing w:after="120" w:line="276"/>
+        <w:jc w:val="both"/>
+      </w:pPr>
+      <w:r>
+        <w:rPr>
+          <w:b/>
+          <w:bCs/>
+          <w:color w:val="1F3A5F"/>
+        </w:rPr>
+        <w:t xml:space="preserve">16.3  </w:t>
+      </w:r>
+      <w:r>
+        <w:t xml:space="preserve">In caso di violazione, il Cliente paga a WST una penale pari a 24 mensilità dei corrispettivi medi pagati negli ultimi 12 mesi, e comunque non inferiore a 500 €, salvo il risarcimento del maggior danno.</w:t>
+      </w:r>
+    </w:p>
+    <w:p>
+      <w:pPr>
+        <w:spacing w:after="120" w:line="276"/>
+        <w:jc w:val="both"/>
+      </w:pPr>
+      <w:r>
+        <w:rPr>
+          <w:b/>
+          <w:bCs/>
+          <w:color w:val="1F3A5F"/>
+        </w:rPr>
+        <w:t xml:space="preserve">16.4  </w:t>
+      </w:r>
+      <w:r>
+        <w:t xml:space="preserve">Le informazioni sul Conservatore e sulle condizioni economiche praticate a WST sono riservate ai sensi dell'art. 12.1.</w:t>
       </w:r>
     </w:p>
     <w:p>
@@ -4816,7 +4825,7 @@
         <w:jc w:val="both"/>
       </w:pPr>
       <w:r>
-        <w:t xml:space="preserve">Il Cliente dichiara di aver letto il Contratto e gli Allegati e di approvare espressamente, con questa seconda firma separata, le seguenti clausole: art. 2.4 (esclusione di verifiche sul contenuto); art. 3, punti 3 e 7 (responsabilità sul periodo di conservazione e manleva); art. 5.2 (rinnovo automatico); art. 5.4 (clausola risolutiva espressa); art. 5.5 (recesso di WST); art. 5.7 (corrispettivi dovuti in caso di risoluzione); art. 6.4 (sospensione dei versamenti); art. 6.5 (aggiornamento dei prezzi); art. 6.7 (non rimborsabilità dei canoni); art. 6.8 (termine per contestare le fatture); art. 7.4 e 7.5 (cancellazione anticipata: responsabilità e irreversibilità); art. 9.2 e 9.3 (esclusione e limitazione di responsabilità); art. 9.5 (manleva); art. 9.6 (decadenza dai reclami); art. 12.2 (divieto di cessione); art. 12.6 (foro esclusivo); art. 13.3 e 13.4 (modifiche e sostituzione del Conservatore); art. 14.2 (validità della firma elettronica); art. 15.2, 15.3 e 15.5 (cessazione della licenza, divieti d'uso del Software e responsabilità sui dati).</w:t>
+        <w:t xml:space="preserve">Il Cliente dichiara di aver letto il Contratto e gli Allegati e di approvare espressamente, con questa seconda firma separata, le seguenti clausole: art. 2.4 (esclusione di verifiche sul contenuto); art. 3, punti 3 e 7 (responsabilità sul periodo di conservazione e manleva); art. 5.2 (rinnovo automatico); art. 5.4 (clausola risolutiva espressa); art. 5.5 (recesso di WST); art. 5.7 (corrispettivi dovuti in caso di risoluzione); art. 6.4 (sospensione dei versamenti); art. 6.5 (aggiornamento dei prezzi); art. 6.7 (non rimborsabilità dei canoni); art. 6.8 (termine per contestare le fatture); art. 7.4 e 7.5 (cancellazione anticipata: responsabilità e irreversibilità); art. 9.2 e 9.3 (esclusione e limitazione di responsabilità); art. 9.5 (manleva); art. 9.6 (decadenza dai reclami); art. 12.2 (divieto di cessione); art. 12.6 (foro esclusivo); art. 13.3 e 13.4 (modifiche e sostituzione del Conservatore); art. 14.2 (validità della firma elettronica); art. 15.2, 15.3 e 15.5 (cessazione della licenza, divieti d'uso del Software e responsabilità sui dati); art. 16.2 e 16.3 (patto di non aggiramento e penale).</w:t>
       </w:r>
     </w:p>
     <w:tbl>
@@ -6358,7 +6367,7 @@
                 <w:sz w:val="19"/>
                 <w:szCs w:val="19"/>
               </w:rPr>
-              <w:t xml:space="preserve">una tantum</w:t>
+              <w:t xml:space="preserve">per anno solare</w:t>
             </w:r>
           </w:p>
         </w:tc>
@@ -6621,7 +6630,7 @@
                 <w:sz w:val="19"/>
                 <w:szCs w:val="19"/>
               </w:rPr>
-              <w:t xml:space="preserve">Da 100 MB a 150 MB (50 MB aggiuntivi)</w:t>
+              <w:t xml:space="preserve">Da 101 MB a 500 MB</w:t>
             </w:r>
           </w:p>
         </w:tc>
@@ -6700,7 +6709,7 @@
                 <w:sz w:val="19"/>
                 <w:szCs w:val="19"/>
               </w:rPr>
-              <w:t xml:space="preserve">Da 150 MB a 1 GB</w:t>
+              <w:t xml:space="preserve">Da 501 MB a 1 GB</w:t>
             </w:r>
           </w:p>
         </w:tc>
@@ -7087,7 +7096,7 @@
         <w:jc w:val="both"/>
       </w:pPr>
       <w:r>
-        <w:t xml:space="preserve">Fino a 1 GB si paga la sola fascia raggiunta. Oltre 1 GB le fasce sono progressive: ogni fascia si applica solo ai GB che vi rientrano. Esempi: spazio occupato 130 MB = 95 € per anno; 600 MB = 170 € per anno; 3,4 GB, arrotondato a 4 GB = 170 + 3 × 97 = 461 € per anno. Finché lo spazio resta entro 100 MB il Cliente paga solo il Pacchetto.</w:t>
+        <w:t xml:space="preserve">Fino a 1 GB si paga la sola fascia raggiunta. Oltre 1 GB le fasce sono progressive: ogni fascia si applica solo ai GB che vi rientrano. Esempi: spazio occupato 300 MB = 95 € per anno; 600 MB = 170 € per anno; 3,4 GB, arrotondato a 4 GB = 170 + 3 × 97 = 461 € per anno. Finché lo spazio resta entro 100 MB il Cliente paga solo il Pacchetto.</w:t>
       </w:r>
     </w:p>
     <w:p>
@@ -7924,7 +7933,7 @@
         <w:t xml:space="preserve">Sub-responsabili.</w:t>
       </w:r>
       <w:r>
-        <w:t xml:space="preserve"> Il Cliente autorizza Intesi Group S.p.A. e i suoi sub-responsabili pubblicati su https://www.intesigroup.com/it/dpa/. WST informa il Cliente di ogni nuova aggiunta o sostituzione con 30 giorni di anticipo; il Cliente può opporsi per motivi legittimi.</w:t>
+        <w:t xml:space="preserve"> Il Cliente autorizza come sub-responsabile il Conservatore, Intesi Group S.p.A. (Via Torino 48, Milano, P.IVA 02780480964), e i sub-responsabili da esso indicati, il cui elenco è disponibile su richiesta presso WST. WST informa il Cliente di ogni nuova aggiunta o sostituzione con 30 giorni di anticipo; il Cliente può opporsi per motivi legittimi.</w:t>
       </w:r>
     </w:p>
     <w:p>
@@ -8266,7 +8275,7 @@
         <w:jc w:val="both"/>
       </w:pPr>
       <w:r>
-        <w:t xml:space="preserve">di aver preso visione del Manuale del Sistema di Conservazione di Intesi Group S.p.A.</w:t>
+        <w:t xml:space="preserve">di aver ricevuto la possibilità di prendere visione del Manuale del Sistema di Conservazione del Conservatore sotto indicato.</w:t>
       </w:r>
     </w:p>
     <w:p>
@@ -8319,7 +8328,7 @@
         <w:jc w:val="both"/>
       </w:pPr>
       <w:r>
-        <w:t xml:space="preserve">a </w:t>
+        <w:t xml:space="preserve">al Conservatore </w:t>
       </w:r>
       <w:r>
         <w:rPr>
@@ -8329,7 +8338,7 @@
         <w:t xml:space="preserve">Intesi Group S.p.A.</w:t>
       </w:r>
       <w:r>
-        <w:t xml:space="preserve">, e per essa al Responsabile del servizio di conservazione pro tempore, tramite WST, la delega a svolgere le attività del processo di conservazione descritte nel Manuale, ai sensi delle Linee Guida AgID sulla formazione, gestione e conservazione dei documenti informatici.</w:t>
+        <w:t xml:space="preserve">, Via Torino 48, Milano, P.IVA 02780480964, e per esso al Responsabile del servizio di conservazione pro tempore, tramite WST, la delega a svolgere le attività del processo di conservazione descritte nel Manuale, ai sensi delle Linee Guida AgID sulla formazione, gestione e conservazione dei documenti informatici.</w:t>
       </w:r>
     </w:p>
     <w:p>

</xml_diff>

<commit_message>
Contratto: notifiche automatiche sugli esiti dei versamenti, chiarita la conservazione dei dati alla cessazione
Co-Authored-By: Claude Opus 5.5 <noreply@anthropic.com>
Claude-Session: https://claude.ai/code/session_01WDncHtSFTdQuV5JxtunJCC
</commit_message>
<xml_diff>
--- a/Contratto_Conservazione_WsTech.docx
+++ b/Contratto_Conservazione_WsTech.docx
@@ -2023,11 +2023,17 @@
     </w:p>
     <w:p>
       <w:pPr>
-        <w:keepNext w:val="false"/>
-        <w:keepLines w:val="false"/>
-        <w:spacing w:after="120" w:line="276"/>
-        <w:jc w:val="both"/>
-      </w:pPr>
+        <w:spacing w:after="120" w:line="276"/>
+        <w:jc w:val="both"/>
+      </w:pPr>
+      <w:r>
+        <w:rPr>
+          <w:b/>
+          <w:bCs/>
+          <w:color w:val="1F3A5F"/>
+        </w:rPr>
+        <w:t xml:space="preserve">4.1  </w:t>
+      </w:r>
       <w:r>
         <w:t xml:space="preserve">WST si impegna a:</w:t>
       </w:r>
@@ -2099,7 +2105,7 @@
         <w:jc w:val="both"/>
       </w:pPr>
       <w:r>
-        <w:t xml:space="preserve">comunicare al Cliente, senza ingiustificato ritardo, i rifiuti di PdV e le anomalie segnalate dal Conservatore;</w:t>
+        <w:t xml:space="preserve">comunicare al Cliente i rifiuti di PdV e le anomalie segnalate dal Conservatore, secondo l'art. 4.2;</w:t>
       </w:r>
     </w:p>
     <w:p>
@@ -2128,6 +2134,75 @@
       </w:pPr>
       <w:r>
         <w:t xml:space="preserve">informare il Cliente per iscritto di ogni cambiamento del Conservatore, con almeno 60 giorni di preavviso salvo cause non dipendenti da WST.</w:t>
+      </w:r>
+    </w:p>
+    <w:p>
+      <w:pPr>
+        <w:spacing w:after="120" w:line="276"/>
+        <w:jc w:val="both"/>
+      </w:pPr>
+      <w:r>
+        <w:rPr>
+          <w:b/>
+          <w:bCs/>
+          <w:color w:val="1F3A5F"/>
+        </w:rPr>
+        <w:t xml:space="preserve">4.2  </w:t>
+      </w:r>
+      <w:r>
+        <w:rPr>
+          <w:b/>
+          <w:bCs/>
+        </w:rPr>
+        <w:t xml:space="preserve">Notifiche automatiche.</w:t>
+      </w:r>
+      <w:r>
+        <w:t xml:space="preserve"> Gli esiti dei versamenti sono comunicati in modo automatico, senza bisogno di controlli manuali da parte di WST:</w:t>
+      </w:r>
+    </w:p>
+    <w:p>
+      <w:pPr>
+        <w:pStyle w:val="ListParagraph"/>
+        <w:numPr>
+          <w:ilvl w:val="0"/>
+          <w:numId w:val="3"/>
+        </w:numPr>
+        <w:spacing w:after="80" w:line="276"/>
+        <w:jc w:val="both"/>
+      </w:pPr>
+      <w:r>
+        <w:t xml:space="preserve">se un versamento non va a buon fine o il Conservatore segnala un'anomalia, il sistema di WST invia una notifica via e-mail, nello stesso momento, al Cliente, all'indirizzo indicato nell'Allegato A, e a WST;</w:t>
+      </w:r>
+    </w:p>
+    <w:p>
+      <w:pPr>
+        <w:pStyle w:val="ListParagraph"/>
+        <w:numPr>
+          <w:ilvl w:val="0"/>
+          <w:numId w:val="3"/>
+        </w:numPr>
+        <w:spacing w:after="80" w:line="276"/>
+        <w:jc w:val="both"/>
+      </w:pPr>
+      <w:r>
+        <w:t xml:space="preserve">per il Cliente che usa il Software, lo stato di ogni versamento (versato, in attesa, rifiutato) è visibile anche nel Software.</w:t>
+      </w:r>
+    </w:p>
+    <w:p>
+      <w:pPr>
+        <w:spacing w:after="120" w:line="276"/>
+        <w:jc w:val="both"/>
+      </w:pPr>
+      <w:r>
+        <w:rPr>
+          <w:b/>
+          <w:bCs/>
+          <w:color w:val="1F3A5F"/>
+        </w:rPr>
+        <w:t xml:space="preserve">4.3  </w:t>
+      </w:r>
+      <w:r>
+        <w:t xml:space="preserve">La notifica automatica vale come comunicazione al Cliente. Il Cliente si impegna a leggerla e, se l'errore dipende dai documenti o dai dati che ha fornito, a correggerli e riconsegnarli entro 5 giorni lavorativi. Se l'errore dipende da WST o dal Conservatore, WST ripete il versamento senza costi per il Cliente.</w:t>
       </w:r>
     </w:p>
     <w:p>
@@ -4003,7 +4078,7 @@
         <w:t xml:space="preserve">11.5  </w:t>
       </w:r>
       <w:r>
-        <w:t xml:space="preserve">Alla cessazione WST cancella le copie di lavoro dei documenti e dei dati del Cliente in suo possesso, salvo obblighi di legge.</w:t>
+        <w:t xml:space="preserve">Le esibizioni e le esportazioni di cui agli artt. 11.3 e 11.4 sono eseguite estraendo i documenti dal Sistema di Conservazione, dove restano fino allo scarto. Alla cessazione WST cancella quindi solo le copie di lavoro presenti nei propri sistemi, compreso il Software, e conserva i soli dati necessari a ritrovare i documenti del Cliente nel Sistema di Conservazione e a gestire esibizioni, esportazioni e fatturazione, fino allo scarto, salvo obblighi di legge.</w:t>
       </w:r>
     </w:p>
     <w:p>
@@ -4825,7 +4900,7 @@
         <w:jc w:val="both"/>
       </w:pPr>
       <w:r>
-        <w:t xml:space="preserve">Il Cliente dichiara di aver letto il Contratto e gli Allegati e di approvare espressamente, con questa seconda firma separata, le seguenti clausole: art. 2.4 (esclusione di verifiche sul contenuto); art. 3, punti 3 e 7 (responsabilità sul periodo di conservazione e manleva); art. 5.2 (rinnovo automatico); art. 5.4 (clausola risolutiva espressa); art. 5.5 (recesso di WST); art. 5.7 (corrispettivi dovuti in caso di risoluzione); art. 6.4 (sospensione dei versamenti); art. 6.5 (aggiornamento dei prezzi); art. 6.7 (non rimborsabilità dei canoni); art. 6.8 (termine per contestare le fatture); art. 7.4 e 7.5 (cancellazione anticipata: responsabilità e irreversibilità); art. 9.2 e 9.3 (esclusione e limitazione di responsabilità); art. 9.5 (manleva); art. 9.6 (decadenza dai reclami); art. 12.2 (divieto di cessione); art. 12.6 (foro esclusivo); art. 13.3 e 13.4 (modifiche e sostituzione del Conservatore); art. 14.2 (validità della firma elettronica); art. 15.2, 15.3 e 15.5 (cessazione della licenza, divieti d'uso del Software e responsabilità sui dati); art. 16.2 e 16.3 (patto di non aggiramento e penale).</w:t>
+        <w:t xml:space="preserve">Il Cliente dichiara di aver letto il Contratto e gli Allegati e di approvare espressamente, con questa seconda firma separata, le seguenti clausole: art. 2.4 (esclusione di verifiche sul contenuto); art. 4.3 (valore delle notifiche automatiche); art. 3, punti 3 e 7 (responsabilità sul periodo di conservazione e manleva); art. 5.2 (rinnovo automatico); art. 5.4 (clausola risolutiva espressa); art. 5.5 (recesso di WST); art. 5.7 (corrispettivi dovuti in caso di risoluzione); art. 6.4 (sospensione dei versamenti); art. 6.5 (aggiornamento dei prezzi); art. 6.7 (non rimborsabilità dei canoni); art. 6.8 (termine per contestare le fatture); art. 7.4 e 7.5 (cancellazione anticipata: responsabilità e irreversibilità); art. 9.2 e 9.3 (esclusione e limitazione di responsabilità); art. 9.5 (manleva); art. 9.6 (decadenza dai reclami); art. 12.2 (divieto di cessione); art. 12.6 (foro esclusivo); art. 13.3 e 13.4 (modifiche e sostituzione del Conservatore); art. 14.2 (validità della firma elettronica); art. 15.2, 15.3 e 15.5 (cessazione della licenza, divieti d'uso del Software e responsabilità sui dati); art. 16.2 e 16.3 (patto di non aggiramento e penale).</w:t>
       </w:r>
     </w:p>
     <w:tbl>
@@ -5563,6 +5638,55 @@
         <w:tc>
           <w:tcPr>
             <w:tcW w:type="dxa" w:w="6361"/>
+            <w:tcMar>
+              <w:top w:type="dxa" w:w="20"/>
+              <w:left w:type="dxa" w:w="100"/>
+              <w:bottom w:type="dxa" w:w="20"/>
+              <w:right w:type="dxa" w:w="100"/>
+            </w:tcMar>
+            <w:vAlign w:val="center"/>
+          </w:tcPr>
+          <w:p>
+            <w:pPr>
+              <w:spacing w:after="0" w:before="0"/>
+            </w:pPr>
+          </w:p>
+        </w:tc>
+      </w:tr>
+      <w:tr>
+        <w:trPr>
+          <w:cantSplit/>
+          <w:tblHeader w:val="false"/>
+        </w:trPr>
+        <w:tc>
+          <w:tcPr>
+            <w:tcW w:type="dxa" w:w="3277"/>
+            <w:shd w:fill="EAF1F9" w:color="auto" w:val="clear"/>
+            <w:tcMar>
+              <w:top w:type="dxa" w:w="20"/>
+              <w:left w:type="dxa" w:w="100"/>
+              <w:bottom w:type="dxa" w:w="20"/>
+              <w:right w:type="dxa" w:w="100"/>
+            </w:tcMar>
+            <w:vAlign w:val="center"/>
+          </w:tcPr>
+          <w:p>
+            <w:pPr>
+              <w:spacing w:after="0" w:before="0"/>
+            </w:pPr>
+            <w:r>
+              <w:rPr>
+                <w:sz w:val="19"/>
+                <w:szCs w:val="19"/>
+              </w:rPr>
+              <w:t xml:space="preserve">E-mail per le notifiche automatiche sugli esiti dei versamenti</w:t>
+            </w:r>
+          </w:p>
+        </w:tc>
+        <w:tc>
+          <w:tcPr>
+            <w:tcW w:type="dxa" w:w="6361"/>
+            <w:shd w:fill="EAF1F9" w:color="auto" w:val="clear"/>
             <w:tcMar>
               <w:top w:type="dxa" w:w="20"/>
               <w:left w:type="dxa" w:w="100"/>
@@ -8038,7 +8162,7 @@
         <w:t xml:space="preserve">Fine del trattamento.</w:t>
       </w:r>
       <w:r>
-        <w:t xml:space="preserve"> Alla cessazione WST cancella le proprie copie dei dati, salvo obblighi di legge. I documenti conservati restano presso il Conservatore secondo l'art. 11 del Contratto.</w:t>
+        <w:t xml:space="preserve"> Alla cessazione WST cancella le proprie copie di lavoro dei dati, salvo obblighi di legge, e conserva i soli dati necessari alle esibizioni e alle esportazioni secondo l'art. 11.5 del Contratto. I documenti conservati restano presso il Conservatore fino allo scarto. La nomina resta efficace fino allo scarto dei documenti per le sole attività di esibizione ed esportazione.</w:t>
       </w:r>
     </w:p>
     <w:p>

</xml_diff>

<commit_message>
Contratto: legale rappresentante, PEC e contatti assistenza di WST
Co-Authored-By: Claude Opus 5.5 <noreply@anthropic.com>
Claude-Session: https://claude.ai/code/session_01WDncHtSFTdQuV5JxtunJCC
</commit_message>
<xml_diff>
--- a/Contratto_Conservazione_WsTech.docx
+++ b/Contratto_Conservazione_WsTech.docx
@@ -97,7 +97,7 @@
         <w:t xml:space="preserve">Web System Technology S.r.l.</w:t>
       </w:r>
       <w:r>
-        <w:t xml:space="preserve">, con sede legale in Via Cesare Terranova 74, 03100 Frosinone (FR), P.IVA e C.F. 02664400609, partita IVA comunitaria IT02664400609, PEC [●], in persona del legale rappresentante pro tempore [●] (di seguito "</w:t>
+        <w:t xml:space="preserve">, con sede legale in Via Cesare Terranova 74, 03100 Frosinone (FR), P.IVA e C.F. 02664400609, partita IVA comunitaria IT02664400609, PEC wstechsrl@pec.it, in persona del legale rappresentante pro tempore Antonio Tomaro (di seguito "</w:t>
       </w:r>
       <w:r>
         <w:rPr>
@@ -2998,7 +2998,7 @@
         <w:t xml:space="preserve">8.1  </w:t>
       </w:r>
       <w:r>
-        <w:t xml:space="preserve">WST è l'unico punto di contatto del Cliente. Fornisce assistenza nei giorni lavorativi, dalle 9:00 alle 18:00, tramite e-mail [●] e telefono [●]. WST gestisce direttamente le richieste di primo livello e inoltra al Conservatore quelle che riguardano il Sistema di Conservazione.</w:t>
+        <w:t xml:space="preserve">WST è l'unico punto di contatto del Cliente. Fornisce assistenza nei giorni lavorativi, dalle 9:00 alle 18:00, tramite e-mail info@wstech.it e telefono 0775 1627986. WST gestisce direttamente le richieste di primo livello e inoltra al Conservatore quelle che riguardano il Sistema di Conservazione.</w:t>
       </w:r>
     </w:p>
     <w:p>
@@ -4783,7 +4783,7 @@
                 <w:sz w:val="18"/>
                 <w:szCs w:val="18"/>
               </w:rPr>
-              <w:t xml:space="preserve">Il legale rappresentante</w:t>
+              <w:t xml:space="preserve">Il legale rappresentante – Antonio Tomaro</w:t>
             </w:r>
           </w:p>
           <w:p>
@@ -8299,7 +8299,7 @@
                 <w:sz w:val="18"/>
                 <w:szCs w:val="18"/>
               </w:rPr>
-              <w:t xml:space="preserve">(WST)</w:t>
+              <w:t xml:space="preserve">WST – Antonio Tomaro</w:t>
             </w:r>
           </w:p>
           <w:p>
@@ -8918,7 +8918,21 @@
               <w:sz w:val="16"/>
               <w:szCs w:val="16"/>
             </w:rPr>
-            <w:t xml:space="preserve">P.IVA e C.F. 02664400609  ·  VAT IT02664400609</w:t>
+            <w:t xml:space="preserve">P.IVA e C.F. 02664400609  ·  PEC wstechsrl@pec.it</w:t>
+          </w:r>
+        </w:p>
+        <w:p>
+          <w:pPr>
+            <w:spacing w:after="0"/>
+            <w:jc w:val="right"/>
+          </w:pPr>
+          <w:r>
+            <w:rPr>
+              <w:color w:val="7F7F7F"/>
+              <w:sz w:val="16"/>
+              <w:szCs w:val="16"/>
+            </w:rPr>
+            <w:t xml:space="preserve">info@wstech.it  ·  Tel. 0775 1627986</w:t>
           </w:r>
         </w:p>
       </w:tc>

</xml_diff>